<commit_message>
refactor: Pantalla de ventas secundaria con su nombre propio, sincronizada con la principal y sin navegación entre pantallas
</commit_message>
<xml_diff>
--- a/scripts/manual/Manual de usuario CG-POS.docx
+++ b/scripts/manual/Manual de usuario CG-POS.docx
@@ -222,7 +222,7 @@
           </w:tcPr>
           <w:p>
             <w:r>
-              <w:t>Caja – venta</w:t>
+              <w:t>Caja – pantalla de ventas principal</w:t>
             </w:r>
           </w:p>
         </w:tc>
@@ -242,7 +242,7 @@
           </w:tcPr>
           <w:p>
             <w:r>
-              <w:t>Cajero</w:t>
+              <w:t>Cajero, con lector y teclado</w:t>
             </w:r>
           </w:p>
         </w:tc>
@@ -254,7 +254,39 @@
           </w:tcPr>
           <w:p>
             <w:r>
-              <w:t>Caja – pantalla del cliente (2.º monitor)</w:t>
+              <w:t>Caja – pantalla de ventas secundaria</w:t>
+            </w:r>
+          </w:p>
+        </w:tc>
+        <w:tc>
+          <w:tcPr>
+            <w:tcW w:type="dxa" w:w="3969"/>
+          </w:tcPr>
+          <w:p>
+            <w:r>
+              <w:t>http://localhost:5180/venta-secundaria</w:t>
+            </w:r>
+          </w:p>
+        </w:tc>
+        <w:tc>
+          <w:tcPr>
+            <w:tcW w:type="dxa" w:w="2268"/>
+          </w:tcPr>
+          <w:p>
+            <w:r>
+              <w:t>Cajero, tocando el catálogo</w:t>
+            </w:r>
+          </w:p>
+        </w:tc>
+      </w:tr>
+      <w:tr>
+        <w:tc>
+          <w:tcPr>
+            <w:tcW w:type="dxa" w:w="3402"/>
+          </w:tcPr>
+          <w:p>
+            <w:r>
+              <w:t>Caja – pantalla de clientes</w:t>
             </w:r>
           </w:p>
         </w:tc>
@@ -351,7 +383,7 @@
           <w:i/>
           <w:color w:val="2E7D32"/>
         </w:rPr>
-        <w:t>Las tres pantallas de la caja se abren solas, cada una en su monitor, con el acceso directo que deja instalado el técnico.</w:t>
+        <w:t>Las pantallas de la caja se abren solas al encender el equipo, cada una en su monitor, con el acceso directo que deja instalado el técnico. Ninguna lleva a otra: cada monitor muestra siempre la suya.</w:t>
       </w:r>
     </w:p>
     <w:p>
@@ -4165,205 +4197,7 @@
         <w:pStyle w:val="Heading2"/>
       </w:pPr>
       <w:r>
-        <w:t>3.4. La pantalla secundaria (mostrador táctil)</w:t>
-      </w:r>
-    </w:p>
-    <w:p>
-      <w:r>
-        <w:t>Además de la pantalla con lector, la caja tiene una pantalla táctil pensada para vender tocando, como en una cafetería. Se entra por «Mostrador táctil» (segunda página de teclas) o directamente en /mostrador, y se vuelve con «Pantalla con lector». Es la misma venta: lo que agregue en una aparece en la otra.</w:t>
-      </w:r>
-    </w:p>
-    <w:tbl>
-      <w:tblPr>
-        <w:tblStyle w:val="TableGrid"/>
-        <w:tblW w:type="auto" w:w="0"/>
-        <w:tblLook w:firstColumn="1" w:firstRow="1" w:lastColumn="0" w:lastRow="0" w:noHBand="0" w:noVBand="1" w:val="04A0"/>
-      </w:tblPr>
-      <w:tblGrid>
-        <w:gridCol w:w="4759"/>
-        <w:gridCol w:w="4759"/>
-      </w:tblGrid>
-      <w:tr>
-        <w:tc>
-          <w:tcPr>
-            <w:tcW w:type="dxa" w:w="3118"/>
-          </w:tcPr>
-          <w:p>
-            <w:r/>
-            <w:r>
-              <w:rPr>
-                <w:b/>
-                <w:color w:val="1B4D3E"/>
-              </w:rPr>
-              <w:t>Parte de la pantalla</w:t>
-            </w:r>
-          </w:p>
-        </w:tc>
-        <w:tc>
-          <w:tcPr>
-            <w:tcW w:type="dxa" w:w="6520"/>
-          </w:tcPr>
-          <w:p>
-            <w:r/>
-            <w:r>
-              <w:rPr>
-                <w:b/>
-                <w:color w:val="1B4D3E"/>
-              </w:rPr>
-              <w:t>Qué hace</w:t>
-            </w:r>
-          </w:p>
-        </w:tc>
-      </w:tr>
-      <w:tr>
-        <w:tc>
-          <w:tcPr>
-            <w:tcW w:type="dxa" w:w="3118"/>
-          </w:tcPr>
-          <w:p>
-            <w:r>
-              <w:t>Columna izquierda</w:t>
-            </w:r>
-          </w:p>
-        </w:tc>
-        <w:tc>
-          <w:tcPr>
-            <w:tcW w:type="dxa" w:w="6520"/>
-          </w:tcPr>
-          <w:p>
-            <w:r>
-              <w:t>La venta: sus líneas, los totales y el botón Cobrar. Al tocar el encabezado se abre cliente y comprobante.</w:t>
-            </w:r>
-          </w:p>
-        </w:tc>
-      </w:tr>
-      <w:tr>
-        <w:tc>
-          <w:tcPr>
-            <w:tcW w:type="dxa" w:w="3118"/>
-          </w:tcPr>
-          <w:p>
-            <w:r>
-              <w:t>Tocar una línea</w:t>
-            </w:r>
-          </w:p>
-        </w:tc>
-        <w:tc>
-          <w:tcPr>
-            <w:tcW w:type="dxa" w:w="6520"/>
-          </w:tcPr>
-          <w:p>
-            <w:r>
-              <w:t>La selecciona; con los botones de abajo se cambia la cantidad o se quita (la de quitar pide autorización).</w:t>
-            </w:r>
-          </w:p>
-        </w:tc>
-      </w:tr>
-      <w:tr>
-        <w:tc>
-          <w:tcPr>
-            <w:tcW w:type="dxa" w:w="3118"/>
-          </w:tcPr>
-          <w:p>
-            <w:r>
-              <w:t>Buscador (arriba a la derecha)</w:t>
-            </w:r>
-          </w:p>
-        </w:tc>
-        <w:tc>
-          <w:tcPr>
-            <w:tcW w:type="dxa" w:w="6520"/>
-          </w:tcPr>
-          <w:p>
-            <w:r>
-              <w:t>Busca por descripción o por código lo que no está en los mosaicos.</w:t>
-            </w:r>
-          </w:p>
-        </w:tc>
-      </w:tr>
-      <w:tr>
-        <w:tc>
-          <w:tcPr>
-            <w:tcW w:type="dxa" w:w="3118"/>
-          </w:tcPr>
-          <w:p>
-            <w:r>
-              <w:t>Pestañas de departamento y categoría</w:t>
-            </w:r>
-          </w:p>
-        </w:tc>
-        <w:tc>
-          <w:tcPr>
-            <w:tcW w:type="dxa" w:w="6520"/>
-          </w:tcPr>
-          <w:p>
-            <w:r>
-              <w:t>Filtran los mosaicos, como las secciones de un menú.</w:t>
-            </w:r>
-          </w:p>
-        </w:tc>
-      </w:tr>
-      <w:tr>
-        <w:tc>
-          <w:tcPr>
-            <w:tcW w:type="dxa" w:w="3118"/>
-          </w:tcPr>
-          <w:p>
-            <w:r>
-              <w:t>Mosaicos</w:t>
-            </w:r>
-          </w:p>
-        </w:tc>
-        <w:tc>
-          <w:tcPr>
-            <w:tcW w:type="dxa" w:w="6520"/>
-          </w:tcPr>
-          <w:p>
-            <w:r>
-              <w:t>Un toque agrega el artículo con su imagen y su precio. Aparecen los artículos marcados para el catálogo.</w:t>
-            </w:r>
-          </w:p>
-        </w:tc>
-      </w:tr>
-      <w:tr>
-        <w:tc>
-          <w:tcPr>
-            <w:tcW w:type="dxa" w:w="3118"/>
-          </w:tcPr>
-          <w:p>
-            <w:r>
-              <w:t>Barra de abajo</w:t>
-            </w:r>
-          </w:p>
-        </w:tc>
-        <w:tc>
-          <w:tcPr>
-            <w:tcW w:type="dxa" w:w="6520"/>
-          </w:tcPr>
-          <w:p>
-            <w:r>
-              <w:t>Cliente, consulta de precio, facturas en espera, devoluciones y la vuelta a la pantalla con lector.</w:t>
-            </w:r>
-          </w:p>
-        </w:tc>
-      </w:tr>
-    </w:tbl>
-    <w:p/>
-    <w:p>
-      <w:r>
-        <w:rPr>
-          <w:i/>
-          <w:color w:val="2E7D32"/>
-        </w:rPr>
-        <w:t>Los artículos que se pesan o que piden serial se atienden mejor en la pantalla con lector; desde el mostrador se agrega una unidad y luego se ajusta la cantidad.</w:t>
-      </w:r>
-    </w:p>
-    <w:p>
-      <w:pPr>
-        <w:pStyle w:val="Heading2"/>
-      </w:pPr>
-      <w:r>
-        <w:t>3.5. La pantalla de venta</w:t>
+        <w:t>3.4. La pantalla de ventas principal</w:t>
       </w:r>
     </w:p>
     <w:p>
@@ -4569,6 +4403,209 @@
       </w:tr>
     </w:tbl>
     <w:p/>
+    <w:p>
+      <w:pPr>
+        <w:pStyle w:val="Heading2"/>
+      </w:pPr>
+      <w:r>
+        <w:t>3.5. La pantalla de ventas secundaria</w:t>
+      </w:r>
+    </w:p>
+    <w:p>
+      <w:r>
+        <w:t>La caja tiene tres pantallas, cada una en su monitor: la de ventas principal (con lector y teclado), la de ventas secundaria (táctil, con el catálogo en mosaicos, como el mostrador de una cafetería) y la del cliente. Las abre el equipo al encenderse; no hay que navegar de una a otra.</w:t>
+      </w:r>
+    </w:p>
+    <w:p>
+      <w:r>
+        <w:t>La pantalla de ventas secundaria trabaja la misma venta que la principal: lo que se agrega en una aparece en la otra al instante, y se cobra desde cualquiera de las dos.</w:t>
+      </w:r>
+    </w:p>
+    <w:tbl>
+      <w:tblPr>
+        <w:tblStyle w:val="TableGrid"/>
+        <w:tblW w:type="auto" w:w="0"/>
+        <w:tblLook w:firstColumn="1" w:firstRow="1" w:lastColumn="0" w:lastRow="0" w:noHBand="0" w:noVBand="1" w:val="04A0"/>
+      </w:tblPr>
+      <w:tblGrid>
+        <w:gridCol w:w="4759"/>
+        <w:gridCol w:w="4759"/>
+      </w:tblGrid>
+      <w:tr>
+        <w:tc>
+          <w:tcPr>
+            <w:tcW w:type="dxa" w:w="3118"/>
+          </w:tcPr>
+          <w:p>
+            <w:r/>
+            <w:r>
+              <w:rPr>
+                <w:b/>
+                <w:color w:val="1B4D3E"/>
+              </w:rPr>
+              <w:t>Parte de la pantalla</w:t>
+            </w:r>
+          </w:p>
+        </w:tc>
+        <w:tc>
+          <w:tcPr>
+            <w:tcW w:type="dxa" w:w="6520"/>
+          </w:tcPr>
+          <w:p>
+            <w:r/>
+            <w:r>
+              <w:rPr>
+                <w:b/>
+                <w:color w:val="1B4D3E"/>
+              </w:rPr>
+              <w:t>Qué hace</w:t>
+            </w:r>
+          </w:p>
+        </w:tc>
+      </w:tr>
+      <w:tr>
+        <w:tc>
+          <w:tcPr>
+            <w:tcW w:type="dxa" w:w="3118"/>
+          </w:tcPr>
+          <w:p>
+            <w:r>
+              <w:t>Columna izquierda</w:t>
+            </w:r>
+          </w:p>
+        </w:tc>
+        <w:tc>
+          <w:tcPr>
+            <w:tcW w:type="dxa" w:w="6520"/>
+          </w:tcPr>
+          <w:p>
+            <w:r>
+              <w:t>La venta: sus líneas, los totales y el botón Cobrar. Al tocar el encabezado se abre cliente y comprobante.</w:t>
+            </w:r>
+          </w:p>
+        </w:tc>
+      </w:tr>
+      <w:tr>
+        <w:tc>
+          <w:tcPr>
+            <w:tcW w:type="dxa" w:w="3118"/>
+          </w:tcPr>
+          <w:p>
+            <w:r>
+              <w:t>Tocar una línea</w:t>
+            </w:r>
+          </w:p>
+        </w:tc>
+        <w:tc>
+          <w:tcPr>
+            <w:tcW w:type="dxa" w:w="6520"/>
+          </w:tcPr>
+          <w:p>
+            <w:r>
+              <w:t>La selecciona; con los botones de abajo se cambia la cantidad o se quita (la de quitar pide autorización).</w:t>
+            </w:r>
+          </w:p>
+        </w:tc>
+      </w:tr>
+      <w:tr>
+        <w:tc>
+          <w:tcPr>
+            <w:tcW w:type="dxa" w:w="3118"/>
+          </w:tcPr>
+          <w:p>
+            <w:r>
+              <w:t>Buscador (arriba a la derecha)</w:t>
+            </w:r>
+          </w:p>
+        </w:tc>
+        <w:tc>
+          <w:tcPr>
+            <w:tcW w:type="dxa" w:w="6520"/>
+          </w:tcPr>
+          <w:p>
+            <w:r>
+              <w:t>Busca por descripción o por código lo que no está en los mosaicos.</w:t>
+            </w:r>
+          </w:p>
+        </w:tc>
+      </w:tr>
+      <w:tr>
+        <w:tc>
+          <w:tcPr>
+            <w:tcW w:type="dxa" w:w="3118"/>
+          </w:tcPr>
+          <w:p>
+            <w:r>
+              <w:t>Pestañas de departamento y categoría</w:t>
+            </w:r>
+          </w:p>
+        </w:tc>
+        <w:tc>
+          <w:tcPr>
+            <w:tcW w:type="dxa" w:w="6520"/>
+          </w:tcPr>
+          <w:p>
+            <w:r>
+              <w:t>Filtran los mosaicos, como las secciones de un menú.</w:t>
+            </w:r>
+          </w:p>
+        </w:tc>
+      </w:tr>
+      <w:tr>
+        <w:tc>
+          <w:tcPr>
+            <w:tcW w:type="dxa" w:w="3118"/>
+          </w:tcPr>
+          <w:p>
+            <w:r>
+              <w:t>Mosaicos</w:t>
+            </w:r>
+          </w:p>
+        </w:tc>
+        <w:tc>
+          <w:tcPr>
+            <w:tcW w:type="dxa" w:w="6520"/>
+          </w:tcPr>
+          <w:p>
+            <w:r>
+              <w:t>Un toque agrega el artículo con su imagen y su precio. Aparecen los artículos marcados para el catálogo.</w:t>
+            </w:r>
+          </w:p>
+        </w:tc>
+      </w:tr>
+      <w:tr>
+        <w:tc>
+          <w:tcPr>
+            <w:tcW w:type="dxa" w:w="3118"/>
+          </w:tcPr>
+          <w:p>
+            <w:r>
+              <w:t>Barra de abajo</w:t>
+            </w:r>
+          </w:p>
+        </w:tc>
+        <w:tc>
+          <w:tcPr>
+            <w:tcW w:type="dxa" w:w="6520"/>
+          </w:tcPr>
+          <w:p>
+            <w:r>
+              <w:t>Cliente, consulta de precio, facturas en espera y devoluciones.</w:t>
+            </w:r>
+          </w:p>
+        </w:tc>
+      </w:tr>
+    </w:tbl>
+    <w:p/>
+    <w:p>
+      <w:r>
+        <w:rPr>
+          <w:i/>
+          <w:color w:val="2E7D32"/>
+        </w:rPr>
+        <w:t>Los artículos que se pesan o que piden serial se atienden mejor en la pantalla principal; desde la secundaria se agrega una unidad y luego se ajusta la cantidad.</w:t>
+      </w:r>
+    </w:p>
     <w:p>
       <w:pPr>
         <w:pStyle w:val="Heading2"/>

</xml_diff>

<commit_message>
fix: El ingreso de la caja recuerda la pantalla (principal, secundaria, devoluciones o despacho)
</commit_message>
<xml_diff>
--- a/scripts/manual/Manual de usuario CG-POS.docx
+++ b/scripts/manual/Manual de usuario CG-POS.docx
@@ -232,7 +232,7 @@
           </w:tcPr>
           <w:p>
             <w:r>
-              <w:t>http://localhost:5180/</w:t>
+              <w:t>http://localhost:5180/ingreso?pantalla=principal</w:t>
             </w:r>
           </w:p>
         </w:tc>
@@ -264,7 +264,7 @@
           </w:tcPr>
           <w:p>
             <w:r>
-              <w:t>http://localhost:5180/venta-secundaria</w:t>
+              <w:t>http://localhost:5180/ingreso?pantalla=secundaria</w:t>
             </w:r>
           </w:p>
         </w:tc>
@@ -306,7 +306,7 @@
           </w:tcPr>
           <w:p>
             <w:r>
-              <w:t>El cliente la ve</w:t>
+              <w:t>El cliente la ve (no pide usuario)</w:t>
             </w:r>
           </w:p>
         </w:tc>
@@ -328,7 +328,7 @@
           </w:tcPr>
           <w:p>
             <w:r>
-              <w:t>http://localhost:5180/devoluciones</w:t>
+              <w:t>http://localhost:5180/ingreso?pantalla=devoluciones</w:t>
             </w:r>
           </w:p>
         </w:tc>
@@ -360,7 +360,7 @@
           </w:tcPr>
           <w:p>
             <w:r>
-              <w:t>http://localhost:5180/despacho</w:t>
+              <w:t>http://localhost:5180/ingreso?pantalla=despacho</w:t>
             </w:r>
           </w:p>
         </w:tc>
@@ -383,7 +383,7 @@
           <w:i/>
           <w:color w:val="2E7D32"/>
         </w:rPr>
-        <w:t>Las pantallas de la caja se abren solas al encender el equipo, cada una en su monitor, con el acceso directo que deja instalado el técnico. Ninguna lleva a otra: cada monitor muestra siempre la suya.</w:t>
+        <w:t>Las pantallas de la caja se abren solas al encender el equipo, cada una en su monitor, con el acceso directo que deja instalado el técnico. Ninguna lleva a otra: cada monitor muestra siempre la suya. Cada dirección pide el usuario y, al entrar, abre su pantalla; la del cliente no pide usuario.</w:t>
       </w:r>
     </w:p>
     <w:p>
@@ -663,7 +663,16 @@
         <w:pStyle w:val="ListNumber"/>
       </w:pPr>
       <w:r>
-        <w:t>Ese mismo script deja lo mínimo para arrancar: el usuario administrador, los parámetros del negocio con valores razonables y los catálogos que son iguales en cualquier negocio dominicano.</w:t>
+        <w:t>Ese mismo script deja lo mínimo para arrancar: la empresa, el usuario administrador, los parámetros del negocio con valores razonables y los catálogos que son iguales en cualquier negocio dominicano.</w:t>
+      </w:r>
+    </w:p>
+    <w:p>
+      <w:r>
+        <w:rPr>
+          <w:i/>
+          <w:color w:val="2E7D32"/>
+        </w:rPr>
+        <w:t>Antes de ejecutar el script en el servidor de la empresa, revise en él el RNC: es el que sale en las facturas y ante la DGII, y después no se puede cambiar desde el Central. La razón social, el nombre comercial, la dirección y el teléfono sí se corrigen luego en Organización → Empresa.</w:t>
       </w:r>
     </w:p>
     <w:tbl>
@@ -725,7 +734,7 @@
           </w:tcPr>
           <w:p>
             <w:r>
-              <w:t>Empresa, sucursales y cajas</w:t>
+              <w:t>Sucursales y cajas</w:t>
             </w:r>
           </w:p>
         </w:tc>
@@ -737,7 +746,7 @@
           </w:tcPr>
           <w:p>
             <w:r>
-              <w:t>Parámetros con valores de arranque (plazos, topes, fidelidad, cuadre…)</w:t>
+              <w:t>La empresa, con su RNC (revíselo antes de instalar)</w:t>
             </w:r>
           </w:p>
         </w:tc>
@@ -747,7 +756,7 @@
           </w:tcPr>
           <w:p>
             <w:r>
-              <w:t>Departamentos, categorías y marcas</w:t>
+              <w:t>Usuarios y roles de caja</w:t>
             </w:r>
           </w:p>
         </w:tc>
@@ -759,7 +768,7 @@
           </w:tcPr>
           <w:p>
             <w:r>
-              <w:t>Monedas: peso dominicano y dólar</w:t>
+              <w:t>Parámetros con valores de arranque (plazos, topes, fidelidad, cuadre…)</w:t>
             </w:r>
           </w:p>
         </w:tc>
@@ -768,9 +777,7 @@
             <w:tcW w:type="dxa" w:w="4819"/>
           </w:tcPr>
           <w:p>
-            <w:r>
-              <w:t>Artículos y sus precios</w:t>
-            </w:r>
+            <w:r/>
           </w:p>
         </w:tc>
       </w:tr>
@@ -781,7 +788,7 @@
           </w:tcPr>
           <w:p>
             <w:r>
-              <w:t>Impuestos: ITBIS 18 %, 16 %, 0 % y exento</w:t>
+              <w:t>Monedas: peso dominicano y dólar</w:t>
             </w:r>
           </w:p>
         </w:tc>
@@ -791,7 +798,7 @@
           </w:tcPr>
           <w:p>
             <w:r>
-              <w:t>Clientes</w:t>
+              <w:t>Departamentos, categorías y marcas</w:t>
             </w:r>
           </w:p>
         </w:tc>
@@ -803,7 +810,7 @@
           </w:tcPr>
           <w:p>
             <w:r>
-              <w:t>Unidades de medida: unidad, libra, pie, yarda, galón</w:t>
+              <w:t>Impuestos: ITBIS 18 %, 16 %, 0 % y exento</w:t>
             </w:r>
           </w:p>
         </w:tc>
@@ -813,7 +820,7 @@
           </w:tcPr>
           <w:p>
             <w:r>
-              <w:t>Bancos y almacenes</w:t>
+              <w:t>Artículos y sus precios</w:t>
             </w:r>
           </w:p>
         </w:tc>
@@ -825,7 +832,7 @@
           </w:tcPr>
           <w:p>
             <w:r>
-              <w:t>Denominaciones de billetes y monedas, para el cuadre</w:t>
+              <w:t>Unidades de medida: unidad, libra, pie, yarda, galón</w:t>
             </w:r>
           </w:p>
         </w:tc>
@@ -835,7 +842,7 @@
           </w:tcPr>
           <w:p>
             <w:r>
-              <w:t>Promociones</w:t>
+              <w:t>Clientes</w:t>
             </w:r>
           </w:p>
         </w:tc>
@@ -847,7 +854,7 @@
           </w:tcPr>
           <w:p>
             <w:r>
-              <w:t>Formas de pago: efectivo, tarjeta, transferencia, cheque, dólares, nota de crédito, bonos, puntos…</w:t>
+              <w:t>Denominaciones de billetes y monedas, para el cuadre</w:t>
             </w:r>
           </w:p>
         </w:tc>
@@ -857,7 +864,7 @@
           </w:tcPr>
           <w:p>
             <w:r>
-              <w:t>Rangos de comprobantes fiscales</w:t>
+              <w:t>Bancos y almacenes</w:t>
             </w:r>
           </w:p>
         </w:tc>
@@ -869,6 +876,28 @@
           </w:tcPr>
           <w:p>
             <w:r>
+              <w:t>Formas de pago: efectivo, tarjeta, transferencia, cheque, dólares, nota de crédito, bonos, puntos…</w:t>
+            </w:r>
+          </w:p>
+        </w:tc>
+        <w:tc>
+          <w:tcPr>
+            <w:tcW w:type="dxa" w:w="4819"/>
+          </w:tcPr>
+          <w:p>
+            <w:r>
+              <w:t>Promociones</w:t>
+            </w:r>
+          </w:p>
+        </w:tc>
+      </w:tr>
+      <w:tr>
+        <w:tc>
+          <w:tcPr>
+            <w:tcW w:type="dxa" w:w="4819"/>
+          </w:tcPr>
+          <w:p>
+            <w:r>
               <w:t>Tipos de tarjeta y motivos de descuento y de devolución</w:t>
             </w:r>
           </w:p>
@@ -879,7 +908,7 @@
           </w:tcPr>
           <w:p>
             <w:r>
-              <w:t>Usuarios y roles de caja</w:t>
+              <w:t>Rangos de comprobantes fiscales</w:t>
             </w:r>
           </w:p>
         </w:tc>
@@ -1095,7 +1124,7 @@
           </w:tcPr>
           <w:p>
             <w:r>
-              <w:t>Empresa, sucursal y caja</w:t>
+              <w:t>Sucursal y caja</w:t>
             </w:r>
           </w:p>
         </w:tc>
@@ -1115,7 +1144,7 @@
           </w:tcPr>
           <w:p>
             <w:r>
-              <w:t>La caja se identifica por su sucursal y su número; sin eso no se conecta.</w:t>
+              <w:t>La caja se identifica por su sucursal y su número; sin eso no se conecta. La empresa ya viene creada: revise sus datos.</w:t>
             </w:r>
           </w:p>
         </w:tc>

</xml_diff>

<commit_message>
feat(auditoria): Implementar funcionalidad de auditoría en el sistema
- Se agregaron configuraciones para la auditoría de cambios en las entidades de la base de datos.
- Se creó un servicio para consultar registros de auditoría, incluyendo filtros por fecha, acción, entidad y usuario.
- Se implementó la lógica para registrar cambios en los campos de las entidades afectadas.
- Se desarrolló una API para exponer los registros de auditoría y sus opciones de filtrado.
- Se creó una interfaz de usuario en Blazor para visualizar los registros de auditoría, permitiendo la paginación y filtrado.
- Se aseguraron las pruebas para validar el correcto funcionamiento de la auditoría y su acceso controlado.
</commit_message>
<xml_diff>
--- a/scripts/manual/Manual de usuario CG-POS.docx
+++ b/scripts/manual/Manual de usuario CG-POS.docx
@@ -672,7 +672,7 @@
           <w:i/>
           <w:color w:val="2E7D32"/>
         </w:rPr>
-        <w:t>Antes de ejecutar el script en el servidor de la empresa, revise en él el RNC: es el que sale en las facturas y ante la DGII, y después no se puede cambiar desde el Central. La razón social, el nombre comercial, la dirección y el teléfono sí se corrigen luego en Organización → Empresa.</w:t>
+        <w:t>El RNC que trae el script es un marcador: lo primero que debe hacer al entrar al Central es corregirlo en Organización → Empresa, junto con la razón social, el nombre comercial, la dirección y el teléfono. Es el dato que sale en las facturas y ante la DGII. Se admite un RNC de 9 dígitos o una cédula de 11, si quien factura es una persona física; el sistema le valida el dígito verificador.</w:t>
       </w:r>
     </w:p>
     <w:tbl>
@@ -746,7 +746,7 @@
           </w:tcPr>
           <w:p>
             <w:r>
-              <w:t>La empresa, con su RNC (revíselo antes de instalar)</w:t>
+              <w:t>La empresa, con un RNC de marcador que usted corrige al entrar</w:t>
             </w:r>
           </w:p>
         </w:tc>
@@ -1124,6 +1124,38 @@
           </w:tcPr>
           <w:p>
             <w:r>
+              <w:t>Datos de la empresa</w:t>
+            </w:r>
+          </w:p>
+        </w:tc>
+        <w:tc>
+          <w:tcPr>
+            <w:tcW w:type="dxa" w:w="2721"/>
+          </w:tcPr>
+          <w:p>
+            <w:r>
+              <w:t>Organización → Empresa</w:t>
+            </w:r>
+          </w:p>
+        </w:tc>
+        <w:tc>
+          <w:tcPr>
+            <w:tcW w:type="dxa" w:w="4535"/>
+          </w:tcPr>
+          <w:p>
+            <w:r>
+              <w:t>El RNC (o la cédula) y la razón social con los que se factura. El script los siembra como marcador: corríjalos antes de emitir el primer comprobante.</w:t>
+            </w:r>
+          </w:p>
+        </w:tc>
+      </w:tr>
+      <w:tr>
+        <w:tc>
+          <w:tcPr>
+            <w:tcW w:type="dxa" w:w="2381"/>
+          </w:tcPr>
+          <w:p>
+            <w:r>
               <w:t>Sucursal y caja</w:t>
             </w:r>
           </w:p>
@@ -1144,7 +1176,7 @@
           </w:tcPr>
           <w:p>
             <w:r>
-              <w:t>La caja se identifica por su sucursal y su número; sin eso no se conecta. La empresa ya viene creada: revise sus datos.</w:t>
+              <w:t>La caja se identifica por su sucursal y su número; sin eso no se conecta.</w:t>
             </w:r>
           </w:p>
         </w:tc>
@@ -1445,7 +1477,7 @@
           </w:tcPr>
           <w:p>
             <w:r>
-              <w:t>Datos fiscales de la empresa (el RNC no se cambia).</w:t>
+              <w:t>Datos fiscales de la empresa, el RNC incluido: RNC de 9 dígitos o cédula de 11. Los comprobantes ya emitidos conservan el que llevaban y el cambio queda en la auditoría.</w:t>
             </w:r>
           </w:p>
         </w:tc>
@@ -1605,12 +1637,188 @@
       </w:r>
     </w:p>
     <w:p>
+      <w:pPr>
+        <w:pStyle w:val="ListBullet"/>
+      </w:pPr>
+      <w:r>
+        <w:t>Auditoría (/seguridad/auditoria): todo lo que se ha hecho en el Central, con el valor que tenía antes y el que quedó después de cada campo que cambió.</w:t>
+      </w:r>
+    </w:p>
+    <w:p>
       <w:r>
         <w:rPr>
           <w:i/>
           <w:color w:val="2E7D32"/>
         </w:rPr>
         <w:t>El nivel se usa para las autorizaciones: un descuento que pasa el tope de un supervisor pide la clave de alguien de nivel superior.</w:t>
+      </w:r>
+    </w:p>
+    <w:p>
+      <w:pPr>
+        <w:pStyle w:val="Heading3"/>
+      </w:pPr>
+      <w:r>
+        <w:t>2.4.1. Auditoría: el antes y el después</w:t>
+      </w:r>
+    </w:p>
+    <w:p>
+      <w:r>
+        <w:t>Cada vez que alguien guarda algo en el Central, el sistema anota qué se hizo, quién lo hizo, cuándo, con qué motivo y, campo por campo, qué valor había antes y cuál quedó después. No hay que activar nada: se anota solo. Los movimientos no se editan ni se borran desde la aplicación.</w:t>
+      </w:r>
+    </w:p>
+    <w:tbl>
+      <w:tblPr>
+        <w:tblStyle w:val="TableGrid"/>
+        <w:tblW w:type="auto" w:w="0"/>
+        <w:tblLook w:firstColumn="1" w:firstRow="1" w:lastColumn="0" w:lastRow="0" w:noHBand="0" w:noVBand="1" w:val="04A0"/>
+      </w:tblPr>
+      <w:tblGrid>
+        <w:gridCol w:w="4759"/>
+        <w:gridCol w:w="4759"/>
+      </w:tblGrid>
+      <w:tr>
+        <w:tc>
+          <w:tcPr>
+            <w:tcW w:type="dxa" w:w="1984"/>
+          </w:tcPr>
+          <w:p>
+            <w:r/>
+            <w:r>
+              <w:rPr>
+                <w:b/>
+                <w:color w:val="1B4D3E"/>
+              </w:rPr>
+              <w:t>Columna</w:t>
+            </w:r>
+          </w:p>
+        </w:tc>
+        <w:tc>
+          <w:tcPr>
+            <w:tcW w:type="dxa" w:w="5953"/>
+          </w:tcPr>
+          <w:p>
+            <w:r/>
+            <w:r>
+              <w:rPr>
+                <w:b/>
+                <w:color w:val="1B4D3E"/>
+              </w:rPr>
+              <w:t>Qué muestra</w:t>
+            </w:r>
+          </w:p>
+        </w:tc>
+      </w:tr>
+      <w:tr>
+        <w:tc>
+          <w:tcPr>
+            <w:tcW w:type="dxa" w:w="1984"/>
+          </w:tcPr>
+          <w:p>
+            <w:r>
+              <w:t>Cuándo</w:t>
+            </w:r>
+          </w:p>
+        </w:tc>
+        <w:tc>
+          <w:tcPr>
+            <w:tcW w:type="dxa" w:w="5953"/>
+          </w:tcPr>
+          <w:p>
+            <w:r>
+              <w:t>Fecha y hora del movimiento, en la hora del servidor donde se consulta.</w:t>
+            </w:r>
+          </w:p>
+        </w:tc>
+      </w:tr>
+      <w:tr>
+        <w:tc>
+          <w:tcPr>
+            <w:tcW w:type="dxa" w:w="1984"/>
+          </w:tcPr>
+          <w:p>
+            <w:r>
+              <w:t>Acción</w:t>
+            </w:r>
+          </w:p>
+        </w:tc>
+        <w:tc>
+          <w:tcPr>
+            <w:tcW w:type="dxa" w:w="5953"/>
+          </w:tcPr>
+          <w:p>
+            <w:r>
+              <w:t>Qué se hizo (por ejemplo, actualizar la empresa), sobre qué entidad y con qué motivo, si lo lleva.</w:t>
+            </w:r>
+          </w:p>
+        </w:tc>
+      </w:tr>
+      <w:tr>
+        <w:tc>
+          <w:tcPr>
+            <w:tcW w:type="dxa" w:w="1984"/>
+          </w:tcPr>
+          <w:p>
+            <w:r>
+              <w:t>Usuario</w:t>
+            </w:r>
+          </w:p>
+        </w:tc>
+        <w:tc>
+          <w:tcPr>
+            <w:tcW w:type="dxa" w:w="5953"/>
+          </w:tcPr>
+          <w:p>
+            <w:r>
+              <w:t>Quién lo hizo y, en las operaciones que la piden, quién la autorizó.</w:t>
+            </w:r>
+          </w:p>
+        </w:tc>
+      </w:tr>
+      <w:tr>
+        <w:tc>
+          <w:tcPr>
+            <w:tcW w:type="dxa" w:w="1984"/>
+          </w:tcPr>
+          <w:p>
+            <w:r>
+              <w:t>Qué cambió</w:t>
+            </w:r>
+          </w:p>
+        </w:tc>
+        <w:tc>
+          <w:tcPr>
+            <w:tcW w:type="dxa" w:w="5953"/>
+          </w:tcPr>
+          <w:p>
+            <w:r>
+              <w:t>Cada campo con su valor anterior (tachado) y el que quedó. Una creación no tiene valor anterior y una eliminación no tiene valor nuevo.</w:t>
+            </w:r>
+          </w:p>
+        </w:tc>
+      </w:tr>
+    </w:tbl>
+    <w:p/>
+    <w:p>
+      <w:r>
+        <w:t>Los filtros de arriba acotan la búsqueda: rango de fechas, acción, entidad, usuario, un texto libre (busca también dentro de los valores que cambiaron) y el interruptor «Solo cambios de datos», que deja fuera los ingresos y las consultas. Abajo se elige el tamaño de página (10, 25, 50, 100 o 200) y se pasa de una página a otra; el Central envía solo la página que se está viendo, así que la consulta es rápida aunque haya años de movimientos.</w:t>
+      </w:r>
+    </w:p>
+    <w:p>
+      <w:r>
+        <w:rPr>
+          <w:i/>
+          <w:color w:val="2E7D32"/>
+        </w:rPr>
+        <w:t>Las contraseñas, los certificados y las firmas se anotan como cambiados, pero su contenido nunca se muestra: en su lugar aparece «(oculto)».</w:t>
+      </w:r>
+    </w:p>
+    <w:p>
+      <w:r>
+        <w:rPr>
+          <w:i/>
+          <w:color w:val="2E7D32"/>
+        </w:rPr>
+        <w:t>Para entrar a esta pantalla hace falta el permiso «Consultar la auditoría del Central y de las cajas». Se puede dar a contabilidad o a auditoría sin darles permiso para administrar nada.</w:t>
       </w:r>
     </w:p>
     <w:p>

</xml_diff>

<commit_message>
Refactor client validation and improve error messages in sales service; update client dialog and return screen for better clarity; remove DGII contributor table and related sequence from database.
</commit_message>
<xml_diff>
--- a/scripts/manual/Manual de usuario CG-POS.docx
+++ b/scripts/manual/Manual de usuario CG-POS.docx
@@ -200,7 +200,7 @@
           </w:tcPr>
           <w:p>
             <w:r>
-              <w:t>La dirección del servidor + /chequeador</w:t>
+              <w:t>La dirección del servidor + /chequeador/01, con el código de la sucursal al final</w:t>
             </w:r>
           </w:p>
         </w:tc>
@@ -8361,7 +8361,7 @@
     </w:p>
     <w:p>
       <w:r>
-        <w:t>Ruta: /chequeador, en la pantalla que se pone en el pasillo de la tienda. El cliente pasa el producto por el lector y ve la descripción, el precio grande, el precio por cantidad y las ofertas vigentes; la consulta se borra sola a los pocos segundos para el siguiente cliente.</w:t>
+        <w:t>Ruta: /chequeador/01, donde 01 es el código de la sucursal, en la pantalla que se pone en el pasillo de la tienda. Tecnología deja cada pantalla con la dirección de su sucursal, así el cliente nunca elige sucursal y siempre ve el precio y las ofertas de la tienda donde está parado. El cliente pasa el producto por el lector y ve la descripción, el precio grande, el precio por cantidad y las ofertas vigentes; la consulta se borra sola a los pocos segundos para el siguiente cliente.</w:t>
       </w:r>
     </w:p>
     <w:p>
@@ -9288,7 +9288,7 @@
     </w:p>
     <w:p>
       <w:r>
-        <w:t>Se digita la cédula o el RNC; el sistema lo busca en el padrón de la DGII y en los clientes registrados. Si no aparece, se digita el nombre. El tipo de comprobante sale del cliente y cambiarlo a mano requiere permiso.</w:t>
+        <w:t>Se digita la cédula o el RNC; la caja lo busca en los clientes, que bajan del Central. Si no aparece, se digita el nombre. El tipo de comprobante sale del cliente y cambiarlo a mano requiere permiso.</w:t>
       </w:r>
     </w:p>
     <w:tbl>

</xml_diff>

<commit_message>
feat: Actualizar manual de usuario con información sobre sucursales inactivas y mejorar la visualización de errores en la pantalla del chequeador
</commit_message>
<xml_diff>
--- a/scripts/manual/Manual de usuario CG-POS.docx
+++ b/scripts/manual/Manual de usuario CG-POS.docx
@@ -8371,6 +8371,15 @@
           <w:color w:val="2E7D32"/>
         </w:rPr>
         <w:t>El chequeador viene apagado: se enciende en Parámetros, con Central.Chequeador.Habilitado.</w:t>
+      </w:r>
+    </w:p>
+    <w:p>
+      <w:r>
+        <w:rPr>
+          <w:i/>
+          <w:color w:val="2E7D32"/>
+        </w:rPr>
+        <w:t>Si la dirección trae un código de sucursal que no existe o está inactiva, la pantalla dice «Página no encontrada» y no consulta nada: mostrar el precio de otra sucursal sería engañar al cliente.</w:t>
       </w:r>
     </w:p>
     <w:p>

</xml_diff>

<commit_message>
Implementación del enrolamiento de cajas en el sistema Central
- Se añade la clase ApiEnrolamientoPruebas para probar el flujo de enrolamiento de cajas.
- Se crea el script SQL para agregar las columnas necesarias y la tabla de solicitudes de enrolamiento en la base de datos.
- Se desarrolla la página de solicitudes de cajas en la interfaz de usuario, permitiendo a los administradores aceptar o rechazar solicitudes.
- Se define el modelo SolicitudEnrolamiento para manejar las solicitudes de enrolamiento de cajas.
- Se implementa la clase CredencialCaja para gestionar las credenciales de las cajas, incluyendo almacenamiento seguro y manejo de secretos.
</commit_message>
<xml_diff>
--- a/scripts/manual/Manual de usuario CG-POS.docx
+++ b/scripts/manual/Manual de usuario CG-POS.docx
@@ -1198,7 +1198,7 @@
           </w:tcPr>
           <w:p>
             <w:r>
-              <w:t>Organización → Cajas</w:t>
+              <w:t>Organización → Solicitudes de cajas</w:t>
             </w:r>
           </w:p>
         </w:tc>
@@ -1208,7 +1208,7 @@
           </w:tcPr>
           <w:p>
             <w:r>
-              <w:t>Es la clave con la que la caja se comunica con el Central.</w:t>
+              <w:t>La caja la pide al instalarse y usted la acepta. Nadie copia claves a mano.</w:t>
             </w:r>
           </w:p>
         </w:tc>
@@ -1541,7 +1541,39 @@
           </w:tcPr>
           <w:p>
             <w:r>
-              <w:t>Alta de cajas, habilitarlas y emitir la credencial con la que la caja se conecta al Central. El código también es de dos dígitos (01 a 99) y único dentro de su sucursal.</w:t>
+              <w:t>Alta de cajas, habilitarlas, ver a qué equipo está atada cada una y liberar el equipo cuando la caja se muda a otra máquina. El código también es de dos dígitos (01 a 99) y único dentro de su sucursal.</w:t>
+            </w:r>
+          </w:p>
+        </w:tc>
+      </w:tr>
+      <w:tr>
+        <w:tc>
+          <w:tcPr>
+            <w:tcW w:type="dxa" w:w="2154"/>
+          </w:tcPr>
+          <w:p>
+            <w:r>
+              <w:t>Solicitudes de cajas</w:t>
+            </w:r>
+          </w:p>
+        </w:tc>
+        <w:tc>
+          <w:tcPr>
+            <w:tcW w:type="dxa" w:w="2835"/>
+          </w:tcPr>
+          <w:p>
+            <w:r>
+              <w:t>/organizacion/solicitudes-cajas</w:t>
+            </w:r>
+          </w:p>
+        </w:tc>
+        <w:tc>
+          <w:tcPr>
+            <w:tcW w:type="dxa" w:w="4649"/>
+          </w:tcPr>
+          <w:p>
+            <w:r>
+              <w:t>Cajas recién instaladas que piden entrar al Central. Al aceptar una se le entrega su credencial y queda atada a ese equipo.</w:t>
             </w:r>
           </w:p>
         </w:tc>
@@ -8413,7 +8445,7 @@
         <w:pStyle w:val="ListNumber"/>
       </w:pPr>
       <w:r>
-        <w:t>En el Central, cree la sucursal y la caja (Organización) y emita la credencial de esa caja. El secreto se muestra una sola vez: cópielo.</w:t>
+        <w:t>En el Central, cree la sucursal y la caja (Organización). No hay que emitir ninguna clave: la caja la pedirá sola.</w:t>
       </w:r>
     </w:p>
     <w:p>
@@ -8429,7 +8461,23 @@
         <w:pStyle w:val="ListNumber"/>
       </w:pPr>
       <w:r>
-        <w:t>Instale el programa de la caja con scripts/caja/instalar-caja.ps1, indicando el número de sucursal, el de caja, el secreto que copió y la dirección del Central.</w:t>
+        <w:t>Instale el programa de la caja con scripts/caja/instalar-caja.ps1, indicando el número de sucursal, el de caja y la dirección del Central. No se le pide ninguna clave.</w:t>
+      </w:r>
+    </w:p>
+    <w:p>
+      <w:pPr>
+        <w:pStyle w:val="ListNumber"/>
+      </w:pPr>
+      <w:r>
+        <w:t>Arranque la caja. Al no tener credencial, se anuncia al Central y queda esperando; en su registro dirá que la solicitud quedó registrada.</w:t>
+      </w:r>
+    </w:p>
+    <w:p>
+      <w:pPr>
+        <w:pStyle w:val="ListNumber"/>
+      </w:pPr>
+      <w:r>
+        <w:t>En el Central, entre a Organización → Solicitudes de cajas, revise que el equipo que pide sea el que acaba de instalar (verá su nombre, su dirección y la hora) y acéptela. La caja recoge su credencial sola en el siguiente intento.</w:t>
       </w:r>
     </w:p>
     <w:p>
@@ -8445,7 +8493,7 @@
         <w:pStyle w:val="ListNumber"/>
       </w:pPr>
       <w:r>
-        <w:t>Arranque la caja: en el primer ciclo se conecta al Central y baja artículos, precios, usuarios, parámetros y sus rangos de comprobantes.</w:t>
+        <w:t>Ya con su credencial, la caja baja artículos, precios, usuarios, parámetros y sus rangos de comprobantes.</w:t>
       </w:r>
     </w:p>
     <w:p>
@@ -8455,6 +8503,70 @@
           <w:color w:val="2E7D32"/>
         </w:rPr>
         <w:t>Si la caja avisa que la base no existe o le faltan tablas, es que no se ejecutó el script en ese equipo.</w:t>
+      </w:r>
+    </w:p>
+    <w:p>
+      <w:r>
+        <w:rPr>
+          <w:i/>
+          <w:color w:val="2E7D32"/>
+        </w:rPr>
+        <w:t>La credencial queda guardada cifrada en ese equipo y solo sirve ahí: si alguien copia la configuración a otra máquina, el Central la rechaza y el intento queda registrado. Por eso, cuando una caja cambia de equipo, hay que usar «Liberar equipo».</w:t>
+      </w:r>
+    </w:p>
+    <w:p>
+      <w:pPr>
+        <w:pStyle w:val="Heading3"/>
+      </w:pPr>
+      <w:r>
+        <w:t>3.1.1. Cambiar una caja de equipo</w:t>
+      </w:r>
+    </w:p>
+    <w:p>
+      <w:r>
+        <w:t>El equipo de la caja se dañó, se reinstaló Windows o se reemplaza por otro. La caja es la misma; lo que cambia es la máquina.</w:t>
+      </w:r>
+    </w:p>
+    <w:p>
+      <w:pPr>
+        <w:pStyle w:val="ListNumber"/>
+      </w:pPr>
+      <w:r>
+        <w:t>En el Central, Organización → Cajas, en el menú de esa caja, elija «Liberar equipo» e indique el motivo. Queda registrado quién lo hizo.</w:t>
+      </w:r>
+    </w:p>
+    <w:p>
+      <w:pPr>
+        <w:pStyle w:val="ListNumber"/>
+      </w:pPr>
+      <w:r>
+        <w:t>Instale la caja en el equipo nuevo, con la misma sucursal y el mismo número.</w:t>
+      </w:r>
+    </w:p>
+    <w:p>
+      <w:pPr>
+        <w:pStyle w:val="ListNumber"/>
+      </w:pPr>
+      <w:r>
+        <w:t>Arránquela y acepte su solicitud en Solicitudes de cajas, comprobando que el equipo sea el que acaba de instalar.</w:t>
+      </w:r>
+    </w:p>
+    <w:p>
+      <w:r>
+        <w:rPr>
+          <w:i/>
+          <w:color w:val="2E7D32"/>
+        </w:rPr>
+        <w:t>Si el equipo se perdió o se lo robaron, en vez de liberar conviene revocar la credencial: así la anterior deja de servir aunque alguien tenga el equipo.</w:t>
+      </w:r>
+    </w:p>
+    <w:p>
+      <w:r>
+        <w:rPr>
+          <w:i/>
+          <w:color w:val="2E7D32"/>
+        </w:rPr>
+        <w:t>Si el técnico olvida liberar el equipo, la caja nueva no podrá comunicarse y su registro lo dirá con todas las letras: la credencial está atada a otro equipo. Nada se pierde: se libera y se acepta.</w:t>
       </w:r>
     </w:p>
     <w:p>
@@ -10151,7 +10263,7 @@
         <w:pStyle w:val="ListNumber"/>
       </w:pPr>
       <w:r>
-        <w:t>Revise Organización: cree la empresa, la sucursal y la caja, y emita la credencial de la caja.</w:t>
+        <w:t>Revise Organización: cree la empresa, la sucursal y la caja. La credencial la pedirá la caja al instalarse.</w:t>
       </w:r>
     </w:p>
     <w:p>
@@ -10215,7 +10327,15 @@
         <w:pStyle w:val="ListNumber"/>
       </w:pPr>
       <w:r>
-        <w:t>Cree la base de la caja con scripts/base-datos/pos/structura_base_datos.sql e instale la caja con su sucursal, su número y el secreto.</w:t>
+        <w:t>Cree la base de la caja con scripts/base-datos/pos/structura_base_datos.sql e instale la caja con su sucursal, su número y la dirección del Central.</w:t>
+      </w:r>
+    </w:p>
+    <w:p>
+      <w:pPr>
+        <w:pStyle w:val="ListNumber"/>
+      </w:pPr>
+      <w:r>
+        <w:t>Acepte la solicitud de esa caja en el Central (Organización → Solicitudes de cajas).</w:t>
       </w:r>
     </w:p>
     <w:p>

</xml_diff>

<commit_message>
feat: Los ritmos de la caja (sincronización, mantenimiento y respaldo) se configuran en el Central
</commit_message>
<xml_diff>
--- a/scripts/manual/Manual de usuario CG-POS.docx
+++ b/scripts/manual/Manual de usuario CG-POS.docx
@@ -1605,7 +1605,7 @@
           </w:tcPr>
           <w:p>
             <w:r>
-              <w:t>Todas las reglas del negocio: vigencia de notas de crédito, retención de la Ley 32-23, redondeo, fondo de caja, chequeador, listas de boda, fidelidad… Se pueden fijar en general, por sucursal o por caja.</w:t>
+              <w:t>Todas las reglas del negocio: vigencia de notas de crédito, retención de la Ley 32-23, redondeo, fondo de caja, chequeador, listas de boda, fidelidad, y también cada cuánto la caja sincroniza, se mantiene y respalda. Se pueden fijar en general, por sucursal o por caja.</w:t>
             </w:r>
           </w:p>
         </w:tc>
@@ -7115,6 +7115,15 @@
           <w:color w:val="2E7D32"/>
         </w:rPr>
         <w:t>Los parámetros obligatorios que no tengan valor se avisan arriba en la pantalla de Parámetros, y la operación que los necesita se rechaza hasta configurarlos.</w:t>
+      </w:r>
+    </w:p>
+    <w:p>
+      <w:r>
+        <w:rPr>
+          <w:i/>
+          <w:color w:val="2E7D32"/>
+        </w:rPr>
+        <w:t>En el módulo «Sincronización y mantenimiento» también se configura el ritmo de la caja: cada cuántos segundos sincroniza, cada cuánto baja los maestros, desde qué hora respalda y contra qué servidor verifica su reloj. Se leen en cada ciclo, así que cambiarlos aquí se nota en las cajas sin reinstalar ni reiniciar nada. Si no los configura, cada caja usa los valores con que fue instalada.</w:t>
       </w:r>
     </w:p>
     <w:p>

</xml_diff>

<commit_message>
feat: Añadir soporte para impresoras en Windows y mejorar documentación sobre configuración de impresoras
</commit_message>
<xml_diff>
--- a/scripts/manual/Manual de usuario CG-POS.docx
+++ b/scripts/manual/Manual de usuario CG-POS.docx
@@ -8528,7 +8528,194 @@
         <w:pStyle w:val="Heading3"/>
       </w:pPr>
       <w:r>
-        <w:t>3.1.1. Cambiar una caja de equipo</w:t>
+        <w:t>3.1.1. La impresora de tickets</w:t>
+      </w:r>
+    </w:p>
+    <w:p>
+      <w:r>
+        <w:t>La caja imprime en la impresora térmica del mostrador. Se indica una sola vez, al instalarla, y hay tres formas según cómo esté conectada:</w:t>
+      </w:r>
+    </w:p>
+    <w:tbl>
+      <w:tblPr>
+        <w:tblStyle w:val="TableGrid"/>
+        <w:tblW w:type="auto" w:w="0"/>
+        <w:tblLook w:firstColumn="1" w:firstRow="1" w:lastColumn="0" w:lastRow="0" w:noHBand="0" w:noVBand="1" w:val="04A0"/>
+      </w:tblPr>
+      <w:tblGrid>
+        <w:gridCol w:w="3173"/>
+        <w:gridCol w:w="3173"/>
+        <w:gridCol w:w="3173"/>
+      </w:tblGrid>
+      <w:tr>
+        <w:tc>
+          <w:tcPr>
+            <w:tcW w:type="dxa" w:w="1247"/>
+          </w:tcPr>
+          <w:p>
+            <w:r/>
+            <w:r>
+              <w:rPr>
+                <w:b/>
+                <w:color w:val="1B4D3E"/>
+              </w:rPr>
+              <w:t>Tipo</w:t>
+            </w:r>
+          </w:p>
+        </w:tc>
+        <w:tc>
+          <w:tcPr>
+            <w:tcW w:type="dxa" w:w="3969"/>
+          </w:tcPr>
+          <w:p>
+            <w:r/>
+            <w:r>
+              <w:rPr>
+                <w:b/>
+                <w:color w:val="1B4D3E"/>
+              </w:rPr>
+              <w:t>Cuándo se usa</w:t>
+            </w:r>
+          </w:p>
+        </w:tc>
+        <w:tc>
+          <w:tcPr>
+            <w:tcW w:type="dxa" w:w="4309"/>
+          </w:tcPr>
+          <w:p>
+            <w:r/>
+            <w:r>
+              <w:rPr>
+                <w:b/>
+                <w:color w:val="1B4D3E"/>
+              </w:rPr>
+              <w:t>Qué se indica</w:t>
+            </w:r>
+          </w:p>
+        </w:tc>
+      </w:tr>
+      <w:tr>
+        <w:tc>
+          <w:tcPr>
+            <w:tcW w:type="dxa" w:w="1247"/>
+          </w:tcPr>
+          <w:p>
+            <w:r>
+              <w:t>Windows</w:t>
+            </w:r>
+          </w:p>
+        </w:tc>
+        <w:tc>
+          <w:tcPr>
+            <w:tcW w:type="dxa" w:w="3969"/>
+          </w:tcPr>
+          <w:p>
+            <w:r>
+              <w:t>La impresora está instalada en el equipo (USB o serie). Es lo más común.</w:t>
+            </w:r>
+          </w:p>
+        </w:tc>
+        <w:tc>
+          <w:tcPr>
+            <w:tcW w:type="dxa" w:w="4309"/>
+          </w:tcPr>
+          <w:p>
+            <w:r>
+              <w:t>El nombre exacto con el que aparece en Dispositivos e impresoras de Windows.</w:t>
+            </w:r>
+          </w:p>
+        </w:tc>
+      </w:tr>
+      <w:tr>
+        <w:tc>
+          <w:tcPr>
+            <w:tcW w:type="dxa" w:w="1247"/>
+          </w:tcPr>
+          <w:p>
+            <w:r>
+              <w:t>Red</w:t>
+            </w:r>
+          </w:p>
+        </w:tc>
+        <w:tc>
+          <w:tcPr>
+            <w:tcW w:type="dxa" w:w="3969"/>
+          </w:tcPr>
+          <w:p>
+            <w:r>
+              <w:t>La impresora tiene su propio puerto de red y su dirección.</w:t>
+            </w:r>
+          </w:p>
+        </w:tc>
+        <w:tc>
+          <w:tcPr>
+            <w:tcW w:type="dxa" w:w="4309"/>
+          </w:tcPr>
+          <w:p>
+            <w:r>
+              <w:t>Su dirección y su puerto (normalmente 9100).</w:t>
+            </w:r>
+          </w:p>
+        </w:tc>
+      </w:tr>
+      <w:tr>
+        <w:tc>
+          <w:tcPr>
+            <w:tcW w:type="dxa" w:w="1247"/>
+          </w:tcPr>
+          <w:p>
+            <w:r>
+              <w:t>Archivo</w:t>
+            </w:r>
+          </w:p>
+        </w:tc>
+        <w:tc>
+          <w:tcPr>
+            <w:tcW w:type="dxa" w:w="3969"/>
+          </w:tcPr>
+          <w:p>
+            <w:r>
+              <w:t>Todavía no hay impresora: sirve para probar la caja.</w:t>
+            </w:r>
+          </w:p>
+        </w:tc>
+        <w:tc>
+          <w:tcPr>
+            <w:tcW w:type="dxa" w:w="4309"/>
+          </w:tcPr>
+          <w:p>
+            <w:r>
+              <w:t>La carpeta donde se van guardando los tickets.</w:t>
+            </w:r>
+          </w:p>
+        </w:tc>
+      </w:tr>
+    </w:tbl>
+    <w:p/>
+    <w:p>
+      <w:r>
+        <w:rPr>
+          <w:i/>
+          <w:color w:val="2E7D32"/>
+        </w:rPr>
+        <w:t>La gaveta del dinero se conecta a la impresora, no al equipo: se abre con un pulso que viaja por el mismo cable. Por eso no se configura aparte.</w:t>
+      </w:r>
+    </w:p>
+    <w:p>
+      <w:r>
+        <w:rPr>
+          <w:i/>
+          <w:color w:val="2E7D32"/>
+        </w:rPr>
+        <w:t>Si cambia la impresora de una caja, hay que reiniciar el servicio de la caja para que lo tome.</w:t>
+      </w:r>
+    </w:p>
+    <w:p>
+      <w:pPr>
+        <w:pStyle w:val="Heading3"/>
+      </w:pPr>
+      <w:r>
+        <w:t>3.1.2. Cambiar una caja de equipo</w:t>
       </w:r>
     </w:p>
     <w:p>

</xml_diff>

<commit_message>
feat: Implement caja configuration management
- Added ConfiguracionCaja class to manage caja configuration details securely.
- Created RutasApiConfiguracion for API endpoints to handle caja configuration requests.
- Developed ConfiguracionCajaLocal to persist and retrieve caja configuration from the database.
- Introduced ProteccionSecretoEquipo for encrypting and decrypting caja credentials tied to the machine.
- Implemented ConfigurarCaja.razor page for user interface to configure caja settings.
</commit_message>
<xml_diff>
--- a/scripts/manual/Manual de usuario CG-POS.docx
+++ b/scripts/manual/Manual de usuario CG-POS.docx
@@ -1198,7 +1198,7 @@
           </w:tcPr>
           <w:p>
             <w:r>
-              <w:t>Organización → Solicitudes de cajas</w:t>
+              <w:t>Organización → Cajas</w:t>
             </w:r>
           </w:p>
         </w:tc>
@@ -1208,7 +1208,7 @@
           </w:tcPr>
           <w:p>
             <w:r>
-              <w:t>La caja la pide al instalarse y usted la acepta. Nadie copia claves a mano.</w:t>
+              <w:t>Se emite desde el Central y se escribe una vez en la pantalla de la caja, junto con su IP.</w:t>
             </w:r>
           </w:p>
         </w:tc>
@@ -1541,39 +1541,7 @@
           </w:tcPr>
           <w:p>
             <w:r>
-              <w:t>Alta de cajas, habilitarlas, ver a qué equipo está atada cada una y liberar el equipo cuando la caja se muda a otra máquina. El código también es de dos dígitos (01 a 99) y único dentro de su sucursal.</w:t>
-            </w:r>
-          </w:p>
-        </w:tc>
-      </w:tr>
-      <w:tr>
-        <w:tc>
-          <w:tcPr>
-            <w:tcW w:type="dxa" w:w="2154"/>
-          </w:tcPr>
-          <w:p>
-            <w:r>
-              <w:t>Solicitudes de cajas</w:t>
-            </w:r>
-          </w:p>
-        </w:tc>
-        <w:tc>
-          <w:tcPr>
-            <w:tcW w:type="dxa" w:w="2835"/>
-          </w:tcPr>
-          <w:p>
-            <w:r>
-              <w:t>/organizacion/solicitudes-cajas</w:t>
-            </w:r>
-          </w:p>
-        </w:tc>
-        <w:tc>
-          <w:tcPr>
-            <w:tcW w:type="dxa" w:w="4649"/>
-          </w:tcPr>
-          <w:p>
-            <w:r>
-              <w:t>Cajas recién instaladas que piden entrar al Central. Al aceptar una se le entrega su credencial y queda atada a ese equipo.</w:t>
+              <w:t>Alta de cajas con su código de dos dígitos (01 a 99) y su IP fija, habilitarlas, y emitir o revocar su credencial. El código es único en la sucursal y la IP es única en toda la empresa.</w:t>
             </w:r>
           </w:p>
         </w:tc>
@@ -8454,7 +8422,7 @@
         <w:pStyle w:val="ListNumber"/>
       </w:pPr>
       <w:r>
-        <w:t>En el Central, cree la sucursal y la caja (Organización). No hay que emitir ninguna clave: la caja la pedirá sola.</w:t>
+        <w:t>En el Central, cree la sucursal y la caja (Organización → Cajas), con la IP fija del equipo donde va a correr. Después, en el menú de esa caja, «Emitir credencial»: el secreto se muestra una sola vez, cópielo.</w:t>
       </w:r>
     </w:p>
     <w:p>
@@ -8478,15 +8446,7 @@
         <w:pStyle w:val="ListNumber"/>
       </w:pPr>
       <w:r>
-        <w:t>Arranque la caja. Al no tener credencial, se anuncia al Central y queda esperando; en su registro dirá que la solicitud quedó registrada.</w:t>
-      </w:r>
-    </w:p>
-    <w:p>
-      <w:pPr>
-        <w:pStyle w:val="ListNumber"/>
-      </w:pPr>
-      <w:r>
-        <w:t>En el Central, entre a Organización → Solicitudes de cajas, revise que el equipo que pide sea el que acaba de instalar (verá su nombre, su dirección y la hora) y acéptela. La caja recoge su credencial sola en el siguiente intento.</w:t>
+        <w:t>Arranque la caja y abra cualquiera de sus pantallas. Como todavía no sabe cuál es, le pedirá cinco datos: el código de su sucursal, el de la caja, la IP de ese equipo, la dirección del Central y la credencial que copió.</w:t>
       </w:r>
     </w:p>
     <w:p>
@@ -8520,7 +8480,7 @@
           <w:i/>
           <w:color w:val="2E7D32"/>
         </w:rPr>
-        <w:t>La credencial queda guardada cifrada en ese equipo y solo sirve ahí: si alguien copia la configuración a otra máquina, el Central la rechaza y el intento queda registrado. Por eso, cuando una caja cambia de equipo, hay que usar «Liberar equipo».</w:t>
+        <w:t>La credencial queda cifrada en la base de esa caja: no se vuelve a ver y copiarla a otra máquina no sirve. En cada comunicación el Central comprueba los cuatro datos juntos —sucursal, caja, IP y credencial—, así que dos cajas no pueden usar lo mismo.</w:t>
       </w:r>
     </w:p>
     <w:p>
@@ -8728,7 +8688,7 @@
         <w:pStyle w:val="ListNumber"/>
       </w:pPr>
       <w:r>
-        <w:t>En el Central, Organización → Cajas, en el menú de esa caja, elija «Liberar equipo» e indique el motivo. Queda registrado quién lo hizo.</w:t>
+        <w:t>En el Central, Organización → Cajas, edite la caja y ponga la IP del equipo nuevo; después emítale una credencial nueva.</w:t>
       </w:r>
     </w:p>
     <w:p>
@@ -8744,7 +8704,7 @@
         <w:pStyle w:val="ListNumber"/>
       </w:pPr>
       <w:r>
-        <w:t>Arránquela y acepte su solicitud en Solicitudes de cajas, comprobando que el equipo sea el que acaba de instalar.</w:t>
+        <w:t>Arránquela y llene su pantalla de configuración con los mismos códigos, la IP nueva y la credencial nueva.</w:t>
       </w:r>
     </w:p>
     <w:p>
@@ -8753,7 +8713,7 @@
           <w:i/>
           <w:color w:val="2E7D32"/>
         </w:rPr>
-        <w:t>Si el equipo se perdió o se lo robaron, en vez de liberar conviene revocar la credencial: así la anterior deja de servir aunque alguien tenga el equipo.</w:t>
+        <w:t>Si el equipo se perdió o se lo robaron, revoque la credencial de inmediato: la anterior deja de servir aunque enciendan el equipo.</w:t>
       </w:r>
     </w:p>
     <w:p>
@@ -8762,7 +8722,7 @@
           <w:i/>
           <w:color w:val="2E7D32"/>
         </w:rPr>
-        <w:t>Si el técnico olvida liberar el equipo, la caja nueva no podrá comunicarse y su registro lo dirá con todas las letras: la credencial está atada a otro equipo. Nada se pierde: se libera y se acepta.</w:t>
+        <w:t>Mientras los datos no cuadren, la caja sigue vendiendo con lo que tiene en su base; lo que no hace es sincronizar. En su barra de estado dirá «Sin conexión (credenciales)», para distinguirlo de quedarse sin red.</w:t>
       </w:r>
     </w:p>
     <w:p>
@@ -10531,7 +10491,7 @@
         <w:pStyle w:val="ListNumber"/>
       </w:pPr>
       <w:r>
-        <w:t>Acepte la solicitud de esa caja en el Central (Organización → Solicitudes de cajas).</w:t>
+        <w:t>Llene la pantalla de configuración de la caja con su sucursal, su código, su IP, la dirección del Central y la credencial.</w:t>
       </w:r>
     </w:p>
     <w:p>

</xml_diff>

<commit_message>
feat: Implement Caja Configuration Validation
- Added functionality to validate caja configuration through the Central API.
- Introduced new endpoint for caja configuration validation in RutasApiDispositivos.
- Created SolicitudValidarConfiguracionCaja and RespuestaValidarConfiguracionCaja records for request and response handling.
- Updated ServicioDispositivos to include validation logic for caja configuration.
- Enhanced SeguridadCentral to authorize configuration requests based on user permissions.
- Modified ConfiguracionCajaLocal to integrate validation before saving caja configuration.
- Updated UI to capture Central user credentials for caja configuration.
- Added ValidadorConfiguracionCentral to handle API communication for validation.
</commit_message>
<xml_diff>
--- a/scripts/manual/Manual de usuario CG-POS.docx
+++ b/scripts/manual/Manual de usuario CG-POS.docx
@@ -655,7 +655,7 @@
         <w:pStyle w:val="ListNumber"/>
       </w:pPr>
       <w:r>
-        <w:t>En el servidor, abra SQL Server Management Studio (o use sqlcmd) y ejecute el archivo scripts/base-datos/central/structura_base_datos.sql. Crea la base CgPosCentral con todas sus tablas, llaves e índices.</w:t>
+        <w:t>En el servidor, abra SQL Server Management Studio (o use sqlcmd) y ejecute el archivo scripts/base-datos/estructura_base_datos_central.sql. Crea la base CgPosCentral con todas sus tablas, llaves e índices.</w:t>
       </w:r>
     </w:p>
     <w:p>
@@ -2089,7 +2089,7 @@
         <w:pStyle w:val="ListNumber"/>
       </w:pPr>
       <w:r>
-        <w:t>Abra scripts/base-datos/central/cargar-clientes-dgii.sql, cambie la ruta del archivo arriba y ejecútelo.</w:t>
+        <w:t>Abra scripts/base-datos/cargar-clientes-dgii.sql, cambie la ruta del archivo arriba y ejecútelo.</w:t>
       </w:r>
     </w:p>
     <w:p>
@@ -8430,7 +8430,7 @@
         <w:pStyle w:val="ListNumber"/>
       </w:pPr>
       <w:r>
-        <w:t>En el equipo de la caja, instale SQL Server Express y ejecute scripts/base-datos/pos/structura_base_datos.sql. Crea la base CgPosCaja vacía: no lleva datos, todo baja del Central.</w:t>
+        <w:t>En el equipo de la caja, instale SQL Server Express y ejecute scripts/base-datos/estructura_base_datos_pos.sql. Crea la base CgPosCaja vacía: no lleva datos, todo baja del Central.</w:t>
       </w:r>
     </w:p>
     <w:p>
@@ -8446,7 +8446,7 @@
         <w:pStyle w:val="ListNumber"/>
       </w:pPr>
       <w:r>
-        <w:t>Arranque la caja y abra cualquiera de sus pantallas. Como todavía no sabe cuál es, le pedirá cinco datos: el código de su sucursal, el de la caja, la IP de ese equipo, la dirección del Central y la credencial que copió.</w:t>
+        <w:t>Arranque la caja y abra cualquiera de sus pantallas. Como todavía no sabe cuál es, le pedirá cinco datos: el código de su sucursal, el de la caja, la IP de ese equipo, la dirección del Central y la credencial que copió. Además le pedirá su usuario y contraseña del Central, para saber quién está montando esa caja.</w:t>
       </w:r>
     </w:p>
     <w:p>
@@ -8472,6 +8472,15 @@
           <w:color w:val="2E7D32"/>
         </w:rPr>
         <w:t>Si la caja avisa que la base no existe o le faltan tablas, es que no se ejecutó el script en ese equipo.</w:t>
+      </w:r>
+    </w:p>
+    <w:p>
+      <w:r>
+        <w:rPr>
+          <w:i/>
+          <w:color w:val="2E7D32"/>
+        </w:rPr>
+        <w:t>Quien configura una caja tiene que ser un usuario del Central con el permiso «Autorizar la configuración de una caja desde el propio equipo». El Central lo comprueba en el momento, junto con la credencial y la dirección del equipo, y deja anotado quién configuró esa caja. La contraseña no se guarda en la caja: solo el nombre del usuario.</w:t>
       </w:r>
     </w:p>
     <w:p>
@@ -10411,7 +10420,7 @@
         <w:pStyle w:val="ListNumber"/>
       </w:pPr>
       <w:r>
-        <w:t>Cree la base del Central con scripts/base-datos/central/structura_base_datos.sql y entre con el usuario ADMIN (cambie su contraseña).</w:t>
+        <w:t>Cree la base del Central con scripts/base-datos/estructura_base_datos_central.sql y entre con el usuario ADMIN (cambie su contraseña).</w:t>
       </w:r>
     </w:p>
     <w:p>
@@ -10483,7 +10492,7 @@
         <w:pStyle w:val="ListNumber"/>
       </w:pPr>
       <w:r>
-        <w:t>Cree la base de la caja con scripts/base-datos/pos/structura_base_datos.sql e instale la caja con su sucursal, su número y la dirección del Central.</w:t>
+        <w:t>Cree la base de la caja con scripts/base-datos/estructura_base_datos_pos.sql e instale la caja con su sucursal, su número y la dirección del Central.</w:t>
       </w:r>
     </w:p>
     <w:p>
@@ -10734,7 +10743,7 @@
           </w:tcPr>
           <w:p>
             <w:r>
-              <w:t>No se ejecutó el script de creación en ese equipo, o el sistema está apuntando a otra base. Ejecute scripts/base-datos/central/structura_base_datos.sql en el servidor o scripts/base-datos/pos/structura_base_datos.sql en la caja.</w:t>
+              <w:t>No se ejecutó el script de creación en ese equipo, o el sistema está apuntando a otra base. Ejecute scripts/base-datos/estructura_base_datos_central.sql en el servidor o scripts/base-datos/estructura_base_datos_pos.sql en la caja.</w:t>
             </w:r>
           </w:p>
         </w:tc>

</xml_diff>

<commit_message>
Refactor ServicioCaja and related components to remove re-opening closure functionality
- Removed the ReabrirCierreAsync method from ServicioCaja, including all related logic for re-opening closures.
- Updated PanelAperturaTurno component to remove the button for re-opening the last closure.
- Adjusted PantallaVenta component to remove the re-opening closure method call.
- Cleaned up ClienteAgente by removing the ReabrirCierreAsync method.
</commit_message>
<xml_diff>
--- a/scripts/manual/Manual de usuario CG-POS.docx
+++ b/scripts/manual/Manual de usuario CG-POS.docx
@@ -6129,7 +6129,7 @@
     <w:p/>
     <w:p>
       <w:r>
-        <w:t>8. Usuarios y roles de caja: al menos un cajero (solo vender y cobrar), un supervisor (autoriza descuentos, devoluciones, retiros y notas internas) y un gerente (además reabre cierres y autoriza lo de mayor monto).</w:t>
+        <w:t>8. Usuarios y roles de caja: al menos un cajero (solo vender y cobrar), un supervisor (autoriza descuentos, devoluciones, retiros y notas internas) y un gerente (además autoriza lo de mayor monto).</w:t>
       </w:r>
     </w:p>
     <w:p>
@@ -6350,7 +6350,7 @@
           </w:tcPr>
           <w:p>
             <w:r>
-              <w:t>Todo lo anterior, más reabrir un cierre, autorizar lo que pasa el tope del supervisor y cambiar el comprobante de una factura.</w:t>
+              <w:t>Todo lo anterior, más autorizar lo que pasa el tope del supervisor y cambiar el comprobante de una factura.</w:t>
             </w:r>
           </w:p>
         </w:tc>
@@ -8800,7 +8800,7 @@
         <w:pStyle w:val="ListBullet"/>
       </w:pPr>
       <w:r>
-        <w:t>Si el último cierre se hizo por error, aparece Reabrir el último cierre: pide motivo y la autorización de alguien de nivel superior, y queda registrado.</w:t>
+        <w:t>Cerrar el turno es definitivo: la caja no puede volver atrás. Cuente con calma antes de cerrar; si de todos modos quedó mal, la corrección se hace en el Central.</w:t>
       </w:r>
     </w:p>
     <w:p>
@@ -10897,7 +10897,7 @@
           </w:tcPr>
           <w:p>
             <w:r>
-              <w:t>Desde la apertura, Reabrir el último cierre con motivo y autorización de nivel superior.</w:t>
+              <w:t>La caja no lo puede deshacer: el cierre es definitivo. Se corrige en el Central, con el detalle de lo que pasó.</w:t>
             </w:r>
           </w:p>
         </w:tc>

</xml_diff>

<commit_message>
Refactor tax handling for special regime invoices (E44) and government invoices (E45)
- Updated SQL scripts to clarify retention tax descriptions for government invoices.
- Enhanced database structure to accommodate new fields for tax handling in sales lines.
- Modified Python script to generate updated database structure reflecting changes in retention tax.
- Revised user manual to include updated explanations for tax handling in invoices.
- Adjusted sales contracts to include new flag for tax exemption on special regime invoices.
- Implemented logic in sales processing to handle tax exemption for special regime invoices.
- Updated ticket generation to reflect tax exemption status on invoices.
- Enhanced UI to display tax exemption status clearly on client and sales screens.
</commit_message>
<xml_diff>
--- a/scripts/manual/Manual de usuario CG-POS.docx
+++ b/scripts/manual/Manual de usuario CG-POS.docx
@@ -6909,7 +6909,7 @@
           </w:tcPr>
           <w:p>
             <w:r>
-              <w:t>Solo se cambia si le factura a quien la aplica (E44).</w:t>
+              <w:t>Solo para facturas gubernamentales (E45), y quien factura en e-CF está exento.</w:t>
             </w:r>
           </w:p>
         </w:tc>
@@ -8919,7 +8919,7 @@
           </w:tcPr>
           <w:p>
             <w:r>
-              <w:t>Subtotal, ITBIS, descuentos, TOTAL y, en facturas de régimen especial, la retención y el total a pagar.</w:t>
+              <w:t>Subtotal, ITBIS (o el aviso de exenta en régimen especial), descuentos, TOTAL y, en facturas gubernamentales con retención, el total a pagar.</w:t>
             </w:r>
           </w:p>
         </w:tc>
@@ -9680,7 +9680,7 @@
           </w:tcPr>
           <w:p>
             <w:r>
-              <w:t>Clientes de régimen especial. Si el negocio lo tiene configurado, se le aplica la retención de la Ley 32-23.</w:t>
+              <w:t>Zonas francas, diplomáticos y demás acogidos a un régimen especial, que deben presentar su carné o certificación de exención de la DGII. La factura va SIN ITBIS.</w:t>
             </w:r>
           </w:p>
         </w:tc>
@@ -9702,7 +9702,7 @@
           </w:tcPr>
           <w:p>
             <w:r>
-              <w:t>Instituciones del Estado. Exige RNC.</w:t>
+              <w:t>Instituciones del Estado. Exige RNC. Lleva ITBIS normal.</w:t>
             </w:r>
           </w:p>
         </w:tc>
@@ -9711,7 +9711,12 @@
     <w:p/>
     <w:p>
       <w:r>
-        <w:t>Retención de la Ley 32-23: en las facturas E44, el sistema calcula el porcentaje configurado sobre el subtotal ya con descuentos y se lo descuenta a lo que el cliente paga en caja. La factura mantiene su total; el ticket muestra “RETENCIÓN LEY 32-23” y “TOTAL A PAGAR”.</w:t>
+        <w:t>Factura exenta (E44): al elegir este comprobante, toda la factura pasa a ser exenta de ITBIS, tengan o no impuesto los artículos. Los precios bajan a su base, así que el cliente paga menos: un artículo de RD$118 se cobra a RD$100. La pantalla, la pantalla del cliente y el ticket lo indican con “EXENTA DE ITBIS – RÉGIMEN ESPECIAL”. Si el bien que se vende no está exento para ese cliente, no se usa el E44: se le factura con E31.</w:t>
+      </w:r>
+    </w:p>
+    <w:p>
+      <w:r>
+        <w:t>Retención de la Ley 32-23: en las facturas E45, si el negocio configuró el porcentaje, el sistema lo calcula sobre el subtotal ya con descuentos y se lo descuenta a lo que el cliente paga en caja. La factura mantiene su total; el ticket muestra “RETENCIÓN LEY 32-23” y “TOTAL A PAGAR”. Normalmente va en cero: quien factura electrónicamente está exento de esa retención.</w:t>
       </w:r>
     </w:p>
     <w:p>

</xml_diff>

<commit_message>
feat: Add support for ITBIS exemption certification for governmental sales (E45)
- Updated `DatosVenta` to include optional `CertificacionExencion` field.
- Enhanced `Venta` class to manage ITBIS exemption based on certification.
- Introduced `SolicitudCertificacionExencion` for API requests.
- Modified `RutasApiVentas` to handle certification registration and removal.
- Updated `ServiciosVentas` to process certification logic.
- Adjusted ticket generation to reflect exemption reasons.
- Enhanced UI components to allow input for certification number.
- Updated CSS for better layout of certification fields.
</commit_message>
<xml_diff>
--- a/scripts/manual/Manual de usuario CG-POS.docx
+++ b/scripts/manual/Manual de usuario CG-POS.docx
@@ -9702,7 +9702,7 @@
           </w:tcPr>
           <w:p>
             <w:r>
-              <w:t>Instituciones del Estado. Exige RNC. Lleva ITBIS normal.</w:t>
+              <w:t>Instituciones del Estado. Exige RNC. Lleva ITBIS, salvo que la entidad presente su certificación de exención.</w:t>
             </w:r>
           </w:p>
         </w:tc>
@@ -9712,6 +9712,11 @@
     <w:p>
       <w:r>
         <w:t>Factura exenta (E44): al elegir este comprobante, toda la factura pasa a ser exenta de ITBIS, tengan o no impuesto los artículos. Los precios bajan a su base, así que el cliente paga menos: un artículo de RD$118 se cobra a RD$100. La pantalla, la pantalla del cliente y el ticket lo indican con “EXENTA DE ITBIS – RÉGIMEN ESPECIAL”. Si el bien que se vende no está exento para ese cliente, no se usa el E44: se le factura con E31.</w:t>
+      </w:r>
+    </w:p>
+    <w:p>
+      <w:r>
+        <w:t>Entidad del Estado con exención (E45): si la institución presenta su certificación de exención de ITBIS, digite el número en el diálogo del cliente y toque “Aplicar exención”. La factura pasa a ser exenta y el ticket lo indica con el número de la certificación. Si no la presenta, la factura lleva su ITBIS normal.</w:t>
       </w:r>
     </w:p>
     <w:p>

</xml_diff>

<commit_message>
docs(cotizaciones): README y manual de usuario
Qué es una cotización, cómo se hace en el Central, qué significa que el
precio quede congelado, y el paso a paso de la caja con F9, incluida la
autorización de una vencida y qué pasa sin comunicación.

Co-Authored-By: Claude Opus 5 <noreply@anthropic.com>
</commit_message>
<xml_diff>
--- a/scripts/manual/Manual de usuario CG-POS.docx
+++ b/scripts/manual/Manual de usuario CG-POS.docx
@@ -9433,6 +9433,28 @@
           </w:tcPr>
           <w:p>
             <w:r>
+              <w:t>F9</w:t>
+            </w:r>
+          </w:p>
+        </w:tc>
+        <w:tc>
+          <w:tcPr>
+            <w:tcW w:type="dxa" w:w="7937"/>
+          </w:tcPr>
+          <w:p>
+            <w:r>
+              <w:t>Cotización: traer un presupuesto hecho en el Central</w:t>
+            </w:r>
+          </w:p>
+        </w:tc>
+      </w:tr>
+      <w:tr>
+        <w:tc>
+          <w:tcPr>
+            <w:tcW w:type="dxa" w:w="1701"/>
+          </w:tcPr>
+          <w:p>
+            <w:r>
               <w:t>F10</w:t>
             </w:r>
           </w:p>
@@ -10035,7 +10057,71 @@
         <w:pStyle w:val="Heading2"/>
       </w:pPr>
       <w:r>
-        <w:t>3.12. Facturas en espera, anular y suspender</w:t>
+        <w:t>3.12. Facturar una cotización (F9)</w:t>
+      </w:r>
+    </w:p>
+    <w:p>
+      <w:r>
+        <w:t>Una cotización es el presupuesto que administración le hizo al cliente desde el Central, con los precios del momento. El cliente llega con el papel y se le factura sin volver a digitar nada.</w:t>
+      </w:r>
+    </w:p>
+    <w:p>
+      <w:pPr>
+        <w:pStyle w:val="ListNumber"/>
+      </w:pPr>
+      <w:r>
+        <w:t>Presione F9 y escanee o digite el número de la cotización (empieza con COT).</w:t>
+      </w:r>
+    </w:p>
+    <w:p>
+      <w:pPr>
+        <w:pStyle w:val="ListNumber"/>
+      </w:pPr>
+      <w:r>
+        <w:t>La caja se la pide al Central y carga los artículos con los precios que se le prometieron al cliente: no se les aplican ofertas ni se recalculan.</w:t>
+      </w:r>
+    </w:p>
+    <w:p>
+      <w:pPr>
+        <w:pStyle w:val="ListNumber"/>
+      </w:pPr>
+      <w:r>
+        <w:t>Cobre normalmente. El ticket sale con el número de la cotización y en el Central queda marcada como facturada.</w:t>
+      </w:r>
+    </w:p>
+    <w:p>
+      <w:r>
+        <w:rPr>
+          <w:i/>
+          <w:color w:val="2E7D32"/>
+        </w:rPr>
+        <w:t>Si la cotización venció, la caja pide la autorización de un supervisor y el motivo queda registrado. Una cotización ya facturada o anulada no se puede volver a usar.</w:t>
+      </w:r>
+    </w:p>
+    <w:p>
+      <w:r>
+        <w:rPr>
+          <w:i/>
+          <w:color w:val="2E7D32"/>
+        </w:rPr>
+        <w:t>La cotización vive en el Central: si la caja está sin comunicación, no se puede traer. La pantalla lo dice con esas palabras, y siempre se puede facturar a mano.</w:t>
+      </w:r>
+    </w:p>
+    <w:p>
+      <w:r>
+        <w:rPr>
+          <w:i/>
+          <w:color w:val="2E7D32"/>
+        </w:rPr>
+        <w:t>La venta tiene que estar vacía: si ya tiene artículos, termínela o límpiela antes de traer la cotización.</w:t>
+      </w:r>
+    </w:p>
+    <w:p>
+      <w:pPr>
+        <w:pStyle w:val="Heading2"/>
+      </w:pPr>
+      <w:r>
+        <w:t>3.13. Facturas en espera, anular y suspender</w:t>
       </w:r>
     </w:p>
     <w:p>
@@ -10075,7 +10161,7 @@
         <w:pStyle w:val="Heading2"/>
       </w:pPr>
       <w:r>
-        <w:t>3.13. Entregas y envíos</w:t>
+        <w:t>3.14. Entregas y envíos</w:t>
       </w:r>
     </w:p>
     <w:p>
@@ -10120,7 +10206,7 @@
         <w:pStyle w:val="Heading2"/>
       </w:pPr>
       <w:r>
-        <w:t>3.14. Devoluciones y notas de crédito</w:t>
+        <w:t>3.15. Devoluciones y notas de crédito</w:t>
       </w:r>
     </w:p>
     <w:p>
@@ -10311,7 +10397,7 @@
         <w:pStyle w:val="Heading2"/>
       </w:pPr>
       <w:r>
-        <w:t>3.15. Retiros, pre-cierre y cierre de turno</w:t>
+        <w:t>3.16. Retiros, pre-cierre y cierre de turno</w:t>
       </w:r>
     </w:p>
     <w:p>
@@ -10367,7 +10453,7 @@
         <w:pStyle w:val="Heading2"/>
       </w:pPr>
       <w:r>
-        <w:t>3.16. La barra de estado</w:t>
+        <w:t>3.17. La barra de estado</w:t>
       </w:r>
     </w:p>
     <w:p>

</xml_diff>

<commit_message>
feat(devoluciones): la caja emite notas de crédito de facturas de cualquier tienda
La caja le pide la factura al Central, la guarda en una copia temporal y emite
la nota con su propio certificado y su rango de e-NCF. El Central le retiene las
líneas mientras emite para que dos tiendas no devuelvan lo mismo, y la copia se
borra al emitir. Sin conexión solo se devuelven las facturas de esta caja.

Corrige además un choque de Ids: el comprobante electrónico no distinguía si
venía de una venta o de una devolución, y las dos numeran sus Id por separado.
</commit_message>
<xml_diff>
--- a/scripts/manual/Manual de usuario CG-POS.docx
+++ b/scripts/manual/Manual de usuario CG-POS.docx
@@ -10390,6 +10390,52 @@
           <w:color w:val="2E7D32"/>
         </w:rPr>
         <w:t>La vigencia de las notas de crédito se cuenta desde su emisión con los días configurados HOY en el Central: si una nota se venció y el negocio decide aceptarla, se suben los días en el Central y vuelve a poder usarse.</w:t>
+      </w:r>
+    </w:p>
+    <w:p>
+      <w:r>
+        <w:t>Facturas de otra sucursal o de otra caja:</w:t>
+      </w:r>
+    </w:p>
+    <w:p>
+      <w:pPr>
+        <w:pStyle w:val="ListBullet"/>
+      </w:pPr>
+      <w:r>
+        <w:t>Se devuelven igual. Si la factura no es de esta caja, el sistema se la pide al Central y la trae con lo que ya se devolvió de ella en cualquier tienda de la empresa; la pantalla avisa de qué sucursal y caja viene.</w:t>
+      </w:r>
+    </w:p>
+    <w:p>
+      <w:pPr>
+        <w:pStyle w:val="ListBullet"/>
+      </w:pPr>
+      <w:r>
+        <w:t>La nota de crédito la emite SIEMPRE esta caja, con su propio certificado y su propio rango de e-NCF. La factura solo se consulta.</w:t>
+      </w:r>
+    </w:p>
+    <w:p>
+      <w:pPr>
+        <w:pStyle w:val="ListBullet"/>
+      </w:pPr>
+      <w:r>
+        <w:t>Mientras se emite, el Central le retiene esas líneas a esta caja, para que otra tienda no devuelva al mismo tiempo la misma mercancía. La retención se suelta sola a los minutos configurados en el Central si la nota no se llega a emitir.</w:t>
+      </w:r>
+    </w:p>
+    <w:p>
+      <w:pPr>
+        <w:pStyle w:val="ListBullet"/>
+      </w:pPr>
+      <w:r>
+        <w:t>La copia de la factura traída del Central se borra en cuanto se emite la nota: en la caja no queda guardada la venta de otra tienda.</w:t>
+      </w:r>
+    </w:p>
+    <w:p>
+      <w:r>
+        <w:rPr>
+          <w:i/>
+          <w:color w:val="2E7D32"/>
+        </w:rPr>
+        <w:t>Para devolver una factura de otra tienda hace falta conexión con el Central. Sin conexión solo se devuelven las facturas de esta misma caja, y la pantalla lo dice con esas palabras en vez de dejar al cajero esperando.</w:t>
       </w:r>
     </w:p>
     <w:p>

</xml_diff>

<commit_message>
fix(devoluciones): la factura de la nota de crédito siempre sale del Central
También las facturas de esta misma caja: el Central es el único que sabe cuánto
se devolvió ya de cada línea en toda la empresa, y una nota nunca se emite contra
una factura que él no tenga registrada. Sin conexión no se emiten notas.

La copia se enlaza con la venta local cuando la vendió esta caja, para los puntos
de fidelidad y la mercancía pendiente de entregar, y lo devuelto se toma como el
mayor entre lo que dice el Central y lo que la caja ya emitió, por si una nota
todavía no ha subido.
</commit_message>
<xml_diff>
--- a/scripts/manual/Manual de usuario CG-POS.docx
+++ b/scripts/manual/Manual de usuario CG-POS.docx
@@ -10394,7 +10394,7 @@
     </w:p>
     <w:p>
       <w:r>
-        <w:t>Facturas de otra sucursal o de otra caja:</w:t>
+        <w:t>De dónde sale la factura:</w:t>
       </w:r>
     </w:p>
     <w:p>
@@ -10402,7 +10402,7 @@
         <w:pStyle w:val="ListBullet"/>
       </w:pPr>
       <w:r>
-        <w:t>Se devuelven igual. Si la factura no es de esta caja, el sistema se la pide al Central y la trae con lo que ya se devolvió de ella en cualquier tienda de la empresa; la pantalla avisa de qué sucursal y caja viene.</w:t>
+        <w:t>La factura SIEMPRE se busca en el Central, aunque la haya vendido esta misma caja. El Central es el único que sabe cuánto se devolvió ya de cada línea en toda la empresa, y una nota de crédito nunca se hace contra una factura que el Central no tenga registrada.</w:t>
       </w:r>
     </w:p>
     <w:p>
@@ -10410,7 +10410,7 @@
         <w:pStyle w:val="ListBullet"/>
       </w:pPr>
       <w:r>
-        <w:t>La nota de crédito la emite SIEMPRE esta caja, con su propio certificado y su propio rango de e-NCF. La factura solo se consulta.</w:t>
+        <w:t>Se puede devolver una factura de cualquier sucursal y de cualquier caja. Si no es de esta caja, la pantalla avisa de qué sucursal y caja viene.</w:t>
       </w:r>
     </w:p>
     <w:p>
@@ -10418,7 +10418,7 @@
         <w:pStyle w:val="ListBullet"/>
       </w:pPr>
       <w:r>
-        <w:t>Mientras se emite, el Central le retiene esas líneas a esta caja, para que otra tienda no devuelva al mismo tiempo la misma mercancía. La retención se suelta sola a los minutos configurados en el Central si la nota no se llega a emitir.</w:t>
+        <w:t>La nota de crédito la emite SIEMPRE la caja donde está el cliente, con su propio certificado y su propio rango de e-NCF. La factura solo se consulta.</w:t>
       </w:r>
     </w:p>
     <w:p>
@@ -10426,7 +10426,15 @@
         <w:pStyle w:val="ListBullet"/>
       </w:pPr>
       <w:r>
-        <w:t>La copia de la factura traída del Central se borra en cuanto se emite la nota: en la caja no queda guardada la venta de otra tienda.</w:t>
+        <w:t>Mientras se emite, el Central le retiene esas líneas a esta caja, para que otra no devuelva al mismo tiempo la misma mercancía. La retención se suelta sola a los minutos configurados en el Central si la nota no se llega a emitir.</w:t>
+      </w:r>
+    </w:p>
+    <w:p>
+      <w:pPr>
+        <w:pStyle w:val="ListBullet"/>
+      </w:pPr>
+      <w:r>
+        <w:t>La copia de la factura que trajo el Central se borra en cuanto se emite la nota: la caja no guarda facturas.</w:t>
       </w:r>
     </w:p>
     <w:p>
@@ -10435,7 +10443,7 @@
           <w:i/>
           <w:color w:val="2E7D32"/>
         </w:rPr>
-        <w:t>Para devolver una factura de otra tienda hace falta conexión con el Central. Sin conexión solo se devuelven las facturas de esta misma caja, y la pantalla lo dice con esas palabras en vez de dejar al cajero esperando.</w:t>
+        <w:t>Las notas de crédito necesitan conexión con el Central. Si la caja está sin red, o si la factura es tan reciente que todavía no ha terminado de subir, la pantalla lo dice con esas palabras en vez de dejar al cajero esperando.</w:t>
       </w:r>
     </w:p>
     <w:p>

</xml_diff>

<commit_message>
feat(despacho): el despacho de pendientes y envíos se opera en el Central
El Central pasa a guardar el pendiente completo y a despacharlo: preparar,
entregar total o parcial con serial y quien recibe, constancia en PDF carta y
anular con motivo y su propio permiso. La caja solo lo crea al cobrar, y un
reenvío de su mensaje ya no pisa lo que el Central despachó.

Se quitan de la caja la pantalla /despacho, su API y sus permisos. Lo pendiente
de entregar lo descuenta ahora el Central al entregarle la factura a la caja
para devolverla (RF-233), que es el único que sabe qué salió del almacén.
</commit_message>
<xml_diff>
--- a/scripts/manual/Manual de usuario CG-POS.docx
+++ b/scripts/manual/Manual de usuario CG-POS.docx
@@ -339,38 +339,6 @@
           <w:p>
             <w:r>
               <w:t>Cajero o encargado de devoluciones</w:t>
-            </w:r>
-          </w:p>
-        </w:tc>
-      </w:tr>
-      <w:tr>
-        <w:tc>
-          <w:tcPr>
-            <w:tcW w:type="dxa" w:w="3402"/>
-          </w:tcPr>
-          <w:p>
-            <w:r>
-              <w:t>Caja – despacho de pendientes</w:t>
-            </w:r>
-          </w:p>
-        </w:tc>
-        <w:tc>
-          <w:tcPr>
-            <w:tcW w:type="dxa" w:w="3969"/>
-          </w:tcPr>
-          <w:p>
-            <w:r>
-              <w:t>http://localhost:5180/ingreso?pantalla=despacho</w:t>
-            </w:r>
-          </w:p>
-        </w:tc>
-        <w:tc>
-          <w:tcPr>
-            <w:tcW w:type="dxa" w:w="2268"/>
-          </w:tcPr>
-          <w:p>
-            <w:r>
-              <w:t>Personal de entrega</w:t>
             </w:r>
           </w:p>
         </w:tc>
@@ -8085,12 +8053,72 @@
         <w:pStyle w:val="Heading2"/>
       </w:pPr>
       <w:r>
-        <w:t>2.14. Despacho</w:t>
+        <w:t>2.14. Despacho de pendientes y envíos</w:t>
       </w:r>
     </w:p>
     <w:p>
       <w:r>
-        <w:t>Ruta: /despacho/pendientes. Todos los pendientes de entrega y envíos de todas las sucursales, con su estado y sus atrasos; si el negocio lo activa, el Central le avisa por correo al cliente cuando su pedido queda preparado.</w:t>
+        <w:t>Ruta: /despacho/pendientes. Aquí se despacha TODO lo que quedó pendiente de entregar en cualquier sucursal. El despacho se hace en el Central y no en la caja: no emite comprobante fiscal ni toca la gaveta, y quien atiende a un cliente que llama o que llega a otra tienda necesita verlos todos. La caja solo crea el pendiente al cobrar.</w:t>
+      </w:r>
+    </w:p>
+    <w:p>
+      <w:r>
+        <w:t>En la lista se ven el estado, la fecha comprometida y los atrasos; se filtra por sucursal, método, estado, o solo los abiertos o los atrasados, y se busca por número, factura, cliente, teléfono o destino.</w:t>
+      </w:r>
+    </w:p>
+    <w:p>
+      <w:r>
+        <w:t>Al abrir un pendiente:</w:t>
+      </w:r>
+    </w:p>
+    <w:p>
+      <w:pPr>
+        <w:pStyle w:val="ListNumber"/>
+      </w:pPr>
+      <w:r>
+        <w:t>Preparación: se marca En preparación, Preparado y, si es un envío, Despachado cuando sale con el transportista. No se pueden saltar pasos.</w:t>
+      </w:r>
+    </w:p>
+    <w:p>
+      <w:pPr>
+        <w:pStyle w:val="ListNumber"/>
+      </w:pPr>
+      <w:r>
+        <w:t>Entrega: se escribe cuánto se entrega de cada artículo (puede ser todo o una parte), el serial de los serializados, y el nombre y la cédula de quien recibe. Con una entrega parcial el pendiente queda en Parcial y guarda lo que falta.</w:t>
+      </w:r>
+    </w:p>
+    <w:p>
+      <w:pPr>
+        <w:pStyle w:val="ListNumber"/>
+      </w:pPr>
+      <w:r>
+        <w:t>Constancia: de cada entrega se imprime un PDF en tamaño carta para que lo firme quien recibe. Se imprime en una impresora normal, no en la de tickets.</w:t>
+      </w:r>
+    </w:p>
+    <w:p>
+      <w:pPr>
+        <w:pStyle w:val="ListNumber"/>
+      </w:pPr>
+      <w:r>
+        <w:t>Anular: solo si todavía no se ha entregado nada, con motivo. Libera la mercancía para poder devolverla.</w:t>
+      </w:r>
+    </w:p>
+    <w:p>
+      <w:r>
+        <w:rPr>
+          <w:i/>
+          <w:color w:val="2E7D32"/>
+        </w:rPr>
+        <w:t>Anular un pendiente lleva su propio permiso (Central.Despacho.Anular), aparte del de operar el despacho: libera mercancía que ya se facturó.</w:t>
+      </w:r>
+    </w:p>
+    <w:p>
+      <w:r>
+        <w:rPr>
+          <w:i/>
+          <w:color w:val="2E7D32"/>
+        </w:rPr>
+        <w:t>Mientras algo siga pendiente de entregar, no se puede devolver: el cliente todavía no lo tiene. Para devolverlo hay que anular primero el pendiente. Si el negocio lo activa, el Central le avisa por correo al cliente cuando su pedido queda preparado.</w:t>
       </w:r>
     </w:p>
     <w:p>
@@ -9518,7 +9546,7 @@
     <w:p/>
     <w:p>
       <w:r>
-        <w:t>Segunda página (se cambia con el botón de la misma barra): catálogo en mosaicos, eliminar línea, eliminar por escaneo, limpiar pantalla, descuento a la línea, descuento a la factura, entrega o envío, despacho, anular, suspender, gaveta, reimprimir, retiro de efectivo, cierre de turno y salir.</w:t>
+        <w:t>Segunda página (se cambia con el botón de la misma barra): catálogo en mosaicos, eliminar línea, eliminar por escaneo, limpiar pantalla, descuento a la línea, descuento a la factura, entrega o envío, anular, suspender, gaveta, reimprimir, retiro de efectivo, cierre de turno y salir.</w:t>
       </w:r>
     </w:p>
     <w:p>
@@ -10190,7 +10218,7 @@
         <w:pStyle w:val="ListNumber"/>
       </w:pPr>
       <w:r>
-        <w:t>Al cobrar se imprime un comprobante de pendiente por cada destino, con código de barras.</w:t>
+        <w:t>Al cobrar se imprime un comprobante de pendiente por cada destino, con código de barras: una copia para el cliente y otra para el almacén.</w:t>
       </w:r>
     </w:p>
     <w:p>
@@ -10198,7 +10226,7 @@
         <w:pStyle w:val="ListNumber"/>
       </w:pPr>
       <w:r>
-        <w:t>En la pantalla /despacho se escanea ese comprobante para preparar, entregar (total o parcial, con quien recibe) o anular.</w:t>
+        <w:t>De ahí en adelante el pendiente se despacha desde el Central (Despacho → Pendientes): la caja ya no tiene nada que ver con él. Vea «2.14. Despacho de pendientes y envíos».</w:t>
       </w:r>
     </w:p>
     <w:p>

</xml_diff>

<commit_message>
feat(central): la numeración de sus documentos se configura y es obligatoria
SecuenciasCentral dice qué documento numera cada fila, con cuántos dígitos y si
está activa, y se administra desde Organización. Sin su secuencia, el documento
no se crea: se rechaza diciendo cuál falta, en vez de inventar una numeración.
Las listas de boda dejan de numerarse contando en memoria y pasan a usarla.

Los listados del Manager arrancan en 10 filas por página y sus filas son más
bajas, para ver más de un vistazo.
</commit_message>
<xml_diff>
--- a/scripts/manual/Manual de usuario CG-POS.docx
+++ b/scripts/manual/Manual de usuario CG-POS.docx
@@ -8126,7 +8126,219 @@
         <w:pStyle w:val="Heading2"/>
       </w:pPr>
       <w:r>
-        <w:t>2.15. Cierre consolidado de sucursal</w:t>
+        <w:t>2.15. Secuencias de documentos</w:t>
+      </w:r>
+    </w:p>
+    <w:p>
+      <w:r>
+        <w:t>Ruta: /organizacion/secuencias. Aquí se dice cómo se numera cada documento que emite el Central: el prefijo que lleva delante, cuántos dígitos tiene el correlativo y por cuál va.</w:t>
+      </w:r>
+    </w:p>
+    <w:p>
+      <w:r>
+        <w:rPr>
+          <w:i/>
+          <w:color w:val="2E7D32"/>
+        </w:rPr>
+        <w:t>Sin su secuencia, el documento NO se puede crear: el sistema lo rechaza diciendo cuál falta. Es a propósito, para que la numeración la decida el negocio y no se invente sola la primera vez que alguien hace el documento.</w:t>
+      </w:r>
+    </w:p>
+    <w:p>
+      <w:r>
+        <w:t>En el sistema hay tres numeraciones distintas y conviene no confundirlas:</w:t>
+      </w:r>
+    </w:p>
+    <w:tbl>
+      <w:tblPr>
+        <w:tblStyle w:val="TableGrid"/>
+        <w:tblW w:type="auto" w:w="0"/>
+        <w:tblLook w:firstColumn="1" w:firstRow="1" w:lastColumn="0" w:lastRow="0" w:noHBand="0" w:noVBand="1" w:val="04A0"/>
+      </w:tblPr>
+      <w:tblGrid>
+        <w:gridCol w:w="3173"/>
+        <w:gridCol w:w="3173"/>
+        <w:gridCol w:w="3173"/>
+      </w:tblGrid>
+      <w:tr>
+        <w:tc>
+          <w:tcPr>
+            <w:tcW w:type="dxa" w:w="2835"/>
+          </w:tcPr>
+          <w:p>
+            <w:r/>
+            <w:r>
+              <w:rPr>
+                <w:b/>
+                <w:color w:val="1B4D3E"/>
+              </w:rPr>
+              <w:t>Numeración</w:t>
+            </w:r>
+          </w:p>
+        </w:tc>
+        <w:tc>
+          <w:tcPr>
+            <w:tcW w:type="dxa" w:w="3402"/>
+          </w:tcPr>
+          <w:p>
+            <w:r/>
+            <w:r>
+              <w:rPr>
+                <w:b/>
+                <w:color w:val="1B4D3E"/>
+              </w:rPr>
+              <w:t>Quién la lleva</w:t>
+            </w:r>
+          </w:p>
+        </w:tc>
+        <w:tc>
+          <w:tcPr>
+            <w:tcW w:type="dxa" w:w="3402"/>
+          </w:tcPr>
+          <w:p>
+            <w:r/>
+            <w:r>
+              <w:rPr>
+                <w:b/>
+                <w:color w:val="1B4D3E"/>
+              </w:rPr>
+              <w:t>Cómo se ve</w:t>
+            </w:r>
+          </w:p>
+        </w:tc>
+      </w:tr>
+      <w:tr>
+        <w:tc>
+          <w:tcPr>
+            <w:tcW w:type="dxa" w:w="2835"/>
+          </w:tcPr>
+          <w:p>
+            <w:r>
+              <w:t>Documentos de la caja</w:t>
+            </w:r>
+          </w:p>
+        </w:tc>
+        <w:tc>
+          <w:tcPr>
+            <w:tcW w:type="dxa" w:w="3402"/>
+          </w:tcPr>
+          <w:p>
+            <w:r>
+              <w:t>Cada caja, en su propia base</w:t>
+            </w:r>
+          </w:p>
+        </w:tc>
+        <w:tc>
+          <w:tcPr>
+            <w:tcW w:type="dxa" w:w="3402"/>
+          </w:tcPr>
+          <w:p>
+            <w:r>
+              <w:t>Sucursal + caja + tipo + secuencia (010110000001)</w:t>
+            </w:r>
+          </w:p>
+        </w:tc>
+      </w:tr>
+      <w:tr>
+        <w:tc>
+          <w:tcPr>
+            <w:tcW w:type="dxa" w:w="2835"/>
+          </w:tcPr>
+          <w:p>
+            <w:r>
+              <w:t>Documentos del Central</w:t>
+            </w:r>
+          </w:p>
+        </w:tc>
+        <w:tc>
+          <w:tcPr>
+            <w:tcW w:type="dxa" w:w="3402"/>
+          </w:tcPr>
+          <w:p>
+            <w:r>
+              <w:t>El Central, en esta pantalla</w:t>
+            </w:r>
+          </w:p>
+        </w:tc>
+        <w:tc>
+          <w:tcPr>
+            <w:tcW w:type="dxa" w:w="3402"/>
+          </w:tcPr>
+          <w:p>
+            <w:r>
+              <w:t>Prefijo + correlativo (COT000001)</w:t>
+            </w:r>
+          </w:p>
+        </w:tc>
+      </w:tr>
+      <w:tr>
+        <w:tc>
+          <w:tcPr>
+            <w:tcW w:type="dxa" w:w="2835"/>
+          </w:tcPr>
+          <w:p>
+            <w:r>
+              <w:t>Comprobantes fiscales</w:t>
+            </w:r>
+          </w:p>
+        </w:tc>
+        <w:tc>
+          <w:tcPr>
+            <w:tcW w:type="dxa" w:w="3402"/>
+          </w:tcPr>
+          <w:p>
+            <w:r>
+              <w:t>La caja, con el rango que da la DGII</w:t>
+            </w:r>
+          </w:p>
+        </w:tc>
+        <w:tc>
+          <w:tcPr>
+            <w:tcW w:type="dxa" w:w="3402"/>
+          </w:tcPr>
+          <w:p>
+            <w:r>
+              <w:t>e-NCF (E320000000001)</w:t>
+            </w:r>
+          </w:p>
+        </w:tc>
+      </w:tr>
+    </w:tbl>
+    <w:p/>
+    <w:p>
+      <w:r>
+        <w:t>La de la caja funciona sin internet: la caja factura aunque el Central esté apagado. La de esta pantalla numera lo que nace en el Central (cotizaciones, listas de boda). Y el e-NCF se administra en Fiscal, que es otra cosa.</w:t>
+      </w:r>
+    </w:p>
+    <w:p>
+      <w:pPr>
+        <w:pStyle w:val="ListNumber"/>
+      </w:pPr>
+      <w:r>
+        <w:t>Para agregar la numeración de un documento nuevo, presione «Nueva secuencia» y escriba el prefijo y cómo se llama.</w:t>
+      </w:r>
+    </w:p>
+    <w:p>
+      <w:pPr>
+        <w:pStyle w:val="ListNumber"/>
+      </w:pPr>
+      <w:r>
+        <w:t>Para continuar una numeración que venía de otro sistema, cambie «Último número entregado». Solo se puede subir: bajarlo repetiría números ya usados.</w:t>
+      </w:r>
+    </w:p>
+    <w:p>
+      <w:pPr>
+        <w:pStyle w:val="ListNumber"/>
+      </w:pPr>
+      <w:r>
+        <w:t>Desactivar una secuencia impide crear ese documento y conserva el contador.</w:t>
+      </w:r>
+    </w:p>
+    <w:p>
+      <w:pPr>
+        <w:pStyle w:val="Heading2"/>
+      </w:pPr>
+      <w:r>
+        <w:t>2.16. Cierre consolidado de sucursal</w:t>
       </w:r>
     </w:p>
     <w:p>
@@ -8180,7 +8392,7 @@
         <w:pStyle w:val="Heading2"/>
       </w:pPr>
       <w:r>
-        <w:t>2.16. Reportes</w:t>
+        <w:t>2.17. Reportes</w:t>
       </w:r>
     </w:p>
     <w:p>
@@ -8369,7 +8581,7 @@
         <w:pStyle w:val="Heading2"/>
       </w:pPr>
       <w:r>
-        <w:t>2.17. Monitor de sincronización</w:t>
+        <w:t>2.18. Monitor de sincronización</w:t>
       </w:r>
     </w:p>
     <w:p>
@@ -8393,7 +8605,7 @@
         <w:pStyle w:val="Heading2"/>
       </w:pPr>
       <w:r>
-        <w:t>2.18. Chequeador de precios</w:t>
+        <w:t>2.19. Chequeador de precios</w:t>
       </w:r>
     </w:p>
     <w:p>

</xml_diff>

<commit_message>
refactor: actualizar la numeración de documentos en el Central para usar códigos en lugar de prefijos
</commit_message>
<xml_diff>
--- a/scripts/manual/Manual de usuario CG-POS.docx
+++ b/scripts/manual/Manual de usuario CG-POS.docx
@@ -8311,10 +8311,18 @@
     </w:p>
     <w:p>
       <w:pPr>
+        <w:pStyle w:val="ListBullet"/>
+      </w:pPr>
+      <w:r>
+        <w:t>El CÓDIGO es con lo que el sistema encuentra la secuencia y no se cambia. El PREFIJO es solo lo que se ve delante del número, y ese sí se puede cambiar cuando quiera: lo que ya se emitió conserva el prefijo con el que salió.</w:t>
+      </w:r>
+    </w:p>
+    <w:p>
+      <w:pPr>
         <w:pStyle w:val="ListNumber"/>
       </w:pPr>
       <w:r>
-        <w:t>Para agregar la numeración de un documento nuevo, presione «Nueva secuencia» y escriba el prefijo y cómo se llama.</w:t>
+        <w:t>Para agregar la numeración de un documento nuevo, presione «Nueva secuencia» y escriba su código, su prefijo y cómo se llama.</w:t>
       </w:r>
     </w:p>
     <w:p>

</xml_diff>

<commit_message>
feat: agregar numeración del Central para documentos y actualizar la lógica de asignación de números en el sistema
</commit_message>
<xml_diff>
--- a/scripts/manual/Manual de usuario CG-POS.docx
+++ b/scripts/manual/Manual de usuario CG-POS.docx
@@ -8141,6 +8141,20 @@
           <w:color w:val="2E7D32"/>
         </w:rPr>
         <w:t>Sin su secuencia, el documento NO se puede crear: el sistema lo rechaza diciendo cuál falta. Es a propósito, para que la numeración la decida el negocio y no se invente sola la primera vez que alguien hace el documento.</w:t>
+      </w:r>
+    </w:p>
+    <w:p>
+      <w:r>
+        <w:t>El Central le pone su propio número a los documentos que le suben las cajas. Una factura llega con el número de la caja (010110000001) y el Central le agrega el suyo (FAC000001): los dos quedan guardados y se ven juntos en el listado de facturas. Lo mismo con las notas de crédito, los despachos y el cierre de sucursal.</w:t>
+      </w:r>
+    </w:p>
+    <w:p>
+      <w:r>
+        <w:rPr>
+          <w:i/>
+          <w:color w:val="2E7D32"/>
+        </w:rPr>
+        <w:t>Si al llegar un documento de la caja falta su secuencia, el documento se guarda igual pero sin número del Central: la caja ya lo emitió y perderlo sería peor. Configure la secuencia y los siguientes ya lo traerán.</w:t>
       </w:r>
     </w:p>
     <w:p>

</xml_diff>

<commit_message>
feat(cotizaciones): convertir el editor en página propia y separarlo del listado
El alta y la edición de cotizaciones estaban en un MudDialog dentro del
listado. Ahora viven en EditorCotizacion.razor con rutas /cotizaciones/nueva
y /cotizaciones/{id}, y el listado queda solo para buscar y abrir. Se agrega
"Nueva cotización" al menú y ObtenerCotizacionAsync al cliente, para poder
entrar por URL sin pasar por el listado. Manual actualizado con la sección
del módulo.
</commit_message>
<xml_diff>
--- a/scripts/manual/Manual de usuario CG-POS.docx
+++ b/scripts/manual/Manual de usuario CG-POS.docx
@@ -8040,7 +8040,74 @@
         <w:pStyle w:val="Heading2"/>
       </w:pPr>
       <w:r>
-        <w:t>2.13. Fidelidad</w:t>
+        <w:t>2.13. Cotizaciones</w:t>
+      </w:r>
+    </w:p>
+    <w:p>
+      <w:r>
+        <w:t>Ruta: /cotizaciones. Es el presupuesto que se le arma a un cliente desde cualquier computadora con navegador: no hace falta que sea una caja. Los precios quedan congelados mientras la cotización esté vigente, y después cualquier caja de cualquier sucursal la convierte en factura buscándola por su número (F9).</w:t>
+      </w:r>
+    </w:p>
+    <w:p>
+      <w:pPr>
+        <w:pStyle w:val="ListNumber"/>
+      </w:pPr>
+      <w:r>
+        <w:t>Para hacer una nueva, use «Nueva cotización» del menú o el botón del listado: se abre una pantalla completa, no una ventanita.</w:t>
+      </w:r>
+    </w:p>
+    <w:p>
+      <w:pPr>
+        <w:pStyle w:val="ListNumber"/>
+      </w:pPr>
+      <w:r>
+        <w:t>Escriba el nombre del cliente y, si lo tiene, su cédula o RNC, teléfono y correo.</w:t>
+      </w:r>
+    </w:p>
+    <w:p>
+      <w:pPr>
+        <w:pStyle w:val="ListNumber"/>
+      </w:pPr>
+      <w:r>
+        <w:t>Agregue los artículos: se buscan por código interno o descripción y traen el precio del día, que se puede cambiar a mano igual que el descuento.</w:t>
+      </w:r>
+    </w:p>
+    <w:p>
+      <w:pPr>
+        <w:pStyle w:val="ListNumber"/>
+      </w:pPr>
+      <w:r>
+        <w:t>Guarde: el Central le asigna su número (por ejemplo COT000001) y su fecha de vencimiento, según los días configurados en Parámetros.</w:t>
+      </w:r>
+    </w:p>
+    <w:p>
+      <w:pPr>
+        <w:pStyle w:val="ListNumber"/>
+      </w:pPr>
+      <w:r>
+        <w:t>Con «Imprimir» sale el PDF en tamaño carta para entregárselo o enviárselo al cliente.</w:t>
+      </w:r>
+    </w:p>
+    <w:p>
+      <w:r>
+        <w:t>El listado queda solo para buscar: escriba el número, el cliente, su documento o el número de la factura, o filtre por estado. Al tocar una fila se abre esa cotización en su pantalla.</w:t>
+      </w:r>
+    </w:p>
+    <w:p>
+      <w:r>
+        <w:rPr>
+          <w:i/>
+          <w:color w:val="2E7D32"/>
+        </w:rPr>
+        <w:t>Una cotización ya facturada o anulada se abre igual, pero solo para consultarla: no se modifica.</w:t>
+      </w:r>
+    </w:p>
+    <w:p>
+      <w:pPr>
+        <w:pStyle w:val="Heading2"/>
+      </w:pPr>
+      <w:r>
+        <w:t>2.14. Fidelidad</w:t>
       </w:r>
     </w:p>
     <w:p>
@@ -8053,7 +8120,7 @@
         <w:pStyle w:val="Heading2"/>
       </w:pPr>
       <w:r>
-        <w:t>2.14. Despacho de pendientes y envíos</w:t>
+        <w:t>2.15. Despacho de pendientes y envíos</w:t>
       </w:r>
     </w:p>
     <w:p>
@@ -8126,7 +8193,7 @@
         <w:pStyle w:val="Heading2"/>
       </w:pPr>
       <w:r>
-        <w:t>2.15. Secuencias de documentos</w:t>
+        <w:t>2.16. Secuencias de documentos</w:t>
       </w:r>
     </w:p>
     <w:p>
@@ -8360,7 +8427,7 @@
         <w:pStyle w:val="Heading2"/>
       </w:pPr>
       <w:r>
-        <w:t>2.16. Cierre consolidado de sucursal</w:t>
+        <w:t>2.17. Cierre consolidado de sucursal</w:t>
       </w:r>
     </w:p>
     <w:p>
@@ -8414,7 +8481,7 @@
         <w:pStyle w:val="Heading2"/>
       </w:pPr>
       <w:r>
-        <w:t>2.17. Reportes</w:t>
+        <w:t>2.18. Reportes</w:t>
       </w:r>
     </w:p>
     <w:p>
@@ -8603,7 +8670,7 @@
         <w:pStyle w:val="Heading2"/>
       </w:pPr>
       <w:r>
-        <w:t>2.18. Monitor de sincronización</w:t>
+        <w:t>2.19. Monitor de sincronización</w:t>
       </w:r>
     </w:p>
     <w:p>
@@ -8627,7 +8694,7 @@
         <w:pStyle w:val="Heading2"/>
       </w:pPr>
       <w:r>
-        <w:t>2.19. Chequeador de precios</w:t>
+        <w:t>2.20. Chequeador de precios</w:t>
       </w:r>
     </w:p>
     <w:p>

</xml_diff>

<commit_message>
feat(listas-boda): convertir el editor en página propia y separarlo del listado
Mismo cambio que en cotizaciones: el alta y la edición salen del MudDialog
y pasan a EditorListaBoda.razor, con rutas /listas-boda/nueva y
/listas-boda/{id}. El listado queda solo para buscar y abrir. Se agrega
"Nueva lista" al menú y ObtenerListaBodaAsync al cliente, para entrar por
URL sin pasar por el listado. Manual actualizado.
</commit_message>
<xml_diff>
--- a/scripts/manual/Manual de usuario CG-POS.docx
+++ b/scripts/manual/Manual de usuario CG-POS.docx
@@ -8008,7 +8008,15 @@
         <w:pStyle w:val="ListNumber"/>
       </w:pPr>
       <w:r>
-        <w:t>Nueva lista: datos de los festejados (cédula o RNC, teléfono, correo), del evento (nombre, fecha, lugar) y los artículos pedidos con su cantidad. Los artículos se buscan por su código interno o su descripción y se eligen del maestro: no se escriben a mano, para que lo pedido sea exactamente lo que la caja cobra.</w:t>
+        <w:t>Para hacer una nueva, use «Nueva lista» del menú o el botón del listado: se abre una pantalla completa, no una ventanita.</w:t>
+      </w:r>
+    </w:p>
+    <w:p>
+      <w:pPr>
+        <w:pStyle w:val="ListNumber"/>
+      </w:pPr>
+      <w:r>
+        <w:t>Escriba los datos de los festejados (cédula o RNC, teléfono, correo), los del evento (nombre, fecha, lugar) y los artículos pedidos con su cantidad. Los artículos se buscan por su código interno o su descripción y se eligen del maestro: no se escriben a mano, para que lo pedido sea exactamente lo que la caja cobra.</w:t>
       </w:r>
     </w:p>
     <w:p>
@@ -8033,6 +8041,11 @@
       </w:pPr>
       <w:r>
         <w:t>Cuando pasa el evento, la lista se cierra (y se puede reabrir si hace falta).</w:t>
+      </w:r>
+    </w:p>
+    <w:p>
+      <w:r>
+        <w:t>El listado queda solo para buscar: escriba el número, el evento, el cliente o su documento, o filtre por estado. Al tocar una fila se abre esa lista en su pantalla, con lo comprado y las facturas registradas.</w:t>
       </w:r>
     </w:p>
     <w:p>

</xml_diff>

<commit_message>
feat(central): captura rápida de artículos por teclado en cotizaciones y listas de boda
El editor tenía una fila de autocompletar por artículo y había que
presionar "Agregar artículo" para cada uno. Ahora hay una sola fila de
captura: código + Enter busca el artículo y el foco avanza solo hasta que
la línea entra a la lista y todo vuelve al código. Se agrega
DialogoBuscarArticulo, un modal de búsqueda por código o descripción
compartido por los dos módulos, que también se abre solo cuando el código
digitado no existe. Lo último agregado se muestra primero y el total pasa
al lado de la observación.
</commit_message>
<xml_diff>
--- a/scripts/manual/Manual de usuario CG-POS.docx
+++ b/scripts/manual/Manual de usuario CG-POS.docx
@@ -8016,7 +8016,23 @@
         <w:pStyle w:val="ListNumber"/>
       </w:pPr>
       <w:r>
-        <w:t>Escriba los datos de los festejados (cédula o RNC, teléfono, correo), los del evento (nombre, fecha, lugar) y los artículos pedidos con su cantidad. Los artículos se buscan por su código interno o su descripción y se eligen del maestro: no se escriben a mano, para que lo pedido sea exactamente lo que la caja cobra.</w:t>
+        <w:t>Escriba los datos de los festejados (cédula o RNC, teléfono, correo) y los del evento (nombre, fecha, lugar).</w:t>
+      </w:r>
+    </w:p>
+    <w:p>
+      <w:pPr>
+        <w:pStyle w:val="ListNumber"/>
+      </w:pPr>
+      <w:r>
+        <w:t>Agregue los artículos sin soltar el teclado: digite el código y presione Enter (trae la descripción y salta a la cantidad), escriba la cantidad y otro Enter lo pasa a la lista y vuelve al código, vacío y listo para el siguiente. Lo último agregado queda arriba.</w:t>
+      </w:r>
+    </w:p>
+    <w:p>
+      <w:pPr>
+        <w:pStyle w:val="ListNumber"/>
+      </w:pPr>
+      <w:r>
+        <w:t>Si no se sabe el código, presione la lupa del campo y busque el artículo por código o por descripción. Los artículos siempre se eligen del maestro, nunca se escriben a mano, para que lo pedido sea exactamente lo que la caja cobra.</w:t>
       </w:r>
     </w:p>
     <w:p>
@@ -8082,7 +8098,20 @@
         <w:pStyle w:val="ListNumber"/>
       </w:pPr>
       <w:r>
-        <w:t>Agregue los artículos: se buscan por código interno o descripción y traen el precio del día, que se puede cambiar a mano igual que el descuento.</w:t>
+        <w:t>Agregue los artículos sin soltar el teclado: digite el código y presione Enter (trae la descripción y el precio del día y salta a la cantidad), escriba la cantidad y Enter (salta al descuento), y otro Enter lo pasa a la lista y vuelve al código, vacío y listo para el siguiente.</w:t>
+      </w:r>
+    </w:p>
+    <w:p>
+      <w:pPr>
+        <w:pStyle w:val="ListNumber"/>
+      </w:pPr>
+      <w:r>
+        <w:t>Si no se sabe el código, presione la lupa del campo: se abre una ventana para buscar el artículo por código o por descripción, y el que se elija cae en el campo del código. Si lo digitado no existe, esa ventana se abre sola con lo que se escribió.</w:t>
+      </w:r>
+    </w:p>
+    <w:p>
+      <w:r>
+        <w:t>Lo último agregado queda arriba en la lista. El precio, la cantidad y el descuento se siguen pudiendo cambiar en la línea, y el total se ve arriba, al lado de la observación.</w:t>
       </w:r>
     </w:p>
     <w:p>

</xml_diff>

<commit_message>
fix(maestros): buscar los códigos de artículo completos, no por pedazos
El código interno, el de barras y el de proveedor se buscaban con
Contains, así que digitar "040100" devolvía cientos de artículos que solo
empiezan igual. Un código es el artículo o no lo es: ahora se comparan
completos y solo la descripción sigue buscándose por parecido. En los
editores de cotización y lista de boda, un código que no existe abre la
ventana de búsqueda con lo digitado.
</commit_message>
<xml_diff>
--- a/scripts/manual/Manual de usuario CG-POS.docx
+++ b/scripts/manual/Manual de usuario CG-POS.docx
@@ -2031,6 +2031,15 @@
       </w:tr>
     </w:tbl>
     <w:p/>
+    <w:p>
+      <w:r>
+        <w:rPr>
+          <w:i/>
+          <w:color w:val="2E7D32"/>
+        </w:rPr>
+        <w:t>Al buscar un artículo, el código interno, el de barras y el de proveedor se buscan completos: se escribe el código entero o no aparece. Solo la descripción se busca por parecido. Es a propósito: buscar «040100» por pedazos devolvía cientos de artículos que solo empiezan igual.</w:t>
+      </w:r>
+    </w:p>
     <w:p>
       <w:pPr>
         <w:pStyle w:val="Heading3"/>

</xml_diff>

<commit_message>
feat(central): elegir si se busca por descripción o por código en artículos y precios
Un select al lado del buscador acota la búsqueda: la descripción por
parecido y el código (interno, de barras o de proveedor) completo. El
filtro por campo baja hasta la consulta, así que no se traen filas de más.
Además, en cotizaciones el precio deja de digitarse (es el del maestro) y
la cantidad y el descuento arrancan vacíos; en listas de boda se muestra
el precio del día del artículo que se agrega.
</commit_message>
<xml_diff>
--- a/scripts/manual/Manual de usuario CG-POS.docx
+++ b/scripts/manual/Manual de usuario CG-POS.docx
@@ -2037,7 +2037,7 @@
           <w:i/>
           <w:color w:val="2E7D32"/>
         </w:rPr>
-        <w:t>Al buscar un artículo, el código interno, el de barras y el de proveedor se buscan completos: se escribe el código entero o no aparece. Solo la descripción se busca por parecido. Es a propósito: buscar «040100» por pedazos devolvía cientos de artículos que solo empiezan igual.</w:t>
+        <w:t>En Artículos y en Precios, al lado del buscador hay un «Buscar por» donde se elige Descripción o Código. La descripción se busca por parecido; el código (interno, de barras o de proveedor) hay que escribirlo completo, porque un código es el artículo o no lo es: buscar «040100» por pedazos devolvía cientos de artículos que solo empiezan igual.</w:t>
       </w:r>
     </w:p>
     <w:p>
@@ -8033,7 +8033,7 @@
         <w:pStyle w:val="ListNumber"/>
       </w:pPr>
       <w:r>
-        <w:t>Agregue los artículos sin soltar el teclado: digite el código y presione Enter (trae la descripción y salta a la cantidad), escriba la cantidad y otro Enter lo pasa a la lista y vuelve al código, vacío y listo para el siguiente. Lo último agregado queda arriba.</w:t>
+        <w:t>Agregue los artículos sin soltar el teclado: digite el código y presione Enter (trae la descripción y el precio del día y salta a la cantidad), escriba la cantidad y otro Enter lo pasa a la lista y vuelve al código, vacío y listo para el siguiente. Si no escribe cantidad, vale una unidad. Lo último agregado queda arriba.</w:t>
       </w:r>
     </w:p>
     <w:p>
@@ -8042,6 +8042,15 @@
       </w:pPr>
       <w:r>
         <w:t>Si no se sabe el código, presione la lupa del campo y busque el artículo por código o por descripción. Los artículos siempre se eligen del maestro, nunca se escriben a mano, para que lo pedido sea exactamente lo que la caja cobra.</w:t>
+      </w:r>
+    </w:p>
+    <w:p>
+      <w:r>
+        <w:rPr>
+          <w:i/>
+          <w:color w:val="2E7D32"/>
+        </w:rPr>
+        <w:t>El precio que se ve al agregar es el del día, solo para orientar a los festejados: la lista guarda lo pedido, no precios, y la caja cobra el precio que esté vigente el día de cada compra. Por eso los artículos de una lista ya guardada muestran una raya en vez de precio.</w:t>
       </w:r>
     </w:p>
     <w:p>
@@ -8107,7 +8116,7 @@
         <w:pStyle w:val="ListNumber"/>
       </w:pPr>
       <w:r>
-        <w:t>Agregue los artículos sin soltar el teclado: digite el código y presione Enter (trae la descripción y el precio del día y salta a la cantidad), escriba la cantidad y Enter (salta al descuento), y otro Enter lo pasa a la lista y vuelve al código, vacío y listo para el siguiente.</w:t>
+        <w:t>Agregue los artículos sin soltar el teclado: digite el código y presione Enter (trae la descripción y el precio del día y salta a la cantidad), escriba la cantidad y Enter (salta al descuento), y otro Enter lo pasa a la lista y vuelve al código, vacío y listo para el siguiente. La cantidad y el descuento salen vacíos: si no escribe nada, vale una unidad y sin descuento.</w:t>
       </w:r>
     </w:p>
     <w:p>
@@ -8120,7 +8129,7 @@
     </w:p>
     <w:p>
       <w:r>
-        <w:t>Lo último agregado queda arriba en la lista. El precio, la cantidad y el descuento se siguen pudiendo cambiar en la línea, y el total se ve arriba, al lado de la observación.</w:t>
+        <w:t>Lo último agregado queda arriba en la lista. El precio es el del maestro y no se digita: lo que se cotiza es el precio del día. La cantidad y el descuento sí se pueden corregir en la línea, y el total se ve arriba, al lado de la observación.</w:t>
       </w:r>
     </w:p>
     <w:p>

</xml_diff>

<commit_message>
feat(caja): avisar en pantalla cuando la caja está bajando datos del Central
Una caja recién configurada tarda en tener sus datos y la pantalla decía
que la caja no había llegado del Central, que es lo que se ve cuando algo
está roto de verdad. Ahora la sincronización publica en qué anda y la
pantalla de ingreso lo muestra, se refresca sola y se habilita al
terminar; la barra de estado de la venta también lo dice. Cuando una
actualización falla, el motivo se ve en la pantalla y el mensaje nombra el
artículo. Además, un artículo inactivo ya no necesita precio: uno solo con
precio cero impedía que la caja bajara todos los maestros.
</commit_message>
<xml_diff>
--- a/scripts/manual/Manual de usuario CG-POS.docx
+++ b/scripts/manual/Manual de usuario CG-POS.docx
@@ -9140,6 +9140,15 @@
       </w:r>
     </w:p>
     <w:p>
+      <w:r>
+        <w:rPr>
+          <w:i/>
+          <w:color w:val="2E7D32"/>
+        </w:rPr>
+        <w:t>Una caja recién configurada tarda en tener sus datos: mientras el Central se los manda, la pantalla dice «Actualizando los datos de la caja…» y en qué anda. No hay nada que hacer, solo esperar: la pantalla se habilita sola al terminar. Si en vez de eso sale un aviso rojo, ahí sí hay algo que revisar, y debajo dice qué fue lo que no se pudo aplicar.</w:t>
+      </w:r>
+    </w:p>
+    <w:p>
       <w:pPr>
         <w:pStyle w:val="ListNumber"/>
       </w:pPr>
@@ -10909,7 +10918,7 @@
         <w:pStyle w:val="ListBullet"/>
       </w:pPr>
       <w:r>
-        <w:t>Sincronización: si la caja está comunicada con el Central y cuántos documentos están pendientes de enviar.</w:t>
+        <w:t>Sincronización: si la caja está comunicada con el Central y cuántos documentos están pendientes de enviar. Mientras baja datos dice «Actualizando» y en qué anda, y al pasar el mouse por encima se lee el detalle del último error, si lo hubo.</w:t>
       </w:r>
     </w:p>
     <w:p>
@@ -11327,6 +11336,28 @@
           <w:p>
             <w:r>
               <w:t>La caja lo avisa. Se puede registrar la aprobación manual del banco con autorización de supervisor, y queda marcada para conciliar.</w:t>
+            </w:r>
+          </w:p>
+        </w:tc>
+      </w:tr>
+      <w:tr>
+        <w:tc>
+          <w:tcPr>
+            <w:tcW w:type="dxa" w:w="2551"/>
+          </w:tcPr>
+          <w:p>
+            <w:r>
+              <w:t>La caja no baja los artículos nuevos</w:t>
+            </w:r>
+          </w:p>
+        </w:tc>
+        <w:tc>
+          <w:tcPr>
+            <w:tcW w:type="dxa" w:w="7087"/>
+          </w:tcPr>
+          <w:p>
+            <w:r>
+              <w:t>Pase el mouse por el indicador de sincronización de la barra de estado: si la última actualización falló, ahí dice por qué y de qué artículo se trata. Casi siempre es un dato del Central que la caja no acepta (un artículo activo sin precio, una categoría que no es de su departamento). Se corrige en el Central y la caja lo aplica sola en el siguiente ciclo, sin perder nada.</w:t>
             </w:r>
           </w:p>
         </w:tc>

</xml_diff>

<commit_message>
refactor(entregas): quitar el maestro de almacenes y retirar por sucursal
Cada sucursal tiene un solo punto de entrega, así que el almacén era un
maestro con un registro por sucursal que no decía nada nuevo y obligaba a
la caja a conocer los almacenes de las demás tiendas. Ahora el pendiente
guarda la sucursal donde el cliente retira: MetodoEntrega.RetiroSucursal y
SucursalRetiroId/Nombre. Se elimina la tabla en las dos bases, el catálogo
del Central y su prueba. Los ALTER van por texto.
</commit_message>
<xml_diff>
--- a/scripts/manual/Manual de usuario CG-POS.docx
+++ b/scripts/manual/Manual de usuario CG-POS.docx
@@ -832,7 +832,7 @@
           </w:tcPr>
           <w:p>
             <w:r>
-              <w:t>Bancos y almacenes</w:t>
+              <w:t>Bancos</w:t>
             </w:r>
           </w:p>
         </w:tc>
@@ -5755,7 +5755,16 @@
     <w:p/>
     <w:p>
       <w:r>
-        <w:t>5. Almacenes, para las entregas y los envíos: uno por sucursal y, si aplica, el depósito desde donde se despacha.</w:t>
+        <w:rPr>
+          <w:i/>
+          <w:color w:val="2E7D32"/>
+        </w:rPr>
+        <w:t>Las entregas no necesitan nada más: lo que el cliente deja para retirar se retira en una sucursal, la suya o la que él diga, y las sucursales ya están creadas.</w:t>
+      </w:r>
+    </w:p>
+    <w:p>
+      <w:r>
+        <w:t>5. Programa de fidelidad (si lo van a usar): niveles y cómo se acumulan los puntos.</w:t>
       </w:r>
     </w:p>
     <w:tbl>
@@ -5772,7 +5781,7 @@
       <w:tr>
         <w:tc>
           <w:tcPr>
-            <w:tcW w:type="dxa" w:w="1587"/>
+            <w:tcW w:type="dxa" w:w="1701"/>
           </w:tcPr>
           <w:p>
             <w:r/>
@@ -5781,13 +5790,13 @@
                 <w:b/>
                 <w:color w:val="1B4D3E"/>
               </w:rPr>
-              <w:t>Código</w:t>
-            </w:r>
-          </w:p>
-        </w:tc>
-        <w:tc>
-          <w:tcPr>
-            <w:tcW w:type="dxa" w:w="2835"/>
+              <w:t>Nivel</w:t>
+            </w:r>
+          </w:p>
+        </w:tc>
+        <w:tc>
+          <w:tcPr>
+            <w:tcW w:type="dxa" w:w="1417"/>
           </w:tcPr>
           <w:p>
             <w:r/>
@@ -5796,13 +5805,13 @@
                 <w:b/>
                 <w:color w:val="1B4D3E"/>
               </w:rPr>
-              <w:t>Almacén</w:t>
-            </w:r>
-          </w:p>
-        </w:tc>
-        <w:tc>
-          <w:tcPr>
-            <w:tcW w:type="dxa" w:w="3969"/>
+              <w:t>Factor</w:t>
+            </w:r>
+          </w:p>
+        </w:tc>
+        <w:tc>
+          <w:tcPr>
+            <w:tcW w:type="dxa" w:w="5386"/>
           </w:tcPr>
           <w:p>
             <w:r/>
@@ -5811,7 +5820,7 @@
                 <w:b/>
                 <w:color w:val="1B4D3E"/>
               </w:rPr>
-              <w:t>Para qué</w:t>
+              <w:t>Regla de acumulación sugerida</w:t>
             </w:r>
           </w:p>
         </w:tc>
@@ -5819,31 +5828,31 @@
       <w:tr>
         <w:tc>
           <w:tcPr>
-            <w:tcW w:type="dxa" w:w="1587"/>
-          </w:tcPr>
-          <w:p>
-            <w:r>
-              <w:t>ALM-01</w:t>
-            </w:r>
-          </w:p>
-        </w:tc>
-        <w:tc>
-          <w:tcPr>
-            <w:tcW w:type="dxa" w:w="2835"/>
-          </w:tcPr>
-          <w:p>
-            <w:r>
-              <w:t>Almacén de la sucursal</w:t>
-            </w:r>
-          </w:p>
-        </w:tc>
-        <w:tc>
-          <w:tcPr>
-            <w:tcW w:type="dxa" w:w="3969"/>
-          </w:tcPr>
-          <w:p>
-            <w:r>
-              <w:t>Retiro del cliente en el local</w:t>
+            <w:tcW w:type="dxa" w:w="1701"/>
+          </w:tcPr>
+          <w:p>
+            <w:r>
+              <w:t>Clásico</w:t>
+            </w:r>
+          </w:p>
+        </w:tc>
+        <w:tc>
+          <w:tcPr>
+            <w:tcW w:type="dxa" w:w="1417"/>
+          </w:tcPr>
+          <w:p>
+            <w:r>
+              <w:t>1.0</w:t>
+            </w:r>
+          </w:p>
+        </w:tc>
+        <w:tc>
+          <w:tcPr>
+            <w:tcW w:type="dxa" w:w="5386"/>
+          </w:tcPr>
+          <w:p>
+            <w:r>
+              <w:t>1 punto por cada RD$100 de compra</w:t>
             </w:r>
           </w:p>
         </w:tc>
@@ -5851,31 +5860,31 @@
       <w:tr>
         <w:tc>
           <w:tcPr>
-            <w:tcW w:type="dxa" w:w="1587"/>
-          </w:tcPr>
-          <w:p>
-            <w:r>
-              <w:t>DEP-CEN</w:t>
-            </w:r>
-          </w:p>
-        </w:tc>
-        <w:tc>
-          <w:tcPr>
-            <w:tcW w:type="dxa" w:w="2835"/>
-          </w:tcPr>
-          <w:p>
-            <w:r>
-              <w:t>Depósito central</w:t>
-            </w:r>
-          </w:p>
-        </w:tc>
-        <w:tc>
-          <w:tcPr>
-            <w:tcW w:type="dxa" w:w="3969"/>
-          </w:tcPr>
-          <w:p>
-            <w:r>
-              <w:t>Pedidos grandes que salen del depósito (cajas, barriles)</w:t>
+            <w:tcW w:type="dxa" w:w="1701"/>
+          </w:tcPr>
+          <w:p>
+            <w:r>
+              <w:t>Oro</w:t>
+            </w:r>
+          </w:p>
+        </w:tc>
+        <w:tc>
+          <w:tcPr>
+            <w:tcW w:type="dxa" w:w="1417"/>
+          </w:tcPr>
+          <w:p>
+            <w:r>
+              <w:t>1.5</w:t>
+            </w:r>
+          </w:p>
+        </w:tc>
+        <w:tc>
+          <w:tcPr>
+            <w:tcW w:type="dxa" w:w="5386"/>
+          </w:tcPr>
+          <w:p>
+            <w:r>
+              <w:t>El mismo acumulado, multiplicado por el factor del nivel</w:t>
             </w:r>
           </w:p>
         </w:tc>
@@ -5884,136 +5893,7 @@
     <w:p/>
     <w:p>
       <w:r>
-        <w:t>6. Programa de fidelidad (si lo van a usar): niveles y cómo se acumulan los puntos.</w:t>
-      </w:r>
-    </w:p>
-    <w:tbl>
-      <w:tblPr>
-        <w:tblStyle w:val="TableGrid"/>
-        <w:tblW w:type="auto" w:w="0"/>
-        <w:tblLook w:firstColumn="1" w:firstRow="1" w:lastColumn="0" w:lastRow="0" w:noHBand="0" w:noVBand="1" w:val="04A0"/>
-      </w:tblPr>
-      <w:tblGrid>
-        <w:gridCol w:w="3173"/>
-        <w:gridCol w:w="3173"/>
-        <w:gridCol w:w="3173"/>
-      </w:tblGrid>
-      <w:tr>
-        <w:tc>
-          <w:tcPr>
-            <w:tcW w:type="dxa" w:w="1701"/>
-          </w:tcPr>
-          <w:p>
-            <w:r/>
-            <w:r>
-              <w:rPr>
-                <w:b/>
-                <w:color w:val="1B4D3E"/>
-              </w:rPr>
-              <w:t>Nivel</w:t>
-            </w:r>
-          </w:p>
-        </w:tc>
-        <w:tc>
-          <w:tcPr>
-            <w:tcW w:type="dxa" w:w="1417"/>
-          </w:tcPr>
-          <w:p>
-            <w:r/>
-            <w:r>
-              <w:rPr>
-                <w:b/>
-                <w:color w:val="1B4D3E"/>
-              </w:rPr>
-              <w:t>Factor</w:t>
-            </w:r>
-          </w:p>
-        </w:tc>
-        <w:tc>
-          <w:tcPr>
-            <w:tcW w:type="dxa" w:w="5386"/>
-          </w:tcPr>
-          <w:p>
-            <w:r/>
-            <w:r>
-              <w:rPr>
-                <w:b/>
-                <w:color w:val="1B4D3E"/>
-              </w:rPr>
-              <w:t>Regla de acumulación sugerida</w:t>
-            </w:r>
-          </w:p>
-        </w:tc>
-      </w:tr>
-      <w:tr>
-        <w:tc>
-          <w:tcPr>
-            <w:tcW w:type="dxa" w:w="1701"/>
-          </w:tcPr>
-          <w:p>
-            <w:r>
-              <w:t>Clásico</w:t>
-            </w:r>
-          </w:p>
-        </w:tc>
-        <w:tc>
-          <w:tcPr>
-            <w:tcW w:type="dxa" w:w="1417"/>
-          </w:tcPr>
-          <w:p>
-            <w:r>
-              <w:t>1.0</w:t>
-            </w:r>
-          </w:p>
-        </w:tc>
-        <w:tc>
-          <w:tcPr>
-            <w:tcW w:type="dxa" w:w="5386"/>
-          </w:tcPr>
-          <w:p>
-            <w:r>
-              <w:t>1 punto por cada RD$100 de compra</w:t>
-            </w:r>
-          </w:p>
-        </w:tc>
-      </w:tr>
-      <w:tr>
-        <w:tc>
-          <w:tcPr>
-            <w:tcW w:type="dxa" w:w="1701"/>
-          </w:tcPr>
-          <w:p>
-            <w:r>
-              <w:t>Oro</w:t>
-            </w:r>
-          </w:p>
-        </w:tc>
-        <w:tc>
-          <w:tcPr>
-            <w:tcW w:type="dxa" w:w="1417"/>
-          </w:tcPr>
-          <w:p>
-            <w:r>
-              <w:t>1.5</w:t>
-            </w:r>
-          </w:p>
-        </w:tc>
-        <w:tc>
-          <w:tcPr>
-            <w:tcW w:type="dxa" w:w="5386"/>
-          </w:tcPr>
-          <w:p>
-            <w:r>
-              <w:t>El mismo acumulado, multiplicado por el factor del nivel</w:t>
-            </w:r>
-          </w:p>
-        </w:tc>
-      </w:tr>
-    </w:tbl>
-    <w:p/>
-    <w:p>
-      <w:r>
-        <w:t>7. Topes de descuento por nivel de quien autoriza, para que nadie descuente de más.</w:t>
+        <w:t>6. Topes de descuento por nivel de quien autoriza, para que nadie descuente de más.</w:t>
       </w:r>
     </w:p>
     <w:tbl>
@@ -6106,17 +5986,17 @@
     <w:p/>
     <w:p>
       <w:r>
-        <w:t>8. Usuarios y roles de caja: al menos un cajero (solo vender y cobrar), un supervisor (autoriza descuentos, devoluciones, retiros y notas internas) y un gerente (además autoriza lo de mayor monto).</w:t>
+        <w:t>7. Usuarios y roles de caja: al menos un cajero (solo vender y cobrar), un supervisor (autoriza descuentos, devoluciones, retiros y notas internas) y un gerente (además autoriza lo de mayor monto).</w:t>
       </w:r>
     </w:p>
     <w:p>
       <w:r>
-        <w:t>9. Rangos de comprobantes fiscales por caja (E31, E32, E34, E44 y E45), con los números que le asignó la DGII.</w:t>
+        <w:t>8. Rangos de comprobantes fiscales por caja (E31, E32, E34, E44 y E45), con los números que le asignó la DGII.</w:t>
       </w:r>
     </w:p>
     <w:p>
       <w:r>
-        <w:t>10. Clientes: los colmados, bares y restaurantes a los que les factura con crédito fiscal conviene registrarlos, con su contacto, sus teléfonos y su dirección de entrega. Los demás se buscan en la caja por cédula o RNC, y el listado de la DGII se puede cargar completo como se explica en 2.5.1.</w:t>
+        <w:t>9. Clientes: los colmados, bares y restaurantes a los que les factura con crédito fiscal conviene registrarlos, con su contacto, sus teléfonos y su dirección de entrega. Los demás se buscan en la caja por cédula o RNC, y el listado de la DGII se puede cargar completo como se explica en 2.5.1.</w:t>
       </w:r>
     </w:p>
     <w:p>
@@ -10580,7 +10460,7 @@
         <w:pStyle w:val="ListNumber"/>
       </w:pPr>
       <w:r>
-        <w:t>Marque qué líneas y qué cantidad quedan pendientes, y si es retiro en un almacén o envío a una dirección, con la fecha comprometida.</w:t>
+        <w:t>Marque qué líneas y qué cantidad quedan pendientes, y si el cliente lo retira en una sucursal (la suya u otra) o se le envía a una dirección, con la fecha comprometida.</w:t>
       </w:r>
     </w:p>
     <w:p>
@@ -10588,7 +10468,7 @@
         <w:pStyle w:val="ListNumber"/>
       </w:pPr>
       <w:r>
-        <w:t>Al cobrar se imprime un comprobante de pendiente por cada destino, con código de barras: una copia para el cliente y otra para el almacén.</w:t>
+        <w:t>Al cobrar se imprime un comprobante de pendiente por cada destino, con código de barras: una copia para el cliente y otra para quien despacha.</w:t>
       </w:r>
     </w:p>
     <w:p>
@@ -10992,7 +10872,7 @@
         <w:pStyle w:val="ListNumber"/>
       </w:pPr>
       <w:r>
-        <w:t>Revise los catálogos que ya trae la base (monedas, impuestos, unidades, formas de pago, denominaciones, motivos) y cree los suyos: departamentos, categorías, marcas, bancos y almacenes.</w:t>
+        <w:t>Revise los catálogos que ya trae la base (monedas, impuestos, unidades, formas de pago, denominaciones, motivos) y cree los suyos: departamentos, categorías, marcas y bancos.</w:t>
       </w:r>
     </w:p>
     <w:p>

</xml_diff>

<commit_message>
feat(publicidad): actualizar manejo de publicidad en pantalla del cliente, incluyendo soporte para videos y mejoras en la documentación
</commit_message>
<xml_diff>
--- a/scripts/manual/Manual de usuario CG-POS.docx
+++ b/scripts/manual/Manual de usuario CG-POS.docx
@@ -8953,7 +8953,162 @@
         <w:pStyle w:val="Heading3"/>
       </w:pPr>
       <w:r>
-        <w:t>3.1.2. Cambiar una caja de equipo</w:t>
+        <w:t>3.1.2. La publicidad de la pantalla del cliente</w:t>
+      </w:r>
+    </w:p>
+    <w:p>
+      <w:r>
+        <w:t>El segundo monitor muestra la venta y, al lado, la publicidad del negocio. Los archivos se copian en la carpeta C:\CGPOS\Publicidad del equipo de esa caja y se muestran en orden alfabético, así que conviene nombrarlos 01-..., 02-... y así.</w:t>
+      </w:r>
+    </w:p>
+    <w:tbl>
+      <w:tblPr>
+        <w:tblStyle w:val="TableGrid"/>
+        <w:tblW w:type="auto" w:w="0"/>
+        <w:tblLook w:firstColumn="1" w:firstRow="1" w:lastColumn="0" w:lastRow="0" w:noHBand="0" w:noVBand="1" w:val="04A0"/>
+      </w:tblPr>
+      <w:tblGrid>
+        <w:gridCol w:w="3173"/>
+        <w:gridCol w:w="3173"/>
+        <w:gridCol w:w="3173"/>
+      </w:tblGrid>
+      <w:tr>
+        <w:tc>
+          <w:tcPr>
+            <w:tcW w:type="dxa" w:w="1814"/>
+          </w:tcPr>
+          <w:p>
+            <w:r/>
+            <w:r>
+              <w:rPr>
+                <w:b/>
+                <w:color w:val="1B4D3E"/>
+              </w:rPr>
+              <w:t>Qué se puede poner</w:t>
+            </w:r>
+          </w:p>
+        </w:tc>
+        <w:tc>
+          <w:tcPr>
+            <w:tcW w:type="dxa" w:w="3118"/>
+          </w:tcPr>
+          <w:p>
+            <w:r/>
+            <w:r>
+              <w:rPr>
+                <w:b/>
+                <w:color w:val="1B4D3E"/>
+              </w:rPr>
+              <w:t>Formatos</w:t>
+            </w:r>
+          </w:p>
+        </w:tc>
+        <w:tc>
+          <w:tcPr>
+            <w:tcW w:type="dxa" w:w="4592"/>
+          </w:tcPr>
+          <w:p>
+            <w:r/>
+            <w:r>
+              <w:rPr>
+                <w:b/>
+                <w:color w:val="1B4D3E"/>
+              </w:rPr>
+              <w:t>Cuánto dura en pantalla</w:t>
+            </w:r>
+          </w:p>
+        </w:tc>
+      </w:tr>
+      <w:tr>
+        <w:tc>
+          <w:tcPr>
+            <w:tcW w:type="dxa" w:w="1814"/>
+          </w:tcPr>
+          <w:p>
+            <w:r>
+              <w:t>Imágenes</w:t>
+            </w:r>
+          </w:p>
+        </w:tc>
+        <w:tc>
+          <w:tcPr>
+            <w:tcW w:type="dxa" w:w="3118"/>
+          </w:tcPr>
+          <w:p>
+            <w:r>
+              <w:t>.png, .jpg, .jpeg, .webp, .svg</w:t>
+            </w:r>
+          </w:p>
+        </w:tc>
+        <w:tc>
+          <w:tcPr>
+            <w:tcW w:type="dxa" w:w="4592"/>
+          </w:tcPr>
+          <w:p>
+            <w:r>
+              <w:t>Los segundos del parámetro Pantallas.SegundosPorImagen</w:t>
+            </w:r>
+          </w:p>
+        </w:tc>
+      </w:tr>
+      <w:tr>
+        <w:tc>
+          <w:tcPr>
+            <w:tcW w:type="dxa" w:w="1814"/>
+          </w:tcPr>
+          <w:p>
+            <w:r>
+              <w:t>Videos</w:t>
+            </w:r>
+          </w:p>
+        </w:tc>
+        <w:tc>
+          <w:tcPr>
+            <w:tcW w:type="dxa" w:w="3118"/>
+          </w:tcPr>
+          <w:p>
+            <w:r>
+              <w:t>.mp4, .webm</w:t>
+            </w:r>
+          </w:p>
+        </w:tc>
+        <w:tc>
+          <w:tcPr>
+            <w:tcW w:type="dxa" w:w="4592"/>
+          </w:tcPr>
+          <w:p>
+            <w:r>
+              <w:t>Lo que dure el video: se reproduce completo y sin sonido</w:t>
+            </w:r>
+          </w:p>
+        </w:tc>
+      </w:tr>
+    </w:tbl>
+    <w:p/>
+    <w:p>
+      <w:r>
+        <w:rPr>
+          <w:i/>
+          <w:color w:val="2E7D32"/>
+        </w:rPr>
+        <w:t>Los archivos se pueden cambiar con la caja encendida: entran solos cuando el carrusel termina la vuelta, sin reiniciar nada. Y si cambia los segundos por imagen en el Central, la pantalla lo toma en cuanto la caja sincroniza.</w:t>
+      </w:r>
+    </w:p>
+    <w:p>
+      <w:r>
+        <w:rPr>
+          <w:i/>
+          <w:color w:val="2E7D32"/>
+        </w:rPr>
+        <w:t>Un video .avi o .mov no se ve: conviértalo a .mp4 antes de copiarlo. Sin bocinas no se pierde nada, porque el video va siempre sin sonido.</w:t>
+      </w:r>
+    </w:p>
+    <w:p>
+      <w:pPr>
+        <w:pStyle w:val="Heading3"/>
+      </w:pPr>
+      <w:r>
+        <w:t>3.1.3. Cambiar una caja de equipo</w:t>
       </w:r>
     </w:p>
     <w:p>

</xml_diff>

<commit_message>
feat(ventas): separar la venta en tres tablas (temporal, en espera y cobrada) con número de factura al cobrar
- VentasTemp, VentasGuardadas y Ventas, cada una con sus líneas y destinos, su propia secuencia de Id y sus FK
- el número de factura se toma al cobrar, dentro de la transacción del e-CF: la espera ya no consume números
- la factura en espera se nombra con una referencia del cajero; el borrador se identifica como B-000000
- limpiar/anular antes de cobrar borra el borrador y deja el rastro en la auditoría
- cierre de turno lee las tablas de trabajo; la operación de tarjeta queda enlazada con la venta cobrada
- el consumo de NC externa informa la referencia de la reserva para que el Central la cierre
- pruebas y manual actualizados
</commit_message>
<xml_diff>
--- a/scripts/manual/Manual de usuario CG-POS.docx
+++ b/scripts/manual/Manual de usuario CG-POS.docx
@@ -9330,7 +9330,7 @@
           </w:tcPr>
           <w:p>
             <w:r>
-              <w:t>Cliente de la factura, número de transacción, cantidad de artículos, límite de compra, programa de fidelidad y lista de boda.</w:t>
+              <w:t>Cliente de la factura, identificación de la venta (B-000015 mientras se arma; el número de factura se le da al cobrar), cantidad de artículos, límite de compra, programa de fidelidad y lista de boda.</w:t>
             </w:r>
           </w:p>
         </w:tc>
@@ -10562,7 +10562,7 @@
         <w:pStyle w:val="ListBullet"/>
       </w:pPr>
       <w:r>
-        <w:t>F7 – En espera: guarda la venta actual para atender a otro cliente y retomarla después.</w:t>
+        <w:t>F7 – En espera: guarda la venta actual para atender a otro cliente y retomarla después. Se le pone una referencia corta, el nombre del cliente o unos dígitos («Sra. María», «102»), que es con lo que se encuentra en la lista al volver. Dos facturas en espera del mismo turno no pueden llamarse igual.</w:t>
       </w:r>
     </w:p>
     <w:p>
@@ -10570,7 +10570,31 @@
         <w:pStyle w:val="ListBullet"/>
       </w:pPr>
       <w:r>
-        <w:t>Anular (segunda página): cancela la transacción en curso con motivo y autorización.</w:t>
+        <w:t>Para retomar una factura con otra venta en pantalla, escriba también la referencia de la que está en pantalla: las dos se intercambian. Si la de pantalla no tiene artículos, simplemente se descarta.</w:t>
+      </w:r>
+    </w:p>
+    <w:p>
+      <w:pPr>
+        <w:pStyle w:val="ListBullet"/>
+      </w:pPr>
+      <w:r>
+        <w:t>Mientras la venta se arma o está en espera no tiene número de factura: se identifica como B-000015. El número se le da al cobrar, en el orden en que se cobra; así una factura en espera no se lleva el número de otro cliente, y una venta que no se cobró no deja un hueco en la numeración.</w:t>
+      </w:r>
+    </w:p>
+    <w:p>
+      <w:pPr>
+        <w:pStyle w:val="ListBullet"/>
+      </w:pPr>
+      <w:r>
+        <w:t>Una venta con tarjeta ya aprobada no se pone en espera: cóbrela o anule la tarjeta primero.</w:t>
+      </w:r>
+    </w:p>
+    <w:p>
+      <w:pPr>
+        <w:pStyle w:val="ListBullet"/>
+      </w:pPr>
+      <w:r>
+        <w:t>Anular (segunda página): cancela la transacción en curso con motivo y autorización. Como todavía no era una factura, desaparece de la caja; lo que tenía, quién la anuló, quién lo autorizó y el motivo quedan en la auditoría.</w:t>
       </w:r>
     </w:p>
     <w:p>

</xml_diff>

<commit_message>
feat(pantalla-venta): panel lateral de funciones y teclado con cambio ABC/123
- las teclas pasan a un panel desplegable desde la derecha (botón ☰); Buscar y Totalizar quedan siempre visibles
- el panel no quita el foco al campo de escaneo y se cierra al escanear, al elegir, con Esc o con cualquier tecla F
- el teclado en pantalla de códigos y textos cambia entre números y letras; cantidades y montos siguen numéricos
- manual actualizado
</commit_message>
<xml_diff>
--- a/scripts/manual/Manual de usuario CG-POS.docx
+++ b/scripts/manual/Manual de usuario CG-POS.docx
@@ -9330,7 +9330,7 @@
           </w:tcPr>
           <w:p>
             <w:r>
-              <w:t>Cliente de la factura, identificación de la venta (B-000015 mientras se arma; el número de factura se le da al cobrar), cantidad de artículos, límite de compra, programa de fidelidad y lista de boda.</w:t>
+              <w:t>Cliente de la factura, número de factura que le tocará (se toma de verdad al cobrar: si otra venta se cobra antes, esta pasa al siguiente), cantidad de artículos, límite de compra, programa de fidelidad y lista de boda.</w:t>
             </w:r>
           </w:p>
         </w:tc>
@@ -9374,7 +9374,7 @@
           </w:tcPr>
           <w:p>
             <w:r>
-              <w:t>Donde el lector escribe el código. También se puede digitar.</w:t>
+              <w:t>Donde el lector escribe el código. También se puede digitar. A su derecha: catálogo, teclado en pantalla, Buscar (F2), Totalizar (F8) y el botón ☰ que abre el panel de funciones.</w:t>
             </w:r>
           </w:p>
         </w:tc>
@@ -9408,7 +9408,7 @@
           </w:tcPr>
           <w:p>
             <w:r>
-              <w:t>Barra de teclas F</w:t>
+              <w:t>Panel de funciones (☰)</w:t>
             </w:r>
           </w:p>
         </w:tc>
@@ -9418,7 +9418,7 @@
           </w:tcPr>
           <w:p>
             <w:r>
-              <w:t>Las funciones, en dos páginas.</w:t>
+              <w:t>Se despliega desde la derecha con todas las funciones. Se cierra solo al elegir una, al tocar fuera o al escanear: lo que se lee va a la venta.</w:t>
             </w:r>
           </w:p>
         </w:tc>
@@ -9660,7 +9660,12 @@
     </w:p>
     <w:p>
       <w:r>
-        <w:t>Primera página:</w:t>
+        <w:t>Buscar (F2) y Totalizar (F8) están siempre a la vista, junto al campo de escaneo. Todas las demás están en el panel de funciones, que se abre con el botón ☰. Las teclas F del teclado físico funcionan siempre, con el panel abierto o cerrado.</w:t>
+      </w:r>
+    </w:p>
+    <w:p>
+      <w:r>
+        <w:t>Teclas de función:</w:t>
       </w:r>
     </w:p>
     <w:tbl>
@@ -9951,7 +9956,16 @@
     <w:p/>
     <w:p>
       <w:r>
-        <w:t>Segunda página (se cambia con el botón de la misma barra): catálogo en mosaicos, eliminar línea, eliminar por escaneo, limpiar pantalla, descuento a la línea, descuento a la factura, entrega o envío, anular, suspender, gaveta, reimprimir, retiro de efectivo, cierre de turno y salir.</w:t>
+        <w:t>Más operaciones (en el mismo panel, debajo): catálogo en mosaicos, eliminar línea, eliminar por escaneo, limpiar pantalla, descuento a la línea, descuento a la factura, entrega o envío, anular, suspender, gaveta, reimprimir, retiro de efectivo, cierre de turno y salir.</w:t>
+      </w:r>
+    </w:p>
+    <w:p>
+      <w:r>
+        <w:rPr>
+          <w:i/>
+          <w:color w:val="2E7D32"/>
+        </w:rPr>
+        <w:t>El teclado en pantalla de códigos, documentos y textos cambia entre números y letras con la tecla ABC / 123. El de cantidades y montos es solo numérico.</w:t>
       </w:r>
     </w:p>
     <w:p>
@@ -10241,7 +10255,7 @@
         <w:pStyle w:val="ListBullet"/>
       </w:pPr>
       <w:r>
-        <w:t>Descuento a la línea: toque el precio de la línea. Descuento a la factura: segunda página de teclas. Ambos piden motivo y la autorización de quien tenga tope suficiente; si el descuento pasa su tope, se pide una clave de nivel superior.</w:t>
+        <w:t>Descuento a la línea: toque el precio de la línea. Descuento a la factura: panel de funciones (☰). Ambos piden motivo y la autorización de quien tenga tope suficiente; si el descuento pasa su tope, se pide una clave de nivel superior.</w:t>
       </w:r>
     </w:p>
     <w:p>
@@ -10578,7 +10592,7 @@
         <w:pStyle w:val="ListBullet"/>
       </w:pPr>
       <w:r>
-        <w:t>Mientras la venta se arma o está en espera no tiene número de factura: se identifica como B-000015. El número se le da al cobrar, en el orden en que se cobra; así una factura en espera no se lleva el número de otro cliente, y una venta que no se cobró no deja un hueco en la numeración.</w:t>
+        <w:t>Mientras la venta se arma, la pantalla muestra el número de factura que le tocaría, pero el número se le da de verdad al cobrar, en el orden en que se cobra: una factura en espera no se lleva el número de otro cliente, y una venta que no se cobró no deja un hueco en la numeración. En la auditoría, la venta sin cobrar aparece como B-000015.</w:t>
       </w:r>
     </w:p>
     <w:p>
@@ -10594,7 +10608,7 @@
         <w:pStyle w:val="ListBullet"/>
       </w:pPr>
       <w:r>
-        <w:t>Anular (segunda página): cancela la transacción en curso con motivo y autorización. Como todavía no era una factura, desaparece de la caja; lo que tenía, quién la anuló, quién lo autorizó y el motivo quedan en la auditoría.</w:t>
+        <w:t>Anular (panel de funciones ☰): cancela la transacción en curso con motivo y autorización. Como todavía no era una factura, desaparece de la caja; lo que tenía, quién la anuló, quién lo autorizó y el motivo quedan en la auditoría.</w:t>
       </w:r>
     </w:p>
     <w:p>
@@ -10631,7 +10645,7 @@
         <w:pStyle w:val="ListNumber"/>
       </w:pPr>
       <w:r>
-        <w:t>En la segunda página de teclas, elija Entrega / envío.</w:t>
+        <w:t>En el panel de funciones (☰), elija Entrega / envío.</w:t>
       </w:r>
     </w:p>
     <w:p>

</xml_diff>

<commit_message>
feat(ventas): precios sin ITBIS como en Stellar; el ITBIS se calcula por línea y se suma al total
- la línea vale cantidad × precio sin ITBIS; su ITBIS se redondea por línea y se suma aparte (subtotal + ITBIS = total)
- e-CF, cotizaciones, exención E44, precio mínimo y descuento por BIN trabajan sobre el importe sin ITBIS
- el chequeador muestra precios, precio por mayor y ofertas con el ITBIS sumado
- la línea y los documentos para el Central llevan su ITBIS aparte; el Central ya no lo deduce del importe
- el encabezado de la venta toma el símbolo de moneda de la propia venta
- pruebas, script de la base y manual actualizados
</commit_message>
<xml_diff>
--- a/scripts/manual/Manual de usuario CG-POS.docx
+++ b/scripts/manual/Manual de usuario CG-POS.docx
@@ -3240,7 +3240,7 @@
     </w:p>
     <w:p>
       <w:r>
-        <w:t>Precios, impuesto y código de barras del mismo artículo. El precio de detalle y el de mayor se cargan con impuesto incluido; el precio por mayor se aplica solo, desde la cantidad indicada.</w:t>
+        <w:t>Precios, impuesto y código de barras del mismo artículo. El precio de detalle y el de mayor se cargan SIN ITBIS, como en Stellar: al vender, el ITBIS se calcula sobre cada línea y se suma aparte. El precio por mayor se aplica solo, desde la cantidad indicada.</w:t>
       </w:r>
     </w:p>
     <w:tbl>
@@ -8639,7 +8639,7 @@
     </w:p>
     <w:p>
       <w:r>
-        <w:t>Ruta: /chequeador/01, donde 01 es el código de la sucursal, en la pantalla que se pone en el pasillo de la tienda. Tecnología deja cada pantalla con la dirección de su sucursal, así el cliente nunca elige sucursal y siempre ve el precio y las ofertas de la tienda donde está parado. El cliente pasa el producto por el lector y ve la descripción, el precio grande, el precio por cantidad y las ofertas vigentes; la consulta se borra sola a los pocos segundos para el siguiente cliente.</w:t>
+        <w:t>Ruta: /chequeador/01, donde 01 es el código de la sucursal, en la pantalla que se pone en el pasillo de la tienda. Tecnología deja cada pantalla con la dirección de su sucursal, así el cliente nunca elige sucursal y siempre ve el precio y las ofertas de la tienda donde está parado. El cliente pasa el producto por el lector y ve la descripción, el precio grande, el precio por cantidad y las ofertas vigentes; la consulta se borra sola a los pocos segundos para el siguiente cliente. Los precios se muestran con el ITBIS ya sumado, que es lo que el cliente paga.</w:t>
       </w:r>
     </w:p>
     <w:p>
@@ -9352,7 +9352,7 @@
           </w:tcPr>
           <w:p>
             <w:r>
-              <w:t>Subtotal, ITBIS (o el aviso de exenta en régimen especial), descuentos, TOTAL y, en facturas gubernamentales con retención, el total a pagar.</w:t>
+              <w:t>Subtotal (la suma de las líneas, sin ITBIS), ITBIS (o el aviso de exenta en régimen especial), descuentos, TOTAL (subtotal más ITBIS) y, en facturas gubernamentales con retención, el total a pagar.</w:t>
             </w:r>
           </w:p>
         </w:tc>
@@ -9396,7 +9396,7 @@
           </w:tcPr>
           <w:p>
             <w:r>
-              <w:t>Los artículos de la venta: línea, código, descripción, cantidad, precio, importe y la oferta aplicada.</w:t>
+              <w:t>Los artículos de la venta: línea, código, descripción, cantidad, precio y subtotal sin ITBIS, y la oferta aplicada.</w:t>
             </w:r>
           </w:p>
         </w:tc>
@@ -10180,7 +10180,7 @@
     <w:p/>
     <w:p>
       <w:r>
-        <w:t>Factura exenta (E44): al elegir este comprobante, toda la factura pasa a ser exenta de ITBIS, tengan o no impuesto los artículos. Los precios bajan a su base, así que el cliente paga menos: un artículo de RD$118 se cobra a RD$100. La pantalla, la pantalla del cliente y el ticket lo indican con “EXENTA DE ITBIS – RÉGIMEN ESPECIAL”. Si el bien que se vende no está exento para ese cliente, no se usa el E44: se le factura con E31.</w:t>
+        <w:t>Factura exenta (E44): al elegir este comprobante, toda la factura pasa a ser exenta de ITBIS, tengan o no impuesto los artículos. Como los precios ya van sin ITBIS, simplemente no se le suma: un artículo de RD$100 se cobra a RD$100 y no a RD$118. La pantalla, la pantalla del cliente y el ticket lo indican con “EXENTA DE ITBIS – RÉGIMEN ESPECIAL”. Si el bien que se vende no está exento para ese cliente, no se usa el E44: se le factura con E31.</w:t>
       </w:r>
     </w:p>
     <w:p>

</xml_diff>

<commit_message>
feat(seguridad): largo mínimo y máximo de la clave, por separado para usuarios del Central y de caja
- parámetros nuevos: LargoMaximoContrasena, LargoMinimoClaveCaja y LargoMaximoClaveCaja (los máximos son opcionales)
- la clave de caja deja de usar el largo de la contraseña del Central
- mensajes para largo exacto y para un máximo menor que el mínimo
- pruebas de la regla, script de la base y manual actualizados
</commit_message>
<xml_diff>
--- a/scripts/manual/Manual de usuario CG-POS.docx
+++ b/scripts/manual/Manual de usuario CG-POS.docx
@@ -6703,6 +6703,70 @@
           <w:p>
             <w:r>
               <w:t>Pasado ese plazo la devolución retiene el ITBIS, como manda la norma.</w:t>
+            </w:r>
+          </w:p>
+        </w:tc>
+      </w:tr>
+      <w:tr>
+        <w:tc>
+          <w:tcPr>
+            <w:tcW w:type="dxa" w:w="2835"/>
+          </w:tcPr>
+          <w:p>
+            <w:r>
+              <w:t>Largo de la contraseña del Central (mínimo y máximo)</w:t>
+            </w:r>
+          </w:p>
+        </w:tc>
+        <w:tc>
+          <w:tcPr>
+            <w:tcW w:type="dxa" w:w="1701"/>
+          </w:tcPr>
+          <w:p>
+            <w:r>
+              <w:t>10 · sin tope</w:t>
+            </w:r>
+          </w:p>
+        </w:tc>
+        <w:tc>
+          <w:tcPr>
+            <w:tcW w:type="dxa" w:w="5102"/>
+          </w:tcPr>
+          <w:p>
+            <w:r>
+              <w:t>Para los usuarios del Central Manager. El máximo es opcional: vacío, no hay tope.</w:t>
+            </w:r>
+          </w:p>
+        </w:tc>
+      </w:tr>
+      <w:tr>
+        <w:tc>
+          <w:tcPr>
+            <w:tcW w:type="dxa" w:w="2835"/>
+          </w:tcPr>
+          <w:p>
+            <w:r>
+              <w:t>Largo de la clave de caja (mínimo y máximo)</w:t>
+            </w:r>
+          </w:p>
+        </w:tc>
+        <w:tc>
+          <w:tcPr>
+            <w:tcW w:type="dxa" w:w="1701"/>
+          </w:tcPr>
+          <w:p>
+            <w:r>
+              <w:t>6 · sin tope</w:t>
+            </w:r>
+          </w:p>
+        </w:tc>
+        <w:tc>
+          <w:tcPr>
+            <w:tcW w:type="dxa" w:w="5102"/>
+          </w:tcPr>
+          <w:p>
+            <w:r>
+              <w:t>Para los usuarios de caja, aparte de los del Central: la escriben en el teclado de la caja. Si mínimo y máximo son iguales, la clave debe tener ese largo exacto.</w:t>
             </w:r>
           </w:p>
         </w:tc>

</xml_diff>

<commit_message>
feat(clientes-dgii): los contribuyentes SUSPENDIDO de la DGII se cargan como clientes inactivos
- el script lee ACTIVO y SUSPENDIDO; el suspendido desactiva al cliente existente o se crea inactivo
- informa cuántos activos y suspendidos traía el archivo
- manual actualizado
</commit_message>
<xml_diff>
--- a/scripts/manual/Manual de usuario CG-POS.docx
+++ b/scripts/manual/Manual de usuario CG-POS.docx
@@ -2136,7 +2136,7 @@
           </w:tcPr>
           <w:p>
             <w:r>
-              <w:t>Le actualiza la razón social y lo deja activo. El teléfono, el correo, el contacto, el tipo de comprobante, la lista de precios y las direcciones no se tocan: eso lo llenó usted.</w:t>
+              <w:t>Le actualiza la razón social y el estado: activo o, si la DGII lo tiene suspendido, inactivo. El teléfono, el correo, el contacto, el tipo de comprobante, la lista de precios y las direcciones no se tocan: eso lo llenó usted.</w:t>
             </w:r>
           </w:p>
         </w:tc>
@@ -2158,7 +2158,7 @@
           </w:tcPr>
           <w:p>
             <w:r>
-              <w:t>Lo crea. Un RNC de 9 dígitos nace con crédito fiscal (E31) y una cédula de 11 con consumo (E32). El código del cliente es su propio documento.</w:t>
+              <w:t>Lo crea (inactivo si está suspendido). Un RNC de 9 dígitos nace con crédito fiscal (E31) y una cédula de 11 con consumo (E32). El código del cliente es su propio documento.</w:t>
             </w:r>
           </w:p>
         </w:tc>
@@ -2180,7 +2180,7 @@
           </w:tcPr>
           <w:p>
             <w:r>
-              <w:t>Solo se cargan los contribuyentes ACTIVO. Un cliente que usted había desactivado vuelve a quedar activo si la DGII lo reporta activo.</w:t>
+              <w:t>Se cargan los contribuyentes ACTIVO, que quedan activos, y los SUSPENDIDO, que quedan inactivos. Los demás estados se ignoran. Un cliente que usted había desactivado vuelve a quedar activo si la DGII lo reporta activo.</w:t>
             </w:r>
           </w:p>
         </w:tc>

</xml_diff>

<commit_message>
feat(promociones): el código de la promoción sale de la secuencia PRO del Central
- secuencia «Promocion» (prefijo PRO, 6 dígitos) en Secuencias de documentos
- la promoción nueva recibe el código al guardar; el campo ya no se escribe
- importación: código vacío crea con la secuencia; con código actualiza la existente (si no existe, error)
- los números se toman solo al publicar un archivo válido
- pruebas, script de la base y manual actualizados
</commit_message>
<xml_diff>
--- a/scripts/manual/Manual de usuario CG-POS.docx
+++ b/scripts/manual/Manual de usuario CG-POS.docx
@@ -7036,7 +7036,15 @@
         <w:pStyle w:val="ListBullet"/>
       </w:pPr>
       <w:r>
-        <w:t>Importar (/promociones/importar): carga masiva desde un archivo CSV; se valida todo el archivo y solo se publica si no hay errores.</w:t>
+        <w:t>El código de la promoción no se escribe: lo da la secuencia «Promoción» (PRO000001) al guardarla, y no cambia. Su prefijo y sus dígitos se configuran en Organización → Secuencias de documentos.</w:t>
+      </w:r>
+    </w:p>
+    <w:p>
+      <w:pPr>
+        <w:pStyle w:val="ListBullet"/>
+      </w:pPr>
+      <w:r>
+        <w:t>Importar (/promociones/importar): carga masiva desde un archivo CSV; se valida todo el archivo y solo se publica si no hay errores. Una línea sin código crea una promoción nueva con el número de la secuencia; con código, actualiza esa promoción, que tiene que existir.</w:t>
       </w:r>
     </w:p>
     <w:p>
@@ -7093,7 +7101,7 @@
                 <w:b/>
                 <w:color w:val="1B4D3E"/>
               </w:rPr>
-              <w:t>Código</w:t>
+              <w:t>Ejemplo</w:t>
             </w:r>
           </w:p>
         </w:tc>
@@ -8216,7 +8224,7 @@
     </w:p>
     <w:p>
       <w:r>
-        <w:t>El Central le pone su propio número a los documentos que le suben las cajas. Una factura llega con el número de la caja (010110000001) y el Central le agrega el suyo (FAC000001): los dos quedan guardados y se ven juntos en el listado de facturas. Lo mismo con las notas de crédito, los despachos y el cierre de sucursal.</w:t>
+        <w:t>El Central le pone su propio número a los documentos que le suben las cajas. Una factura llega con el número de la caja (010110000001) y el Central le agrega el suyo (FAC000001): los dos quedan guardados y se ven juntos en el listado de facturas. Lo mismo con las notas de crédito, los despachos y el cierre de sucursal. Las cotizaciones, las listas de boda y las promociones toman de aquí su número al crearse (COT000001, LB000001, PRO000001).</w:t>
       </w:r>
     </w:p>
     <w:p>

</xml_diff>

<commit_message>
style(caja): rediseño del diálogo de la oferta aplicada
- todo en una columna: la oferta aplicada con su insignia, lo que vale la línea sin oferta, el ahorro y con oferta
- las ofertas vigentes del artículo, una por fila, con la aplicada marcada
- se quitan las clases de estilo que ya no se usan

Co-Authored-By: Claude Opus 5 (1M context) <noreply@anthropic.com>
</commit_message>
<xml_diff>
--- a/scripts/manual/Manual de usuario CG-POS.docx
+++ b/scripts/manual/Manual de usuario CG-POS.docx
@@ -7060,7 +7060,15 @@
         <w:pStyle w:val="ListBullet"/>
       </w:pPr>
       <w:r>
-        <w:t>La lista muestra el estado de cada promoción y cuántas cajas ya la recibieron.</w:t>
+        <w:t>Los artículos se agregan digitando el código (o el de barras) y Enter: entra de una vez a la lista, con el precio de antes y el que quedaría con la oferta, y el foco vuelve al código para seguir escaneando. El último agregado se ve arriba.</w:t>
+      </w:r>
+    </w:p>
+    <w:p>
+      <w:pPr>
+        <w:pStyle w:val="ListBullet"/>
+      </w:pPr>
+      <w:r>
+        <w:t>La lista muestra el estado de cada promoción y cuántas cajas ya la recibieron; se filtra por texto, sucursal y rango de fechas.</w:t>
       </w:r>
     </w:p>
     <w:p>

</xml_diff>

<commit_message>
feat(cotizaciones): buscar el cliente por documento y vigencia propuesta
- La cédula o RNC lleva una lupa (o Enter) que busca el cliente en el
  maestro y completa nombre, teléfono y correo; ruta
  /api/manager/cotizaciones/clientes con el permiso de cotizaciones.
- "Vale hasta" arranca con hoy más Central.Cotizaciones.DiasVigencia
  (ruta /api/manager/cotizaciones/vencimiento); el servicio usa el mismo
  cálculo al guardar sin fecha.
- Filas de la tabla más bajas: cantidad y descuento con campo de una
  línea y menos relleno.
- Fila de captura: la descripción ocupa el espacio junto al código y
  cantidad, precio y descuento quedan juntos.
- Manual de usuario actualizado.

Co-Authored-By: Claude Opus 5 (1M context) <noreply@anthropic.com>
</commit_message>
<xml_diff>
--- a/scripts/manual/Manual de usuario CG-POS.docx
+++ b/scripts/manual/Manual de usuario CG-POS.docx
@@ -8068,7 +8068,15 @@
         <w:pStyle w:val="ListNumber"/>
       </w:pPr>
       <w:r>
-        <w:t>Escriba el nombre del cliente y, si lo tiene, su cédula o RNC, teléfono y correo.</w:t>
+        <w:t>Escriba el nombre del cliente y, si lo tiene, su cédula o RNC, teléfono y correo. Si el cliente ya está registrado, digite su cédula o RNC y presione la lupa del campo (o Enter): el nombre, el teléfono y el correo se completan solos con los del maestro de clientes.</w:t>
+      </w:r>
+    </w:p>
+    <w:p>
+      <w:pPr>
+        <w:pStyle w:val="ListNumber"/>
+      </w:pPr>
+      <w:r>
+        <w:t>«Vale hasta» ya viene con la fecha de vencimiento: hoy más los días configurados en Parámetros (Central.Cotizaciones.DiasVigencia, 15 de fábrica). Se puede cambiar antes de guardar.</w:t>
       </w:r>
     </w:p>
     <w:p>
@@ -8097,7 +8105,7 @@
         <w:pStyle w:val="ListNumber"/>
       </w:pPr>
       <w:r>
-        <w:t>Guarde: el Central le asigna su número (por ejemplo COT000001) y su fecha de vencimiento, según los días configurados en Parámetros.</w:t>
+        <w:t>Guarde: el Central le asigna su número (por ejemplo COT000001). Si se borró la fecha de «Vale hasta», la pone él con los días configurados.</w:t>
       </w:r>
     </w:p>
     <w:p>

</xml_diff>

<commit_message>
feat(interfaz): campo de teléfono con formato 809-555-1234
Nuevo CampoTelefono en CgPos.Interfaz (máscara 000-000-0000, solo
dígitos, 12 caracteres con los guiones) y FormatoTelefono para formatear
lo digitado, lo pegado y lo guardado sin formato. Se usa en todos los
teléfonos que se registran: cliente y entrega en la caja; empresa,
sucursal, cliente (dos teléfonos y los de las direcciones), cotización
y lista de boda en el Central. En la caja, el teclado en pantalla
también formatea el teléfono.

Se restauran en el editor de cotizaciones los métodos de búsqueda del
cliente por documento, que se habían borrado. Manual actualizado.

Co-Authored-By: Claude Opus 5 (1M context) <noreply@anthropic.com>
</commit_message>
<xml_diff>
--- a/scripts/manual/Manual de usuario CG-POS.docx
+++ b/scripts/manual/Manual de usuario CG-POS.docx
@@ -582,6 +582,19 @@
       </w:tr>
     </w:tbl>
     <w:p/>
+    <w:p>
+      <w:pPr>
+        <w:pStyle w:val="Heading2"/>
+      </w:pPr>
+      <w:r>
+        <w:t>1.3. Cómo se escriben los teléfonos</w:t>
+      </w:r>
+    </w:p>
+    <w:p>
+      <w:r>
+        <w:t>Todos los campos de teléfono, en la caja y en el Central, aceptan solo números: las letras, los espacios y los signos no entran. Llevan diez dígitos y los guiones se ponen solos mientras se escribe, así que el teléfono queda siempre como 809-555-1234. Si se pega uno con otro formato, se acomoda igual.</w:t>
+      </w:r>
+    </w:p>
     <w:p>
       <w:r>
         <w:br w:type="page"/>

</xml_diff>

<commit_message>
feat(caja): no vender ni cobrar con un turno de un día anterior
- Nuevo parámetro Caja.BloquearVentaTurnoDiaAnterior (true por defecto).
- Con el turno abierto de un día anterior, el Agente rechaza vender y
  cobrar (CodigoResultadoVenta.TurnoDiaAnterior); limpiar, anular,
  eliminar líneas, poner en espera, retomar y anular el pago de tarjeta
  siguen permitidos para dejar el turno listo.
- La pantalla de venta muestra un aviso fijo (DatosEstadoTurno.
  BloqueoDiaAnterior).
- El cierre pide retomar y limpiar las facturas en espera y la venta en
  curso, porque ya no se pueden cobrar.
- Turno.EsDeDiaAnterior y ReglasTurno comparten la regla entre venta,
  estado y cierre.
- Pruebas, script de la base del Central y manual actualizados.

Co-Authored-By: Claude Opus 5 (1M context) <noreply@anthropic.com>
</commit_message>
<xml_diff>
--- a/scripts/manual/Manual de usuario CG-POS.docx
+++ b/scripts/manual/Manual de usuario CG-POS.docx
@@ -9339,6 +9339,14 @@
     </w:p>
     <w:p>
       <w:pPr>
+        <w:pStyle w:val="ListBullet"/>
+      </w:pPr>
+      <w:r>
+        <w:t>Si el turno quedó abierto de un día anterior, la caja no vende ni cobra: sale un aviso rojo fijo y no deja escanear, dar descuentos ni cobrar. Sí deja limpiar la pantalla, eliminar líneas, poner en espera y retomar, para dejar el turno listo. Hay que cerrarlo y abrir uno nuevo. Esta regla se puede apagar en el Central con el parámetro Caja.BloquearVentaTurnoDiaAnterior (viene encendido).</w:t>
+      </w:r>
+    </w:p>
+    <w:p>
+      <w:pPr>
         <w:pStyle w:val="Heading2"/>
       </w:pPr>
       <w:r>
@@ -11056,6 +11064,14 @@
       </w:pPr>
       <w:r>
         <w:t>No se puede cerrar con facturas en espera, transacciones con artículos sin cobrar o ventas sin factura electrónica firmada: la pantalla dice exactamente qué falta.</w:t>
+      </w:r>
+    </w:p>
+    <w:p>
+      <w:pPr>
+        <w:pStyle w:val="ListBullet"/>
+      </w:pPr>
+      <w:r>
+        <w:t>Con un turno de un día anterior, las facturas en espera ya no se pueden cobrar: el cierre avisa cuáles son y pide retomarlas y limpiarlas (con la autorización de un supervisor) antes de cerrar.</w:t>
       </w:r>
     </w:p>
     <w:p>

</xml_diff>

<commit_message>
feat(chequeador): anunciar solo la oferta que más le conviene al cliente
El chequeador de precios mostraba todas las ofertas vigentes del
artículo, y el cliente no sabía cuál le tocaba ni que no se suman. Ahora
muestra una sola, elegida con MotorPromociones sobre una unidad al
precio de detalle y desempatada por código: la misma que aplica la caja
al cobrar. Manual actualizado.

Co-Authored-By: Claude Opus 5 (1M context) <noreply@anthropic.com>
</commit_message>
<xml_diff>
--- a/scripts/manual/Manual de usuario CG-POS.docx
+++ b/scripts/manual/Manual de usuario CG-POS.docx
@@ -8740,7 +8740,16 @@
     </w:p>
     <w:p>
       <w:r>
-        <w:t>Ruta: /chequeador/01, donde 01 es el código de la sucursal, en la pantalla que se pone en el pasillo de la tienda. Tecnología deja cada pantalla con la dirección de su sucursal, así el cliente nunca elige sucursal y siempre ve el precio y las ofertas de la tienda donde está parado. El cliente pasa el producto por el lector y ve la descripción, el precio grande, el precio por cantidad y las ofertas vigentes; la consulta se borra sola a los pocos segundos para el siguiente cliente. Los precios se muestran con el ITBIS ya sumado, que es lo que el cliente paga.</w:t>
+        <w:t>Ruta: /chequeador/01, donde 01 es el código de la sucursal, en la pantalla que se pone en el pasillo de la tienda. Tecnología deja cada pantalla con la dirección de su sucursal, así el cliente nunca elige sucursal y siempre ve el precio y las ofertas de la tienda donde está parado. El cliente pasa el producto por el lector y ve la descripción, el precio grande, el precio por cantidad y la oferta que le conviene; la consulta se borra sola a los pocos segundos para el siguiente cliente. Los precios se muestran con el ITBIS ya sumado, que es lo que el cliente paga.</w:t>
+      </w:r>
+    </w:p>
+    <w:p>
+      <w:r>
+        <w:rPr>
+          <w:i/>
+          <w:color w:val="2E7D32"/>
+        </w:rPr>
+        <w:t>Si el artículo tiene varias ofertas vigentes, el chequeador muestra solo la mejor, que es la que le va a aplicar la caja. Las ofertas no se suman entre sí, y verlas todas haría creer que sí.</w:t>
       </w:r>
     </w:p>
     <w:p>

</xml_diff>

<commit_message>
perf(promociones): categorías y marcas con búsqueda en vez de lista
El diálogo de la promoción dibujaba 6,060 marcas y 669 categorías como
opciones, y cada tecla del código repintaba todo el diálogo, lo que hacía
lento digitar. Ahora se buscan escribiendo (hasta 20 coincidencias, sin
acentos) y lo elegido queda en etiquetas que se quitan con su X;
departamentos y sucursales siguen en lista porque son pocos. El código
del artículo avisa si se busca con el campo vacío. Manual actualizado.
</commit_message>
<xml_diff>
--- a/scripts/manual/Manual de usuario CG-POS.docx
+++ b/scripts/manual/Manual de usuario CG-POS.docx
@@ -7074,6 +7074,14 @@
       </w:pPr>
       <w:r>
         <w:t>Los artículos se agregan digitando el código (o el de barras) y Enter: entra de una vez a la lista, con el precio de antes y el que quedaría con la oferta, y el foco vuelve al código para seguir escaneando. El último agregado se ve arriba.</w:t>
+      </w:r>
+    </w:p>
+    <w:p>
+      <w:pPr>
+        <w:pStyle w:val="ListBullet"/>
+      </w:pPr>
+      <w:r>
+        <w:t>Las categorías y las marcas son miles, así que no salen en una lista: se escribe parte del código o del nombre, se elige de lo que aparece, y lo elegido queda debajo en etiquetas que se quitan con su X. Departamentos y sucursales sí van en lista, porque son pocos.</w:t>
       </w:r>
     </w:p>
     <w:p>

</xml_diff>

<commit_message>
feat(ventas): tope de cantidad que el cajero puede digitar
Nuevo parámetro Ventas.CantidadMaximaDigitada (10 de fábrica): el cajero
digita hasta esa cantidad y, para más, pasa el artículo por el lector una
vez por unidad. Se valida en el Agente para F4, para la cantidad de la
línea y para el escaneo cantidad*código; bajar la cantidad se permite
mientras no pase del tope. Los artículos por peso y los de unidad con
decimales quedan fuera, porque su cantidad la da la balanza o la
etiqueta. Prueba de integración y manual actualizados.
</commit_message>
<xml_diff>
--- a/scripts/manual/Manual de usuario CG-POS.docx
+++ b/scripts/manual/Manual de usuario CG-POS.docx
@@ -10116,6 +10116,15 @@
       </w:pPr>
       <w:r>
         <w:t>Para cambiar una cantidad, toque la cantidad en la línea o use F4. Para ver el otro código del artículo, toque el código.</w:t>
+      </w:r>
+    </w:p>
+    <w:p>
+      <w:r>
+        <w:rPr>
+          <w:i/>
+          <w:color w:val="2E7D32"/>
+        </w:rPr>
+        <w:t>La cantidad que se digita tiene un tope: el que diga el parámetro Ventas.CantidadMaximaDigitada (10 de fábrica). Si el cliente lleva más, el artículo se pasa por el lector una vez por unidad. Vale para F4, para tocar la cantidad y para escanear con cantidad*código. No aplica a los artículos que se venden por peso ni a los de unidad con decimales, porque ahí la cantidad la da la balanza o la etiqueta.</w:t>
       </w:r>
     </w:p>
     <w:p>

</xml_diff>

<commit_message>
feat(turnos): la venta en curso y las facturas en espera son del turno
Con un relevo, el cajero que entra encontraba la pantalla vacía y la
venta a medias del anterior quedaba atrapada: nadie podía tocarla y el
cierre se trababa. Ahora la venta en curso (una por turno) y las
facturas en espera pertenecen al turno, y al cobrar la factura queda a
nombre de quien cobró. Turnos y CierresTurno guardan el código y el
nombre de la sucursal y el código de la caja. El listado de artículos
proyecta solo las columnas que muestra, que devuelve la búsqueda a ~200
ms tras ensanchar Articulos. Pruebas, script de la caja y manual
actualizados.
</commit_message>
<xml_diff>
--- a/scripts/manual/Manual de usuario CG-POS.docx
+++ b/scripts/manual/Manual de usuario CG-POS.docx
@@ -9343,7 +9343,15 @@
         <w:pStyle w:val="ListBullet"/>
       </w:pPr>
       <w:r>
-        <w:t>Si la caja tiene abierto el turno de otro cajero, aparece Relevar turno: con la autorización de un supervisor, usted toma el turno sin cerrarlo ni cuadrar.</w:t>
+        <w:t>Si la caja tiene abierto el turno de otro cajero, aparece Relevar turno: con la autorización de un supervisor, usted toma el turno sin cerrarlo ni cuadrar. El turno sigue siendo del que lo abrió, y quien lo cierra es quien esté operando en ese momento.</w:t>
+      </w:r>
+    </w:p>
+    <w:p>
+      <w:pPr>
+        <w:pStyle w:val="ListBullet"/>
+      </w:pPr>
+      <w:r>
+        <w:t>La venta que está en pantalla y las facturas en espera son del turno, no del cajero: al relevar, el que entra las encuentra tal como estaban y puede seguirlas, cobrarlas, guardarlas o limpiarlas. La factura queda a nombre de quien la cobra, aunque la haya empezado el otro; en la auditoría se ve quién hizo cada cosa.</w:t>
       </w:r>
     </w:p>
     <w:p>

</xml_diff>

<commit_message>
feat(cuadre): el supervisor cuadra los cierres desde el Central con su usuario de caja
La cajera ya no declara nada: cierra el turno, la caja imprime lo esperado por forma de
pago y ella entrega el efectivo contado a ciegas. Quien cuenta y declara es el supervisor,
desde /cuadre, con su usuario y su clave de caja; la diferencia queda a nombre de la cajera.

- Ingreso al módulo con el usuario de caja, permisos Cuadre.Consultar/Declarar/Corregir y
  alcance limitado a las sucursales de sus cajas.
- El cierre sube al Central pendiente de cuadre y guarda quién lo cuadró, cuándo y las
  denominaciones contadas; el efectivo declarado tiene que cuadrar con el conteo.
- Se elimina el parámetro Caja.CierreCiego: para la cajera el cierre siempre es ciego.
- Pruebas de API del flujo completo y manual de usuario actualizado.

Co-Authored-By: Claude Opus 5 (1M context) <noreply@anthropic.com>
</commit_message>
<xml_diff>
--- a/scripts/manual/Manual de usuario CG-POS.docx
+++ b/scripts/manual/Manual de usuario CG-POS.docx
@@ -6631,7 +6631,7 @@
           </w:tcPr>
           <w:p>
             <w:r>
-              <w:t>Cierre ciego</w:t>
+              <w:t>Cantidad máxima que se digita</w:t>
             </w:r>
           </w:p>
         </w:tc>
@@ -6641,7 +6641,7 @@
           </w:tcPr>
           <w:p>
             <w:r>
-              <w:t>Sí</w:t>
+              <w:t>10</w:t>
             </w:r>
           </w:p>
         </w:tc>
@@ -6651,7 +6651,7 @@
           </w:tcPr>
           <w:p>
             <w:r>
-              <w:t>El cajero declara lo que contó sin ver lo esperado: es lo que hace útil el cuadre.</w:t>
+              <w:t>Más de esa cantidad se escanea artículo por artículo, para que no se cuele un cero de más.</w:t>
             </w:r>
           </w:p>
         </w:tc>
@@ -8530,278 +8530,17 @@
         <w:pStyle w:val="Heading2"/>
       </w:pPr>
       <w:r>
-        <w:t>2.18. Reportes</w:t>
-      </w:r>
-    </w:p>
-    <w:p>
-      <w:r>
-        <w:t>Ruta: /reportes. Todos por rango de días y, si se quiere, por sucursal o caja. Cada uno se descarga en Excel y en PDF.</w:t>
-      </w:r>
-    </w:p>
-    <w:tbl>
-      <w:tblPr>
-        <w:tblStyle w:val="TableGrid"/>
-        <w:tblW w:type="auto" w:w="0"/>
-        <w:tblLook w:firstColumn="1" w:firstRow="1" w:lastColumn="0" w:lastRow="0" w:noHBand="0" w:noVBand="1" w:val="04A0"/>
-      </w:tblPr>
-      <w:tblGrid>
-        <w:gridCol w:w="4759"/>
-        <w:gridCol w:w="4759"/>
-      </w:tblGrid>
-      <w:tr>
-        <w:tc>
-          <w:tcPr>
-            <w:tcW w:type="dxa" w:w="2551"/>
-          </w:tcPr>
-          <w:p>
-            <w:r/>
-            <w:r>
-              <w:rPr>
-                <w:b/>
-                <w:color w:val="1B4D3E"/>
-              </w:rPr>
-              <w:t>Reporte</w:t>
-            </w:r>
-          </w:p>
-        </w:tc>
-        <w:tc>
-          <w:tcPr>
-            <w:tcW w:type="dxa" w:w="7087"/>
-          </w:tcPr>
-          <w:p>
-            <w:r/>
-            <w:r>
-              <w:rPr>
-                <w:b/>
-                <w:color w:val="1B4D3E"/>
-              </w:rPr>
-              <w:t>Qué muestra</w:t>
-            </w:r>
-          </w:p>
-        </w:tc>
-      </w:tr>
-      <w:tr>
-        <w:tc>
-          <w:tcPr>
-            <w:tcW w:type="dxa" w:w="2551"/>
-          </w:tcPr>
-          <w:p>
-            <w:r>
-              <w:t>Ventas</w:t>
-            </w:r>
-          </w:p>
-        </w:tc>
-        <w:tc>
-          <w:tcPr>
-            <w:tcW w:type="dxa" w:w="7087"/>
-          </w:tcPr>
-          <w:p>
-            <w:r>
-              <w:t>Por día, sucursal y caja: facturas, notas de crédito, subtotal, descuento, ITBIS y total.</w:t>
-            </w:r>
-          </w:p>
-        </w:tc>
-      </w:tr>
-      <w:tr>
-        <w:tc>
-          <w:tcPr>
-            <w:tcW w:type="dxa" w:w="2551"/>
-          </w:tcPr>
-          <w:p>
-            <w:r>
-              <w:t>ITBIS por tasa</w:t>
-            </w:r>
-          </w:p>
-        </w:tc>
-        <w:tc>
-          <w:tcPr>
-            <w:tcW w:type="dxa" w:w="7087"/>
-          </w:tcPr>
-          <w:p>
-            <w:r>
-              <w:t>Base e impuesto de cada tasa del período.</w:t>
-            </w:r>
-          </w:p>
-        </w:tc>
-      </w:tr>
-      <w:tr>
-        <w:tc>
-          <w:tcPr>
-            <w:tcW w:type="dxa" w:w="2551"/>
-          </w:tcPr>
-          <w:p>
-            <w:r>
-              <w:t>Formato 607</w:t>
-            </w:r>
-          </w:p>
-        </w:tc>
-        <w:tc>
-          <w:tcPr>
-            <w:tcW w:type="dxa" w:w="7087"/>
-          </w:tcPr>
-          <w:p>
-            <w:r>
-              <w:t>Un registro por comprobante para la DGII, con la descarga del archivo de envío.</w:t>
-            </w:r>
-          </w:p>
-        </w:tc>
-      </w:tr>
-      <w:tr>
-        <w:tc>
-          <w:tcPr>
-            <w:tcW w:type="dxa" w:w="2551"/>
-          </w:tcPr>
-          <w:p>
-            <w:r>
-              <w:t>Cuadres de caja</w:t>
-            </w:r>
-          </w:p>
-        </w:tc>
-        <w:tc>
-          <w:tcPr>
-            <w:tcW w:type="dxa" w:w="7087"/>
-          </w:tcPr>
-          <w:p>
-            <w:r>
-              <w:t>Turno, cajero, esperado, declarado y diferencia.</w:t>
-            </w:r>
-          </w:p>
-        </w:tc>
-      </w:tr>
-      <w:tr>
-        <w:tc>
-          <w:tcPr>
-            <w:tcW w:type="dxa" w:w="2551"/>
-          </w:tcPr>
-          <w:p>
-            <w:r>
-              <w:t>e-CF y DGII</w:t>
-            </w:r>
-          </w:p>
-        </w:tc>
-        <w:tc>
-          <w:tcPr>
-            <w:tcW w:type="dxa" w:w="7087"/>
-          </w:tcPr>
-          <w:p>
-            <w:r>
-              <w:t>Estado de cada comprobante enviado.</w:t>
-            </w:r>
-          </w:p>
-        </w:tc>
-      </w:tr>
-      <w:tr>
-        <w:tc>
-          <w:tcPr>
-            <w:tcW w:type="dxa" w:w="2551"/>
-          </w:tcPr>
-          <w:p>
-            <w:r>
-              <w:t>Sincronización</w:t>
-            </w:r>
-          </w:p>
-        </w:tc>
-        <w:tc>
-          <w:tcPr>
-            <w:tcW w:type="dxa" w:w="7087"/>
-          </w:tcPr>
-          <w:p>
-            <w:r>
-              <w:t>Última comunicación de cada caja, mensajes, rechazos y alertas.</w:t>
-            </w:r>
-          </w:p>
-        </w:tc>
-      </w:tr>
-    </w:tbl>
-    <w:p/>
-    <w:p>
-      <w:pPr>
-        <w:pStyle w:val="Heading2"/>
-      </w:pPr>
-      <w:r>
-        <w:t>2.19. Monitor de sincronización</w:t>
-      </w:r>
-    </w:p>
-    <w:p>
-      <w:pPr>
-        <w:pStyle w:val="ListBullet"/>
-      </w:pPr>
-      <w:r>
-        <w:t>/monitor: estado de cada caja, cuánto hace que no se comunica y cuántos documentos trae pendientes.</w:t>
-      </w:r>
-    </w:p>
-    <w:p>
-      <w:pPr>
-        <w:pStyle w:val="ListBullet"/>
-      </w:pPr>
-      <w:r>
-        <w:t>/monitor/conflictos: documentos que el Central no pudo aceptar (por ejemplo un número repetido), para resolverlos.</w:t>
-      </w:r>
-    </w:p>
-    <w:p>
-      <w:pPr>
-        <w:pStyle w:val="Heading2"/>
-      </w:pPr>
-      <w:r>
-        <w:t>2.20. Chequeador de precios</w:t>
-      </w:r>
-    </w:p>
-    <w:p>
-      <w:r>
-        <w:t>Ruta: /chequeador/01, donde 01 es el código de la sucursal, en la pantalla que se pone en el pasillo de la tienda. Tecnología deja cada pantalla con la dirección de su sucursal, así el cliente nunca elige sucursal y siempre ve el precio y las ofertas de la tienda donde está parado. El cliente pasa el producto por el lector y ve la descripción, el precio grande, el precio por cantidad y la oferta que le conviene; la consulta se borra sola a los pocos segundos para el siguiente cliente. Los precios se muestran con el ITBIS ya sumado, que es lo que el cliente paga.</w:t>
-      </w:r>
-    </w:p>
-    <w:p>
-      <w:r>
-        <w:rPr>
-          <w:i/>
-          <w:color w:val="2E7D32"/>
-        </w:rPr>
-        <w:t>Si el artículo tiene varias ofertas vigentes, el chequeador muestra solo la mejor, que es la que le va a aplicar la caja. Las ofertas no se suman entre sí, y verlas todas haría creer que sí.</w:t>
-      </w:r>
-    </w:p>
-    <w:p>
-      <w:r>
-        <w:rPr>
-          <w:i/>
-          <w:color w:val="2E7D32"/>
-        </w:rPr>
-        <w:t>El chequeador viene apagado: se enciende en Parámetros, con Central.Chequeador.Habilitado.</w:t>
-      </w:r>
-    </w:p>
-    <w:p>
-      <w:r>
-        <w:rPr>
-          <w:i/>
-          <w:color w:val="2E7D32"/>
-        </w:rPr>
-        <w:t>Si la dirección trae un código de sucursal que no existe o está inactiva, la pantalla dice «Página no encontrada» y no consulta nada: mostrar el precio de otra sucursal sería engañar al cliente.</w:t>
-      </w:r>
-    </w:p>
-    <w:p>
-      <w:r>
-        <w:br w:type="page"/>
-      </w:r>
-    </w:p>
-    <w:p>
-      <w:pPr>
-        <w:pStyle w:val="Heading1"/>
-      </w:pPr>
-      <w:r>
-        <w:t>3. La caja, paso a paso</w:t>
-      </w:r>
-    </w:p>
-    <w:p>
-      <w:pPr>
-        <w:pStyle w:val="Heading2"/>
-      </w:pPr>
-      <w:r>
-        <w:t>3.1. Instalar una caja desde cero</w:t>
-      </w:r>
-    </w:p>
-    <w:p>
-      <w:r>
-        <w:t>Cada caja tiene su propia base de datos en su propio equipo: por eso sigue vendiendo aunque se caiga la red. La instalación la hace tecnología, una sola vez por caja.</w:t>
+        <w:t>2.18. Módulo de cuadre</w:t>
+      </w:r>
+    </w:p>
+    <w:p>
+      <w:r>
+        <w:t>Ruta: /cuadre, en una computadora de la tienda. Aquí el supervisor cuenta el dinero que le entregaron las cajeras y lo declara. La cajera ya no declara nada: cierra su turno, entrega el efectivo y el comprobante del lote de tarjetas con el cuadre impreso, y se va. Quien cuenta responde por lo que cuenta.</w:t>
+      </w:r>
+    </w:p>
+    <w:p>
+      <w:r>
+        <w:t>Se entra con el USUARIO Y LA CLAVE DE CAJA del supervisor o del gerente de tienda, no con un usuario del Central: no hay que crearles uno. La sesión dura pocos minutos porque la computadora es compartida, y solo se ven las sucursales de las cajas que ese usuario tiene asignadas. Un usuario del Central entra con el suyo y ve todas las sucursales.</w:t>
       </w:r>
     </w:p>
     <w:p>
@@ -8809,7 +8548,7 @@
         <w:pStyle w:val="ListNumber"/>
       </w:pPr>
       <w:r>
-        <w:t>En el Central, cree la sucursal y la caja (Organización → Cajas), con la IP fija del equipo donde va a correr. Después, en el menú de esa caja, «Emitir credencial»: el secreto se muestra una sola vez, cópielo.</w:t>
+        <w:t>La cajera cierra el lote del terminal de tarjetas y después cierra su turno en la caja, con autorización del supervisor.</w:t>
       </w:r>
     </w:p>
     <w:p>
@@ -8817,7 +8556,7 @@
         <w:pStyle w:val="ListNumber"/>
       </w:pPr>
       <w:r>
-        <w:t>En el equipo de la caja, instale SQL Server Express y ejecute scripts/base-datos/estructura_base_datos_pos.sql. Crea la base CgPosCaja vacía: no lleva datos, todo baja del Central.</w:t>
+        <w:t>La caja imprime el cuadre con lo esperado por forma de pago. El papel, el efectivo contado a ciegas y el comprobante del lote se los lleva el supervisor.</w:t>
       </w:r>
     </w:p>
     <w:p>
@@ -8825,7 +8564,7 @@
         <w:pStyle w:val="ListNumber"/>
       </w:pPr>
       <w:r>
-        <w:t>Instale el programa de la caja con scripts/caja/instalar-caja.ps1, indicando el número de sucursal, el de caja y la dirección del Central. No se le pide ninguna clave.</w:t>
+        <w:t>En /cuadre aparece ese cierre como pendiente de cuadre, lo más viejo primero.</w:t>
       </w:r>
     </w:p>
     <w:p>
@@ -8833,7 +8572,7 @@
         <w:pStyle w:val="ListNumber"/>
       </w:pPr>
       <w:r>
-        <w:t>Arranque la caja y abra cualquiera de sus pantallas. Como todavía no sabe cuál es, le pedirá cinco datos: el código de su sucursal, el de la caja, la IP de ese equipo, la dirección del Central y la credencial que copió. Además le pedirá su usuario y contraseña del Central, para saber quién está montando esa caja.</w:t>
+        <w:t>El supervisor cuenta las denominaciones del efectivo y escribe el total de cada forma de pago; el sistema no deja guardar si el efectivo declarado no coincide con el conteo.</w:t>
       </w:r>
     </w:p>
     <w:p>
@@ -8841,55 +8580,7 @@
         <w:pStyle w:val="ListNumber"/>
       </w:pPr>
       <w:r>
-        <w:t>Copie el certificado digital de la empresa en el equipo. El PIN no se guarda: lo digita un supervisor en la caja.</w:t>
-      </w:r>
-    </w:p>
-    <w:p>
-      <w:pPr>
-        <w:pStyle w:val="ListNumber"/>
-      </w:pPr>
-      <w:r>
-        <w:t>Ya con su credencial, la caja baja artículos, precios, usuarios, parámetros y sus rangos de comprobantes.</w:t>
-      </w:r>
-    </w:p>
-    <w:p>
-      <w:r>
-        <w:rPr>
-          <w:i/>
-          <w:color w:val="2E7D32"/>
-        </w:rPr>
-        <w:t>Si la caja avisa que la base no existe o le faltan tablas, es que no se ejecutó el script en ese equipo.</w:t>
-      </w:r>
-    </w:p>
-    <w:p>
-      <w:r>
-        <w:rPr>
-          <w:i/>
-          <w:color w:val="2E7D32"/>
-        </w:rPr>
-        <w:t>Quien configura una caja tiene que ser un usuario del Central con el permiso «Autorizar la configuración de una caja desde el propio equipo». El Central lo comprueba en el momento, junto con la credencial y la dirección del equipo, y deja anotado quién configuró esa caja. La contraseña no se guarda en la caja: solo el nombre del usuario.</w:t>
-      </w:r>
-    </w:p>
-    <w:p>
-      <w:r>
-        <w:rPr>
-          <w:i/>
-          <w:color w:val="2E7D32"/>
-        </w:rPr>
-        <w:t>La credencial queda cifrada en la base de esa caja: no se vuelve a ver y copiarla a otra máquina no sirve. En cada comunicación el Central comprueba los cuatro datos juntos —sucursal, caja, IP y credencial—, así que dos cajas no pueden usar lo mismo.</w:t>
-      </w:r>
-    </w:p>
-    <w:p>
-      <w:pPr>
-        <w:pStyle w:val="Heading3"/>
-      </w:pPr>
-      <w:r>
-        <w:t>3.1.1. La impresora de tickets</w:t>
-      </w:r>
-    </w:p>
-    <w:p>
-      <w:r>
-        <w:t>La caja imprime en la impresora térmica del mostrador. Se indica una sola vez, al instalarla, y hay tres formas según cómo esté conectada:</w:t>
+        <w:t>Al confirmar, el cierre queda cuadrado, con su faltante o sobrante A NOMBRE DE LA CAJERA y el nombre de quien lo cuadró.</w:t>
       </w:r>
     </w:p>
     <w:tbl>
@@ -8906,7 +8597,7 @@
       <w:tr>
         <w:tc>
           <w:tcPr>
-            <w:tcW w:type="dxa" w:w="1247"/>
+            <w:tcW w:type="dxa" w:w="2268"/>
           </w:tcPr>
           <w:p>
             <w:r/>
@@ -8915,13 +8606,13 @@
                 <w:b/>
                 <w:color w:val="1B4D3E"/>
               </w:rPr>
-              <w:t>Tipo</w:t>
-            </w:r>
-          </w:p>
-        </w:tc>
-        <w:tc>
-          <w:tcPr>
-            <w:tcW w:type="dxa" w:w="3969"/>
+              <w:t>Permiso</w:t>
+            </w:r>
+          </w:p>
+        </w:tc>
+        <w:tc>
+          <w:tcPr>
+            <w:tcW w:type="dxa" w:w="2551"/>
           </w:tcPr>
           <w:p>
             <w:r/>
@@ -8930,13 +8621,13 @@
                 <w:b/>
                 <w:color w:val="1B4D3E"/>
               </w:rPr>
-              <w:t>Cuándo se usa</w:t>
-            </w:r>
-          </w:p>
-        </w:tc>
-        <w:tc>
-          <w:tcPr>
-            <w:tcW w:type="dxa" w:w="4309"/>
+              <w:t>Quién lo suele tener</w:t>
+            </w:r>
+          </w:p>
+        </w:tc>
+        <w:tc>
+          <w:tcPr>
+            <w:tcW w:type="dxa" w:w="4819"/>
           </w:tcPr>
           <w:p>
             <w:r/>
@@ -8945,7 +8636,7 @@
                 <w:b/>
                 <w:color w:val="1B4D3E"/>
               </w:rPr>
-              <w:t>Qué se indica</w:t>
+              <w:t>Qué puede hacer</w:t>
             </w:r>
           </w:p>
         </w:tc>
@@ -8953,31 +8644,31 @@
       <w:tr>
         <w:tc>
           <w:tcPr>
-            <w:tcW w:type="dxa" w:w="1247"/>
-          </w:tcPr>
-          <w:p>
-            <w:r>
-              <w:t>Windows</w:t>
-            </w:r>
-          </w:p>
-        </w:tc>
-        <w:tc>
-          <w:tcPr>
-            <w:tcW w:type="dxa" w:w="3969"/>
-          </w:tcPr>
-          <w:p>
-            <w:r>
-              <w:t>La impresora está instalada en el equipo (USB o serie). Es lo más común.</w:t>
-            </w:r>
-          </w:p>
-        </w:tc>
-        <w:tc>
-          <w:tcPr>
-            <w:tcW w:type="dxa" w:w="4309"/>
-          </w:tcPr>
-          <w:p>
-            <w:r>
-              <w:t>El nombre exacto con el que aparece en Dispositivos e impresoras de Windows.</w:t>
+            <w:tcW w:type="dxa" w:w="2268"/>
+          </w:tcPr>
+          <w:p>
+            <w:r>
+              <w:t>Cuadre.Consultar</w:t>
+            </w:r>
+          </w:p>
+        </w:tc>
+        <w:tc>
+          <w:tcPr>
+            <w:tcW w:type="dxa" w:w="2551"/>
+          </w:tcPr>
+          <w:p>
+            <w:r>
+              <w:t>Gerencia de tienda</w:t>
+            </w:r>
+          </w:p>
+        </w:tc>
+        <w:tc>
+          <w:tcPr>
+            <w:tcW w:type="dxa" w:w="4819"/>
+          </w:tcPr>
+          <w:p>
+            <w:r>
+              <w:t>Ver los cierres y los reportes del módulo en su sucursal.</w:t>
             </w:r>
           </w:p>
         </w:tc>
@@ -8985,31 +8676,31 @@
       <w:tr>
         <w:tc>
           <w:tcPr>
-            <w:tcW w:type="dxa" w:w="1247"/>
-          </w:tcPr>
-          <w:p>
-            <w:r>
-              <w:t>Red</w:t>
-            </w:r>
-          </w:p>
-        </w:tc>
-        <w:tc>
-          <w:tcPr>
-            <w:tcW w:type="dxa" w:w="3969"/>
-          </w:tcPr>
-          <w:p>
-            <w:r>
-              <w:t>La impresora tiene su propio puerto de red y su dirección.</w:t>
-            </w:r>
-          </w:p>
-        </w:tc>
-        <w:tc>
-          <w:tcPr>
-            <w:tcW w:type="dxa" w:w="4309"/>
-          </w:tcPr>
-          <w:p>
-            <w:r>
-              <w:t>Su dirección y su puerto (normalmente 9100).</w:t>
+            <w:tcW w:type="dxa" w:w="2268"/>
+          </w:tcPr>
+          <w:p>
+            <w:r>
+              <w:t>Cuadre.Declarar</w:t>
+            </w:r>
+          </w:p>
+        </w:tc>
+        <w:tc>
+          <w:tcPr>
+            <w:tcW w:type="dxa" w:w="2551"/>
+          </w:tcPr>
+          <w:p>
+            <w:r>
+              <w:t>Supervisor</w:t>
+            </w:r>
+          </w:p>
+        </w:tc>
+        <w:tc>
+          <w:tcPr>
+            <w:tcW w:type="dxa" w:w="4819"/>
+          </w:tcPr>
+          <w:p>
+            <w:r>
+              <w:t>Cuadrar los cierres pendientes de su sucursal.</w:t>
             </w:r>
           </w:p>
         </w:tc>
@@ -9017,31 +8708,31 @@
       <w:tr>
         <w:tc>
           <w:tcPr>
-            <w:tcW w:type="dxa" w:w="1247"/>
-          </w:tcPr>
-          <w:p>
-            <w:r>
-              <w:t>Archivo</w:t>
-            </w:r>
-          </w:p>
-        </w:tc>
-        <w:tc>
-          <w:tcPr>
-            <w:tcW w:type="dxa" w:w="3969"/>
-          </w:tcPr>
-          <w:p>
-            <w:r>
-              <w:t>Todavía no hay impresora: sirve para probar la caja.</w:t>
-            </w:r>
-          </w:p>
-        </w:tc>
-        <w:tc>
-          <w:tcPr>
-            <w:tcW w:type="dxa" w:w="4309"/>
-          </w:tcPr>
-          <w:p>
-            <w:r>
-              <w:t>La carpeta donde se van guardando los tickets.</w:t>
+            <w:tcW w:type="dxa" w:w="2268"/>
+          </w:tcPr>
+          <w:p>
+            <w:r>
+              <w:t>Cuadre.Corregir</w:t>
+            </w:r>
+          </w:p>
+        </w:tc>
+        <w:tc>
+          <w:tcPr>
+            <w:tcW w:type="dxa" w:w="2551"/>
+          </w:tcPr>
+          <w:p>
+            <w:r>
+              <w:t>El rol que decida el negocio</w:t>
+            </w:r>
+          </w:p>
+        </w:tc>
+        <w:tc>
+          <w:tcPr>
+            <w:tcW w:type="dxa" w:w="4819"/>
+          </w:tcPr>
+          <w:p>
+            <w:r>
+              <w:t>Corregir un cuadre ya hecho, con motivo, mientras el día no esté consolidado.</w:t>
             </w:r>
           </w:p>
         </w:tc>
@@ -9054,7 +8745,7 @@
           <w:i/>
           <w:color w:val="2E7D32"/>
         </w:rPr>
-        <w:t>La gaveta del dinero se conecta a la impresora, no al equipo: se abre con un pulso que viaja por el mismo cable. Por eso no se configura aparte.</w:t>
+        <w:t>El turno cierra en la caja aunque el Central esté caído: el cuadre espera. La caja nunca se queda trancada por la red.</w:t>
       </w:r>
     </w:p>
     <w:p>
@@ -9063,7 +8754,361 @@
           <w:i/>
           <w:color w:val="2E7D32"/>
         </w:rPr>
-        <w:t>Si cambia la impresora de una caja, hay que reiniciar el servicio de la caja para que lo tome.</w:t>
+        <w:t>Corregir no borra nada: queda lo que se había declarado, lo nuevo, el motivo y quién lo corrigió. Contabilidad corrige desde Cierres de caja, en el Central, incluso después de consolidar el día.</w:t>
+      </w:r>
+    </w:p>
+    <w:p>
+      <w:pPr>
+        <w:pStyle w:val="Heading2"/>
+      </w:pPr>
+      <w:r>
+        <w:t>2.19. Reportes</w:t>
+      </w:r>
+    </w:p>
+    <w:p>
+      <w:r>
+        <w:t>Ruta: /reportes. Todos por rango de días y, si se quiere, por sucursal o caja. Cada uno se descarga en Excel y en PDF.</w:t>
+      </w:r>
+    </w:p>
+    <w:tbl>
+      <w:tblPr>
+        <w:tblStyle w:val="TableGrid"/>
+        <w:tblW w:type="auto" w:w="0"/>
+        <w:tblLook w:firstColumn="1" w:firstRow="1" w:lastColumn="0" w:lastRow="0" w:noHBand="0" w:noVBand="1" w:val="04A0"/>
+      </w:tblPr>
+      <w:tblGrid>
+        <w:gridCol w:w="4759"/>
+        <w:gridCol w:w="4759"/>
+      </w:tblGrid>
+      <w:tr>
+        <w:tc>
+          <w:tcPr>
+            <w:tcW w:type="dxa" w:w="2551"/>
+          </w:tcPr>
+          <w:p>
+            <w:r/>
+            <w:r>
+              <w:rPr>
+                <w:b/>
+                <w:color w:val="1B4D3E"/>
+              </w:rPr>
+              <w:t>Reporte</w:t>
+            </w:r>
+          </w:p>
+        </w:tc>
+        <w:tc>
+          <w:tcPr>
+            <w:tcW w:type="dxa" w:w="7087"/>
+          </w:tcPr>
+          <w:p>
+            <w:r/>
+            <w:r>
+              <w:rPr>
+                <w:b/>
+                <w:color w:val="1B4D3E"/>
+              </w:rPr>
+              <w:t>Qué muestra</w:t>
+            </w:r>
+          </w:p>
+        </w:tc>
+      </w:tr>
+      <w:tr>
+        <w:tc>
+          <w:tcPr>
+            <w:tcW w:type="dxa" w:w="2551"/>
+          </w:tcPr>
+          <w:p>
+            <w:r>
+              <w:t>Ventas</w:t>
+            </w:r>
+          </w:p>
+        </w:tc>
+        <w:tc>
+          <w:tcPr>
+            <w:tcW w:type="dxa" w:w="7087"/>
+          </w:tcPr>
+          <w:p>
+            <w:r>
+              <w:t>Por día, sucursal y caja: facturas, notas de crédito, subtotal, descuento, ITBIS y total.</w:t>
+            </w:r>
+          </w:p>
+        </w:tc>
+      </w:tr>
+      <w:tr>
+        <w:tc>
+          <w:tcPr>
+            <w:tcW w:type="dxa" w:w="2551"/>
+          </w:tcPr>
+          <w:p>
+            <w:r>
+              <w:t>ITBIS por tasa</w:t>
+            </w:r>
+          </w:p>
+        </w:tc>
+        <w:tc>
+          <w:tcPr>
+            <w:tcW w:type="dxa" w:w="7087"/>
+          </w:tcPr>
+          <w:p>
+            <w:r>
+              <w:t>Base e impuesto de cada tasa del período.</w:t>
+            </w:r>
+          </w:p>
+        </w:tc>
+      </w:tr>
+      <w:tr>
+        <w:tc>
+          <w:tcPr>
+            <w:tcW w:type="dxa" w:w="2551"/>
+          </w:tcPr>
+          <w:p>
+            <w:r>
+              <w:t>Formato 607</w:t>
+            </w:r>
+          </w:p>
+        </w:tc>
+        <w:tc>
+          <w:tcPr>
+            <w:tcW w:type="dxa" w:w="7087"/>
+          </w:tcPr>
+          <w:p>
+            <w:r>
+              <w:t>Un registro por comprobante para la DGII, con la descarga del archivo de envío.</w:t>
+            </w:r>
+          </w:p>
+        </w:tc>
+      </w:tr>
+      <w:tr>
+        <w:tc>
+          <w:tcPr>
+            <w:tcW w:type="dxa" w:w="2551"/>
+          </w:tcPr>
+          <w:p>
+            <w:r>
+              <w:t>Cuadres de caja</w:t>
+            </w:r>
+          </w:p>
+        </w:tc>
+        <w:tc>
+          <w:tcPr>
+            <w:tcW w:type="dxa" w:w="7087"/>
+          </w:tcPr>
+          <w:p>
+            <w:r>
+              <w:t>Turno, cajero, esperado, declarado y diferencia.</w:t>
+            </w:r>
+          </w:p>
+        </w:tc>
+      </w:tr>
+      <w:tr>
+        <w:tc>
+          <w:tcPr>
+            <w:tcW w:type="dxa" w:w="2551"/>
+          </w:tcPr>
+          <w:p>
+            <w:r>
+              <w:t>e-CF y DGII</w:t>
+            </w:r>
+          </w:p>
+        </w:tc>
+        <w:tc>
+          <w:tcPr>
+            <w:tcW w:type="dxa" w:w="7087"/>
+          </w:tcPr>
+          <w:p>
+            <w:r>
+              <w:t>Estado de cada comprobante enviado.</w:t>
+            </w:r>
+          </w:p>
+        </w:tc>
+      </w:tr>
+      <w:tr>
+        <w:tc>
+          <w:tcPr>
+            <w:tcW w:type="dxa" w:w="2551"/>
+          </w:tcPr>
+          <w:p>
+            <w:r>
+              <w:t>Sincronización</w:t>
+            </w:r>
+          </w:p>
+        </w:tc>
+        <w:tc>
+          <w:tcPr>
+            <w:tcW w:type="dxa" w:w="7087"/>
+          </w:tcPr>
+          <w:p>
+            <w:r>
+              <w:t>Última comunicación de cada caja, mensajes, rechazos y alertas.</w:t>
+            </w:r>
+          </w:p>
+        </w:tc>
+      </w:tr>
+    </w:tbl>
+    <w:p/>
+    <w:p>
+      <w:pPr>
+        <w:pStyle w:val="Heading2"/>
+      </w:pPr>
+      <w:r>
+        <w:t>2.20. Monitor de sincronización</w:t>
+      </w:r>
+    </w:p>
+    <w:p>
+      <w:pPr>
+        <w:pStyle w:val="ListBullet"/>
+      </w:pPr>
+      <w:r>
+        <w:t>/monitor: estado de cada caja, cuánto hace que no se comunica y cuántos documentos trae pendientes.</w:t>
+      </w:r>
+    </w:p>
+    <w:p>
+      <w:pPr>
+        <w:pStyle w:val="ListBullet"/>
+      </w:pPr>
+      <w:r>
+        <w:t>/monitor/conflictos: documentos que el Central no pudo aceptar (por ejemplo un número repetido), para resolverlos.</w:t>
+      </w:r>
+    </w:p>
+    <w:p>
+      <w:pPr>
+        <w:pStyle w:val="Heading2"/>
+      </w:pPr>
+      <w:r>
+        <w:t>2.21. Chequeador de precios</w:t>
+      </w:r>
+    </w:p>
+    <w:p>
+      <w:r>
+        <w:t>Ruta: /chequeador/01, donde 01 es el código de la sucursal, en la pantalla que se pone en el pasillo de la tienda. Tecnología deja cada pantalla con la dirección de su sucursal, así el cliente nunca elige sucursal y siempre ve el precio y las ofertas de la tienda donde está parado. El cliente pasa el producto por el lector y ve la descripción, el precio grande, el precio por cantidad y la oferta que le conviene; la consulta se borra sola a los pocos segundos para el siguiente cliente. Los precios se muestran con el ITBIS ya sumado, que es lo que el cliente paga.</w:t>
+      </w:r>
+    </w:p>
+    <w:p>
+      <w:r>
+        <w:rPr>
+          <w:i/>
+          <w:color w:val="2E7D32"/>
+        </w:rPr>
+        <w:t>Si el artículo tiene varias ofertas vigentes, el chequeador muestra solo la mejor, que es la que le va a aplicar la caja. Las ofertas no se suman entre sí, y verlas todas haría creer que sí.</w:t>
+      </w:r>
+    </w:p>
+    <w:p>
+      <w:r>
+        <w:rPr>
+          <w:i/>
+          <w:color w:val="2E7D32"/>
+        </w:rPr>
+        <w:t>El chequeador viene apagado: se enciende en Parámetros, con Central.Chequeador.Habilitado.</w:t>
+      </w:r>
+    </w:p>
+    <w:p>
+      <w:r>
+        <w:rPr>
+          <w:i/>
+          <w:color w:val="2E7D32"/>
+        </w:rPr>
+        <w:t>Si la dirección trae un código de sucursal que no existe o está inactiva, la pantalla dice «Página no encontrada» y no consulta nada: mostrar el precio de otra sucursal sería engañar al cliente.</w:t>
+      </w:r>
+    </w:p>
+    <w:p>
+      <w:r>
+        <w:br w:type="page"/>
+      </w:r>
+    </w:p>
+    <w:p>
+      <w:pPr>
+        <w:pStyle w:val="Heading1"/>
+      </w:pPr>
+      <w:r>
+        <w:t>3. La caja, paso a paso</w:t>
+      </w:r>
+    </w:p>
+    <w:p>
+      <w:pPr>
+        <w:pStyle w:val="Heading2"/>
+      </w:pPr>
+      <w:r>
+        <w:t>3.1. Instalar una caja desde cero</w:t>
+      </w:r>
+    </w:p>
+    <w:p>
+      <w:r>
+        <w:t>Cada caja tiene su propia base de datos en su propio equipo: por eso sigue vendiendo aunque se caiga la red. La instalación la hace tecnología, una sola vez por caja.</w:t>
+      </w:r>
+    </w:p>
+    <w:p>
+      <w:pPr>
+        <w:pStyle w:val="ListNumber"/>
+      </w:pPr>
+      <w:r>
+        <w:t>En el Central, cree la sucursal y la caja (Organización → Cajas), con la IP fija del equipo donde va a correr. Después, en el menú de esa caja, «Emitir credencial»: el secreto se muestra una sola vez, cópielo.</w:t>
+      </w:r>
+    </w:p>
+    <w:p>
+      <w:pPr>
+        <w:pStyle w:val="ListNumber"/>
+      </w:pPr>
+      <w:r>
+        <w:t>En el equipo de la caja, instale SQL Server Express y ejecute scripts/base-datos/estructura_base_datos_pos.sql. Crea la base CgPosCaja vacía: no lleva datos, todo baja del Central.</w:t>
+      </w:r>
+    </w:p>
+    <w:p>
+      <w:pPr>
+        <w:pStyle w:val="ListNumber"/>
+      </w:pPr>
+      <w:r>
+        <w:t>Instale el programa de la caja con scripts/caja/instalar-caja.ps1, indicando el número de sucursal, el de caja y la dirección del Central. No se le pide ninguna clave.</w:t>
+      </w:r>
+    </w:p>
+    <w:p>
+      <w:pPr>
+        <w:pStyle w:val="ListNumber"/>
+      </w:pPr>
+      <w:r>
+        <w:t>Arranque la caja y abra cualquiera de sus pantallas. Como todavía no sabe cuál es, le pedirá cinco datos: el código de su sucursal, el de la caja, la IP de ese equipo, la dirección del Central y la credencial que copió. Además le pedirá su usuario y contraseña del Central, para saber quién está montando esa caja.</w:t>
+      </w:r>
+    </w:p>
+    <w:p>
+      <w:pPr>
+        <w:pStyle w:val="ListNumber"/>
+      </w:pPr>
+      <w:r>
+        <w:t>Copie el certificado digital de la empresa en el equipo. El PIN no se guarda: lo digita un supervisor en la caja.</w:t>
+      </w:r>
+    </w:p>
+    <w:p>
+      <w:pPr>
+        <w:pStyle w:val="ListNumber"/>
+      </w:pPr>
+      <w:r>
+        <w:t>Ya con su credencial, la caja baja artículos, precios, usuarios, parámetros y sus rangos de comprobantes.</w:t>
+      </w:r>
+    </w:p>
+    <w:p>
+      <w:r>
+        <w:rPr>
+          <w:i/>
+          <w:color w:val="2E7D32"/>
+        </w:rPr>
+        <w:t>Si la caja avisa que la base no existe o le faltan tablas, es que no se ejecutó el script en ese equipo.</w:t>
+      </w:r>
+    </w:p>
+    <w:p>
+      <w:r>
+        <w:rPr>
+          <w:i/>
+          <w:color w:val="2E7D32"/>
+        </w:rPr>
+        <w:t>Quien configura una caja tiene que ser un usuario del Central con el permiso «Autorizar la configuración de una caja desde el propio equipo». El Central lo comprueba en el momento, junto con la credencial y la dirección del equipo, y deja anotado quién configuró esa caja. La contraseña no se guarda en la caja: solo el nombre del usuario.</w:t>
+      </w:r>
+    </w:p>
+    <w:p>
+      <w:r>
+        <w:rPr>
+          <w:i/>
+          <w:color w:val="2E7D32"/>
+        </w:rPr>
+        <w:t>La credencial queda cifrada en la base de esa caja: no se vuelve a ver y copiarla a otra máquina no sirve. En cada comunicación el Central comprueba los cuatro datos juntos —sucursal, caja, IP y credencial—, así que dos cajas no pueden usar lo mismo.</w:t>
       </w:r>
     </w:p>
     <w:p>
@@ -9071,12 +9116,12 @@
         <w:pStyle w:val="Heading3"/>
       </w:pPr>
       <w:r>
-        <w:t>3.1.2. La publicidad de la pantalla del cliente</w:t>
-      </w:r>
-    </w:p>
-    <w:p>
-      <w:r>
-        <w:t>El segundo monitor muestra la venta y, al lado, la publicidad del negocio. Los archivos se copian en la carpeta C:\CGPOS\Publicidad del equipo de esa caja y se muestran en orden alfabético, así que conviene nombrarlos 01-..., 02-... y así.</w:t>
+        <w:t>3.1.1. La impresora de tickets</w:t>
+      </w:r>
+    </w:p>
+    <w:p>
+      <w:r>
+        <w:t>La caja imprime en la impresora térmica del mostrador. Se indica una sola vez, al instalarla, y hay tres formas según cómo esté conectada:</w:t>
       </w:r>
     </w:p>
     <w:tbl>
@@ -9093,7 +9138,7 @@
       <w:tr>
         <w:tc>
           <w:tcPr>
-            <w:tcW w:type="dxa" w:w="1814"/>
+            <w:tcW w:type="dxa" w:w="1247"/>
           </w:tcPr>
           <w:p>
             <w:r/>
@@ -9102,1122 +9147,13 @@
                 <w:b/>
                 <w:color w:val="1B4D3E"/>
               </w:rPr>
-              <w:t>Qué se puede poner</w:t>
-            </w:r>
-          </w:p>
-        </w:tc>
-        <w:tc>
-          <w:tcPr>
-            <w:tcW w:type="dxa" w:w="3118"/>
-          </w:tcPr>
-          <w:p>
-            <w:r/>
-            <w:r>
-              <w:rPr>
-                <w:b/>
-                <w:color w:val="1B4D3E"/>
-              </w:rPr>
-              <w:t>Formatos</w:t>
-            </w:r>
-          </w:p>
-        </w:tc>
-        <w:tc>
-          <w:tcPr>
-            <w:tcW w:type="dxa" w:w="4592"/>
-          </w:tcPr>
-          <w:p>
-            <w:r/>
-            <w:r>
-              <w:rPr>
-                <w:b/>
-                <w:color w:val="1B4D3E"/>
-              </w:rPr>
-              <w:t>Cuánto dura en pantalla</w:t>
-            </w:r>
-          </w:p>
-        </w:tc>
-      </w:tr>
-      <w:tr>
-        <w:tc>
-          <w:tcPr>
-            <w:tcW w:type="dxa" w:w="1814"/>
-          </w:tcPr>
-          <w:p>
-            <w:r>
-              <w:t>Imágenes</w:t>
-            </w:r>
-          </w:p>
-        </w:tc>
-        <w:tc>
-          <w:tcPr>
-            <w:tcW w:type="dxa" w:w="3118"/>
-          </w:tcPr>
-          <w:p>
-            <w:r>
-              <w:t>.png, .jpg, .jpeg, .webp, .svg</w:t>
-            </w:r>
-          </w:p>
-        </w:tc>
-        <w:tc>
-          <w:tcPr>
-            <w:tcW w:type="dxa" w:w="4592"/>
-          </w:tcPr>
-          <w:p>
-            <w:r>
-              <w:t>Los segundos del parámetro Pantallas.SegundosPorImagen</w:t>
-            </w:r>
-          </w:p>
-        </w:tc>
-      </w:tr>
-      <w:tr>
-        <w:tc>
-          <w:tcPr>
-            <w:tcW w:type="dxa" w:w="1814"/>
-          </w:tcPr>
-          <w:p>
-            <w:r>
-              <w:t>Videos</w:t>
-            </w:r>
-          </w:p>
-        </w:tc>
-        <w:tc>
-          <w:tcPr>
-            <w:tcW w:type="dxa" w:w="3118"/>
-          </w:tcPr>
-          <w:p>
-            <w:r>
-              <w:t>.mp4, .webm</w:t>
-            </w:r>
-          </w:p>
-        </w:tc>
-        <w:tc>
-          <w:tcPr>
-            <w:tcW w:type="dxa" w:w="4592"/>
-          </w:tcPr>
-          <w:p>
-            <w:r>
-              <w:t>Lo que dure el video: se reproduce completo y sin sonido</w:t>
-            </w:r>
-          </w:p>
-        </w:tc>
-      </w:tr>
-    </w:tbl>
-    <w:p/>
-    <w:p>
-      <w:r>
-        <w:rPr>
-          <w:i/>
-          <w:color w:val="2E7D32"/>
-        </w:rPr>
-        <w:t>Los archivos se pueden cambiar con la caja encendida: entran solos cuando el carrusel termina la vuelta, sin reiniciar nada. Y si cambia los segundos por imagen en el Central, la pantalla lo toma en cuanto la caja sincroniza.</w:t>
-      </w:r>
-    </w:p>
-    <w:p>
-      <w:r>
-        <w:rPr>
-          <w:i/>
-          <w:color w:val="2E7D32"/>
-        </w:rPr>
-        <w:t>Un video .avi o .mov no se ve: conviértalo a .mp4 antes de copiarlo. Sin bocinas no se pierde nada, porque el video va siempre sin sonido.</w:t>
-      </w:r>
-    </w:p>
-    <w:p>
-      <w:pPr>
-        <w:pStyle w:val="Heading3"/>
-      </w:pPr>
-      <w:r>
-        <w:t>3.1.3. Cambiar una caja de equipo</w:t>
-      </w:r>
-    </w:p>
-    <w:p>
-      <w:r>
-        <w:t>El equipo de la caja se dañó, se reinstaló Windows o se reemplaza por otro. La caja es la misma; lo que cambia es la máquina.</w:t>
-      </w:r>
-    </w:p>
-    <w:p>
-      <w:pPr>
-        <w:pStyle w:val="ListNumber"/>
-      </w:pPr>
-      <w:r>
-        <w:t>En el Central, Organización → Cajas, edite la caja y ponga la IP del equipo nuevo; después emítale una credencial nueva.</w:t>
-      </w:r>
-    </w:p>
-    <w:p>
-      <w:pPr>
-        <w:pStyle w:val="ListNumber"/>
-      </w:pPr>
-      <w:r>
-        <w:t>Instale la caja en el equipo nuevo, con la misma sucursal y el mismo número.</w:t>
-      </w:r>
-    </w:p>
-    <w:p>
-      <w:pPr>
-        <w:pStyle w:val="ListNumber"/>
-      </w:pPr>
-      <w:r>
-        <w:t>Arránquela y llene su pantalla de configuración con los mismos códigos, la IP nueva y la credencial nueva.</w:t>
-      </w:r>
-    </w:p>
-    <w:p>
-      <w:r>
-        <w:rPr>
-          <w:i/>
-          <w:color w:val="2E7D32"/>
-        </w:rPr>
-        <w:t>Si el equipo se perdió o se lo robaron, revoque la credencial de inmediato: la anterior deja de servir aunque enciendan el equipo.</w:t>
-      </w:r>
-    </w:p>
-    <w:p>
-      <w:r>
-        <w:rPr>
-          <w:i/>
-          <w:color w:val="2E7D32"/>
-        </w:rPr>
-        <w:t>Mientras los datos no cuadren, la caja sigue vendiendo con lo que tiene en su base; lo que no hace es sincronizar. En su barra de estado dirá «Sin conexión (credenciales)», para distinguirlo de quedarse sin red.</w:t>
-      </w:r>
-    </w:p>
-    <w:p>
-      <w:pPr>
-        <w:pStyle w:val="Heading2"/>
-      </w:pPr>
-      <w:r>
-        <w:t>3.2. Entrar a la caja</w:t>
-      </w:r>
-    </w:p>
-    <w:p>
-      <w:pPr>
-        <w:pStyle w:val="ListNumber"/>
-      </w:pPr>
-      <w:r>
-        <w:t>En la pantalla de ingreso digite su usuario y su clave (no hay PIN ni carné: siempre usuario y clave).</w:t>
-      </w:r>
-    </w:p>
-    <w:p>
-      <w:r>
-        <w:rPr>
-          <w:i/>
-          <w:color w:val="2E7D32"/>
-        </w:rPr>
-        <w:t>Una caja recién configurada tarda en tener sus datos: mientras el Central se los manda, la pantalla dice «Actualizando los datos de la caja…», en qué anda y cuántos artículos lleva de cuántos. No hay nada que hacer, solo esperar: la pantalla se habilita sola al terminar. Si en vez de eso sale un aviso rojo, ahí sí hay algo que revisar, y debajo dice qué fue lo que no se pudo aplicar.</w:t>
-      </w:r>
-    </w:p>
-    <w:p>
-      <w:pPr>
-        <w:pStyle w:val="ListNumber"/>
-      </w:pPr>
-      <w:r>
-        <w:t>Si se equivoca varias veces seguidas, el usuario se bloquea por unos minutos; un supervisor lo desbloquea desde el Central.</w:t>
-      </w:r>
-    </w:p>
-    <w:p>
-      <w:pPr>
-        <w:pStyle w:val="ListNumber"/>
-      </w:pPr>
-      <w:r>
-        <w:t>Si la caja no tiene turno abierto, el sistema le pide abrirlo.</w:t>
-      </w:r>
-    </w:p>
-    <w:p>
-      <w:pPr>
-        <w:pStyle w:val="Heading2"/>
-      </w:pPr>
-      <w:r>
-        <w:t>3.3. Abrir el turno</w:t>
-      </w:r>
-    </w:p>
-    <w:p>
-      <w:r>
-        <w:t>El turno es el período de trabajo de un cajero en esa caja. Solo puede haber un turno abierto por caja.</w:t>
-      </w:r>
-    </w:p>
-    <w:p>
-      <w:pPr>
-        <w:pStyle w:val="ListBullet"/>
-      </w:pPr>
-      <w:r>
-        <w:t>Al abrir se digita el fondo de caja (el sistema sugiere el monto configurado).</w:t>
-      </w:r>
-    </w:p>
-    <w:p>
-      <w:pPr>
-        <w:pStyle w:val="ListBullet"/>
-      </w:pPr>
-      <w:r>
-        <w:t>Si la caja tiene abierto el turno de otro cajero, aparece Relevar turno: con la autorización de un supervisor, usted toma el turno sin cerrarlo ni cuadrar. El turno sigue siendo del que lo abrió, y quien lo cierra es quien esté operando en ese momento.</w:t>
-      </w:r>
-    </w:p>
-    <w:p>
-      <w:pPr>
-        <w:pStyle w:val="ListBullet"/>
-      </w:pPr>
-      <w:r>
-        <w:t>La venta que está en pantalla y las facturas en espera son del turno, no del cajero: al relevar, el que entra las encuentra tal como estaban y puede seguirlas, cobrarlas, guardarlas o limpiarlas. La factura queda a nombre de quien la cobra, aunque la haya empezado el otro; en la auditoría se ve quién hizo cada cosa.</w:t>
-      </w:r>
-    </w:p>
-    <w:p>
-      <w:pPr>
-        <w:pStyle w:val="ListBullet"/>
-      </w:pPr>
-      <w:r>
-        <w:t>Cerrar el turno es definitivo: la caja no puede volver atrás. Cuente con calma antes de cerrar; si de todos modos quedó mal, la corrección se hace en el Central.</w:t>
-      </w:r>
-    </w:p>
-    <w:p>
-      <w:pPr>
-        <w:pStyle w:val="ListBullet"/>
-      </w:pPr>
-      <w:r>
-        <w:t>Si el turno quedó abierto de un día anterior, la caja no vende ni cobra: sale un aviso rojo fijo y no deja escanear, dar descuentos ni cobrar. Sí deja limpiar la pantalla, eliminar líneas, poner en espera y retomar, para dejar el turno listo. Hay que cerrarlo y abrir uno nuevo. Esta regla se puede apagar en el Central con el parámetro Caja.BloquearVentaTurnoDiaAnterior (viene encendido).</w:t>
-      </w:r>
-    </w:p>
-    <w:p>
-      <w:pPr>
-        <w:pStyle w:val="Heading2"/>
-      </w:pPr>
-      <w:r>
-        <w:t>3.4. La pantalla de ventas principal</w:t>
-      </w:r>
-    </w:p>
-    <w:p>
-      <w:r>
-        <w:t>La pantalla está dividida en cinco zonas:</w:t>
-      </w:r>
-    </w:p>
-    <w:tbl>
-      <w:tblPr>
-        <w:tblStyle w:val="TableGrid"/>
-        <w:tblW w:type="auto" w:w="0"/>
-        <w:tblLook w:firstColumn="1" w:firstRow="1" w:lastColumn="0" w:lastRow="0" w:noHBand="0" w:noVBand="1" w:val="04A0"/>
-      </w:tblPr>
-      <w:tblGrid>
-        <w:gridCol w:w="4759"/>
-        <w:gridCol w:w="4759"/>
-      </w:tblGrid>
-      <w:tr>
-        <w:tc>
-          <w:tcPr>
-            <w:tcW w:type="dxa" w:w="2835"/>
-          </w:tcPr>
-          <w:p>
-            <w:r/>
-            <w:r>
-              <w:rPr>
-                <w:b/>
-                <w:color w:val="1B4D3E"/>
-              </w:rPr>
-              <w:t>Zona</w:t>
-            </w:r>
-          </w:p>
-        </w:tc>
-        <w:tc>
-          <w:tcPr>
-            <w:tcW w:type="dxa" w:w="6803"/>
-          </w:tcPr>
-          <w:p>
-            <w:r/>
-            <w:r>
-              <w:rPr>
-                <w:b/>
-                <w:color w:val="1B4D3E"/>
-              </w:rPr>
-              <w:t>Para qué sirve</w:t>
-            </w:r>
-          </w:p>
-        </w:tc>
-      </w:tr>
-      <w:tr>
-        <w:tc>
-          <w:tcPr>
-            <w:tcW w:type="dxa" w:w="2835"/>
-          </w:tcPr>
-          <w:p>
-            <w:r>
-              <w:t>Encabezado izquierdo</w:t>
-            </w:r>
-          </w:p>
-        </w:tc>
-        <w:tc>
-          <w:tcPr>
-            <w:tcW w:type="dxa" w:w="6803"/>
-          </w:tcPr>
-          <w:p>
-            <w:r>
-              <w:t>Tipo de comprobante que se va a emitir (E31, E32, E44 o E45). Al tocarlo se abre el cliente.</w:t>
-            </w:r>
-          </w:p>
-        </w:tc>
-      </w:tr>
-      <w:tr>
-        <w:tc>
-          <w:tcPr>
-            <w:tcW w:type="dxa" w:w="2835"/>
-          </w:tcPr>
-          <w:p>
-            <w:r>
-              <w:t>Encabezado central</w:t>
-            </w:r>
-          </w:p>
-        </w:tc>
-        <w:tc>
-          <w:tcPr>
-            <w:tcW w:type="dxa" w:w="6803"/>
-          </w:tcPr>
-          <w:p>
-            <w:r>
-              <w:t>Cliente de la factura, número de factura que le tocará (se toma de verdad al cobrar: si otra venta se cobra antes, esta pasa al siguiente), cantidad de artículos, límite de compra, programa de fidelidad y lista de boda.</w:t>
-            </w:r>
-          </w:p>
-        </w:tc>
-      </w:tr>
-      <w:tr>
-        <w:tc>
-          <w:tcPr>
-            <w:tcW w:type="dxa" w:w="2835"/>
-          </w:tcPr>
-          <w:p>
-            <w:r>
-              <w:t>Encabezado derecho</w:t>
-            </w:r>
-          </w:p>
-        </w:tc>
-        <w:tc>
-          <w:tcPr>
-            <w:tcW w:type="dxa" w:w="6803"/>
-          </w:tcPr>
-          <w:p>
-            <w:r>
-              <w:t>Subtotal (la suma de las líneas, sin ITBIS), ITBIS (o el aviso de exenta en régimen especial), descuentos, TOTAL (subtotal más ITBIS) y, en facturas gubernamentales con retención, el total a pagar.</w:t>
-            </w:r>
-          </w:p>
-        </w:tc>
-      </w:tr>
-      <w:tr>
-        <w:tc>
-          <w:tcPr>
-            <w:tcW w:type="dxa" w:w="2835"/>
-          </w:tcPr>
-          <w:p>
-            <w:r>
-              <w:t>Campo de escaneo</w:t>
-            </w:r>
-          </w:p>
-        </w:tc>
-        <w:tc>
-          <w:tcPr>
-            <w:tcW w:type="dxa" w:w="6803"/>
-          </w:tcPr>
-          <w:p>
-            <w:r>
-              <w:t>Donde el lector escribe el código. También se puede digitar. A su derecha: catálogo, teclado en pantalla, Buscar (F2), Totalizar (F8) y el botón ☰ que abre el panel de funciones.</w:t>
-            </w:r>
-          </w:p>
-        </w:tc>
-      </w:tr>
-      <w:tr>
-        <w:tc>
-          <w:tcPr>
-            <w:tcW w:type="dxa" w:w="2835"/>
-          </w:tcPr>
-          <w:p>
-            <w:r>
-              <w:t>Grilla de líneas</w:t>
-            </w:r>
-          </w:p>
-        </w:tc>
-        <w:tc>
-          <w:tcPr>
-            <w:tcW w:type="dxa" w:w="6803"/>
-          </w:tcPr>
-          <w:p>
-            <w:r>
-              <w:t>Los artículos de la venta: línea, código, descripción, cantidad, precio y subtotal sin ITBIS, y la oferta aplicada.</w:t>
-            </w:r>
-          </w:p>
-        </w:tc>
-      </w:tr>
-      <w:tr>
-        <w:tc>
-          <w:tcPr>
-            <w:tcW w:type="dxa" w:w="2835"/>
-          </w:tcPr>
-          <w:p>
-            <w:r>
-              <w:t>Panel de funciones (☰)</w:t>
-            </w:r>
-          </w:p>
-        </w:tc>
-        <w:tc>
-          <w:tcPr>
-            <w:tcW w:type="dxa" w:w="6803"/>
-          </w:tcPr>
-          <w:p>
-            <w:r>
-              <w:t>Se despliega desde la derecha con todas las funciones. Se cierra solo al elegir una, al tocar fuera o al escanear: lo que se lee va a la venta.</w:t>
-            </w:r>
-          </w:p>
-        </w:tc>
-      </w:tr>
-      <w:tr>
-        <w:tc>
-          <w:tcPr>
-            <w:tcW w:type="dxa" w:w="2835"/>
-          </w:tcPr>
-          <w:p>
-            <w:r>
-              <w:t>Barra de estado (abajo)</w:t>
-            </w:r>
-          </w:p>
-        </w:tc>
-        <w:tc>
-          <w:tcPr>
-            <w:tcW w:type="dxa" w:w="6803"/>
-          </w:tcPr>
-          <w:p>
-            <w:r>
-              <w:t>Usuario, caja, turno, versión, estado del certificado e-CF y estado de la sincronización con el Central.</w:t>
-            </w:r>
-          </w:p>
-        </w:tc>
-      </w:tr>
-    </w:tbl>
-    <w:p/>
-    <w:p>
-      <w:pPr>
-        <w:pStyle w:val="Heading2"/>
-      </w:pPr>
-      <w:r>
-        <w:t>3.5. La pantalla de ventas secundaria</w:t>
-      </w:r>
-    </w:p>
-    <w:p>
-      <w:r>
-        <w:t>La caja tiene tres pantallas, cada una en su monitor: la de ventas principal (con lector y teclado), la de ventas secundaria (táctil, con el catálogo en mosaicos, como el mostrador de una cafetería) y la del cliente. Las abre el equipo al encenderse; no hay que navegar de una a otra.</w:t>
-      </w:r>
-    </w:p>
-    <w:p>
-      <w:r>
-        <w:t>La pantalla de ventas secundaria trabaja la misma venta que la principal: lo que se agrega en una aparece en la otra al instante, y se cobra desde cualquiera de las dos.</w:t>
-      </w:r>
-    </w:p>
-    <w:tbl>
-      <w:tblPr>
-        <w:tblStyle w:val="TableGrid"/>
-        <w:tblW w:type="auto" w:w="0"/>
-        <w:tblLook w:firstColumn="1" w:firstRow="1" w:lastColumn="0" w:lastRow="0" w:noHBand="0" w:noVBand="1" w:val="04A0"/>
-      </w:tblPr>
-      <w:tblGrid>
-        <w:gridCol w:w="4759"/>
-        <w:gridCol w:w="4759"/>
-      </w:tblGrid>
-      <w:tr>
-        <w:tc>
-          <w:tcPr>
-            <w:tcW w:type="dxa" w:w="3118"/>
-          </w:tcPr>
-          <w:p>
-            <w:r/>
-            <w:r>
-              <w:rPr>
-                <w:b/>
-                <w:color w:val="1B4D3E"/>
-              </w:rPr>
-              <w:t>Parte de la pantalla</w:t>
-            </w:r>
-          </w:p>
-        </w:tc>
-        <w:tc>
-          <w:tcPr>
-            <w:tcW w:type="dxa" w:w="6520"/>
-          </w:tcPr>
-          <w:p>
-            <w:r/>
-            <w:r>
-              <w:rPr>
-                <w:b/>
-                <w:color w:val="1B4D3E"/>
-              </w:rPr>
-              <w:t>Qué hace</w:t>
-            </w:r>
-          </w:p>
-        </w:tc>
-      </w:tr>
-      <w:tr>
-        <w:tc>
-          <w:tcPr>
-            <w:tcW w:type="dxa" w:w="3118"/>
-          </w:tcPr>
-          <w:p>
-            <w:r>
-              <w:t>Columna izquierda</w:t>
-            </w:r>
-          </w:p>
-        </w:tc>
-        <w:tc>
-          <w:tcPr>
-            <w:tcW w:type="dxa" w:w="6520"/>
-          </w:tcPr>
-          <w:p>
-            <w:r>
-              <w:t>La venta: sus líneas, los totales y el botón Cobrar. Al tocar el encabezado se abre cliente y comprobante.</w:t>
-            </w:r>
-          </w:p>
-        </w:tc>
-      </w:tr>
-      <w:tr>
-        <w:tc>
-          <w:tcPr>
-            <w:tcW w:type="dxa" w:w="3118"/>
-          </w:tcPr>
-          <w:p>
-            <w:r>
-              <w:t>Tocar una línea</w:t>
-            </w:r>
-          </w:p>
-        </w:tc>
-        <w:tc>
-          <w:tcPr>
-            <w:tcW w:type="dxa" w:w="6520"/>
-          </w:tcPr>
-          <w:p>
-            <w:r>
-              <w:t>La selecciona; con los botones de abajo se cambia la cantidad o se quita (la de quitar pide autorización).</w:t>
-            </w:r>
-          </w:p>
-        </w:tc>
-      </w:tr>
-      <w:tr>
-        <w:tc>
-          <w:tcPr>
-            <w:tcW w:type="dxa" w:w="3118"/>
-          </w:tcPr>
-          <w:p>
-            <w:r>
-              <w:t>Buscador (arriba a la derecha)</w:t>
-            </w:r>
-          </w:p>
-        </w:tc>
-        <w:tc>
-          <w:tcPr>
-            <w:tcW w:type="dxa" w:w="6520"/>
-          </w:tcPr>
-          <w:p>
-            <w:r>
-              <w:t>Busca por descripción o por código lo que no está en los mosaicos.</w:t>
-            </w:r>
-          </w:p>
-        </w:tc>
-      </w:tr>
-      <w:tr>
-        <w:tc>
-          <w:tcPr>
-            <w:tcW w:type="dxa" w:w="3118"/>
-          </w:tcPr>
-          <w:p>
-            <w:r>
-              <w:t>Pestañas de departamento y categoría</w:t>
-            </w:r>
-          </w:p>
-        </w:tc>
-        <w:tc>
-          <w:tcPr>
-            <w:tcW w:type="dxa" w:w="6520"/>
-          </w:tcPr>
-          <w:p>
-            <w:r>
-              <w:t>Filtran los mosaicos, como las secciones de un menú.</w:t>
-            </w:r>
-          </w:p>
-        </w:tc>
-      </w:tr>
-      <w:tr>
-        <w:tc>
-          <w:tcPr>
-            <w:tcW w:type="dxa" w:w="3118"/>
-          </w:tcPr>
-          <w:p>
-            <w:r>
-              <w:t>Mosaicos</w:t>
-            </w:r>
-          </w:p>
-        </w:tc>
-        <w:tc>
-          <w:tcPr>
-            <w:tcW w:type="dxa" w:w="6520"/>
-          </w:tcPr>
-          <w:p>
-            <w:r>
-              <w:t>Un toque agrega el artículo con su imagen y su precio. Aparecen los artículos marcados para el catálogo.</w:t>
-            </w:r>
-          </w:p>
-        </w:tc>
-      </w:tr>
-      <w:tr>
-        <w:tc>
-          <w:tcPr>
-            <w:tcW w:type="dxa" w:w="3118"/>
-          </w:tcPr>
-          <w:p>
-            <w:r>
-              <w:t>Barra de abajo</w:t>
-            </w:r>
-          </w:p>
-        </w:tc>
-        <w:tc>
-          <w:tcPr>
-            <w:tcW w:type="dxa" w:w="6520"/>
-          </w:tcPr>
-          <w:p>
-            <w:r>
-              <w:t>Cliente, consulta de precio, facturas en espera y devoluciones.</w:t>
-            </w:r>
-          </w:p>
-        </w:tc>
-      </w:tr>
-    </w:tbl>
-    <w:p/>
-    <w:p>
-      <w:r>
-        <w:rPr>
-          <w:i/>
-          <w:color w:val="2E7D32"/>
-        </w:rPr>
-        <w:t>Los artículos que se pesan o que piden serial se atienden mejor en la pantalla principal; desde la secundaria se agrega una unidad y luego se ajusta la cantidad.</w:t>
-      </w:r>
-    </w:p>
-    <w:p>
-      <w:pPr>
-        <w:pStyle w:val="Heading2"/>
-      </w:pPr>
-      <w:r>
-        <w:t>3.6. Las teclas de función</w:t>
-      </w:r>
-    </w:p>
-    <w:p>
-      <w:r>
-        <w:t>Buscar (F2) y Totalizar (F8) están siempre a la vista, junto al campo de escaneo. Todas las demás están en el panel de funciones, que se abre con el botón ☰. Las teclas F del teclado físico funcionan siempre, con el panel abierto o cerrado.</w:t>
-      </w:r>
-    </w:p>
-    <w:p>
-      <w:r>
-        <w:t>Teclas de función:</w:t>
-      </w:r>
-    </w:p>
-    <w:tbl>
-      <w:tblPr>
-        <w:tblStyle w:val="TableGrid"/>
-        <w:tblW w:type="auto" w:w="0"/>
-        <w:tblLook w:firstColumn="1" w:firstRow="1" w:lastColumn="0" w:lastRow="0" w:noHBand="0" w:noVBand="1" w:val="04A0"/>
-      </w:tblPr>
-      <w:tblGrid>
-        <w:gridCol w:w="4759"/>
-        <w:gridCol w:w="4759"/>
-      </w:tblGrid>
-      <w:tr>
-        <w:tc>
-          <w:tcPr>
-            <w:tcW w:type="dxa" w:w="1701"/>
-          </w:tcPr>
-          <w:p>
-            <w:r/>
-            <w:r>
-              <w:rPr>
-                <w:b/>
-                <w:color w:val="1B4D3E"/>
-              </w:rPr>
-              <w:t>Tecla</w:t>
-            </w:r>
-          </w:p>
-        </w:tc>
-        <w:tc>
-          <w:tcPr>
-            <w:tcW w:type="dxa" w:w="7937"/>
-          </w:tcPr>
-          <w:p>
-            <w:r/>
-            <w:r>
-              <w:rPr>
-                <w:b/>
-                <w:color w:val="1B4D3E"/>
-              </w:rPr>
-              <w:t>Qué hace</w:t>
-            </w:r>
-          </w:p>
-        </w:tc>
-      </w:tr>
-      <w:tr>
-        <w:tc>
-          <w:tcPr>
-            <w:tcW w:type="dxa" w:w="1701"/>
-          </w:tcPr>
-          <w:p>
-            <w:r>
-              <w:t>F2</w:t>
-            </w:r>
-          </w:p>
-        </w:tc>
-        <w:tc>
-          <w:tcPr>
-            <w:tcW w:type="dxa" w:w="7937"/>
-          </w:tcPr>
-          <w:p>
-            <w:r>
-              <w:t>Buscar un artículo por descripción</w:t>
-            </w:r>
-          </w:p>
-        </w:tc>
-      </w:tr>
-      <w:tr>
-        <w:tc>
-          <w:tcPr>
-            <w:tcW w:type="dxa" w:w="1701"/>
-          </w:tcPr>
-          <w:p>
-            <w:r>
-              <w:t>F3</w:t>
-            </w:r>
-          </w:p>
-        </w:tc>
-        <w:tc>
-          <w:tcPr>
-            <w:tcW w:type="dxa" w:w="7937"/>
-          </w:tcPr>
-          <w:p>
-            <w:r>
-              <w:t>Límite de compra que pidió el cliente: avisa al pasarse y, al totalizar, pide confirmar «¿Cobrar de todas formas?» (queda en la auditoría)</w:t>
-            </w:r>
-          </w:p>
-        </w:tc>
-      </w:tr>
-      <w:tr>
-        <w:tc>
-          <w:tcPr>
-            <w:tcW w:type="dxa" w:w="1701"/>
-          </w:tcPr>
-          <w:p>
-            <w:r>
-              <w:t>F4</w:t>
-            </w:r>
-          </w:p>
-        </w:tc>
-        <w:tc>
-          <w:tcPr>
-            <w:tcW w:type="dxa" w:w="7937"/>
-          </w:tcPr>
-          <w:p>
-            <w:r>
-              <w:t>Cambiar la cantidad de la línea seleccionada</w:t>
-            </w:r>
-          </w:p>
-        </w:tc>
-      </w:tr>
-      <w:tr>
-        <w:tc>
-          <w:tcPr>
-            <w:tcW w:type="dxa" w:w="1701"/>
-          </w:tcPr>
-          <w:p>
-            <w:r>
-              <w:t>F5</w:t>
-            </w:r>
-          </w:p>
-        </w:tc>
-        <w:tc>
-          <w:tcPr>
-            <w:tcW w:type="dxa" w:w="7937"/>
-          </w:tcPr>
-          <w:p>
-            <w:r>
-              <w:t>Tomar el peso de la balanza</w:t>
-            </w:r>
-          </w:p>
-        </w:tc>
-      </w:tr>
-      <w:tr>
-        <w:tc>
-          <w:tcPr>
-            <w:tcW w:type="dxa" w:w="1701"/>
-          </w:tcPr>
-          <w:p>
-            <w:r>
-              <w:t>F6</w:t>
-            </w:r>
-          </w:p>
-        </w:tc>
-        <w:tc>
-          <w:tcPr>
-            <w:tcW w:type="dxa" w:w="7937"/>
-          </w:tcPr>
-          <w:p>
-            <w:r>
-              <w:t>Lista de boda: asociar la venta a una lista de regalos</w:t>
-            </w:r>
-          </w:p>
-        </w:tc>
-      </w:tr>
-      <w:tr>
-        <w:tc>
-          <w:tcPr>
-            <w:tcW w:type="dxa" w:w="1701"/>
-          </w:tcPr>
-          <w:p>
-            <w:r>
-              <w:t>F7</w:t>
-            </w:r>
-          </w:p>
-        </w:tc>
-        <w:tc>
-          <w:tcPr>
-            <w:tcW w:type="dxa" w:w="7937"/>
-          </w:tcPr>
-          <w:p>
-            <w:r>
-              <w:t>Facturas en espera (guardar la actual y retomar otra)</w:t>
-            </w:r>
-          </w:p>
-        </w:tc>
-      </w:tr>
-      <w:tr>
-        <w:tc>
-          <w:tcPr>
-            <w:tcW w:type="dxa" w:w="1701"/>
-          </w:tcPr>
-          <w:p>
-            <w:r>
-              <w:t>F8</w:t>
-            </w:r>
-          </w:p>
-        </w:tc>
-        <w:tc>
-          <w:tcPr>
-            <w:tcW w:type="dxa" w:w="7937"/>
-          </w:tcPr>
-          <w:p>
-            <w:r>
-              <w:t>Totalizar: abre el cobro</w:t>
-            </w:r>
-          </w:p>
-        </w:tc>
-      </w:tr>
-      <w:tr>
-        <w:tc>
-          <w:tcPr>
-            <w:tcW w:type="dxa" w:w="1701"/>
-          </w:tcPr>
-          <w:p>
-            <w:r>
-              <w:t>F9</w:t>
-            </w:r>
-          </w:p>
-        </w:tc>
-        <w:tc>
-          <w:tcPr>
-            <w:tcW w:type="dxa" w:w="7937"/>
-          </w:tcPr>
-          <w:p>
-            <w:r>
-              <w:t>Cotización: traer un presupuesto hecho en el Central</w:t>
-            </w:r>
-          </w:p>
-        </w:tc>
-      </w:tr>
-      <w:tr>
-        <w:tc>
-          <w:tcPr>
-            <w:tcW w:type="dxa" w:w="1701"/>
-          </w:tcPr>
-          <w:p>
-            <w:r>
-              <w:t>F10</w:t>
-            </w:r>
-          </w:p>
-        </w:tc>
-        <w:tc>
-          <w:tcPr>
-            <w:tcW w:type="dxa" w:w="7937"/>
-          </w:tcPr>
-          <w:p>
-            <w:r>
-              <w:t>Ir a devoluciones</w:t>
-            </w:r>
-          </w:p>
-        </w:tc>
-      </w:tr>
-      <w:tr>
-        <w:tc>
-          <w:tcPr>
-            <w:tcW w:type="dxa" w:w="1701"/>
-          </w:tcPr>
-          <w:p>
-            <w:r>
-              <w:t>F11</w:t>
-            </w:r>
-          </w:p>
-        </w:tc>
-        <w:tc>
-          <w:tcPr>
-            <w:tcW w:type="dxa" w:w="7937"/>
-          </w:tcPr>
-          <w:p>
-            <w:r>
-              <w:t>Consultar el precio de un artículo sin venderlo</w:t>
-            </w:r>
-          </w:p>
-        </w:tc>
-      </w:tr>
-      <w:tr>
-        <w:tc>
-          <w:tcPr>
-            <w:tcW w:type="dxa" w:w="1701"/>
-          </w:tcPr>
-          <w:p>
-            <w:r>
-              <w:t>F12</w:t>
-            </w:r>
-          </w:p>
-        </w:tc>
-        <w:tc>
-          <w:tcPr>
-            <w:tcW w:type="dxa" w:w="7937"/>
-          </w:tcPr>
-          <w:p>
-            <w:r>
-              <w:t>Cliente, comprobante y programa de fidelidad</w:t>
-            </w:r>
-          </w:p>
-        </w:tc>
-      </w:tr>
-    </w:tbl>
-    <w:p/>
-    <w:p>
-      <w:r>
-        <w:t>Más operaciones (en el mismo panel, debajo): catálogo en mosaicos, eliminar línea, eliminar por escaneo, limpiar pantalla, descuento a la línea, descuento a la factura, entrega o envío, anular, suspender, gaveta, reimprimir, retiro de efectivo, cierre de turno y salir.</w:t>
-      </w:r>
-    </w:p>
-    <w:p>
-      <w:r>
-        <w:rPr>
-          <w:i/>
-          <w:color w:val="2E7D32"/>
-        </w:rPr>
-        <w:t>El teclado en pantalla de códigos, documentos y textos cambia entre números y letras con la tecla ABC / 123. El de cantidades y montos es solo numérico.</w:t>
-      </w:r>
-    </w:p>
-    <w:p>
-      <w:pPr>
-        <w:pStyle w:val="Heading2"/>
-      </w:pPr>
-      <w:r>
-        <w:t>3.7. Hacer una venta</w:t>
-      </w:r>
-    </w:p>
-    <w:p>
-      <w:pPr>
-        <w:pStyle w:val="ListNumber"/>
-      </w:pPr>
-      <w:r>
-        <w:t>Pase el código del artículo por el lector (o dígitelo y presione Enter). Para varias unidades: 12*CEM-425.</w:t>
-      </w:r>
-    </w:p>
-    <w:p>
-      <w:pPr>
-        <w:pStyle w:val="ListNumber"/>
-      </w:pPr>
-      <w:r>
-        <w:t>Para cambiar una cantidad, toque la cantidad en la línea o use F4. Para ver el otro código del artículo, toque el código.</w:t>
-      </w:r>
-    </w:p>
-    <w:p>
-      <w:r>
-        <w:rPr>
-          <w:i/>
-          <w:color w:val="2E7D32"/>
-        </w:rPr>
-        <w:t>La cantidad que se digita tiene un tope: el que diga el parámetro Ventas.CantidadMaximaDigitada (10 de fábrica). Si el cliente lleva más, el artículo se pasa por el lector una vez por unidad. Vale para F4, para tocar la cantidad y para escanear con cantidad*código. No aplica a los artículos que se venden por peso ni a los de unidad con decimales, porque ahí la cantidad la da la balanza o la etiqueta.</w:t>
-      </w:r>
-    </w:p>
-    <w:p>
-      <w:pPr>
-        <w:pStyle w:val="ListNumber"/>
-      </w:pPr>
-      <w:r>
-        <w:t>Si el artículo se vende por peso, se toma el peso de la balanza (F5) o se digita.</w:t>
-      </w:r>
-    </w:p>
-    <w:p>
-      <w:pPr>
-        <w:pStyle w:val="ListNumber"/>
-      </w:pPr>
-      <w:r>
-        <w:t>Si el artículo lleva serial, el sistema lo pide al escanearlo.</w:t>
-      </w:r>
-    </w:p>
-    <w:p>
-      <w:pPr>
-        <w:pStyle w:val="ListNumber"/>
-      </w:pPr>
-      <w:r>
-        <w:t>Con F12 asigne el cliente si lleva comprobante fiscal, y su cédula del programa de fidelidad.</w:t>
-      </w:r>
-    </w:p>
-    <w:p>
-      <w:pPr>
-        <w:pStyle w:val="ListNumber"/>
-      </w:pPr>
-      <w:r>
-        <w:t>Revise el total con el cliente y presione F8 para cobrar.</w:t>
-      </w:r>
-    </w:p>
-    <w:p>
-      <w:r>
-        <w:rPr>
-          <w:i/>
-          <w:color w:val="2E7D32"/>
-        </w:rPr>
-        <w:t>Cada operación se guarda al instante: si la caja se apaga, al volver a entrar la venta aparece tal como estaba.</w:t>
-      </w:r>
-    </w:p>
-    <w:p>
-      <w:pPr>
-        <w:pStyle w:val="Heading2"/>
-      </w:pPr>
-      <w:r>
-        <w:t>3.8. Cliente y tipo de comprobante (F12)</w:t>
-      </w:r>
-    </w:p>
-    <w:p>
-      <w:r>
-        <w:t>Se digita la cédula o el RNC; la caja lo busca en los clientes, que bajan del Central. Si no aparece, se digita el nombre. El tipo de comprobante sale del cliente y cambiarlo a mano requiere permiso.</w:t>
-      </w:r>
-    </w:p>
-    <w:tbl>
-      <w:tblPr>
-        <w:tblStyle w:val="TableGrid"/>
-        <w:tblW w:type="auto" w:w="0"/>
-        <w:tblLook w:firstColumn="1" w:firstRow="1" w:lastColumn="0" w:lastRow="0" w:noHBand="0" w:noVBand="1" w:val="04A0"/>
-      </w:tblPr>
-      <w:tblGrid>
-        <w:gridCol w:w="4759"/>
-        <w:gridCol w:w="4759"/>
-      </w:tblGrid>
-      <w:tr>
-        <w:tc>
-          <w:tcPr>
-            <w:tcW w:type="dxa" w:w="2835"/>
-          </w:tcPr>
-          <w:p>
-            <w:r/>
-            <w:r>
-              <w:rPr>
-                <w:b/>
-                <w:color w:val="1B4D3E"/>
-              </w:rPr>
-              <w:t>Comprobante</w:t>
-            </w:r>
-          </w:p>
-        </w:tc>
-        <w:tc>
-          <w:tcPr>
-            <w:tcW w:type="dxa" w:w="6803"/>
+              <w:t>Tipo</w:t>
+            </w:r>
+          </w:p>
+        </w:tc>
+        <w:tc>
+          <w:tcPr>
+            <w:tcW w:type="dxa" w:w="3969"/>
           </w:tcPr>
           <w:p>
             <w:r/>
@@ -10230,25 +9166,50 @@
             </w:r>
           </w:p>
         </w:tc>
+        <w:tc>
+          <w:tcPr>
+            <w:tcW w:type="dxa" w:w="4309"/>
+          </w:tcPr>
+          <w:p>
+            <w:r/>
+            <w:r>
+              <w:rPr>
+                <w:b/>
+                <w:color w:val="1B4D3E"/>
+              </w:rPr>
+              <w:t>Qué se indica</w:t>
+            </w:r>
+          </w:p>
+        </w:tc>
       </w:tr>
       <w:tr>
         <w:tc>
           <w:tcPr>
-            <w:tcW w:type="dxa" w:w="2835"/>
-          </w:tcPr>
-          <w:p>
-            <w:r>
-              <w:t>E32 – Consumo</w:t>
-            </w:r>
-          </w:p>
-        </w:tc>
-        <w:tc>
-          <w:tcPr>
-            <w:tcW w:type="dxa" w:w="6803"/>
-          </w:tcPr>
-          <w:p>
-            <w:r>
-              <w:t>Cliente común. Desde el monto configurado (RD$250,000 por defecto) exige cédula o RNC.</w:t>
+            <w:tcW w:type="dxa" w:w="1247"/>
+          </w:tcPr>
+          <w:p>
+            <w:r>
+              <w:t>Windows</w:t>
+            </w:r>
+          </w:p>
+        </w:tc>
+        <w:tc>
+          <w:tcPr>
+            <w:tcW w:type="dxa" w:w="3969"/>
+          </w:tcPr>
+          <w:p>
+            <w:r>
+              <w:t>La impresora está instalada en el equipo (USB o serie). Es lo más común.</w:t>
+            </w:r>
+          </w:p>
+        </w:tc>
+        <w:tc>
+          <w:tcPr>
+            <w:tcW w:type="dxa" w:w="4309"/>
+          </w:tcPr>
+          <w:p>
+            <w:r>
+              <w:t>El nombre exacto con el que aparece en Dispositivos e impresoras de Windows.</w:t>
             </w:r>
           </w:p>
         </w:tc>
@@ -10256,21 +9217,31 @@
       <w:tr>
         <w:tc>
           <w:tcPr>
-            <w:tcW w:type="dxa" w:w="2835"/>
-          </w:tcPr>
-          <w:p>
-            <w:r>
-              <w:t>E31 – Crédito fiscal</w:t>
-            </w:r>
-          </w:p>
-        </w:tc>
-        <w:tc>
-          <w:tcPr>
-            <w:tcW w:type="dxa" w:w="6803"/>
-          </w:tcPr>
-          <w:p>
-            <w:r>
-              <w:t>Empresa que necesita el ITBIS. Exige RNC o cédula.</w:t>
+            <w:tcW w:type="dxa" w:w="1247"/>
+          </w:tcPr>
+          <w:p>
+            <w:r>
+              <w:t>Red</w:t>
+            </w:r>
+          </w:p>
+        </w:tc>
+        <w:tc>
+          <w:tcPr>
+            <w:tcW w:type="dxa" w:w="3969"/>
+          </w:tcPr>
+          <w:p>
+            <w:r>
+              <w:t>La impresora tiene su propio puerto de red y su dirección.</w:t>
+            </w:r>
+          </w:p>
+        </w:tc>
+        <w:tc>
+          <w:tcPr>
+            <w:tcW w:type="dxa" w:w="4309"/>
+          </w:tcPr>
+          <w:p>
+            <w:r>
+              <w:t>Su dirección y su puerto (normalmente 9100).</w:t>
             </w:r>
           </w:p>
         </w:tc>
@@ -10278,359 +9249,44 @@
       <w:tr>
         <w:tc>
           <w:tcPr>
-            <w:tcW w:type="dxa" w:w="2835"/>
-          </w:tcPr>
-          <w:p>
-            <w:r>
-              <w:t>E44 – Régimen especial</w:t>
-            </w:r>
-          </w:p>
-        </w:tc>
-        <w:tc>
-          <w:tcPr>
-            <w:tcW w:type="dxa" w:w="6803"/>
-          </w:tcPr>
-          <w:p>
-            <w:r>
-              <w:t>Zonas francas, diplomáticos y demás acogidos a un régimen especial, que deben presentar su carné o certificación de exención de la DGII. La factura va SIN ITBIS.</w:t>
-            </w:r>
-          </w:p>
-        </w:tc>
-      </w:tr>
-      <w:tr>
-        <w:tc>
-          <w:tcPr>
-            <w:tcW w:type="dxa" w:w="2835"/>
-          </w:tcPr>
-          <w:p>
-            <w:r>
-              <w:t>E45 – Gubernamental</w:t>
-            </w:r>
-          </w:p>
-        </w:tc>
-        <w:tc>
-          <w:tcPr>
-            <w:tcW w:type="dxa" w:w="6803"/>
-          </w:tcPr>
-          <w:p>
-            <w:r>
-              <w:t>Instituciones del Estado. Exige RNC. Lleva ITBIS, salvo que la entidad presente su certificación de exención.</w:t>
+            <w:tcW w:type="dxa" w:w="1247"/>
+          </w:tcPr>
+          <w:p>
+            <w:r>
+              <w:t>Archivo</w:t>
+            </w:r>
+          </w:p>
+        </w:tc>
+        <w:tc>
+          <w:tcPr>
+            <w:tcW w:type="dxa" w:w="3969"/>
+          </w:tcPr>
+          <w:p>
+            <w:r>
+              <w:t>Todavía no hay impresora: sirve para probar la caja.</w:t>
+            </w:r>
+          </w:p>
+        </w:tc>
+        <w:tc>
+          <w:tcPr>
+            <w:tcW w:type="dxa" w:w="4309"/>
+          </w:tcPr>
+          <w:p>
+            <w:r>
+              <w:t>La carpeta donde se van guardando los tickets.</w:t>
             </w:r>
           </w:p>
         </w:tc>
       </w:tr>
     </w:tbl>
     <w:p/>
-    <w:p>
-      <w:r>
-        <w:t>Factura exenta (E44): al elegir este comprobante, toda la factura pasa a ser exenta de ITBIS, tengan o no impuesto los artículos. Como los precios ya van sin ITBIS, simplemente no se le suma: un artículo de RD$100 se cobra a RD$100 y no a RD$118. La pantalla, la pantalla del cliente y el ticket lo indican con “EXENTA DE ITBIS – RÉGIMEN ESPECIAL”. Si el bien que se vende no está exento para ese cliente, no se usa el E44: se le factura con E31.</w:t>
-      </w:r>
-    </w:p>
-    <w:p>
-      <w:r>
-        <w:t>Entidad del Estado con exención (E45): si la institución presenta su certificación de exención de ITBIS, digite el número en el diálogo del cliente y toque “Aplicar exención”. La factura pasa a ser exenta y el ticket lo indica con el número de la certificación. Si no la presenta, la factura lleva su ITBIS normal.</w:t>
-      </w:r>
-    </w:p>
-    <w:p>
-      <w:r>
-        <w:t>Retención de la Ley 32-23: en las facturas E45, si el negocio configuró el porcentaje, el sistema lo calcula sobre el subtotal ya con descuentos y se lo descuenta a lo que el cliente paga en caja. La factura mantiene su total; el ticket muestra “RETENCIÓN LEY 32-23” y “TOTAL A PAGAR”. Normalmente va en cero: quien factura electrónicamente está exento de esa retención.</w:t>
-      </w:r>
-    </w:p>
-    <w:p>
-      <w:pPr>
-        <w:pStyle w:val="Heading2"/>
-      </w:pPr>
-      <w:r>
-        <w:t>3.9. Lista de boda (F6)</w:t>
-      </w:r>
-    </w:p>
-    <w:p>
-      <w:pPr>
-        <w:pStyle w:val="ListNumber"/>
-      </w:pPr>
-      <w:r>
-        <w:t>Pida al cliente el número de la lista (la crea la administración en el Central).</w:t>
-      </w:r>
-    </w:p>
-    <w:p>
-      <w:pPr>
-        <w:pStyle w:val="ListNumber"/>
-      </w:pPr>
-      <w:r>
-        <w:t>Presione F6, digite el número y acepte: la lista queda en el encabezado de la venta y sale en el ticket.</w:t>
-      </w:r>
-    </w:p>
-    <w:p>
-      <w:pPr>
-        <w:pStyle w:val="ListNumber"/>
-      </w:pPr>
-      <w:r>
-        <w:t>Al cobrar, la compra queda registrada en la lista y, si el negocio lo tiene configurado, baja las cantidades pedidas.</w:t>
-      </w:r>
-    </w:p>
     <w:p>
       <w:r>
         <w:rPr>
           <w:i/>
           <w:color w:val="2E7D32"/>
         </w:rPr>
-        <w:t>La lista se consulta en el Central: si no hay comunicación, no se puede asociar. Una lista cerrada no se acepta.</w:t>
-      </w:r>
-    </w:p>
-    <w:p>
-      <w:pPr>
-        <w:pStyle w:val="Heading2"/>
-      </w:pPr>
-      <w:r>
-        <w:t>3.10. Descuentos y ofertas</w:t>
-      </w:r>
-    </w:p>
-    <w:p>
-      <w:pPr>
-        <w:pStyle w:val="ListBullet"/>
-      </w:pPr>
-      <w:r>
-        <w:t>Ofertas: se aplican solas según lo configurado en el Central. La columna Promo muestra cuál se aplicó; al tocarla se ve el detalle y se puede desactivar (con permiso).</w:t>
-      </w:r>
-    </w:p>
-    <w:p>
-      <w:pPr>
-        <w:pStyle w:val="ListBullet"/>
-      </w:pPr>
-      <w:r>
-        <w:t>Descuento a la línea: toque el precio de la línea. Descuento a la factura: panel de funciones (☰). Ambos piden motivo y la autorización de quien tenga tope suficiente; si el descuento pasa su tope, se pide una clave de nivel superior.</w:t>
-      </w:r>
-    </w:p>
-    <w:p>
-      <w:pPr>
-        <w:pStyle w:val="ListBullet"/>
-      </w:pPr>
-      <w:r>
-        <w:t>No se aplican descuentos manuales a artículos en oferta ni a departamentos que el negocio excluyó.</w:t>
-      </w:r>
-    </w:p>
-    <w:p>
-      <w:pPr>
-        <w:pStyle w:val="ListBullet"/>
-      </w:pPr>
-      <w:r>
-        <w:t>Descuento del banco por tarjeta: se aplica solo, al pasar la tarjeta en el cobro (ver 3.11).</w:t>
-      </w:r>
-    </w:p>
-    <w:p>
-      <w:pPr>
-        <w:pStyle w:val="Heading2"/>
-      </w:pPr>
-      <w:r>
-        <w:t>3.11. Cobrar (F8)</w:t>
-      </w:r>
-    </w:p>
-    <w:p>
-      <w:r>
-        <w:t>En la pantalla de cobro elija la forma de pago, digite el monto y agréguelo. Se puede combinar cuantas formas haga falta; arriba siempre se ve lo pagado, lo que falta o la devuelta.</w:t>
-      </w:r>
-    </w:p>
-    <w:tbl>
-      <w:tblPr>
-        <w:tblStyle w:val="TableGrid"/>
-        <w:tblW w:type="auto" w:w="0"/>
-        <w:tblLook w:firstColumn="1" w:firstRow="1" w:lastColumn="0" w:lastRow="0" w:noHBand="0" w:noVBand="1" w:val="04A0"/>
-      </w:tblPr>
-      <w:tblGrid>
-        <w:gridCol w:w="4759"/>
-        <w:gridCol w:w="4759"/>
-      </w:tblGrid>
-      <w:tr>
-        <w:tc>
-          <w:tcPr>
-            <w:tcW w:type="dxa" w:w="2268"/>
-          </w:tcPr>
-          <w:p>
-            <w:r/>
-            <w:r>
-              <w:rPr>
-                <w:b/>
-                <w:color w:val="1B4D3E"/>
-              </w:rPr>
-              <w:t>Forma de pago</w:t>
-            </w:r>
-          </w:p>
-        </w:tc>
-        <w:tc>
-          <w:tcPr>
-            <w:tcW w:type="dxa" w:w="7370"/>
-          </w:tcPr>
-          <w:p>
-            <w:r/>
-            <w:r>
-              <w:rPr>
-                <w:b/>
-                <w:color w:val="1B4D3E"/>
-              </w:rPr>
-              <w:t>Qué pide y qué hay que saber</w:t>
-            </w:r>
-          </w:p>
-        </w:tc>
-      </w:tr>
-      <w:tr>
-        <w:tc>
-          <w:tcPr>
-            <w:tcW w:type="dxa" w:w="2268"/>
-          </w:tcPr>
-          <w:p>
-            <w:r>
-              <w:t>Efectivo</w:t>
-            </w:r>
-          </w:p>
-        </w:tc>
-        <w:tc>
-          <w:tcPr>
-            <w:tcW w:type="dxa" w:w="7370"/>
-          </w:tcPr>
-          <w:p>
-            <w:r>
-              <w:t>Es el único que da devuelta. Hay botones de billetes rápidos y “Exacto”.</w:t>
-            </w:r>
-          </w:p>
-        </w:tc>
-      </w:tr>
-      <w:tr>
-        <w:tc>
-          <w:tcPr>
-            <w:tcW w:type="dxa" w:w="2268"/>
-          </w:tcPr>
-          <w:p>
-            <w:r>
-              <w:t>Tarjeta</w:t>
-            </w:r>
-          </w:p>
-        </w:tc>
-        <w:tc>
-          <w:tcPr>
-            <w:tcW w:type="dxa" w:w="7370"/>
-          </w:tcPr>
-          <w:p>
-            <w:r>
-              <w:t>Se presiona Pasar tarjeta: el terminal pide la tarjeta al cliente. Si el terminal lee el BIN, el descuento del banco se aplica solo antes de cobrar y se le cobra menos. Si el terminal no responde, se puede registrar la aprobación manual con autorización de supervisor.</w:t>
-            </w:r>
-          </w:p>
-        </w:tc>
-      </w:tr>
-      <w:tr>
-        <w:tc>
-          <w:tcPr>
-            <w:tcW w:type="dxa" w:w="2268"/>
-          </w:tcPr>
-          <w:p>
-            <w:r>
-              <w:t>Dólares u otra moneda</w:t>
-            </w:r>
-          </w:p>
-        </w:tc>
-        <w:tc>
-          <w:tcPr>
-            <w:tcW w:type="dxa" w:w="7370"/>
-          </w:tcPr>
-          <w:p>
-            <w:r>
-              <w:t>Se convierte con la tasa del día; la devuelta se da en pesos.</w:t>
-            </w:r>
-          </w:p>
-        </w:tc>
-      </w:tr>
-      <w:tr>
-        <w:tc>
-          <w:tcPr>
-            <w:tcW w:type="dxa" w:w="2268"/>
-          </w:tcPr>
-          <w:p>
-            <w:r>
-              <w:t>Transferencia o cheque</w:t>
-            </w:r>
-          </w:p>
-        </w:tc>
-        <w:tc>
-          <w:tcPr>
-            <w:tcW w:type="dxa" w:w="7370"/>
-          </w:tcPr>
-          <w:p>
-            <w:r>
-              <w:t>Piden banco y número.</w:t>
-            </w:r>
-          </w:p>
-        </w:tc>
-      </w:tr>
-      <w:tr>
-        <w:tc>
-          <w:tcPr>
-            <w:tcW w:type="dxa" w:w="2268"/>
-          </w:tcPr>
-          <w:p>
-            <w:r>
-              <w:t>Bono o tarjeta de regalo</w:t>
-            </w:r>
-          </w:p>
-        </w:tc>
-        <w:tc>
-          <w:tcPr>
-            <w:tcW w:type="dxa" w:w="7370"/>
-          </w:tcPr>
-          <w:p>
-            <w:r>
-              <w:t>Pide el serial. No se acepta con crédito fiscal.</w:t>
-            </w:r>
-          </w:p>
-        </w:tc>
-      </w:tr>
-      <w:tr>
-        <w:tc>
-          <w:tcPr>
-            <w:tcW w:type="dxa" w:w="2268"/>
-          </w:tcPr>
-          <w:p>
-            <w:r>
-              <w:t>Nota de crédito</w:t>
-            </w:r>
-          </w:p>
-        </w:tc>
-        <w:tc>
-          <w:tcPr>
-            <w:tcW w:type="dxa" w:w="7370"/>
-          </w:tcPr>
-          <w:p>
-            <w:r>
-              <w:t>Se escanea el código de la nota. El sistema valida que exista, esté vigente y tenga saldo; si es de otra sucursal, lo consulta al Central.</w:t>
-            </w:r>
-          </w:p>
-        </w:tc>
-      </w:tr>
-      <w:tr>
-        <w:tc>
-          <w:tcPr>
-            <w:tcW w:type="dxa" w:w="2268"/>
-          </w:tcPr>
-          <w:p>
-            <w:r>
-              <w:t>Puntos de fidelidad</w:t>
-            </w:r>
-          </w:p>
-        </w:tc>
-        <w:tc>
-          <w:tcPr>
-            <w:tcW w:type="dxa" w:w="7370"/>
-          </w:tcPr>
-          <w:p>
-            <w:r>
-              <w:t>Requiere cliente con cédula inscrita y autorización para canjear.</w:t>
-            </w:r>
-          </w:p>
-        </w:tc>
-      </w:tr>
-    </w:tbl>
-    <w:p/>
-    <w:p>
-      <w:r>
-        <w:t>Al terminar: se emite y firma la factura electrónica, se imprime el ticket, se abre la gaveta si hubo efectivo y empieza la siguiente venta. La pantalla del cliente muestra el total y la devuelta.</w:t>
+        <w:t>La gaveta del dinero se conecta a la impresora, no al equipo: se abre con un pulso que viaja por el mismo cable. Por eso no se configura aparte.</w:t>
       </w:r>
     </w:p>
     <w:p>
@@ -10639,238 +9295,20 @@
           <w:i/>
           <w:color w:val="2E7D32"/>
         </w:rPr>
-        <w:t>Si no hay e-NCF disponible o el certificado no está cargado, la venta NO se cobra: primero hay que resolverlo con administración. El sistema no permite facturar sin comprobante fiscal.</w:t>
-      </w:r>
-    </w:p>
-    <w:p>
-      <w:pPr>
-        <w:pStyle w:val="Heading2"/>
-      </w:pPr>
-      <w:r>
-        <w:t>3.12. Facturar una cotización (F9)</w:t>
-      </w:r>
-    </w:p>
-    <w:p>
-      <w:r>
-        <w:t>Una cotización es el presupuesto que administración le hizo al cliente desde el Central, con los precios del momento. El cliente llega con el papel y se le factura sin volver a digitar nada.</w:t>
-      </w:r>
-    </w:p>
-    <w:p>
-      <w:pPr>
-        <w:pStyle w:val="ListNumber"/>
-      </w:pPr>
-      <w:r>
-        <w:t>Presione F9 y escanee o digite el número de la cotización (empieza con COT).</w:t>
-      </w:r>
-    </w:p>
-    <w:p>
-      <w:pPr>
-        <w:pStyle w:val="ListNumber"/>
-      </w:pPr>
-      <w:r>
-        <w:t>La caja se la pide al Central y carga los artículos con los precios que se le prometieron al cliente: no se les aplican ofertas ni se recalculan.</w:t>
-      </w:r>
-    </w:p>
-    <w:p>
-      <w:pPr>
-        <w:pStyle w:val="ListNumber"/>
-      </w:pPr>
-      <w:r>
-        <w:t>Cobre normalmente. El ticket sale con el número de la cotización y en el Central queda marcada como facturada.</w:t>
-      </w:r>
-    </w:p>
-    <w:p>
-      <w:r>
-        <w:rPr>
-          <w:i/>
-          <w:color w:val="2E7D32"/>
-        </w:rPr>
-        <w:t>Si la cotización venció, la caja pide la autorización de un supervisor y el motivo queda registrado. Una cotización ya facturada o anulada no se puede volver a usar.</w:t>
-      </w:r>
-    </w:p>
-    <w:p>
-      <w:r>
-        <w:rPr>
-          <w:i/>
-          <w:color w:val="2E7D32"/>
-        </w:rPr>
-        <w:t>La cotización vive en el Central: si la caja está sin comunicación, no se puede traer. La pantalla lo dice con esas palabras, y siempre se puede facturar a mano.</w:t>
-      </w:r>
-    </w:p>
-    <w:p>
-      <w:r>
-        <w:rPr>
-          <w:i/>
-          <w:color w:val="2E7D32"/>
-        </w:rPr>
-        <w:t>La venta tiene que estar vacía: si ya tiene artículos, termínela o límpiela antes de traer la cotización.</w:t>
-      </w:r>
-    </w:p>
-    <w:p>
-      <w:pPr>
-        <w:pStyle w:val="Heading2"/>
-      </w:pPr>
-      <w:r>
-        <w:t>3.13. Facturas en espera, anular y suspender</w:t>
-      </w:r>
-    </w:p>
-    <w:p>
-      <w:pPr>
-        <w:pStyle w:val="ListBullet"/>
-      </w:pPr>
-      <w:r>
-        <w:t>F7 – En espera: guarda la venta actual para atender a otro cliente y retomarla después. Se le pone una referencia corta, el nombre del cliente o unos dígitos («Sra. María», «102»), que es con lo que se encuentra en la lista al volver. Dos facturas en espera del mismo turno no pueden llamarse igual.</w:t>
-      </w:r>
-    </w:p>
-    <w:p>
-      <w:pPr>
-        <w:pStyle w:val="ListBullet"/>
-      </w:pPr>
-      <w:r>
-        <w:t>Para retomar una factura con otra venta en pantalla, escriba también la referencia de la que está en pantalla: las dos se intercambian. Si la de pantalla no tiene artículos, simplemente se descarta.</w:t>
-      </w:r>
-    </w:p>
-    <w:p>
-      <w:pPr>
-        <w:pStyle w:val="ListBullet"/>
-      </w:pPr>
-      <w:r>
-        <w:t>Mientras la venta se arma, la pantalla muestra el número de factura que le tocaría, pero el número se le da de verdad al cobrar, en el orden en que se cobra: una factura en espera no se lleva el número de otro cliente, y una venta que no se cobró no deja un hueco en la numeración. En la auditoría, la venta sin cobrar aparece como B-000015.</w:t>
-      </w:r>
-    </w:p>
-    <w:p>
-      <w:pPr>
-        <w:pStyle w:val="ListBullet"/>
-      </w:pPr>
-      <w:r>
-        <w:t>Una venta con tarjeta ya aprobada no se pone en espera: cóbrela o anule la tarjeta primero.</w:t>
-      </w:r>
-    </w:p>
-    <w:p>
-      <w:pPr>
-        <w:pStyle w:val="ListBullet"/>
-      </w:pPr>
-      <w:r>
-        <w:t>Anular (panel de funciones ☰): cancela la transacción en curso con motivo y autorización. Como todavía no era una factura, desaparece de la caja; lo que tenía, quién la anuló, quién lo autorizó y el motivo quedan en la auditoría.</w:t>
-      </w:r>
-    </w:p>
-    <w:p>
-      <w:pPr>
-        <w:pStyle w:val="ListBullet"/>
-      </w:pPr>
-      <w:r>
-        <w:t>Suspender: bloquea la pantalla; se reanuda con la clave del cajero.</w:t>
-      </w:r>
-    </w:p>
-    <w:p>
-      <w:pPr>
-        <w:pStyle w:val="ListBullet"/>
-      </w:pPr>
-      <w:r>
-        <w:t>Eliminar línea, eliminar por escaneo y limpiar pantalla piden autorización de supervisor; la línea eliminada queda tachada en su lugar, con su mismo número, y sale del total. La numeración de las líneas sigue continua; quién la eliminó y quién lo autorizó queda en la auditoría.</w:t>
-      </w:r>
-    </w:p>
-    <w:p>
-      <w:pPr>
-        <w:pStyle w:val="Heading2"/>
-      </w:pPr>
-      <w:r>
-        <w:t>3.14. Entregas y envíos</w:t>
-      </w:r>
-    </w:p>
-    <w:p>
-      <w:r>
-        <w:t>Cuando el cliente se lleva parte de la mercancía después:</w:t>
-      </w:r>
-    </w:p>
-    <w:p>
-      <w:pPr>
-        <w:pStyle w:val="ListNumber"/>
-      </w:pPr>
-      <w:r>
-        <w:t>En el panel de funciones (☰), elija Entrega / envío.</w:t>
-      </w:r>
-    </w:p>
-    <w:p>
-      <w:pPr>
-        <w:pStyle w:val="ListNumber"/>
-      </w:pPr>
-      <w:r>
-        <w:t>Marque qué líneas y qué cantidad quedan pendientes, y si el cliente lo retira en una sucursal (la suya u otra) o se le envía a una dirección, con la fecha comprometida.</w:t>
-      </w:r>
-    </w:p>
-    <w:p>
-      <w:pPr>
-        <w:pStyle w:val="ListNumber"/>
-      </w:pPr>
-      <w:r>
-        <w:t>Al cobrar se imprime un comprobante de pendiente por cada destino, con código de barras: una copia para el cliente y otra para quien despacha.</w:t>
-      </w:r>
-    </w:p>
-    <w:p>
-      <w:pPr>
-        <w:pStyle w:val="ListNumber"/>
-      </w:pPr>
-      <w:r>
-        <w:t>De ahí en adelante el pendiente se despacha desde el Central (Despacho → Pendientes): la caja ya no tiene nada que ver con él. Vea «2.14. Despacho de pendientes y envíos».</w:t>
-      </w:r>
-    </w:p>
-    <w:p>
-      <w:pPr>
-        <w:pStyle w:val="Heading2"/>
-      </w:pPr>
-      <w:r>
-        <w:t>3.15. Devoluciones y notas de crédito</w:t>
-      </w:r>
-    </w:p>
-    <w:p>
-      <w:r>
-        <w:t>Se entra con F10 o directamente a /devoluciones.</w:t>
-      </w:r>
-    </w:p>
-    <w:p>
-      <w:pPr>
-        <w:pStyle w:val="ListNumber"/>
-      </w:pPr>
-      <w:r>
-        <w:t>Escanee el código de barras del ticket o digite el e-NCF de la factura.</w:t>
-      </w:r>
-    </w:p>
-    <w:p>
-      <w:pPr>
-        <w:pStyle w:val="ListNumber"/>
-      </w:pPr>
-      <w:r>
-        <w:t>Indique qué se devuelve de cada línea (el sistema muestra lo vendido, lo ya devuelto y lo disponible).</w:t>
-      </w:r>
-    </w:p>
-    <w:p>
-      <w:pPr>
-        <w:pStyle w:val="ListNumber"/>
-      </w:pPr>
-      <w:r>
-        <w:t>Elija el motivo y, si la factura no tiene cliente, digite la cédula o el RNC.</w:t>
-      </w:r>
-    </w:p>
-    <w:p>
-      <w:pPr>
-        <w:pStyle w:val="ListNumber"/>
-      </w:pPr>
-      <w:r>
-        <w:t>Indique cómo se le devuelve: saldo en la nota (lo normal), efectivo, a la tarjeta o cheque, según lo que el negocio permita.</w:t>
-      </w:r>
-    </w:p>
-    <w:p>
-      <w:pPr>
-        <w:pStyle w:val="ListNumber"/>
-      </w:pPr>
-      <w:r>
-        <w:t>Pida la autorización del encargado: se imprime la nota de crédito para el cliente y la copia de contabilidad.</w:t>
-      </w:r>
-    </w:p>
-    <w:p>
-      <w:r>
-        <w:t>Tipos de nota de crédito:</w:t>
+        <w:t>Si cambia la impresora de una caja, hay que reiniciar el servicio de la caja para que lo tome.</w:t>
+      </w:r>
+    </w:p>
+    <w:p>
+      <w:pPr>
+        <w:pStyle w:val="Heading3"/>
+      </w:pPr>
+      <w:r>
+        <w:t>3.1.2. La publicidad de la pantalla del cliente</w:t>
+      </w:r>
+    </w:p>
+    <w:p>
+      <w:r>
+        <w:t>El segundo monitor muestra la venta y, al lado, la publicidad del negocio. Los archivos se copian en la carpeta C:\CGPOS\Publicidad del equipo de esa caja y se muestran en orden alfabético, así que conviene nombrarlos 01-..., 02-... y así.</w:t>
       </w:r>
     </w:p>
     <w:tbl>
@@ -10887,6 +9325,1800 @@
       <w:tr>
         <w:tc>
           <w:tcPr>
+            <w:tcW w:type="dxa" w:w="1814"/>
+          </w:tcPr>
+          <w:p>
+            <w:r/>
+            <w:r>
+              <w:rPr>
+                <w:b/>
+                <w:color w:val="1B4D3E"/>
+              </w:rPr>
+              <w:t>Qué se puede poner</w:t>
+            </w:r>
+          </w:p>
+        </w:tc>
+        <w:tc>
+          <w:tcPr>
+            <w:tcW w:type="dxa" w:w="3118"/>
+          </w:tcPr>
+          <w:p>
+            <w:r/>
+            <w:r>
+              <w:rPr>
+                <w:b/>
+                <w:color w:val="1B4D3E"/>
+              </w:rPr>
+              <w:t>Formatos</w:t>
+            </w:r>
+          </w:p>
+        </w:tc>
+        <w:tc>
+          <w:tcPr>
+            <w:tcW w:type="dxa" w:w="4592"/>
+          </w:tcPr>
+          <w:p>
+            <w:r/>
+            <w:r>
+              <w:rPr>
+                <w:b/>
+                <w:color w:val="1B4D3E"/>
+              </w:rPr>
+              <w:t>Cuánto dura en pantalla</w:t>
+            </w:r>
+          </w:p>
+        </w:tc>
+      </w:tr>
+      <w:tr>
+        <w:tc>
+          <w:tcPr>
+            <w:tcW w:type="dxa" w:w="1814"/>
+          </w:tcPr>
+          <w:p>
+            <w:r>
+              <w:t>Imágenes</w:t>
+            </w:r>
+          </w:p>
+        </w:tc>
+        <w:tc>
+          <w:tcPr>
+            <w:tcW w:type="dxa" w:w="3118"/>
+          </w:tcPr>
+          <w:p>
+            <w:r>
+              <w:t>.png, .jpg, .jpeg, .webp, .svg</w:t>
+            </w:r>
+          </w:p>
+        </w:tc>
+        <w:tc>
+          <w:tcPr>
+            <w:tcW w:type="dxa" w:w="4592"/>
+          </w:tcPr>
+          <w:p>
+            <w:r>
+              <w:t>Los segundos del parámetro Pantallas.SegundosPorImagen</w:t>
+            </w:r>
+          </w:p>
+        </w:tc>
+      </w:tr>
+      <w:tr>
+        <w:tc>
+          <w:tcPr>
+            <w:tcW w:type="dxa" w:w="1814"/>
+          </w:tcPr>
+          <w:p>
+            <w:r>
+              <w:t>Videos</w:t>
+            </w:r>
+          </w:p>
+        </w:tc>
+        <w:tc>
+          <w:tcPr>
+            <w:tcW w:type="dxa" w:w="3118"/>
+          </w:tcPr>
+          <w:p>
+            <w:r>
+              <w:t>.mp4, .webm</w:t>
+            </w:r>
+          </w:p>
+        </w:tc>
+        <w:tc>
+          <w:tcPr>
+            <w:tcW w:type="dxa" w:w="4592"/>
+          </w:tcPr>
+          <w:p>
+            <w:r>
+              <w:t>Lo que dure el video: se reproduce completo y sin sonido</w:t>
+            </w:r>
+          </w:p>
+        </w:tc>
+      </w:tr>
+    </w:tbl>
+    <w:p/>
+    <w:p>
+      <w:r>
+        <w:rPr>
+          <w:i/>
+          <w:color w:val="2E7D32"/>
+        </w:rPr>
+        <w:t>Los archivos se pueden cambiar con la caja encendida: entran solos cuando el carrusel termina la vuelta, sin reiniciar nada. Y si cambia los segundos por imagen en el Central, la pantalla lo toma en cuanto la caja sincroniza.</w:t>
+      </w:r>
+    </w:p>
+    <w:p>
+      <w:r>
+        <w:rPr>
+          <w:i/>
+          <w:color w:val="2E7D32"/>
+        </w:rPr>
+        <w:t>Un video .avi o .mov no se ve: conviértalo a .mp4 antes de copiarlo. Sin bocinas no se pierde nada, porque el video va siempre sin sonido.</w:t>
+      </w:r>
+    </w:p>
+    <w:p>
+      <w:pPr>
+        <w:pStyle w:val="Heading3"/>
+      </w:pPr>
+      <w:r>
+        <w:t>3.1.3. Cambiar una caja de equipo</w:t>
+      </w:r>
+    </w:p>
+    <w:p>
+      <w:r>
+        <w:t>El equipo de la caja se dañó, se reinstaló Windows o se reemplaza por otro. La caja es la misma; lo que cambia es la máquina.</w:t>
+      </w:r>
+    </w:p>
+    <w:p>
+      <w:pPr>
+        <w:pStyle w:val="ListNumber"/>
+      </w:pPr>
+      <w:r>
+        <w:t>En el Central, Organización → Cajas, edite la caja y ponga la IP del equipo nuevo; después emítale una credencial nueva.</w:t>
+      </w:r>
+    </w:p>
+    <w:p>
+      <w:pPr>
+        <w:pStyle w:val="ListNumber"/>
+      </w:pPr>
+      <w:r>
+        <w:t>Instale la caja en el equipo nuevo, con la misma sucursal y el mismo número.</w:t>
+      </w:r>
+    </w:p>
+    <w:p>
+      <w:pPr>
+        <w:pStyle w:val="ListNumber"/>
+      </w:pPr>
+      <w:r>
+        <w:t>Arránquela y llene su pantalla de configuración con los mismos códigos, la IP nueva y la credencial nueva.</w:t>
+      </w:r>
+    </w:p>
+    <w:p>
+      <w:r>
+        <w:rPr>
+          <w:i/>
+          <w:color w:val="2E7D32"/>
+        </w:rPr>
+        <w:t>Si el equipo se perdió o se lo robaron, revoque la credencial de inmediato: la anterior deja de servir aunque enciendan el equipo.</w:t>
+      </w:r>
+    </w:p>
+    <w:p>
+      <w:r>
+        <w:rPr>
+          <w:i/>
+          <w:color w:val="2E7D32"/>
+        </w:rPr>
+        <w:t>Mientras los datos no cuadren, la caja sigue vendiendo con lo que tiene en su base; lo que no hace es sincronizar. En su barra de estado dirá «Sin conexión (credenciales)», para distinguirlo de quedarse sin red.</w:t>
+      </w:r>
+    </w:p>
+    <w:p>
+      <w:pPr>
+        <w:pStyle w:val="Heading2"/>
+      </w:pPr>
+      <w:r>
+        <w:t>3.2. Entrar a la caja</w:t>
+      </w:r>
+    </w:p>
+    <w:p>
+      <w:pPr>
+        <w:pStyle w:val="ListNumber"/>
+      </w:pPr>
+      <w:r>
+        <w:t>En la pantalla de ingreso digite su usuario y su clave (no hay PIN ni carné: siempre usuario y clave).</w:t>
+      </w:r>
+    </w:p>
+    <w:p>
+      <w:r>
+        <w:rPr>
+          <w:i/>
+          <w:color w:val="2E7D32"/>
+        </w:rPr>
+        <w:t>Una caja recién configurada tarda en tener sus datos: mientras el Central se los manda, la pantalla dice «Actualizando los datos de la caja…», en qué anda y cuántos artículos lleva de cuántos. No hay nada que hacer, solo esperar: la pantalla se habilita sola al terminar. Si en vez de eso sale un aviso rojo, ahí sí hay algo que revisar, y debajo dice qué fue lo que no se pudo aplicar.</w:t>
+      </w:r>
+    </w:p>
+    <w:p>
+      <w:pPr>
+        <w:pStyle w:val="ListNumber"/>
+      </w:pPr>
+      <w:r>
+        <w:t>Si se equivoca varias veces seguidas, el usuario se bloquea por unos minutos; un supervisor lo desbloquea desde el Central.</w:t>
+      </w:r>
+    </w:p>
+    <w:p>
+      <w:pPr>
+        <w:pStyle w:val="ListNumber"/>
+      </w:pPr>
+      <w:r>
+        <w:t>Si la caja no tiene turno abierto, el sistema le pide abrirlo.</w:t>
+      </w:r>
+    </w:p>
+    <w:p>
+      <w:pPr>
+        <w:pStyle w:val="Heading2"/>
+      </w:pPr>
+      <w:r>
+        <w:t>3.3. Abrir el turno</w:t>
+      </w:r>
+    </w:p>
+    <w:p>
+      <w:r>
+        <w:t>El turno es el período de trabajo de un cajero en esa caja. Solo puede haber un turno abierto por caja.</w:t>
+      </w:r>
+    </w:p>
+    <w:p>
+      <w:pPr>
+        <w:pStyle w:val="ListBullet"/>
+      </w:pPr>
+      <w:r>
+        <w:t>Al abrir se digita el fondo de caja (el sistema sugiere el monto configurado).</w:t>
+      </w:r>
+    </w:p>
+    <w:p>
+      <w:pPr>
+        <w:pStyle w:val="ListBullet"/>
+      </w:pPr>
+      <w:r>
+        <w:t>Si la caja tiene abierto el turno de otro cajero, aparece Relevar turno: con la autorización de un supervisor, usted toma el turno sin cerrarlo ni cuadrar. El turno sigue siendo del que lo abrió, y quien lo cierra es quien esté operando en ese momento.</w:t>
+      </w:r>
+    </w:p>
+    <w:p>
+      <w:pPr>
+        <w:pStyle w:val="ListBullet"/>
+      </w:pPr>
+      <w:r>
+        <w:t>La venta que está en pantalla y las facturas en espera son del turno, no del cajero: al relevar, el que entra las encuentra tal como estaban y puede seguirlas, cobrarlas, guardarlas o limpiarlas. La factura queda a nombre de quien la cobra, aunque la haya empezado el otro; en la auditoría se ve quién hizo cada cosa.</w:t>
+      </w:r>
+    </w:p>
+    <w:p>
+      <w:pPr>
+        <w:pStyle w:val="ListBullet"/>
+      </w:pPr>
+      <w:r>
+        <w:t>Cerrar el turno es definitivo: la caja no puede volver atrás. Cuente con calma antes de cerrar; si de todos modos quedó mal, la corrección se hace en el Central.</w:t>
+      </w:r>
+    </w:p>
+    <w:p>
+      <w:pPr>
+        <w:pStyle w:val="ListBullet"/>
+      </w:pPr>
+      <w:r>
+        <w:t>Si el turno quedó abierto de un día anterior, la caja no vende ni cobra: sale un aviso rojo fijo y no deja escanear, dar descuentos ni cobrar. Sí deja limpiar la pantalla, eliminar líneas, poner en espera y retomar, para dejar el turno listo. Hay que cerrarlo y abrir uno nuevo. Esta regla se puede apagar en el Central con el parámetro Caja.BloquearVentaTurnoDiaAnterior (viene encendido).</w:t>
+      </w:r>
+    </w:p>
+    <w:p>
+      <w:pPr>
+        <w:pStyle w:val="Heading2"/>
+      </w:pPr>
+      <w:r>
+        <w:t>3.4. La pantalla de ventas principal</w:t>
+      </w:r>
+    </w:p>
+    <w:p>
+      <w:r>
+        <w:t>La pantalla está dividida en cinco zonas:</w:t>
+      </w:r>
+    </w:p>
+    <w:tbl>
+      <w:tblPr>
+        <w:tblStyle w:val="TableGrid"/>
+        <w:tblW w:type="auto" w:w="0"/>
+        <w:tblLook w:firstColumn="1" w:firstRow="1" w:lastColumn="0" w:lastRow="0" w:noHBand="0" w:noVBand="1" w:val="04A0"/>
+      </w:tblPr>
+      <w:tblGrid>
+        <w:gridCol w:w="4759"/>
+        <w:gridCol w:w="4759"/>
+      </w:tblGrid>
+      <w:tr>
+        <w:tc>
+          <w:tcPr>
+            <w:tcW w:type="dxa" w:w="2835"/>
+          </w:tcPr>
+          <w:p>
+            <w:r/>
+            <w:r>
+              <w:rPr>
+                <w:b/>
+                <w:color w:val="1B4D3E"/>
+              </w:rPr>
+              <w:t>Zona</w:t>
+            </w:r>
+          </w:p>
+        </w:tc>
+        <w:tc>
+          <w:tcPr>
+            <w:tcW w:type="dxa" w:w="6803"/>
+          </w:tcPr>
+          <w:p>
+            <w:r/>
+            <w:r>
+              <w:rPr>
+                <w:b/>
+                <w:color w:val="1B4D3E"/>
+              </w:rPr>
+              <w:t>Para qué sirve</w:t>
+            </w:r>
+          </w:p>
+        </w:tc>
+      </w:tr>
+      <w:tr>
+        <w:tc>
+          <w:tcPr>
+            <w:tcW w:type="dxa" w:w="2835"/>
+          </w:tcPr>
+          <w:p>
+            <w:r>
+              <w:t>Encabezado izquierdo</w:t>
+            </w:r>
+          </w:p>
+        </w:tc>
+        <w:tc>
+          <w:tcPr>
+            <w:tcW w:type="dxa" w:w="6803"/>
+          </w:tcPr>
+          <w:p>
+            <w:r>
+              <w:t>Tipo de comprobante que se va a emitir (E31, E32, E44 o E45). Al tocarlo se abre el cliente.</w:t>
+            </w:r>
+          </w:p>
+        </w:tc>
+      </w:tr>
+      <w:tr>
+        <w:tc>
+          <w:tcPr>
+            <w:tcW w:type="dxa" w:w="2835"/>
+          </w:tcPr>
+          <w:p>
+            <w:r>
+              <w:t>Encabezado central</w:t>
+            </w:r>
+          </w:p>
+        </w:tc>
+        <w:tc>
+          <w:tcPr>
+            <w:tcW w:type="dxa" w:w="6803"/>
+          </w:tcPr>
+          <w:p>
+            <w:r>
+              <w:t>Cliente de la factura, número de factura que le tocará (se toma de verdad al cobrar: si otra venta se cobra antes, esta pasa al siguiente), cantidad de artículos, límite de compra, programa de fidelidad y lista de boda.</w:t>
+            </w:r>
+          </w:p>
+        </w:tc>
+      </w:tr>
+      <w:tr>
+        <w:tc>
+          <w:tcPr>
+            <w:tcW w:type="dxa" w:w="2835"/>
+          </w:tcPr>
+          <w:p>
+            <w:r>
+              <w:t>Encabezado derecho</w:t>
+            </w:r>
+          </w:p>
+        </w:tc>
+        <w:tc>
+          <w:tcPr>
+            <w:tcW w:type="dxa" w:w="6803"/>
+          </w:tcPr>
+          <w:p>
+            <w:r>
+              <w:t>Subtotal (la suma de las líneas, sin ITBIS), ITBIS (o el aviso de exenta en régimen especial), descuentos, TOTAL (subtotal más ITBIS) y, en facturas gubernamentales con retención, el total a pagar.</w:t>
+            </w:r>
+          </w:p>
+        </w:tc>
+      </w:tr>
+      <w:tr>
+        <w:tc>
+          <w:tcPr>
+            <w:tcW w:type="dxa" w:w="2835"/>
+          </w:tcPr>
+          <w:p>
+            <w:r>
+              <w:t>Campo de escaneo</w:t>
+            </w:r>
+          </w:p>
+        </w:tc>
+        <w:tc>
+          <w:tcPr>
+            <w:tcW w:type="dxa" w:w="6803"/>
+          </w:tcPr>
+          <w:p>
+            <w:r>
+              <w:t>Donde el lector escribe el código. También se puede digitar. A su derecha: catálogo, teclado en pantalla, Buscar (F2), Totalizar (F8) y el botón ☰ que abre el panel de funciones.</w:t>
+            </w:r>
+          </w:p>
+        </w:tc>
+      </w:tr>
+      <w:tr>
+        <w:tc>
+          <w:tcPr>
+            <w:tcW w:type="dxa" w:w="2835"/>
+          </w:tcPr>
+          <w:p>
+            <w:r>
+              <w:t>Grilla de líneas</w:t>
+            </w:r>
+          </w:p>
+        </w:tc>
+        <w:tc>
+          <w:tcPr>
+            <w:tcW w:type="dxa" w:w="6803"/>
+          </w:tcPr>
+          <w:p>
+            <w:r>
+              <w:t>Los artículos de la venta: línea, código, descripción, cantidad, precio y subtotal sin ITBIS, y la oferta aplicada.</w:t>
+            </w:r>
+          </w:p>
+        </w:tc>
+      </w:tr>
+      <w:tr>
+        <w:tc>
+          <w:tcPr>
+            <w:tcW w:type="dxa" w:w="2835"/>
+          </w:tcPr>
+          <w:p>
+            <w:r>
+              <w:t>Panel de funciones (☰)</w:t>
+            </w:r>
+          </w:p>
+        </w:tc>
+        <w:tc>
+          <w:tcPr>
+            <w:tcW w:type="dxa" w:w="6803"/>
+          </w:tcPr>
+          <w:p>
+            <w:r>
+              <w:t>Se despliega desde la derecha con todas las funciones. Se cierra solo al elegir una, al tocar fuera o al escanear: lo que se lee va a la venta.</w:t>
+            </w:r>
+          </w:p>
+        </w:tc>
+      </w:tr>
+      <w:tr>
+        <w:tc>
+          <w:tcPr>
+            <w:tcW w:type="dxa" w:w="2835"/>
+          </w:tcPr>
+          <w:p>
+            <w:r>
+              <w:t>Barra de estado (abajo)</w:t>
+            </w:r>
+          </w:p>
+        </w:tc>
+        <w:tc>
+          <w:tcPr>
+            <w:tcW w:type="dxa" w:w="6803"/>
+          </w:tcPr>
+          <w:p>
+            <w:r>
+              <w:t>Usuario, caja, turno, versión, estado del certificado e-CF y estado de la sincronización con el Central.</w:t>
+            </w:r>
+          </w:p>
+        </w:tc>
+      </w:tr>
+    </w:tbl>
+    <w:p/>
+    <w:p>
+      <w:pPr>
+        <w:pStyle w:val="Heading2"/>
+      </w:pPr>
+      <w:r>
+        <w:t>3.5. La pantalla de ventas secundaria</w:t>
+      </w:r>
+    </w:p>
+    <w:p>
+      <w:r>
+        <w:t>La caja tiene tres pantallas, cada una en su monitor: la de ventas principal (con lector y teclado), la de ventas secundaria (táctil, con el catálogo en mosaicos, como el mostrador de una cafetería) y la del cliente. Las abre el equipo al encenderse; no hay que navegar de una a otra.</w:t>
+      </w:r>
+    </w:p>
+    <w:p>
+      <w:r>
+        <w:t>La pantalla de ventas secundaria trabaja la misma venta que la principal: lo que se agrega en una aparece en la otra al instante, y se cobra desde cualquiera de las dos.</w:t>
+      </w:r>
+    </w:p>
+    <w:tbl>
+      <w:tblPr>
+        <w:tblStyle w:val="TableGrid"/>
+        <w:tblW w:type="auto" w:w="0"/>
+        <w:tblLook w:firstColumn="1" w:firstRow="1" w:lastColumn="0" w:lastRow="0" w:noHBand="0" w:noVBand="1" w:val="04A0"/>
+      </w:tblPr>
+      <w:tblGrid>
+        <w:gridCol w:w="4759"/>
+        <w:gridCol w:w="4759"/>
+      </w:tblGrid>
+      <w:tr>
+        <w:tc>
+          <w:tcPr>
+            <w:tcW w:type="dxa" w:w="3118"/>
+          </w:tcPr>
+          <w:p>
+            <w:r/>
+            <w:r>
+              <w:rPr>
+                <w:b/>
+                <w:color w:val="1B4D3E"/>
+              </w:rPr>
+              <w:t>Parte de la pantalla</w:t>
+            </w:r>
+          </w:p>
+        </w:tc>
+        <w:tc>
+          <w:tcPr>
+            <w:tcW w:type="dxa" w:w="6520"/>
+          </w:tcPr>
+          <w:p>
+            <w:r/>
+            <w:r>
+              <w:rPr>
+                <w:b/>
+                <w:color w:val="1B4D3E"/>
+              </w:rPr>
+              <w:t>Qué hace</w:t>
+            </w:r>
+          </w:p>
+        </w:tc>
+      </w:tr>
+      <w:tr>
+        <w:tc>
+          <w:tcPr>
+            <w:tcW w:type="dxa" w:w="3118"/>
+          </w:tcPr>
+          <w:p>
+            <w:r>
+              <w:t>Columna izquierda</w:t>
+            </w:r>
+          </w:p>
+        </w:tc>
+        <w:tc>
+          <w:tcPr>
+            <w:tcW w:type="dxa" w:w="6520"/>
+          </w:tcPr>
+          <w:p>
+            <w:r>
+              <w:t>La venta: sus líneas, los totales y el botón Cobrar. Al tocar el encabezado se abre cliente y comprobante.</w:t>
+            </w:r>
+          </w:p>
+        </w:tc>
+      </w:tr>
+      <w:tr>
+        <w:tc>
+          <w:tcPr>
+            <w:tcW w:type="dxa" w:w="3118"/>
+          </w:tcPr>
+          <w:p>
+            <w:r>
+              <w:t>Tocar una línea</w:t>
+            </w:r>
+          </w:p>
+        </w:tc>
+        <w:tc>
+          <w:tcPr>
+            <w:tcW w:type="dxa" w:w="6520"/>
+          </w:tcPr>
+          <w:p>
+            <w:r>
+              <w:t>La selecciona; con los botones de abajo se cambia la cantidad o se quita (la de quitar pide autorización).</w:t>
+            </w:r>
+          </w:p>
+        </w:tc>
+      </w:tr>
+      <w:tr>
+        <w:tc>
+          <w:tcPr>
+            <w:tcW w:type="dxa" w:w="3118"/>
+          </w:tcPr>
+          <w:p>
+            <w:r>
+              <w:t>Buscador (arriba a la derecha)</w:t>
+            </w:r>
+          </w:p>
+        </w:tc>
+        <w:tc>
+          <w:tcPr>
+            <w:tcW w:type="dxa" w:w="6520"/>
+          </w:tcPr>
+          <w:p>
+            <w:r>
+              <w:t>Busca por descripción o por código lo que no está en los mosaicos.</w:t>
+            </w:r>
+          </w:p>
+        </w:tc>
+      </w:tr>
+      <w:tr>
+        <w:tc>
+          <w:tcPr>
+            <w:tcW w:type="dxa" w:w="3118"/>
+          </w:tcPr>
+          <w:p>
+            <w:r>
+              <w:t>Pestañas de departamento y categoría</w:t>
+            </w:r>
+          </w:p>
+        </w:tc>
+        <w:tc>
+          <w:tcPr>
+            <w:tcW w:type="dxa" w:w="6520"/>
+          </w:tcPr>
+          <w:p>
+            <w:r>
+              <w:t>Filtran los mosaicos, como las secciones de un menú.</w:t>
+            </w:r>
+          </w:p>
+        </w:tc>
+      </w:tr>
+      <w:tr>
+        <w:tc>
+          <w:tcPr>
+            <w:tcW w:type="dxa" w:w="3118"/>
+          </w:tcPr>
+          <w:p>
+            <w:r>
+              <w:t>Mosaicos</w:t>
+            </w:r>
+          </w:p>
+        </w:tc>
+        <w:tc>
+          <w:tcPr>
+            <w:tcW w:type="dxa" w:w="6520"/>
+          </w:tcPr>
+          <w:p>
+            <w:r>
+              <w:t>Un toque agrega el artículo con su imagen y su precio. Aparecen los artículos marcados para el catálogo.</w:t>
+            </w:r>
+          </w:p>
+        </w:tc>
+      </w:tr>
+      <w:tr>
+        <w:tc>
+          <w:tcPr>
+            <w:tcW w:type="dxa" w:w="3118"/>
+          </w:tcPr>
+          <w:p>
+            <w:r>
+              <w:t>Barra de abajo</w:t>
+            </w:r>
+          </w:p>
+        </w:tc>
+        <w:tc>
+          <w:tcPr>
+            <w:tcW w:type="dxa" w:w="6520"/>
+          </w:tcPr>
+          <w:p>
+            <w:r>
+              <w:t>Cliente, consulta de precio, facturas en espera y devoluciones.</w:t>
+            </w:r>
+          </w:p>
+        </w:tc>
+      </w:tr>
+    </w:tbl>
+    <w:p/>
+    <w:p>
+      <w:r>
+        <w:rPr>
+          <w:i/>
+          <w:color w:val="2E7D32"/>
+        </w:rPr>
+        <w:t>Los artículos que se pesan o que piden serial se atienden mejor en la pantalla principal; desde la secundaria se agrega una unidad y luego se ajusta la cantidad.</w:t>
+      </w:r>
+    </w:p>
+    <w:p>
+      <w:pPr>
+        <w:pStyle w:val="Heading2"/>
+      </w:pPr>
+      <w:r>
+        <w:t>3.6. Las teclas de función</w:t>
+      </w:r>
+    </w:p>
+    <w:p>
+      <w:r>
+        <w:t>Buscar (F2) y Totalizar (F8) están siempre a la vista, junto al campo de escaneo. Todas las demás están en el panel de funciones, que se abre con el botón ☰. Las teclas F del teclado físico funcionan siempre, con el panel abierto o cerrado.</w:t>
+      </w:r>
+    </w:p>
+    <w:p>
+      <w:r>
+        <w:t>Teclas de función:</w:t>
+      </w:r>
+    </w:p>
+    <w:tbl>
+      <w:tblPr>
+        <w:tblStyle w:val="TableGrid"/>
+        <w:tblW w:type="auto" w:w="0"/>
+        <w:tblLook w:firstColumn="1" w:firstRow="1" w:lastColumn="0" w:lastRow="0" w:noHBand="0" w:noVBand="1" w:val="04A0"/>
+      </w:tblPr>
+      <w:tblGrid>
+        <w:gridCol w:w="4759"/>
+        <w:gridCol w:w="4759"/>
+      </w:tblGrid>
+      <w:tr>
+        <w:tc>
+          <w:tcPr>
+            <w:tcW w:type="dxa" w:w="1701"/>
+          </w:tcPr>
+          <w:p>
+            <w:r/>
+            <w:r>
+              <w:rPr>
+                <w:b/>
+                <w:color w:val="1B4D3E"/>
+              </w:rPr>
+              <w:t>Tecla</w:t>
+            </w:r>
+          </w:p>
+        </w:tc>
+        <w:tc>
+          <w:tcPr>
+            <w:tcW w:type="dxa" w:w="7937"/>
+          </w:tcPr>
+          <w:p>
+            <w:r/>
+            <w:r>
+              <w:rPr>
+                <w:b/>
+                <w:color w:val="1B4D3E"/>
+              </w:rPr>
+              <w:t>Qué hace</w:t>
+            </w:r>
+          </w:p>
+        </w:tc>
+      </w:tr>
+      <w:tr>
+        <w:tc>
+          <w:tcPr>
+            <w:tcW w:type="dxa" w:w="1701"/>
+          </w:tcPr>
+          <w:p>
+            <w:r>
+              <w:t>F2</w:t>
+            </w:r>
+          </w:p>
+        </w:tc>
+        <w:tc>
+          <w:tcPr>
+            <w:tcW w:type="dxa" w:w="7937"/>
+          </w:tcPr>
+          <w:p>
+            <w:r>
+              <w:t>Buscar un artículo por descripción</w:t>
+            </w:r>
+          </w:p>
+        </w:tc>
+      </w:tr>
+      <w:tr>
+        <w:tc>
+          <w:tcPr>
+            <w:tcW w:type="dxa" w:w="1701"/>
+          </w:tcPr>
+          <w:p>
+            <w:r>
+              <w:t>F3</w:t>
+            </w:r>
+          </w:p>
+        </w:tc>
+        <w:tc>
+          <w:tcPr>
+            <w:tcW w:type="dxa" w:w="7937"/>
+          </w:tcPr>
+          <w:p>
+            <w:r>
+              <w:t>Límite de compra que pidió el cliente: avisa al pasarse y, al totalizar, pide confirmar «¿Cobrar de todas formas?» (queda en la auditoría)</w:t>
+            </w:r>
+          </w:p>
+        </w:tc>
+      </w:tr>
+      <w:tr>
+        <w:tc>
+          <w:tcPr>
+            <w:tcW w:type="dxa" w:w="1701"/>
+          </w:tcPr>
+          <w:p>
+            <w:r>
+              <w:t>F4</w:t>
+            </w:r>
+          </w:p>
+        </w:tc>
+        <w:tc>
+          <w:tcPr>
+            <w:tcW w:type="dxa" w:w="7937"/>
+          </w:tcPr>
+          <w:p>
+            <w:r>
+              <w:t>Cambiar la cantidad de la línea seleccionada</w:t>
+            </w:r>
+          </w:p>
+        </w:tc>
+      </w:tr>
+      <w:tr>
+        <w:tc>
+          <w:tcPr>
+            <w:tcW w:type="dxa" w:w="1701"/>
+          </w:tcPr>
+          <w:p>
+            <w:r>
+              <w:t>F5</w:t>
+            </w:r>
+          </w:p>
+        </w:tc>
+        <w:tc>
+          <w:tcPr>
+            <w:tcW w:type="dxa" w:w="7937"/>
+          </w:tcPr>
+          <w:p>
+            <w:r>
+              <w:t>Tomar el peso de la balanza</w:t>
+            </w:r>
+          </w:p>
+        </w:tc>
+      </w:tr>
+      <w:tr>
+        <w:tc>
+          <w:tcPr>
+            <w:tcW w:type="dxa" w:w="1701"/>
+          </w:tcPr>
+          <w:p>
+            <w:r>
+              <w:t>F6</w:t>
+            </w:r>
+          </w:p>
+        </w:tc>
+        <w:tc>
+          <w:tcPr>
+            <w:tcW w:type="dxa" w:w="7937"/>
+          </w:tcPr>
+          <w:p>
+            <w:r>
+              <w:t>Lista de boda: asociar la venta a una lista de regalos</w:t>
+            </w:r>
+          </w:p>
+        </w:tc>
+      </w:tr>
+      <w:tr>
+        <w:tc>
+          <w:tcPr>
+            <w:tcW w:type="dxa" w:w="1701"/>
+          </w:tcPr>
+          <w:p>
+            <w:r>
+              <w:t>F7</w:t>
+            </w:r>
+          </w:p>
+        </w:tc>
+        <w:tc>
+          <w:tcPr>
+            <w:tcW w:type="dxa" w:w="7937"/>
+          </w:tcPr>
+          <w:p>
+            <w:r>
+              <w:t>Facturas en espera (guardar la actual y retomar otra)</w:t>
+            </w:r>
+          </w:p>
+        </w:tc>
+      </w:tr>
+      <w:tr>
+        <w:tc>
+          <w:tcPr>
+            <w:tcW w:type="dxa" w:w="1701"/>
+          </w:tcPr>
+          <w:p>
+            <w:r>
+              <w:t>F8</w:t>
+            </w:r>
+          </w:p>
+        </w:tc>
+        <w:tc>
+          <w:tcPr>
+            <w:tcW w:type="dxa" w:w="7937"/>
+          </w:tcPr>
+          <w:p>
+            <w:r>
+              <w:t>Totalizar: abre el cobro</w:t>
+            </w:r>
+          </w:p>
+        </w:tc>
+      </w:tr>
+      <w:tr>
+        <w:tc>
+          <w:tcPr>
+            <w:tcW w:type="dxa" w:w="1701"/>
+          </w:tcPr>
+          <w:p>
+            <w:r>
+              <w:t>F9</w:t>
+            </w:r>
+          </w:p>
+        </w:tc>
+        <w:tc>
+          <w:tcPr>
+            <w:tcW w:type="dxa" w:w="7937"/>
+          </w:tcPr>
+          <w:p>
+            <w:r>
+              <w:t>Cotización: traer un presupuesto hecho en el Central</w:t>
+            </w:r>
+          </w:p>
+        </w:tc>
+      </w:tr>
+      <w:tr>
+        <w:tc>
+          <w:tcPr>
+            <w:tcW w:type="dxa" w:w="1701"/>
+          </w:tcPr>
+          <w:p>
+            <w:r>
+              <w:t>F10</w:t>
+            </w:r>
+          </w:p>
+        </w:tc>
+        <w:tc>
+          <w:tcPr>
+            <w:tcW w:type="dxa" w:w="7937"/>
+          </w:tcPr>
+          <w:p>
+            <w:r>
+              <w:t>Ir a devoluciones</w:t>
+            </w:r>
+          </w:p>
+        </w:tc>
+      </w:tr>
+      <w:tr>
+        <w:tc>
+          <w:tcPr>
+            <w:tcW w:type="dxa" w:w="1701"/>
+          </w:tcPr>
+          <w:p>
+            <w:r>
+              <w:t>F11</w:t>
+            </w:r>
+          </w:p>
+        </w:tc>
+        <w:tc>
+          <w:tcPr>
+            <w:tcW w:type="dxa" w:w="7937"/>
+          </w:tcPr>
+          <w:p>
+            <w:r>
+              <w:t>Consultar el precio de un artículo sin venderlo</w:t>
+            </w:r>
+          </w:p>
+        </w:tc>
+      </w:tr>
+      <w:tr>
+        <w:tc>
+          <w:tcPr>
+            <w:tcW w:type="dxa" w:w="1701"/>
+          </w:tcPr>
+          <w:p>
+            <w:r>
+              <w:t>F12</w:t>
+            </w:r>
+          </w:p>
+        </w:tc>
+        <w:tc>
+          <w:tcPr>
+            <w:tcW w:type="dxa" w:w="7937"/>
+          </w:tcPr>
+          <w:p>
+            <w:r>
+              <w:t>Cliente, comprobante y programa de fidelidad</w:t>
+            </w:r>
+          </w:p>
+        </w:tc>
+      </w:tr>
+    </w:tbl>
+    <w:p/>
+    <w:p>
+      <w:r>
+        <w:t>Más operaciones (en el mismo panel, debajo): catálogo en mosaicos, eliminar línea, eliminar por escaneo, limpiar pantalla, descuento a la línea, descuento a la factura, entrega o envío, anular, suspender, gaveta, reimprimir, retiro de efectivo, cierre de turno y salir.</w:t>
+      </w:r>
+    </w:p>
+    <w:p>
+      <w:r>
+        <w:rPr>
+          <w:i/>
+          <w:color w:val="2E7D32"/>
+        </w:rPr>
+        <w:t>El teclado en pantalla de códigos, documentos y textos cambia entre números y letras con la tecla ABC / 123. El de cantidades y montos es solo numérico.</w:t>
+      </w:r>
+    </w:p>
+    <w:p>
+      <w:pPr>
+        <w:pStyle w:val="Heading2"/>
+      </w:pPr>
+      <w:r>
+        <w:t>3.7. Hacer una venta</w:t>
+      </w:r>
+    </w:p>
+    <w:p>
+      <w:pPr>
+        <w:pStyle w:val="ListNumber"/>
+      </w:pPr>
+      <w:r>
+        <w:t>Pase el código del artículo por el lector (o dígitelo y presione Enter). Para varias unidades: 12*CEM-425.</w:t>
+      </w:r>
+    </w:p>
+    <w:p>
+      <w:pPr>
+        <w:pStyle w:val="ListNumber"/>
+      </w:pPr>
+      <w:r>
+        <w:t>Para cambiar una cantidad, toque la cantidad en la línea o use F4. Para ver el otro código del artículo, toque el código.</w:t>
+      </w:r>
+    </w:p>
+    <w:p>
+      <w:r>
+        <w:rPr>
+          <w:i/>
+          <w:color w:val="2E7D32"/>
+        </w:rPr>
+        <w:t>La cantidad que se digita tiene un tope: el que diga el parámetro Ventas.CantidadMaximaDigitada (10 de fábrica). Si el cliente lleva más, el artículo se pasa por el lector una vez por unidad. Vale para F4, para tocar la cantidad y para escanear con cantidad*código. No aplica a los artículos que se venden por peso ni a los de unidad con decimales, porque ahí la cantidad la da la balanza o la etiqueta.</w:t>
+      </w:r>
+    </w:p>
+    <w:p>
+      <w:pPr>
+        <w:pStyle w:val="ListNumber"/>
+      </w:pPr>
+      <w:r>
+        <w:t>Si el artículo se vende por peso, se toma el peso de la balanza (F5) o se digita.</w:t>
+      </w:r>
+    </w:p>
+    <w:p>
+      <w:pPr>
+        <w:pStyle w:val="ListNumber"/>
+      </w:pPr>
+      <w:r>
+        <w:t>Si el artículo lleva serial, el sistema lo pide al escanearlo.</w:t>
+      </w:r>
+    </w:p>
+    <w:p>
+      <w:pPr>
+        <w:pStyle w:val="ListNumber"/>
+      </w:pPr>
+      <w:r>
+        <w:t>Con F12 asigne el cliente si lleva comprobante fiscal, y su cédula del programa de fidelidad.</w:t>
+      </w:r>
+    </w:p>
+    <w:p>
+      <w:pPr>
+        <w:pStyle w:val="ListNumber"/>
+      </w:pPr>
+      <w:r>
+        <w:t>Revise el total con el cliente y presione F8 para cobrar.</w:t>
+      </w:r>
+    </w:p>
+    <w:p>
+      <w:r>
+        <w:rPr>
+          <w:i/>
+          <w:color w:val="2E7D32"/>
+        </w:rPr>
+        <w:t>Cada operación se guarda al instante: si la caja se apaga, al volver a entrar la venta aparece tal como estaba.</w:t>
+      </w:r>
+    </w:p>
+    <w:p>
+      <w:pPr>
+        <w:pStyle w:val="Heading2"/>
+      </w:pPr>
+      <w:r>
+        <w:t>3.8. Cliente y tipo de comprobante (F12)</w:t>
+      </w:r>
+    </w:p>
+    <w:p>
+      <w:r>
+        <w:t>Se digita la cédula o el RNC; la caja lo busca en los clientes, que bajan del Central. Si no aparece, se digita el nombre. El tipo de comprobante sale del cliente y cambiarlo a mano requiere permiso.</w:t>
+      </w:r>
+    </w:p>
+    <w:tbl>
+      <w:tblPr>
+        <w:tblStyle w:val="TableGrid"/>
+        <w:tblW w:type="auto" w:w="0"/>
+        <w:tblLook w:firstColumn="1" w:firstRow="1" w:lastColumn="0" w:lastRow="0" w:noHBand="0" w:noVBand="1" w:val="04A0"/>
+      </w:tblPr>
+      <w:tblGrid>
+        <w:gridCol w:w="4759"/>
+        <w:gridCol w:w="4759"/>
+      </w:tblGrid>
+      <w:tr>
+        <w:tc>
+          <w:tcPr>
+            <w:tcW w:type="dxa" w:w="2835"/>
+          </w:tcPr>
+          <w:p>
+            <w:r/>
+            <w:r>
+              <w:rPr>
+                <w:b/>
+                <w:color w:val="1B4D3E"/>
+              </w:rPr>
+              <w:t>Comprobante</w:t>
+            </w:r>
+          </w:p>
+        </w:tc>
+        <w:tc>
+          <w:tcPr>
+            <w:tcW w:type="dxa" w:w="6803"/>
+          </w:tcPr>
+          <w:p>
+            <w:r/>
+            <w:r>
+              <w:rPr>
+                <w:b/>
+                <w:color w:val="1B4D3E"/>
+              </w:rPr>
+              <w:t>Cuándo se usa</w:t>
+            </w:r>
+          </w:p>
+        </w:tc>
+      </w:tr>
+      <w:tr>
+        <w:tc>
+          <w:tcPr>
+            <w:tcW w:type="dxa" w:w="2835"/>
+          </w:tcPr>
+          <w:p>
+            <w:r>
+              <w:t>E32 – Consumo</w:t>
+            </w:r>
+          </w:p>
+        </w:tc>
+        <w:tc>
+          <w:tcPr>
+            <w:tcW w:type="dxa" w:w="6803"/>
+          </w:tcPr>
+          <w:p>
+            <w:r>
+              <w:t>Cliente común. Desde el monto configurado (RD$250,000 por defecto) exige cédula o RNC.</w:t>
+            </w:r>
+          </w:p>
+        </w:tc>
+      </w:tr>
+      <w:tr>
+        <w:tc>
+          <w:tcPr>
+            <w:tcW w:type="dxa" w:w="2835"/>
+          </w:tcPr>
+          <w:p>
+            <w:r>
+              <w:t>E31 – Crédito fiscal</w:t>
+            </w:r>
+          </w:p>
+        </w:tc>
+        <w:tc>
+          <w:tcPr>
+            <w:tcW w:type="dxa" w:w="6803"/>
+          </w:tcPr>
+          <w:p>
+            <w:r>
+              <w:t>Empresa que necesita el ITBIS. Exige RNC o cédula.</w:t>
+            </w:r>
+          </w:p>
+        </w:tc>
+      </w:tr>
+      <w:tr>
+        <w:tc>
+          <w:tcPr>
+            <w:tcW w:type="dxa" w:w="2835"/>
+          </w:tcPr>
+          <w:p>
+            <w:r>
+              <w:t>E44 – Régimen especial</w:t>
+            </w:r>
+          </w:p>
+        </w:tc>
+        <w:tc>
+          <w:tcPr>
+            <w:tcW w:type="dxa" w:w="6803"/>
+          </w:tcPr>
+          <w:p>
+            <w:r>
+              <w:t>Zonas francas, diplomáticos y demás acogidos a un régimen especial, que deben presentar su carné o certificación de exención de la DGII. La factura va SIN ITBIS.</w:t>
+            </w:r>
+          </w:p>
+        </w:tc>
+      </w:tr>
+      <w:tr>
+        <w:tc>
+          <w:tcPr>
+            <w:tcW w:type="dxa" w:w="2835"/>
+          </w:tcPr>
+          <w:p>
+            <w:r>
+              <w:t>E45 – Gubernamental</w:t>
+            </w:r>
+          </w:p>
+        </w:tc>
+        <w:tc>
+          <w:tcPr>
+            <w:tcW w:type="dxa" w:w="6803"/>
+          </w:tcPr>
+          <w:p>
+            <w:r>
+              <w:t>Instituciones del Estado. Exige RNC. Lleva ITBIS, salvo que la entidad presente su certificación de exención.</w:t>
+            </w:r>
+          </w:p>
+        </w:tc>
+      </w:tr>
+    </w:tbl>
+    <w:p/>
+    <w:p>
+      <w:r>
+        <w:t>Factura exenta (E44): al elegir este comprobante, toda la factura pasa a ser exenta de ITBIS, tengan o no impuesto los artículos. Como los precios ya van sin ITBIS, simplemente no se le suma: un artículo de RD$100 se cobra a RD$100 y no a RD$118. La pantalla, la pantalla del cliente y el ticket lo indican con “EXENTA DE ITBIS – RÉGIMEN ESPECIAL”. Si el bien que se vende no está exento para ese cliente, no se usa el E44: se le factura con E31.</w:t>
+      </w:r>
+    </w:p>
+    <w:p>
+      <w:r>
+        <w:t>Entidad del Estado con exención (E45): si la institución presenta su certificación de exención de ITBIS, digite el número en el diálogo del cliente y toque “Aplicar exención”. La factura pasa a ser exenta y el ticket lo indica con el número de la certificación. Si no la presenta, la factura lleva su ITBIS normal.</w:t>
+      </w:r>
+    </w:p>
+    <w:p>
+      <w:r>
+        <w:t>Retención de la Ley 32-23: en las facturas E45, si el negocio configuró el porcentaje, el sistema lo calcula sobre el subtotal ya con descuentos y se lo descuenta a lo que el cliente paga en caja. La factura mantiene su total; el ticket muestra “RETENCIÓN LEY 32-23” y “TOTAL A PAGAR”. Normalmente va en cero: quien factura electrónicamente está exento de esa retención.</w:t>
+      </w:r>
+    </w:p>
+    <w:p>
+      <w:pPr>
+        <w:pStyle w:val="Heading2"/>
+      </w:pPr>
+      <w:r>
+        <w:t>3.9. Lista de boda (F6)</w:t>
+      </w:r>
+    </w:p>
+    <w:p>
+      <w:pPr>
+        <w:pStyle w:val="ListNumber"/>
+      </w:pPr>
+      <w:r>
+        <w:t>Pida al cliente el número de la lista (la crea la administración en el Central).</w:t>
+      </w:r>
+    </w:p>
+    <w:p>
+      <w:pPr>
+        <w:pStyle w:val="ListNumber"/>
+      </w:pPr>
+      <w:r>
+        <w:t>Presione F6, digite el número y acepte: la lista queda en el encabezado de la venta y sale en el ticket.</w:t>
+      </w:r>
+    </w:p>
+    <w:p>
+      <w:pPr>
+        <w:pStyle w:val="ListNumber"/>
+      </w:pPr>
+      <w:r>
+        <w:t>Al cobrar, la compra queda registrada en la lista y, si el negocio lo tiene configurado, baja las cantidades pedidas.</w:t>
+      </w:r>
+    </w:p>
+    <w:p>
+      <w:r>
+        <w:rPr>
+          <w:i/>
+          <w:color w:val="2E7D32"/>
+        </w:rPr>
+        <w:t>La lista se consulta en el Central: si no hay comunicación, no se puede asociar. Una lista cerrada no se acepta.</w:t>
+      </w:r>
+    </w:p>
+    <w:p>
+      <w:pPr>
+        <w:pStyle w:val="Heading2"/>
+      </w:pPr>
+      <w:r>
+        <w:t>3.10. Descuentos y ofertas</w:t>
+      </w:r>
+    </w:p>
+    <w:p>
+      <w:pPr>
+        <w:pStyle w:val="ListBullet"/>
+      </w:pPr>
+      <w:r>
+        <w:t>Ofertas: se aplican solas según lo configurado en el Central. La columna Promo muestra cuál se aplicó; al tocarla se ve el detalle y se puede desactivar (con permiso).</w:t>
+      </w:r>
+    </w:p>
+    <w:p>
+      <w:pPr>
+        <w:pStyle w:val="ListBullet"/>
+      </w:pPr>
+      <w:r>
+        <w:t>Descuento a la línea: toque el precio de la línea. Descuento a la factura: panel de funciones (☰). Ambos piden motivo y la autorización de quien tenga tope suficiente; si el descuento pasa su tope, se pide una clave de nivel superior.</w:t>
+      </w:r>
+    </w:p>
+    <w:p>
+      <w:pPr>
+        <w:pStyle w:val="ListBullet"/>
+      </w:pPr>
+      <w:r>
+        <w:t>No se aplican descuentos manuales a artículos en oferta ni a departamentos que el negocio excluyó.</w:t>
+      </w:r>
+    </w:p>
+    <w:p>
+      <w:pPr>
+        <w:pStyle w:val="ListBullet"/>
+      </w:pPr>
+      <w:r>
+        <w:t>Descuento del banco por tarjeta: se aplica solo, al pasar la tarjeta en el cobro (ver 3.11).</w:t>
+      </w:r>
+    </w:p>
+    <w:p>
+      <w:pPr>
+        <w:pStyle w:val="Heading2"/>
+      </w:pPr>
+      <w:r>
+        <w:t>3.11. Cobrar (F8)</w:t>
+      </w:r>
+    </w:p>
+    <w:p>
+      <w:r>
+        <w:t>En la pantalla de cobro elija la forma de pago, digite el monto y agréguelo. Se puede combinar cuantas formas haga falta; arriba siempre se ve lo pagado, lo que falta o la devuelta.</w:t>
+      </w:r>
+    </w:p>
+    <w:tbl>
+      <w:tblPr>
+        <w:tblStyle w:val="TableGrid"/>
+        <w:tblW w:type="auto" w:w="0"/>
+        <w:tblLook w:firstColumn="1" w:firstRow="1" w:lastColumn="0" w:lastRow="0" w:noHBand="0" w:noVBand="1" w:val="04A0"/>
+      </w:tblPr>
+      <w:tblGrid>
+        <w:gridCol w:w="4759"/>
+        <w:gridCol w:w="4759"/>
+      </w:tblGrid>
+      <w:tr>
+        <w:tc>
+          <w:tcPr>
+            <w:tcW w:type="dxa" w:w="2268"/>
+          </w:tcPr>
+          <w:p>
+            <w:r/>
+            <w:r>
+              <w:rPr>
+                <w:b/>
+                <w:color w:val="1B4D3E"/>
+              </w:rPr>
+              <w:t>Forma de pago</w:t>
+            </w:r>
+          </w:p>
+        </w:tc>
+        <w:tc>
+          <w:tcPr>
+            <w:tcW w:type="dxa" w:w="7370"/>
+          </w:tcPr>
+          <w:p>
+            <w:r/>
+            <w:r>
+              <w:rPr>
+                <w:b/>
+                <w:color w:val="1B4D3E"/>
+              </w:rPr>
+              <w:t>Qué pide y qué hay que saber</w:t>
+            </w:r>
+          </w:p>
+        </w:tc>
+      </w:tr>
+      <w:tr>
+        <w:tc>
+          <w:tcPr>
+            <w:tcW w:type="dxa" w:w="2268"/>
+          </w:tcPr>
+          <w:p>
+            <w:r>
+              <w:t>Efectivo</w:t>
+            </w:r>
+          </w:p>
+        </w:tc>
+        <w:tc>
+          <w:tcPr>
+            <w:tcW w:type="dxa" w:w="7370"/>
+          </w:tcPr>
+          <w:p>
+            <w:r>
+              <w:t>Es el único que da devuelta. Hay botones de billetes rápidos y “Exacto”.</w:t>
+            </w:r>
+          </w:p>
+        </w:tc>
+      </w:tr>
+      <w:tr>
+        <w:tc>
+          <w:tcPr>
+            <w:tcW w:type="dxa" w:w="2268"/>
+          </w:tcPr>
+          <w:p>
+            <w:r>
+              <w:t>Tarjeta</w:t>
+            </w:r>
+          </w:p>
+        </w:tc>
+        <w:tc>
+          <w:tcPr>
+            <w:tcW w:type="dxa" w:w="7370"/>
+          </w:tcPr>
+          <w:p>
+            <w:r>
+              <w:t>Se presiona Pasar tarjeta: el terminal pide la tarjeta al cliente. Si el terminal lee el BIN, el descuento del banco se aplica solo antes de cobrar y se le cobra menos. Si el terminal no responde, se puede registrar la aprobación manual con autorización de supervisor.</w:t>
+            </w:r>
+          </w:p>
+        </w:tc>
+      </w:tr>
+      <w:tr>
+        <w:tc>
+          <w:tcPr>
+            <w:tcW w:type="dxa" w:w="2268"/>
+          </w:tcPr>
+          <w:p>
+            <w:r>
+              <w:t>Dólares u otra moneda</w:t>
+            </w:r>
+          </w:p>
+        </w:tc>
+        <w:tc>
+          <w:tcPr>
+            <w:tcW w:type="dxa" w:w="7370"/>
+          </w:tcPr>
+          <w:p>
+            <w:r>
+              <w:t>Se convierte con la tasa del día; la devuelta se da en pesos.</w:t>
+            </w:r>
+          </w:p>
+        </w:tc>
+      </w:tr>
+      <w:tr>
+        <w:tc>
+          <w:tcPr>
+            <w:tcW w:type="dxa" w:w="2268"/>
+          </w:tcPr>
+          <w:p>
+            <w:r>
+              <w:t>Transferencia o cheque</w:t>
+            </w:r>
+          </w:p>
+        </w:tc>
+        <w:tc>
+          <w:tcPr>
+            <w:tcW w:type="dxa" w:w="7370"/>
+          </w:tcPr>
+          <w:p>
+            <w:r>
+              <w:t>Piden banco y número.</w:t>
+            </w:r>
+          </w:p>
+        </w:tc>
+      </w:tr>
+      <w:tr>
+        <w:tc>
+          <w:tcPr>
+            <w:tcW w:type="dxa" w:w="2268"/>
+          </w:tcPr>
+          <w:p>
+            <w:r>
+              <w:t>Bono o tarjeta de regalo</w:t>
+            </w:r>
+          </w:p>
+        </w:tc>
+        <w:tc>
+          <w:tcPr>
+            <w:tcW w:type="dxa" w:w="7370"/>
+          </w:tcPr>
+          <w:p>
+            <w:r>
+              <w:t>Pide el serial. No se acepta con crédito fiscal.</w:t>
+            </w:r>
+          </w:p>
+        </w:tc>
+      </w:tr>
+      <w:tr>
+        <w:tc>
+          <w:tcPr>
+            <w:tcW w:type="dxa" w:w="2268"/>
+          </w:tcPr>
+          <w:p>
+            <w:r>
+              <w:t>Nota de crédito</w:t>
+            </w:r>
+          </w:p>
+        </w:tc>
+        <w:tc>
+          <w:tcPr>
+            <w:tcW w:type="dxa" w:w="7370"/>
+          </w:tcPr>
+          <w:p>
+            <w:r>
+              <w:t>Se escanea el código de la nota. El sistema valida que exista, esté vigente y tenga saldo; si es de otra sucursal, lo consulta al Central.</w:t>
+            </w:r>
+          </w:p>
+        </w:tc>
+      </w:tr>
+      <w:tr>
+        <w:tc>
+          <w:tcPr>
+            <w:tcW w:type="dxa" w:w="2268"/>
+          </w:tcPr>
+          <w:p>
+            <w:r>
+              <w:t>Puntos de fidelidad</w:t>
+            </w:r>
+          </w:p>
+        </w:tc>
+        <w:tc>
+          <w:tcPr>
+            <w:tcW w:type="dxa" w:w="7370"/>
+          </w:tcPr>
+          <w:p>
+            <w:r>
+              <w:t>Requiere cliente con cédula inscrita y autorización para canjear.</w:t>
+            </w:r>
+          </w:p>
+        </w:tc>
+      </w:tr>
+    </w:tbl>
+    <w:p/>
+    <w:p>
+      <w:r>
+        <w:t>Al terminar: se emite y firma la factura electrónica, se imprime el ticket, se abre la gaveta si hubo efectivo y empieza la siguiente venta. La pantalla del cliente muestra el total y la devuelta.</w:t>
+      </w:r>
+    </w:p>
+    <w:p>
+      <w:r>
+        <w:rPr>
+          <w:i/>
+          <w:color w:val="2E7D32"/>
+        </w:rPr>
+        <w:t>Si no hay e-NCF disponible o el certificado no está cargado, la venta NO se cobra: primero hay que resolverlo con administración. El sistema no permite facturar sin comprobante fiscal.</w:t>
+      </w:r>
+    </w:p>
+    <w:p>
+      <w:pPr>
+        <w:pStyle w:val="Heading2"/>
+      </w:pPr>
+      <w:r>
+        <w:t>3.12. Facturar una cotización (F9)</w:t>
+      </w:r>
+    </w:p>
+    <w:p>
+      <w:r>
+        <w:t>Una cotización es el presupuesto que administración le hizo al cliente desde el Central, con los precios del momento. El cliente llega con el papel y se le factura sin volver a digitar nada.</w:t>
+      </w:r>
+    </w:p>
+    <w:p>
+      <w:pPr>
+        <w:pStyle w:val="ListNumber"/>
+      </w:pPr>
+      <w:r>
+        <w:t>Presione F9 y escanee o digite el número de la cotización (empieza con COT).</w:t>
+      </w:r>
+    </w:p>
+    <w:p>
+      <w:pPr>
+        <w:pStyle w:val="ListNumber"/>
+      </w:pPr>
+      <w:r>
+        <w:t>La caja se la pide al Central y carga los artículos con los precios que se le prometieron al cliente: no se les aplican ofertas ni se recalculan.</w:t>
+      </w:r>
+    </w:p>
+    <w:p>
+      <w:pPr>
+        <w:pStyle w:val="ListNumber"/>
+      </w:pPr>
+      <w:r>
+        <w:t>Cobre normalmente. El ticket sale con el número de la cotización y en el Central queda marcada como facturada.</w:t>
+      </w:r>
+    </w:p>
+    <w:p>
+      <w:r>
+        <w:rPr>
+          <w:i/>
+          <w:color w:val="2E7D32"/>
+        </w:rPr>
+        <w:t>Si la cotización venció, la caja pide la autorización de un supervisor y el motivo queda registrado. Una cotización ya facturada o anulada no se puede volver a usar.</w:t>
+      </w:r>
+    </w:p>
+    <w:p>
+      <w:r>
+        <w:rPr>
+          <w:i/>
+          <w:color w:val="2E7D32"/>
+        </w:rPr>
+        <w:t>La cotización vive en el Central: si la caja está sin comunicación, no se puede traer. La pantalla lo dice con esas palabras, y siempre se puede facturar a mano.</w:t>
+      </w:r>
+    </w:p>
+    <w:p>
+      <w:r>
+        <w:rPr>
+          <w:i/>
+          <w:color w:val="2E7D32"/>
+        </w:rPr>
+        <w:t>La venta tiene que estar vacía: si ya tiene artículos, termínela o límpiela antes de traer la cotización.</w:t>
+      </w:r>
+    </w:p>
+    <w:p>
+      <w:pPr>
+        <w:pStyle w:val="Heading2"/>
+      </w:pPr>
+      <w:r>
+        <w:t>3.13. Facturas en espera, anular y suspender</w:t>
+      </w:r>
+    </w:p>
+    <w:p>
+      <w:pPr>
+        <w:pStyle w:val="ListBullet"/>
+      </w:pPr>
+      <w:r>
+        <w:t>F7 – En espera: guarda la venta actual para atender a otro cliente y retomarla después. Se le pone una referencia corta, el nombre del cliente o unos dígitos («Sra. María», «102»), que es con lo que se encuentra en la lista al volver. Dos facturas en espera del mismo turno no pueden llamarse igual.</w:t>
+      </w:r>
+    </w:p>
+    <w:p>
+      <w:pPr>
+        <w:pStyle w:val="ListBullet"/>
+      </w:pPr>
+      <w:r>
+        <w:t>Para retomar una factura con otra venta en pantalla, escriba también la referencia de la que está en pantalla: las dos se intercambian. Si la de pantalla no tiene artículos, simplemente se descarta.</w:t>
+      </w:r>
+    </w:p>
+    <w:p>
+      <w:pPr>
+        <w:pStyle w:val="ListBullet"/>
+      </w:pPr>
+      <w:r>
+        <w:t>Mientras la venta se arma, la pantalla muestra el número de factura que le tocaría, pero el número se le da de verdad al cobrar, en el orden en que se cobra: una factura en espera no se lleva el número de otro cliente, y una venta que no se cobró no deja un hueco en la numeración. En la auditoría, la venta sin cobrar aparece como B-000015.</w:t>
+      </w:r>
+    </w:p>
+    <w:p>
+      <w:pPr>
+        <w:pStyle w:val="ListBullet"/>
+      </w:pPr>
+      <w:r>
+        <w:t>Una venta con tarjeta ya aprobada no se pone en espera: cóbrela o anule la tarjeta primero.</w:t>
+      </w:r>
+    </w:p>
+    <w:p>
+      <w:pPr>
+        <w:pStyle w:val="ListBullet"/>
+      </w:pPr>
+      <w:r>
+        <w:t>Anular (panel de funciones ☰): cancela la transacción en curso con motivo y autorización. Como todavía no era una factura, desaparece de la caja; lo que tenía, quién la anuló, quién lo autorizó y el motivo quedan en la auditoría.</w:t>
+      </w:r>
+    </w:p>
+    <w:p>
+      <w:pPr>
+        <w:pStyle w:val="ListBullet"/>
+      </w:pPr>
+      <w:r>
+        <w:t>Suspender: bloquea la pantalla; se reanuda con la clave del cajero.</w:t>
+      </w:r>
+    </w:p>
+    <w:p>
+      <w:pPr>
+        <w:pStyle w:val="ListBullet"/>
+      </w:pPr>
+      <w:r>
+        <w:t>Eliminar línea, eliminar por escaneo y limpiar pantalla piden autorización de supervisor; la línea eliminada queda tachada en su lugar, con su mismo número, y sale del total. La numeración de las líneas sigue continua; quién la eliminó y quién lo autorizó queda en la auditoría.</w:t>
+      </w:r>
+    </w:p>
+    <w:p>
+      <w:pPr>
+        <w:pStyle w:val="Heading2"/>
+      </w:pPr>
+      <w:r>
+        <w:t>3.14. Entregas y envíos</w:t>
+      </w:r>
+    </w:p>
+    <w:p>
+      <w:r>
+        <w:t>Cuando el cliente se lleva parte de la mercancía después:</w:t>
+      </w:r>
+    </w:p>
+    <w:p>
+      <w:pPr>
+        <w:pStyle w:val="ListNumber"/>
+      </w:pPr>
+      <w:r>
+        <w:t>En el panel de funciones (☰), elija Entrega / envío.</w:t>
+      </w:r>
+    </w:p>
+    <w:p>
+      <w:pPr>
+        <w:pStyle w:val="ListNumber"/>
+      </w:pPr>
+      <w:r>
+        <w:t>Marque qué líneas y qué cantidad quedan pendientes, y si el cliente lo retira en una sucursal (la suya u otra) o se le envía a una dirección, con la fecha comprometida.</w:t>
+      </w:r>
+    </w:p>
+    <w:p>
+      <w:pPr>
+        <w:pStyle w:val="ListNumber"/>
+      </w:pPr>
+      <w:r>
+        <w:t>Al cobrar se imprime un comprobante de pendiente por cada destino, con código de barras: una copia para el cliente y otra para quien despacha.</w:t>
+      </w:r>
+    </w:p>
+    <w:p>
+      <w:pPr>
+        <w:pStyle w:val="ListNumber"/>
+      </w:pPr>
+      <w:r>
+        <w:t>De ahí en adelante el pendiente se despacha desde el Central (Despacho → Pendientes): la caja ya no tiene nada que ver con él. Vea «2.14. Despacho de pendientes y envíos».</w:t>
+      </w:r>
+    </w:p>
+    <w:p>
+      <w:pPr>
+        <w:pStyle w:val="Heading2"/>
+      </w:pPr>
+      <w:r>
+        <w:t>3.15. Devoluciones y notas de crédito</w:t>
+      </w:r>
+    </w:p>
+    <w:p>
+      <w:r>
+        <w:t>Se entra con F10 o directamente a /devoluciones.</w:t>
+      </w:r>
+    </w:p>
+    <w:p>
+      <w:pPr>
+        <w:pStyle w:val="ListNumber"/>
+      </w:pPr>
+      <w:r>
+        <w:t>Escanee el código de barras del ticket o digite el e-NCF de la factura.</w:t>
+      </w:r>
+    </w:p>
+    <w:p>
+      <w:pPr>
+        <w:pStyle w:val="ListNumber"/>
+      </w:pPr>
+      <w:r>
+        <w:t>Indique qué se devuelve de cada línea (el sistema muestra lo vendido, lo ya devuelto y lo disponible).</w:t>
+      </w:r>
+    </w:p>
+    <w:p>
+      <w:pPr>
+        <w:pStyle w:val="ListNumber"/>
+      </w:pPr>
+      <w:r>
+        <w:t>Elija el motivo y, si la factura no tiene cliente, digite la cédula o el RNC.</w:t>
+      </w:r>
+    </w:p>
+    <w:p>
+      <w:pPr>
+        <w:pStyle w:val="ListNumber"/>
+      </w:pPr>
+      <w:r>
+        <w:t>Indique cómo se le devuelve: saldo en la nota (lo normal), efectivo, a la tarjeta o cheque, según lo que el negocio permita.</w:t>
+      </w:r>
+    </w:p>
+    <w:p>
+      <w:pPr>
+        <w:pStyle w:val="ListNumber"/>
+      </w:pPr>
+      <w:r>
+        <w:t>Pida la autorización del encargado: se imprime la nota de crédito para el cliente y la copia de contabilidad.</w:t>
+      </w:r>
+    </w:p>
+    <w:p>
+      <w:r>
+        <w:t>Tipos de nota de crédito:</w:t>
+      </w:r>
+    </w:p>
+    <w:tbl>
+      <w:tblPr>
+        <w:tblStyle w:val="TableGrid"/>
+        <w:tblW w:type="auto" w:w="0"/>
+        <w:tblLook w:firstColumn="1" w:firstRow="1" w:lastColumn="0" w:lastRow="0" w:noHBand="0" w:noVBand="1" w:val="04A0"/>
+      </w:tblPr>
+      <w:tblGrid>
+        <w:gridCol w:w="3173"/>
+        <w:gridCol w:w="3173"/>
+        <w:gridCol w:w="3173"/>
+      </w:tblGrid>
+      <w:tr>
+        <w:tc>
+          <w:tcPr>
             <w:tcW w:type="dxa" w:w="2551"/>
           </w:tcPr>
           <w:p>
@@ -11089,7 +11321,7 @@
         <w:pStyle w:val="ListBullet"/>
       </w:pPr>
       <w:r>
-        <w:t>Cierre de turno: se declara lo que hay por forma de pago y se cuenta el efectivo por denominaciones. Normalmente el cajero no ve lo esperado (cierre ciego).</w:t>
+        <w:t>Cierre de turno: el cajero no declara nada ni ve lo esperado. Con la autorización del supervisor, el turno cierra y la caja imprime el cuadre con lo esperado por forma de pago, para el supervisor.</w:t>
       </w:r>
     </w:p>
     <w:p>
@@ -11121,7 +11353,15 @@
         <w:pStyle w:val="ListBullet"/>
       </w:pPr>
       <w:r>
-        <w:t>Al cerrar se imprime el reporte del turno: esperado, declarado y diferencia por forma de pago, denominaciones, retiros, reembolsos y relevos.</w:t>
+        <w:t>Al cerrar se imprime el reporte del turno: lo esperado por forma de pago, los retiros, los reembolsos y los relevos.</w:t>
+      </w:r>
+    </w:p>
+    <w:p>
+      <w:pPr>
+        <w:pStyle w:val="ListBullet"/>
+      </w:pPr>
+      <w:r>
+        <w:t>Después, el cajero cuenta su efectivo a ciegas y se lo entrega al supervisor junto con el comprobante del lote. Quien declara el conteo es el supervisor, en el Central (Módulo de cuadre), y la diferencia queda a nombre del cajero.</w:t>
       </w:r>
     </w:p>
     <w:p>
@@ -11376,7 +11616,7 @@
         <w:pStyle w:val="ListNumber"/>
       </w:pPr>
       <w:r>
-        <w:t>Cierre el turno: declare por forma de pago, cuente las denominaciones y revise el reporte impreso.</w:t>
+        <w:t>Cierre el turno con la autorización del supervisor y revise el cuadre impreso con lo esperado por forma de pago.</w:t>
       </w:r>
     </w:p>
     <w:p>
@@ -11409,6 +11649,14 @@
       </w:pPr>
       <w:r>
         <w:t>En Notas de crédito, revise el saldo de la nota emitida y su consumo.</w:t>
+      </w:r>
+    </w:p>
+    <w:p>
+      <w:pPr>
+        <w:pStyle w:val="ListNumber"/>
+      </w:pPr>
+      <w:r>
+        <w:t>Entre a /cuadre con el usuario de caja del supervisor, cuente las denominaciones del turno que acaba de cerrar y declárelo: el cierre pasa de pendiente a cuadrado con su diferencia.</w:t>
       </w:r>
     </w:p>
     <w:p>

</xml_diff>

<commit_message>
feat(cuadre): reportes del módulo, reimpresión del cuadre y guardia del cierre de sucursal
Segunda fase del módulo: el supervisor y la gerencia ya no solo cuadran, también consultan
el día. La pantalla /cuadre pasa a cinco pestañas (por cuadrar, cierres, resumen del día,
diferencias por cajera, retiros y relevos), con corrección desde la misma tabla y
reimpresión del cuadre en PDF carta.

- Los retiros, reembolsos y relevos del turno ya se guardan en el Central: subían con el
  cierre y se descartaban, así que no había forma de ver con qué motivo y quién autorizó.
- El cierre consolidado de la sucursal no se deja hacer con cierres sin cuadrar.
- Pruebas del día, las diferencias, los movimientos, el PDF y el alcance por sucursal.

Co-Authored-By: Claude Opus 5 (1M context) <noreply@anthropic.com>
</commit_message>
<xml_diff>
--- a/scripts/manual/Manual de usuario CG-POS.docx
+++ b/scripts/manual/Manual de usuario CG-POS.docx
@@ -8489,7 +8489,7 @@
         <w:pStyle w:val="ListNumber"/>
       </w:pPr>
       <w:r>
-        <w:t>Elija la sucursal y el día y presione Preparar: se ven todos los cierres de caja, las formas de pago sumadas y lo que falta (si algún turno no ha cerrado, lo dice).</w:t>
+        <w:t>Elija la sucursal y el día y presione Preparar: se ven todos los cierres de caja, las formas de pago sumadas y lo que falta (si algún turno no ha cerrado, o está cerrado pero sin cuadrar, lo dice).</w:t>
       </w:r>
     </w:p>
     <w:p>
@@ -8514,6 +8514,15 @@
       </w:pPr>
       <w:r>
         <w:t>Cierre la sucursal: queda la diferencia entre lo depositado y lo que había que depositar, y ya no se modifica.</w:t>
+      </w:r>
+    </w:p>
+    <w:p>
+      <w:r>
+        <w:rPr>
+          <w:i/>
+          <w:color w:val="2E7D32"/>
+        </w:rPr>
+        <w:t>No se consolida el día mientras quede un cierre sin cuadrar: ese turno no tiene declarado, y dar por bueno un dinero que nadie contó es justo lo que el módulo de cuadre viene a evitar.</w:t>
       </w:r>
     </w:p>
     <w:p>
@@ -8733,6 +8742,165 @@
           <w:p>
             <w:r>
               <w:t>Corregir un cuadre ya hecho, con motivo, mientras el día no esté consolidado.</w:t>
+            </w:r>
+          </w:p>
+        </w:tc>
+      </w:tr>
+    </w:tbl>
+    <w:p/>
+    <w:p>
+      <w:r>
+        <w:t>La pantalla tiene cinco pestañas, todas de la sucursal y las fechas que se elijan arriba:</w:t>
+      </w:r>
+    </w:p>
+    <w:tbl>
+      <w:tblPr>
+        <w:tblStyle w:val="TableGrid"/>
+        <w:tblW w:type="auto" w:w="0"/>
+        <w:tblLook w:firstColumn="1" w:firstRow="1" w:lastColumn="0" w:lastRow="0" w:noHBand="0" w:noVBand="1" w:val="04A0"/>
+      </w:tblPr>
+      <w:tblGrid>
+        <w:gridCol w:w="4759"/>
+        <w:gridCol w:w="4759"/>
+      </w:tblGrid>
+      <w:tr>
+        <w:tc>
+          <w:tcPr>
+            <w:tcW w:type="dxa" w:w="2268"/>
+          </w:tcPr>
+          <w:p>
+            <w:r/>
+            <w:r>
+              <w:rPr>
+                <w:b/>
+                <w:color w:val="1B4D3E"/>
+              </w:rPr>
+              <w:t>Pestaña</w:t>
+            </w:r>
+          </w:p>
+        </w:tc>
+        <w:tc>
+          <w:tcPr>
+            <w:tcW w:type="dxa" w:w="7370"/>
+          </w:tcPr>
+          <w:p>
+            <w:r/>
+            <w:r>
+              <w:rPr>
+                <w:b/>
+                <w:color w:val="1B4D3E"/>
+              </w:rPr>
+              <w:t>Para qué sirve</w:t>
+            </w:r>
+          </w:p>
+        </w:tc>
+      </w:tr>
+      <w:tr>
+        <w:tc>
+          <w:tcPr>
+            <w:tcW w:type="dxa" w:w="2268"/>
+          </w:tcPr>
+          <w:p>
+            <w:r>
+              <w:t>Por cuadrar</w:t>
+            </w:r>
+          </w:p>
+        </w:tc>
+        <w:tc>
+          <w:tcPr>
+            <w:tcW w:type="dxa" w:w="7370"/>
+          </w:tcPr>
+          <w:p>
+            <w:r>
+              <w:t>Los cierres que las cajas entregaron y nadie ha contado; es con lo que se entra a trabajar.</w:t>
+            </w:r>
+          </w:p>
+        </w:tc>
+      </w:tr>
+      <w:tr>
+        <w:tc>
+          <w:tcPr>
+            <w:tcW w:type="dxa" w:w="2268"/>
+          </w:tcPr>
+          <w:p>
+            <w:r>
+              <w:t>Cierres</w:t>
+            </w:r>
+          </w:p>
+        </w:tc>
+        <w:tc>
+          <w:tcPr>
+            <w:tcW w:type="dxa" w:w="7370"/>
+          </w:tcPr>
+          <w:p>
+            <w:r>
+              <w:t>Todos los del período con su esperado, declarado, diferencia y estado. Desde aquí se reimprime el cuadre en PDF y se corrige, y un interruptor deja ver solo los cuadres corregidos.</w:t>
+            </w:r>
+          </w:p>
+        </w:tc>
+      </w:tr>
+      <w:tr>
+        <w:tc>
+          <w:tcPr>
+            <w:tcW w:type="dxa" w:w="2268"/>
+          </w:tcPr>
+          <w:p>
+            <w:r>
+              <w:t>Resumen del día</w:t>
+            </w:r>
+          </w:p>
+        </w:tc>
+        <w:tc>
+          <w:tcPr>
+            <w:tcW w:type="dxa" w:w="7370"/>
+          </w:tcPr>
+          <w:p>
+            <w:r>
+              <w:t>El día de la sucursal sumado por forma de pago, con el aviso de cuántas cajas faltan por cuadrar.</w:t>
+            </w:r>
+          </w:p>
+        </w:tc>
+      </w:tr>
+      <w:tr>
+        <w:tc>
+          <w:tcPr>
+            <w:tcW w:type="dxa" w:w="2268"/>
+          </w:tcPr>
+          <w:p>
+            <w:r>
+              <w:t>Diferencias por cajera</w:t>
+            </w:r>
+          </w:p>
+        </w:tc>
+        <w:tc>
+          <w:tcPr>
+            <w:tcW w:type="dxa" w:w="7370"/>
+          </w:tcPr>
+          <w:p>
+            <w:r>
+              <w:t>Faltantes, sobrantes y neto de cada cajera en el período.</w:t>
+            </w:r>
+          </w:p>
+        </w:tc>
+      </w:tr>
+      <w:tr>
+        <w:tc>
+          <w:tcPr>
+            <w:tcW w:type="dxa" w:w="2268"/>
+          </w:tcPr>
+          <w:p>
+            <w:r>
+              <w:t>Retiros y relevos</w:t>
+            </w:r>
+          </w:p>
+        </w:tc>
+        <w:tc>
+          <w:tcPr>
+            <w:tcW w:type="dxa" w:w="7370"/>
+          </w:tcPr>
+          <w:p>
+            <w:r>
+              <w:t>Los retiros, reembolsos y relevos de los turnos, con su monto, su motivo y quién los autorizó.</w:t>
             </w:r>
           </w:p>
         </w:tc>

</xml_diff>

<commit_message>
feat(cuadre): la conciliación de tarjetas del turno se guarda y sube al Central
Cerrar el lote del terminal ya cuadraba las tarjetas contra lo aprobado en la caja, pero el
resultado se mostraba y se perdía: el supervisor solo tenía el papel del terminal. Ahora el
lote queda en la caja, viaja con el cierre y se consulta en /cuadre.

- Caja: tablas LotesTarjetas y LotesTarjetasAprobaciones, un lote por turno; volver a cerrarlo
  reemplaza el anterior y queda en la auditoría.
- El cierre de turno lleva el lote al Central, que lo guarda junto al cierre con las
  aprobaciones que aparecieron de un solo lado.
- Pestaña «Tarjetas» en /cuadre y el lote en el PDF del cuadre.
- Cuando el terminal no detalla su lote solo se guarda lo de la caja, sin inventar diferencia.

Co-Authored-By: Claude Opus 5 (1M context) <noreply@anthropic.com>
</commit_message>
<xml_diff>
--- a/scripts/manual/Manual de usuario CG-POS.docx
+++ b/scripts/manual/Manual de usuario CG-POS.docx
@@ -8905,6 +8905,28 @@
           </w:p>
         </w:tc>
       </w:tr>
+      <w:tr>
+        <w:tc>
+          <w:tcPr>
+            <w:tcW w:type="dxa" w:w="2268"/>
+          </w:tcPr>
+          <w:p>
+            <w:r>
+              <w:t>Tarjetas</w:t>
+            </w:r>
+          </w:p>
+        </w:tc>
+        <w:tc>
+          <w:tcPr>
+            <w:tcW w:type="dxa" w:w="7370"/>
+          </w:tcPr>
+          <w:p>
+            <w:r>
+              <w:t>El lote que cerró cada caja contra lo aprobado en ella: transacciones, montos, diferencia y las aprobaciones que aparecen de un solo lado.</w:t>
+            </w:r>
+          </w:p>
+        </w:tc>
+      </w:tr>
     </w:tbl>
     <w:p/>
     <w:p>
@@ -8914,6 +8936,15 @@
           <w:color w:val="2E7D32"/>
         </w:rPr>
         <w:t>El turno cierra en la caja aunque el Central esté caído: el cuadre espera. La caja nunca se queda trancada por la red.</w:t>
+      </w:r>
+    </w:p>
+    <w:p>
+      <w:r>
+        <w:rPr>
+          <w:i/>
+          <w:color w:val="2E7D32"/>
+        </w:rPr>
+        <w:t>Si el terminal no detalla su lote —depende del modelo—, en Tarjetas solo se ve lo de la caja: eso se compara a mano contra el comprobante que imprimió la terminal.</w:t>
       </w:r>
     </w:p>
     <w:p>
@@ -11513,7 +11544,7 @@
         <w:pStyle w:val="ListBullet"/>
       </w:pPr>
       <w:r>
-        <w:t>Cerrar lote: cierra el lote del terminal de tarjetas y compara lo aprobado en la caja con lo que reporta el terminal.</w:t>
+        <w:t>Cerrar lote: cierra el lote del terminal de tarjetas y compara lo aprobado en la caja con lo que reporta el terminal. El resultado queda guardado y sube con el cierre, así que el supervisor lo ve en el Central sin depender del papel.</w:t>
       </w:r>
     </w:p>
     <w:p>

</xml_diff>

<commit_message>
feat(seguridad): la caja se dedica a ventas o a devoluciones según el rol
Devoluciones.Registrar existía en el catálogo y no se comprobaba en ninguna parte: cualquier
cajero emitía notas de crédito. Y el que no podía vender lo descubría después de escanear,
porque la pantalla se abría igual.

- El Agente exige Ventas.Registrar en /api/ventas y Devoluciones.Registrar en
  /api/devoluciones; el turno y las consultas de artículos y clientes quedan abiertos, que es
  lo que el de devoluciones sigue necesitando.
- Tras el ingreso, cada usuario entra a la pantalla que su rol le permite.
- Sin permiso de devoluciones, F10 queda apagado y entrar por la dirección no abre la
  pantalla; sin permiso de ventas, la pantalla de venta queda en modo consulta.
- Rol DEVOLUCIONES y usuario D001 en los datos de prueba, con las pruebas de los dos casos.

Co-Authored-By: Claude Opus 5 (1M context) <noreply@anthropic.com>
</commit_message>
<xml_diff>
--- a/scripts/manual/Manual de usuario CG-POS.docx
+++ b/scripts/manual/Manual de usuario CG-POS.docx
@@ -6225,6 +6225,48 @@
           </w:p>
         </w:tc>
       </w:tr>
+      <w:tr>
+        <w:tc>
+          <w:tcPr>
+            <w:tcW w:type="dxa" w:w="1361"/>
+          </w:tcPr>
+          <w:p>
+            <w:r>
+              <w:t>DEVOLUCIONES</w:t>
+            </w:r>
+          </w:p>
+        </w:tc>
+        <w:tc>
+          <w:tcPr>
+            <w:tcW w:type="dxa" w:w="1474"/>
+          </w:tcPr>
+          <w:p>
+            <w:r>
+              <w:t>Devoluciones</w:t>
+            </w:r>
+          </w:p>
+        </w:tc>
+        <w:tc>
+          <w:tcPr>
+            <w:tcW w:type="dxa" w:w="794"/>
+          </w:tcPr>
+          <w:p>
+            <w:r>
+              <w:t>1</w:t>
+            </w:r>
+          </w:p>
+        </w:tc>
+        <w:tc>
+          <w:tcPr>
+            <w:tcW w:type="dxa" w:w="5669"/>
+          </w:tcPr>
+          <w:p>
+            <w:r>
+              <w:t>Abrir y cerrar su turno y emitir notas de crédito. No vende: en la pantalla de venta solo consulta artículos y clientes.</w:t>
+            </w:r>
+          </w:p>
+        </w:tc>
+      </w:tr>
     </w:tbl>
     <w:p/>
     <w:tbl>
@@ -6469,6 +6511,48 @@
           </w:p>
         </w:tc>
       </w:tr>
+      <w:tr>
+        <w:tc>
+          <w:tcPr>
+            <w:tcW w:type="dxa" w:w="1247"/>
+          </w:tcPr>
+          <w:p>
+            <w:r>
+              <w:t>D001</w:t>
+            </w:r>
+          </w:p>
+        </w:tc>
+        <w:tc>
+          <w:tcPr>
+            <w:tcW w:type="dxa" w:w="2835"/>
+          </w:tcPr>
+          <w:p>
+            <w:r>
+              <w:t>Encargado de devoluciones</w:t>
+            </w:r>
+          </w:p>
+        </w:tc>
+        <w:tc>
+          <w:tcPr>
+            <w:tcW w:type="dxa" w:w="1701"/>
+          </w:tcPr>
+          <w:p>
+            <w:r>
+              <w:t>DEVOLUCIONES</w:t>
+            </w:r>
+          </w:p>
+        </w:tc>
+        <w:tc>
+          <w:tcPr>
+            <w:tcW w:type="dxa" w:w="3402"/>
+          </w:tcPr>
+          <w:p>
+            <w:r>
+              <w:t>La caja del área de devoluciones</w:t>
+            </w:r>
+          </w:p>
+        </w:tc>
+      </w:tr>
     </w:tbl>
     <w:p/>
     <w:p>
@@ -6478,6 +6562,169 @@
           <w:color w:val="2E7D32"/>
         </w:rPr>
         <w:t>El nivel va del 1 al 9 y solo se usa para las autorizaciones: quien autoriza necesita el permiso y un nivel igual o mayor al de quien lo pide. Se sugieren 1, 5 y 8, y no 1, 2 y 3, para dejar huecos e intercalar después un rol intermedio (por ejemplo un encargado en el 6) sin tener que renumerar los que ya existen.</w:t>
+      </w:r>
+    </w:p>
+    <w:p>
+      <w:pPr>
+        <w:pStyle w:val="Heading3"/>
+      </w:pPr>
+      <w:r>
+        <w:t>2.7.3. Dedicar una caja a ventas o a devoluciones</w:t>
+      </w:r>
+    </w:p>
+    <w:p>
+      <w:r>
+        <w:t>Lo que la caja hace lo deciden los permisos del usuario que entra, no un ajuste del equipo:</w:t>
+      </w:r>
+    </w:p>
+    <w:tbl>
+      <w:tblPr>
+        <w:tblStyle w:val="TableGrid"/>
+        <w:tblW w:type="auto" w:w="0"/>
+        <w:tblLook w:firstColumn="1" w:firstRow="1" w:lastColumn="0" w:lastRow="0" w:noHBand="0" w:noVBand="1" w:val="04A0"/>
+      </w:tblPr>
+      <w:tblGrid>
+        <w:gridCol w:w="4759"/>
+        <w:gridCol w:w="4759"/>
+      </w:tblGrid>
+      <w:tr>
+        <w:tc>
+          <w:tcPr>
+            <w:tcW w:type="dxa" w:w="2835"/>
+          </w:tcPr>
+          <w:p>
+            <w:r/>
+            <w:r>
+              <w:rPr>
+                <w:b/>
+                <w:color w:val="1B4D3E"/>
+              </w:rPr>
+              <w:t>El rol tiene</w:t>
+            </w:r>
+          </w:p>
+        </w:tc>
+        <w:tc>
+          <w:tcPr>
+            <w:tcW w:type="dxa" w:w="6803"/>
+          </w:tcPr>
+          <w:p>
+            <w:r/>
+            <w:r>
+              <w:rPr>
+                <w:b/>
+                <w:color w:val="1B4D3E"/>
+              </w:rPr>
+              <w:t>Qué pasa al entrar</w:t>
+            </w:r>
+          </w:p>
+        </w:tc>
+      </w:tr>
+      <w:tr>
+        <w:tc>
+          <w:tcPr>
+            <w:tcW w:type="dxa" w:w="2835"/>
+          </w:tcPr>
+          <w:p>
+            <w:r>
+              <w:t>Ventas.Registrar y Devoluciones.Registrar</w:t>
+            </w:r>
+          </w:p>
+        </w:tc>
+        <w:tc>
+          <w:tcPr>
+            <w:tcW w:type="dxa" w:w="6803"/>
+          </w:tcPr>
+          <w:p>
+            <w:r>
+              <w:t>Todo como siempre: vende y devuelve (F10).</w:t>
+            </w:r>
+          </w:p>
+        </w:tc>
+      </w:tr>
+      <w:tr>
+        <w:tc>
+          <w:tcPr>
+            <w:tcW w:type="dxa" w:w="2835"/>
+          </w:tcPr>
+          <w:p>
+            <w:r>
+              <w:t>Solo Ventas.Registrar</w:t>
+            </w:r>
+          </w:p>
+        </w:tc>
+        <w:tc>
+          <w:tcPr>
+            <w:tcW w:type="dxa" w:w="6803"/>
+          </w:tcPr>
+          <w:p>
+            <w:r>
+              <w:t>Vende. La tecla F10 queda apagada y escribir la dirección de devoluciones no le abre nada.</w:t>
+            </w:r>
+          </w:p>
+        </w:tc>
+      </w:tr>
+      <w:tr>
+        <w:tc>
+          <w:tcPr>
+            <w:tcW w:type="dxa" w:w="2835"/>
+          </w:tcPr>
+          <w:p>
+            <w:r>
+              <w:t>Solo Devoluciones.Registrar</w:t>
+            </w:r>
+          </w:p>
+        </w:tc>
+        <w:tc>
+          <w:tcPr>
+            <w:tcW w:type="dxa" w:w="6803"/>
+          </w:tcPr>
+          <w:p>
+            <w:r>
+              <w:t>Entra directo a devoluciones. En la pantalla de venta solo consulta artículos y clientes: no escanea, no cobra.</w:t>
+            </w:r>
+          </w:p>
+        </w:tc>
+      </w:tr>
+      <w:tr>
+        <w:tc>
+          <w:tcPr>
+            <w:tcW w:type="dxa" w:w="2835"/>
+          </w:tcPr>
+          <w:p>
+            <w:r>
+              <w:t>Ninguno de los dos</w:t>
+            </w:r>
+          </w:p>
+        </w:tc>
+        <w:tc>
+          <w:tcPr>
+            <w:tcW w:type="dxa" w:w="6803"/>
+          </w:tcPr>
+          <w:p>
+            <w:r>
+              <w:t>Se le avisa que su usuario no tiene ventas ni devoluciones y solo puede salir.</w:t>
+            </w:r>
+          </w:p>
+        </w:tc>
+      </w:tr>
+    </w:tbl>
+    <w:p/>
+    <w:p>
+      <w:r>
+        <w:rPr>
+          <w:i/>
+          <w:color w:val="2E7D32"/>
+        </w:rPr>
+        <w:t>Para dejar una caja solo de devoluciones basta con poner ahí un usuario con ese rol: no hay que configurar el equipo. El bloqueo lo hace el servicio de la caja, así que tampoco se salta escribiendo la dirección en el navegador.</w:t>
+      </w:r>
+    </w:p>
+    <w:p>
+      <w:r>
+        <w:rPr>
+          <w:i/>
+          <w:color w:val="2E7D32"/>
+        </w:rPr>
+        <w:t>El que solo devuelve abre y cierra su turno igual que cualquier cajero: la nota de crédito es del turno y entra en el cuadre.</w:t>
       </w:r>
     </w:p>
     <w:p>

</xml_diff>

<commit_message>
feat(cobro): caja sin terminal conectado y aviso cuando el modelo no existe
Hay tiendas que cobran con un verifone aparte, que imprime su volante y no habla con la caja.
Con "Tipo": "Ninguno" la caja deja de buscar un equipo que no existe: al elegir tarjeta pide
directamente el número de aprobación del volante, sin pedir autorización de supervisor —ahí
eso no es una contingencia, es como se cobra siempre— y sin aprobar nada por su cuenta, que
es lo que hace el simulado y dejaría cobros que nunca ocurrieron.

El número es obligatorio: sin él no hay con qué cuadrar el turno contra los comprobantes.

Además, un "Modelo" que no está implementado ya no cae al perfil genérico en silencio: el
Agente avisa al arrancar y dice cuáles hay.

Co-Authored-By: Claude Opus 5 (1M context) <noreply@anthropic.com>
</commit_message>
<xml_diff>
--- a/scripts/manual/Manual de usuario CG-POS.docx
+++ b/scripts/manual/Manual de usuario CG-POS.docx
@@ -11784,6 +11784,14 @@
       </w:pPr>
       <w:r>
         <w:t>Con un turno de un día anterior, las facturas en espera ya no se pueden cobrar: el cierre avisa cuáles son y pide retomarlas y limpiarlas (con la autorización de un supervisor) antes de cerrar.</w:t>
+      </w:r>
+    </w:p>
+    <w:p>
+      <w:pPr>
+        <w:pStyle w:val="ListBullet"/>
+      </w:pPr>
+      <w:r>
+        <w:t>Cobro con tarjeta: si la caja tiene el terminal conectado, ella le manda el monto y recibe sola la aprobación. Si la tienda cobra con un equipo aparte (un inalámbrico, por ejemplo), el cajero digita el número de aprobación del volante: es obligatorio, porque es lo único con que después se cuadra el turno contra los comprobantes.</w:t>
       </w:r>
     </w:p>
     <w:p>

</xml_diff>

<commit_message>
fix(sincronizacion): los maestros bajan por páginas, así el aprovisionamiento termina
La bajada armaba un solo paquete con todo lo cambiado. En una caja nueva eso son
cientos de miles de filas —158 mil artículos y 706 mil clientes en la primera
instalación real—, y la caja cortaba a los 30 segundos sin aplicar nada: quedaba
sin llegar del Central, ciclo tras ciclo.

Ahora el Central corta el rango donde alguna tabla llena la página y dice que
falta más; la caja aplica lo que llegó, guarda su marca y pide desde ahí. Si se
corta la red en el medio no se pierde lo aplicado. El día a día no cambia: unas
pocas filas caben en una página y el viaje es uno solo.

El tamaño lo fija Central.Sincronizacion.FilasPorPagina (5,000 si no se toca).

Co-Authored-By: Claude Opus 5 (1M context) <noreply@anthropic.com>
</commit_message>
<xml_diff>
--- a/scripts/manual/Manual de usuario CG-POS.docx
+++ b/scripts/manual/Manual de usuario CG-POS.docx
@@ -12046,6 +12046,15 @@
       </w:pPr>
       <w:r>
         <w:t>Espere el primer ciclo de sincronización: la caja baja artículos, precios, usuarios y parámetros del Central.</w:t>
+      </w:r>
+    </w:p>
+    <w:p>
+      <w:r>
+        <w:rPr>
+          <w:i/>
+          <w:color w:val="2E7D32"/>
+        </w:rPr>
+        <w:t>La primera bajada de una caja nueva es la más larga: con un catálogo grande son cientos de miles de filas. Vienen en tandas —la pantalla va diciendo «parte 2», «parte 3»— y cada tanda se guarda al llegar, así que si se corta la red o se reinicia el servicio, al volver se retoma donde iba y no hay que empezar de nuevo. El tamaño de la tanda se configura en el Central con «Central.Sincronizacion.FilasPorPagina»; sin tocarlo son 5,000 filas.</w:t>
       </w:r>
     </w:p>
     <w:p>

</xml_diff>

<commit_message>
feat(sincronizacion): el conteo de la bajada cuenta contra el total, con barra de progreso
Los maestros vienen por tandas, así que el «2,000 de 5,000» de la pantalla se
reiniciaba con cada una y no se sabía si faltaba mucho. Ahora la caja le pide al
Central, en la primera tanda, cuántas filas hay que bajar por maestro, y arrastra
esa cuenta: «Aplicando clientes · 24,000 de 705,706», con su barra de progreso en
la pantalla de ingreso y en el modal de Sincronizar.

El Central cuenta solo cuando se lo piden (totales=true): hacerlo en cada tanda
sería recorrer cientos de miles de filas una y otra vez.

Co-Authored-By: Claude Opus 5 (1M context) <noreply@anthropic.com>
</commit_message>
<xml_diff>
--- a/scripts/manual/Manual de usuario CG-POS.docx
+++ b/scripts/manual/Manual de usuario CG-POS.docx
@@ -12055,6 +12055,15 @@
           <w:color w:val="2E7D32"/>
         </w:rPr>
         <w:t>La primera bajada de una caja nueva es la más larga: con un catálogo grande son cientos de miles de filas. Vienen en tandas —la pantalla va diciendo «parte 2», «parte 3»— y cada tanda se guarda al llegar, así que si se corta la red o se reinicia el servicio, al volver se retoma donde iba y no hay que empezar de nuevo. El tamaño de la tanda se configura en el Central con «Central.Sincronizacion.FilasPorPagina»; sin tocarlo son 5,000 filas.</w:t>
+      </w:r>
+    </w:p>
+    <w:p>
+      <w:r>
+        <w:rPr>
+          <w:i/>
+          <w:color w:val="2E7D32"/>
+        </w:rPr>
+        <w:t>Mientras bajan, la pantalla lleva la cuenta contra el total de verdad —«Aplicando clientes · 24,000 de 705,706»— con su barra de progreso, así que se ve de un vistazo si avanza o se quedó parado.</w:t>
       </w:r>
     </w:p>
     <w:p>

</xml_diff>

<commit_message>
feat(caja): los avisos de la pantalla se quitan solos, y el Central decide a los cuántos segundos
En la caja nadie va cerrando avisos con el ratón: se acumulaban encima de la
venta y el cajero dejaba de leerlos. Ahora se van a los 6 segundos, que el
negocio cambia en el Central con «Pantallas.SegundosAviso» (general, por sucursal
o por caja); con 0 se quedan hasta que los cierren.

Solo se van los avisos de un hecho puntual. Lo que describe una situación que
sigue —el turno de un día anterior, la factura que exige la cédula, el límite de
compra pasado— se queda mientras dure.

Co-Authored-By: Claude Opus 5 (1M context) <noreply@anthropic.com>
</commit_message>
<xml_diff>
--- a/scripts/manual/Manual de usuario CG-POS.docx
+++ b/scripts/manual/Manual de usuario CG-POS.docx
@@ -10305,6 +10305,15 @@
       </w:tr>
     </w:tbl>
     <w:p/>
+    <w:p>
+      <w:r>
+        <w:rPr>
+          <w:i/>
+          <w:color w:val="2E7D32"/>
+        </w:rPr>
+        <w:t>Los avisos que salen bajo la barra de escaneo —un error, un rango de e-CF por acabarse, una advertencia— se quitan solos a los 6 segundos, y también se pueden cerrar con la ✕. El tiempo se cambia en el Central con el parámetro «Pantallas.SegundosAviso», en general, por sucursal o por caja; con 0 el aviso se queda hasta que el cajero lo cierre. Lo que no se va es lo que describe una situación que sigue: el turno de un día anterior, la factura que exige la cédula o el límite de compra pasado.</w:t>
+      </w:r>
+    </w:p>
     <w:p>
       <w:pPr>
         <w:pStyle w:val="Heading2"/>

</xml_diff>

<commit_message>
feat(caja): botón para volver a bajar todos los datos del Central
La bajada es incremental: el Central manda lo que cambió allá, así que lo que se
pierda en la base de una caja no vuelve por su cuenta. Hasta ahora la única
salida era borrar la marca de versión a mano con SQL.

En la pantalla de configuración de la caja, ya configurada, hay «Volver a bajar
todo del Central»: pide confirmación y el usuario del Central que lo autoriza —lo
valida contra el Central, igual que al configurar—, olvida la marca y lleva a la
pantalla de ingreso, donde se ve el avance. Los datos que la caja tenga se quedan
mientras llegan los nuevos: borrarlos dejaría la caja sin catálogo si el Central
no responde.

A esa pantalla ahora se llega también con la caja funcionando, no solo cuando el
Central la rechaza; si no, el botón no servía de nada.

Co-Authored-By: Claude Opus 5 (1M context) <noreply@anthropic.com>
</commit_message>
<xml_diff>
--- a/scripts/manual/Manual de usuario CG-POS.docx
+++ b/scripts/manual/Manual de usuario CG-POS.docx
@@ -12382,6 +12382,28 @@
           <w:p>
             <w:r>
               <w:t>Pase el mouse por el indicador de sincronización de la barra de estado: si la última actualización falló, ahí dice por qué y de qué artículo se trata. Casi siempre es un dato del Central que la caja no acepta (un artículo activo sin precio, una categoría que no es de su departamento). Se corrige en el Central y la caja lo aplica sola en el siguiente ciclo, sin perder nada.</w:t>
+            </w:r>
+          </w:p>
+        </w:tc>
+      </w:tr>
+      <w:tr>
+        <w:tc>
+          <w:tcPr>
+            <w:tcW w:type="dxa" w:w="2551"/>
+          </w:tcPr>
+          <w:p>
+            <w:r>
+              <w:t>A la caja le faltan artículos o clientes que en el Central sí están</w:t>
+            </w:r>
+          </w:p>
+        </w:tc>
+        <w:tc>
+          <w:tcPr>
+            <w:tcW w:type="dxa" w:w="7087"/>
+          </w:tcPr>
+          <w:p>
+            <w:r>
+              <w:t>La caja solo pide lo que cambió en el Central, así que lo que se haya perdido en su base no vuelve por su cuenta: allá no pasó nada. En la pantalla de ingreso, «Configuración de la caja» → «Volver a bajar todo del Central», con el usuario del Central que lo autorice. La caja baja el catálogo entero otra vez; tarda y mientras dura no se puede vender. Lo que ya tiene no se duplica: se actualiza.</w:t>
             </w:r>
           </w:p>
         </w:tc>

</xml_diff>

<commit_message>
Revert "feat(caja): botón para volver a bajar todos los datos del Central"
En la caja no va: el técnico no debería entrar a la pantalla de configuración
para esto, y el acceso que le abrí en la pantalla de ingreso sobra. Se hace desde
el Central, en el menú de cada caja.

Esto revierte el commit 3d07afa.

Co-Authored-By: Claude Opus 5 (1M context) <noreply@anthropic.com>
</commit_message>
<xml_diff>
--- a/scripts/manual/Manual de usuario CG-POS.docx
+++ b/scripts/manual/Manual de usuario CG-POS.docx
@@ -12382,28 +12382,6 @@
           <w:p>
             <w:r>
               <w:t>Pase el mouse por el indicador de sincronización de la barra de estado: si la última actualización falló, ahí dice por qué y de qué artículo se trata. Casi siempre es un dato del Central que la caja no acepta (un artículo activo sin precio, una categoría que no es de su departamento). Se corrige en el Central y la caja lo aplica sola en el siguiente ciclo, sin perder nada.</w:t>
-            </w:r>
-          </w:p>
-        </w:tc>
-      </w:tr>
-      <w:tr>
-        <w:tc>
-          <w:tcPr>
-            <w:tcW w:type="dxa" w:w="2551"/>
-          </w:tcPr>
-          <w:p>
-            <w:r>
-              <w:t>A la caja le faltan artículos o clientes que en el Central sí están</w:t>
-            </w:r>
-          </w:p>
-        </w:tc>
-        <w:tc>
-          <w:tcPr>
-            <w:tcW w:type="dxa" w:w="7087"/>
-          </w:tcPr>
-          <w:p>
-            <w:r>
-              <w:t>La caja solo pide lo que cambió en el Central, así que lo que se haya perdido en su base no vuelve por su cuenta: allá no pasó nada. En la pantalla de ingreso, «Configuración de la caja» → «Volver a bajar todo del Central», con el usuario del Central que lo autorice. La caja baja el catálogo entero otra vez; tarda y mientras dura no se puede vender. Lo que ya tiene no se duplica: se actualiza.</w:t>
             </w:r>
           </w:p>
         </w:tc>

</xml_diff>

<commit_message>
feat(central): «Volver a sincronizar esta caja» en el menú de cada caja
La bajada es incremental: el Central manda lo que cambió allá, así que lo que se
pierda en la base de una caja no vuelve por su cuenta. La única salida era borrar
su marca de versión a mano con SQL, entrando a la base de esa caja.

En Organización → Cajas, el menú de cada caja lo pide con un clic. A una caja no
se le puede ordenar nada —es ella la que pregunta—, así que queda anotado en su
estado de sincronización y la próxima vez que pida maestros se le sirven desde la
versión 0; ella guarda la marca nueva y sigue desde ahí.

El pedido se borra al servirlo, no al terminar la bajada: desde el Central no hay
manera de saber que la caja lo aplicó, y dejarlo puesto la haría bajar lo mismo
sin parar. Si algo falla, se vuelve a pedir.

Co-Authored-By: Claude Opus 5 (1M context) <noreply@anthropic.com>
</commit_message>
<xml_diff>
--- a/scripts/manual/Manual de usuario CG-POS.docx
+++ b/scripts/manual/Manual de usuario CG-POS.docx
@@ -12382,6 +12382,28 @@
           <w:p>
             <w:r>
               <w:t>Pase el mouse por el indicador de sincronización de la barra de estado: si la última actualización falló, ahí dice por qué y de qué artículo se trata. Casi siempre es un dato del Central que la caja no acepta (un artículo activo sin precio, una categoría que no es de su departamento). Se corrige en el Central y la caja lo aplica sola en el siguiente ciclo, sin perder nada.</w:t>
+            </w:r>
+          </w:p>
+        </w:tc>
+      </w:tr>
+      <w:tr>
+        <w:tc>
+          <w:tcPr>
+            <w:tcW w:type="dxa" w:w="2551"/>
+          </w:tcPr>
+          <w:p>
+            <w:r>
+              <w:t>A una caja le faltan artículos o clientes que en el Central sí están</w:t>
+            </w:r>
+          </w:p>
+        </w:tc>
+        <w:tc>
+          <w:tcPr>
+            <w:tcW w:type="dxa" w:w="7087"/>
+          </w:tcPr>
+          <w:p>
+            <w:r>
+              <w:t>La caja solo pide lo que cambió en el Central, así que lo que se haya perdido en su base no vuelve por su cuenta: allá no pasó nada. En el Central, Organización → Cajas, en el menú de esa caja, «Volver a sincronizar esta caja». Baja el catálogo entero otra vez la próxima vez que pregunte; tarda varios minutos y mientras dura esa caja no vende. Lo que ya tiene no se duplica: se actualiza.</w:t>
             </w:r>
           </w:p>
         </w:tc>

</xml_diff>

<commit_message>
feat(caja): el motivo de la autorización del supervisor es opcional y el error se ve
Quien autoriza está delante del cajero: escribir el motivo muchas veces sobra y
entorpece la caja. Se pide igual, pero ya no bloquea. Lo que no se pierde nunca
es qué se autorizó, a quién y quién lo autorizó.

El aviso de por qué no pasó la autorización salía debajo del teclado en pantalla,
o sea fuera de la vista. Ahora va entre los campos y el teclado.

Co-Authored-By: Claude Opus 5 (1M context) <noreply@anthropic.com>
</commit_message>
<xml_diff>
--- a/scripts/manual/Manual de usuario CG-POS.docx
+++ b/scripts/manual/Manual de usuario CG-POS.docx
@@ -11517,6 +11517,15 @@
       </w:pPr>
       <w:r>
         <w:t>Eliminar línea, eliminar por escaneo y limpiar pantalla piden autorización de supervisor; la línea eliminada queda tachada en su lugar, con su mismo número, y sale del total. La numeración de las líneas sigue continua; quién la eliminó y quién lo autorizó queda en la auditoría.</w:t>
+      </w:r>
+    </w:p>
+    <w:p>
+      <w:r>
+        <w:rPr>
+          <w:i/>
+          <w:color w:val="2E7D32"/>
+        </w:rPr>
+        <w:t>En el cuadro de autorización del supervisor, el motivo es opcional: quien autoriza está delante del cajero y muchas veces escribirlo solo entorpece. Lo que nunca se pierde es qué se autorizó, a quién y quién lo autorizó, que queda en la auditoría con o sin motivo.</w:t>
       </w:r>
     </w:p>
     <w:p>

</xml_diff>

<commit_message>
feat(caja): buscar clientes por nombre, no solo por documento
El cajero casi nunca se sabe el RNC de memoria; se sabe el nombre. Hasta ahora
solo se podía asignar el cliente digitando su documento.

Dentro del cuadro de cliente, «Buscar por nombre» abre una lista táctil igual a
la de artículos: se escribe con el teclado en pantalla y al buscar la lista ocupa
el cuadro y se elige tocando la fila. Si se escriben solo dígitos busca por
documento.

Por nombre se intenta primero «empieza por», que usa el índice y responde en 2 ms
sobre el padrón entero; solo si eso no da nada se busca el texto en medio, que
cuesta medio segundo. Así lo normal es inmediato y lo raro igual aparece.

Co-Authored-By: Claude Opus 5 (1M context) <noreply@anthropic.com>
</commit_message>
<xml_diff>
--- a/scripts/manual/Manual de usuario CG-POS.docx
+++ b/scripts/manual/Manual de usuario CG-POS.docx
@@ -10920,6 +10920,11 @@
     <w:p>
       <w:r>
         <w:t>Se digita la cédula o el RNC; la caja lo busca en los clientes, que bajan del Central. Si no aparece, se digita el nombre. El tipo de comprobante sale del cliente y cambiarlo a mano requiere permiso.</w:t>
+      </w:r>
+    </w:p>
+    <w:p>
+      <w:r>
+        <w:t>Si no se sabe el documento de memoria, el botón «Buscar por nombre» abre una lista táctil donde se escribe con el teclado en pantalla y se elige tocando la fila. Busca lo mismo por documento (si se escriben solo números) o por nombre, desde tres caracteres, y muestra los primeros 50: si salen demasiados, hay que escribir algo más. Encuentra al instante por el principio del nombre; buscar una palabra de en medio también sirve, pero tarda un poco más porque la caja tiene el padrón entero de la DGII.</w:t>
       </w:r>
     </w:p>
     <w:tbl>

</xml_diff>

<commit_message>
feat(central): filtro de estado en el maestro de artículos
Un maestro con años encima acumula artículos dados de baja que ya no se venden y
que solo estorban al buscar. A la derecha de «Tipo» hay ahora «Estado», que
arranca en Activos; los inactivos se piden a propósito, y «Todos» los muestra
juntos como hasta ahora.

Se suma a lo que se busque y al tipo, no lo reemplaza. La tabla de maestros sabe
filtrar por estado cuando ese maestro se desactiva, así que los demás pueden
sumarlo sin tocar nada más.

Co-Authored-By: Claude Opus 5 (1M context) <noreply@anthropic.com>
</commit_message>
<xml_diff>
--- a/scripts/manual/Manual de usuario CG-POS.docx
+++ b/scripts/manual/Manual de usuario CG-POS.docx
@@ -2051,6 +2051,15 @@
           <w:color w:val="2E7D32"/>
         </w:rPr>
         <w:t>En Artículos y en Precios, al lado del buscador hay un «Buscar por» donde se elige Descripción o Código. La descripción se busca por parecido; el código (interno, de barras o de proveedor) hay que escribirlo completo, porque un código es el artículo o no lo es: buscar «040100» por pedazos devolvía cientos de artículos que solo empiezan igual.</w:t>
+      </w:r>
+    </w:p>
+    <w:p>
+      <w:r>
+        <w:rPr>
+          <w:i/>
+          <w:color w:val="2E7D32"/>
+        </w:rPr>
+        <w:t>A la derecha de la barra, Artículos tiene dos filtros más: «Tipo» —normal, pesado, serializado o combo— y «Estado». El estado arranca en Activos, que es lo que se mira a diario; los artículos dados de baja se piden a propósito eligiendo Inactivos, o Todos para ver los dos. Los filtros se suman a lo que se busque: «alambre» entre los pesados y activos es las tres cosas a la vez.</w:t>
       </w:r>
     </w:p>
     <w:p>

</xml_diff>

<commit_message>
feat(central): una promoción publicada no se cambia; se apaga o se rehace
Poder editar una oferta que ya corrió hacía imposible explicar por qué una
factura de la semana pasada salió con ese precio: el registro dejaba de describir
lo que de verdad pasó.

Lo único que admite ahora es apagarse, y volver a encenderse mientras siga dentro
de sus fechas; una vencida no se revive. Para otra oferta está «Rehacer», que
abre una nueva con todos sus datos para cambiar lo que haga falta antes de
guardar, con su propio código de la secuencia.

La importación por archivo sigue la misma regla: solo crea. Una línea con el
código de una promoción ya publicada se rechaza diciendo por qué.

Co-Authored-By: Claude Opus 5 (1M context) <noreply@anthropic.com>
</commit_message>
<xml_diff>
--- a/scripts/manual/Manual de usuario CG-POS.docx
+++ b/scripts/manual/Manual de usuario CG-POS.docx
@@ -7313,7 +7313,32 @@
         <w:pStyle w:val="ListBullet"/>
       </w:pPr>
       <w:r>
-        <w:t>Importar (/promociones/importar): carga masiva desde un archivo CSV; se valida todo el archivo y solo se publica si no hay errores. Una línea sin código crea una promoción nueva con el número de la secuencia; con código, actualiza esa promoción, que tiene que existir.</w:t>
+        <w:t>Una promoción publicada NO se edita. Lo único que admite es apagarse, y volver a encenderse mientras siga dentro de sus fechas; una vencida ya no se enciende. Es a propósito: si se pudiera cambiar el descuento o los artículos de una oferta que ya corrió, no habría manera de explicar por qué una factura de la semana pasada salió con ese precio.</w:t>
+      </w:r>
+    </w:p>
+    <w:p>
+      <w:pPr>
+        <w:pStyle w:val="ListBullet"/>
+      </w:pPr>
+      <w:r>
+        <w:t>Para otra oferta está «Rehacer», en el menú de cada promoción: abre una nueva con todos los datos de esa —artículos, categorías, marcas, sucursales, días y horario— para cambiar lo que haga falta antes de guardar. Nace con su propio código de la secuencia. Sirve igual para corregir una mal puesta (se rehace y se apaga la anterior) que para repetir la del mes pasado con fechas nuevas.</w:t>
+      </w:r>
+    </w:p>
+    <w:p>
+      <w:r>
+        <w:rPr>
+          <w:i/>
+          <w:color w:val="2E7D32"/>
+        </w:rPr>
+        <w:t>Apagar una promoción llega a las cajas en su sincronización normal, como cualquier otro cambio de maestros.</w:t>
+      </w:r>
+    </w:p>
+    <w:p>
+      <w:pPr>
+        <w:pStyle w:val="ListBullet"/>
+      </w:pPr>
+      <w:r>
+        <w:t>Importar (/promociones/importar): carga masiva desde un archivo CSV; se valida todo el archivo y solo se publica si no hay errores. El archivo solo CREA: la columna del código va vacía y lo pone la secuencia. Una línea con el código de una promoción ya publicada se rechaza, por la misma razón que no se puede editar desde la pantalla.</w:t>
       </w:r>
     </w:p>
     <w:p>

</xml_diff>

<commit_message>
feat(caja): suspender no pide autorización salvo que el negocio lo active, y «Salir» se oculta
«Salir» era la puerta por la que se dejaba la caja sin que el rato parado quedara
medido: un botón al lado del otro, uno con motivo y cronómetro y el otro sin
nada. Queda oculto —no borrado, porque el relevo y el cierre de turno usan esa
función—, así que para ausentarse está Suspender y desde la pantalla bloqueada se
vuelve o se cambia de usuario.

Y suspender deja de pedir autorización de fábrica: si hay que llamar a un
supervisor para ir al baño, nadie lo usa. Quien quiera exigirla enciende
«Caja.SuspenderRequiereAutorizacion» en el Central, en general, por sucursal o
por caja.

Co-Authored-By: Claude Opus 5 (1M context) <noreply@anthropic.com>
</commit_message>
<xml_diff>
--- a/scripts/manual/Manual de usuario CG-POS.docx
+++ b/scripts/manual/Manual de usuario CG-POS.docx
@@ -11557,6 +11557,23 @@
       </w:pPr>
       <w:r>
         <w:t>Los motivos los decide el negocio en el Central, en Maestros → Motivos de caja parada: ahí se dice cuáles son tiempo previsto y cuál pide explicación.</w:t>
+      </w:r>
+    </w:p>
+    <w:p>
+      <w:pPr>
+        <w:pStyle w:val="ListBullet"/>
+      </w:pPr>
+      <w:r>
+        <w:t>Suspender no pide autorización de supervisor: es la única manera de dejar la caja sola, y si hubiera que llamar a alguien para ir al baño nadie la usaría y el reporte de caja parada no mediría nada. Si el negocio prefiere que sí la pida, se enciende el parámetro «Caja.SuspenderRequiereAutorizacion» en el Central, en general, por sucursal o por caja.</w:t>
+      </w:r>
+    </w:p>
+    <w:p>
+      <w:r>
+        <w:rPr>
+          <w:i/>
+          <w:color w:val="2E7D32"/>
+        </w:rPr>
+        <w:t>En el panel de funciones ya no está «Salir». Para ausentarse está Suspender, y desde la pantalla bloqueada se vuelve con la clave del mismo cajero o se cambia de usuario. Así no queda una salida por la que el tiempo parado no se mida; para terminar la jornada sigue estando Cierre de turno.</w:t>
       </w:r>
     </w:p>
     <w:p>

</xml_diff>

<commit_message>
docs(manual): el manual y la guía de instalación, al día con las formas de pago por terminal
El manual seguía describiendo una sola forma de pago de tarjeta que pasaba
por el terminal de la caja, y listaba el catálogo de tipos de tarjeta que ya
no existe. Ahora explica las cuatro: CardNet y Azul cobran en su panel y no
piden nada; Tarjeta y Amex son para lo que se cobró en un equipo aparte y
solo registran el número de aprobación.

También dice que la marca la informa el terminal y no se configura en ninguna
parte, que el BIN nunca se digita, y qué hacer cuando el terminal no responde.

Co-Authored-By: Claude Opus 5 (1M context) <noreply@anthropic.com>
</commit_message>
<xml_diff>
--- a/scripts/manual/Manual de usuario CG-POS.docx
+++ b/scripts/manual/Manual de usuario CG-POS.docx
@@ -879,7 +879,7 @@
           </w:tcPr>
           <w:p>
             <w:r>
-              <w:t>Tipos de tarjeta y motivos de descuento y de devolución</w:t>
+              <w:t>Motivos de descuento y de devolución</w:t>
             </w:r>
           </w:p>
         </w:tc>
@@ -1909,7 +1909,7 @@
           </w:tcPr>
           <w:p>
             <w:r>
-              <w:t>Monedas, tasas de cambio, departamentos, categorías, marcas, unidades, impuestos, formas de pago, denominaciones, bancos, tipos de tarjeta, motivos de descuento y devolución, almacenes, niveles y reglas de fidelidad y descuentos por tarjeta (BIN).</w:t>
+              <w:t>Monedas, tasas de cambio, departamentos, categorías, marcas, unidades, impuestos, formas de pago, denominaciones, bancos, motivos de descuento y devolución, niveles y reglas de fidelidad y descuentos por tarjeta (BIN).</w:t>
             </w:r>
           </w:p>
         </w:tc>
@@ -11282,7 +11282,7 @@
           </w:tcPr>
           <w:p>
             <w:r>
-              <w:t>Tarjeta</w:t>
+              <w:t>CardNet o Azul</w:t>
             </w:r>
           </w:p>
         </w:tc>
@@ -11292,7 +11292,29 @@
           </w:tcPr>
           <w:p>
             <w:r>
-              <w:t>Se presiona Pasar tarjeta: el terminal pide la tarjeta al cliente. Si el terminal lee el BIN, el descuento del banco se aplica solo antes de cobrar y se le cobra menos. Si el terminal no responde, se puede registrar la aprobación manual con autorización de supervisor.</w:t>
+              <w:t>Cobran en el panel de firma de su equipo. No piden nada: se presiona Pasar tarjeta y el terminal atiende al cliente. La aprobación, la marca y los últimos dígitos los devuelve él. Si el negocio activó los descuentos de banco, el equipo también informa el BIN y el descuento se aplica antes de cobrar, así que la factura sale por lo que el cliente pagó. Una caja tiene un solo equipo: la forma de pago del otro procesador se ve apagada.</w:t>
+            </w:r>
+          </w:p>
+        </w:tc>
+      </w:tr>
+      <w:tr>
+        <w:tc>
+          <w:tcPr>
+            <w:tcW w:type="dxa" w:w="2268"/>
+          </w:tcPr>
+          <w:p>
+            <w:r>
+              <w:t>Tarjeta o Amex</w:t>
+            </w:r>
+          </w:p>
+        </w:tc>
+        <w:tc>
+          <w:tcPr>
+            <w:tcW w:type="dxa" w:w="7370"/>
+          </w:tcPr>
+          <w:p>
+            <w:r>
+              <w:t>Se cobró en un equipo aparte. Solo piden el número de aprobación del volante, que es obligatorio: es lo único con que después se cuadra el turno contra los comprobantes. No llevan marca ni descuento de banco, porque nadie leyó la tarjeta.</w:t>
             </w:r>
           </w:p>
         </w:tc>
@@ -11936,7 +11958,23 @@
         <w:pStyle w:val="ListBullet"/>
       </w:pPr>
       <w:r>
-        <w:t>Cobro con tarjeta: si la caja tiene el terminal conectado, ella le manda el monto y recibe sola la aprobación. Si la tienda cobra con un equipo aparte (un inalámbrico, por ejemplo), el cajero digita el número de aprobación del volante: es obligatorio, porque es lo único con que después se cuadra el turno contra los comprobantes.</w:t>
+        <w:t>Cobro con tarjeta: la forma de pago decide con qué equipo se cobra. CardNet y Azul le mandan el monto a su terminal y reciben solas la aprobación. Tarjeta y Amex son para lo que se cobró en un equipo aparte: piden el número de aprobación del volante, que es obligatorio porque es lo único con que después se cuadra el turno.</w:t>
+      </w:r>
+    </w:p>
+    <w:p>
+      <w:pPr>
+        <w:pStyle w:val="ListBullet"/>
+      </w:pPr>
+      <w:r>
+        <w:t>La marca de la tarjeta (Visa, Mastercard…) no se configura en ninguna parte ni la elige el cajero: la informa el terminal al aprobar, y desde ahí va al ticket y al cuadre de tarjetas.</w:t>
+      </w:r>
+    </w:p>
+    <w:p>
+      <w:pPr>
+        <w:pStyle w:val="ListBullet"/>
+      </w:pPr>
+      <w:r>
+        <w:t>Descuento del banco por la tarjeta: solo funciona si el negocio encendió «Caja.DescuentoTarjetaPorBin» en los parámetros del Central. Los primeros dígitos de la tarjeta (el BIN) nunca se digitan: los devuelve el terminal.</w:t>
       </w:r>
     </w:p>
     <w:p>
@@ -12433,7 +12471,7 @@
           </w:tcPr>
           <w:p>
             <w:r>
-              <w:t>La caja lo avisa. Se puede registrar la aprobación manual del banco con autorización de supervisor, y queda marcada para conciliar.</w:t>
+              <w:t>La caja lo avisa y dice con qué forma de pago registrar el cobro. Se cobra en el equipo aparte y se registra con «Tarjeta» o «Amex», digitando el número de aprobación del volante; eso no pide autorización, es su forma normal de cobrar. Digitar una aprobación dentro de CardNet o Azul —saltarse el equipo que sí está— sí pide autorización de supervisor y queda marcado para conciliar.</w:t>
             </w:r>
           </w:p>
         </w:tc>

</xml_diff>